<commit_message>
Update scripts and fix directory paths for Colab
</commit_message>
<xml_diff>
--- a/stock algo trading project.docx
+++ b/stock algo trading project.docx
@@ -4753,23 +4753,7 @@
           <w:szCs w:val="28"/>
         </w:rPr>
         <w:br/>
-        <w:t xml:space="preserve">The project will focus on one industry rather than one stock or the whole market. This gives more training examples than a single stock, while </w:t>
-      </w:r>
-      <w:proofErr w:type="gramStart"/>
-      <w:r>
-        <w:rPr>
-          <w:sz w:val="28"/>
-          <w:szCs w:val="28"/>
-        </w:rPr>
-        <w:t>still keeping</w:t>
-      </w:r>
-      <w:proofErr w:type="gramEnd"/>
-      <w:r>
-        <w:rPr>
-          <w:sz w:val="28"/>
-          <w:szCs w:val="28"/>
-        </w:rPr>
-        <w:t xml:space="preserve"> the stocks somewhat comparable in behavior, news flow, and market structure. A practical first version is to choose one liquid U.S. industry and train one model across all stocks in that industry.</w:t>
+        <w:t>The project will focus on one industry rather than one stock or the whole market. This gives more training examples than a single stock, while still keeping the stocks somewhat comparable in behavior, news flow, and market structure. A practical first version is to choose one liquid U.S. industry and train one model across all stocks in that industry.</w:t>
       </w:r>
     </w:p>
     <w:p>
@@ -4841,23 +4825,7 @@
           <w:sz w:val="28"/>
           <w:szCs w:val="28"/>
         </w:rPr>
-        <w:t xml:space="preserve">SEC EDGAR / data.sec.gov for filings and fundamentals. The SEC provides public APIs and XBRL </w:t>
-      </w:r>
-      <w:proofErr w:type="gramStart"/>
-      <w:r>
-        <w:rPr>
-          <w:sz w:val="28"/>
-          <w:szCs w:val="28"/>
-        </w:rPr>
-        <w:t>company facts</w:t>
-      </w:r>
-      <w:proofErr w:type="gramEnd"/>
-      <w:r>
-        <w:rPr>
-          <w:sz w:val="28"/>
-          <w:szCs w:val="28"/>
-        </w:rPr>
-        <w:t xml:space="preserve"> data through data.sec.gov and related developer resources. </w:t>
+        <w:t xml:space="preserve">SEC EDGAR / data.sec.gov for filings and fundamentals. The SEC provides public APIs and XBRL company facts data through data.sec.gov and related developer resources. </w:t>
       </w:r>
     </w:p>
     <w:p>
@@ -4970,23 +4938,7 @@
           <w:szCs w:val="28"/>
         </w:rPr>
         <w:br/>
-        <w:t xml:space="preserve">For predicting </w:t>
-      </w:r>
-      <w:proofErr w:type="gramStart"/>
-      <w:r>
-        <w:rPr>
-          <w:sz w:val="28"/>
-          <w:szCs w:val="28"/>
-        </w:rPr>
-        <w:t>next-day</w:t>
-      </w:r>
-      <w:proofErr w:type="gramEnd"/>
-      <w:r>
-        <w:rPr>
-          <w:sz w:val="28"/>
-          <w:szCs w:val="28"/>
-        </w:rPr>
-        <w:t xml:space="preserve"> return directly.</w:t>
+        <w:t>For predicting next-day return directly.</w:t>
       </w:r>
     </w:p>
     <w:p>
@@ -5034,33 +4986,8 @@
           <w:sz w:val="28"/>
           <w:szCs w:val="28"/>
         </w:rPr>
-        <w:t xml:space="preserve">Tree-based model such as </w:t>
-      </w:r>
-      <w:proofErr w:type="spellStart"/>
-      <w:r>
-        <w:rPr>
-          <w:sz w:val="28"/>
-          <w:szCs w:val="28"/>
-        </w:rPr>
-        <w:t>XGBoost</w:t>
-      </w:r>
-      <w:proofErr w:type="spellEnd"/>
-      <w:r>
-        <w:rPr>
-          <w:sz w:val="28"/>
-          <w:szCs w:val="28"/>
-        </w:rPr>
-        <w:t xml:space="preserve"> or </w:t>
-      </w:r>
-      <w:proofErr w:type="spellStart"/>
-      <w:r>
-        <w:rPr>
-          <w:sz w:val="28"/>
-          <w:szCs w:val="28"/>
-        </w:rPr>
-        <w:t>LightGBM</w:t>
-      </w:r>
-      <w:proofErr w:type="spellEnd"/>
+        <w:t>Tree-based model such as XGBoost or LightGBM</w:t>
+      </w:r>
       <w:r>
         <w:rPr>
           <w:sz w:val="28"/>
@@ -5418,29 +5345,7 @@
           <w:szCs w:val="28"/>
           <w:rtl/>
         </w:rPr>
-        <w:t xml:space="preserve"> כדי לצמצם את </w:t>
-      </w:r>
-      <w:proofErr w:type="spellStart"/>
-      <w:r>
-        <w:rPr>
-          <w:rFonts w:hint="cs"/>
-          <w:color w:val="EE0000"/>
-          <w:sz w:val="28"/>
-          <w:szCs w:val="28"/>
-          <w:rtl/>
-        </w:rPr>
-        <w:t>המימדים</w:t>
-      </w:r>
-      <w:proofErr w:type="spellEnd"/>
-      <w:r>
-        <w:rPr>
-          <w:rFonts w:hint="cs"/>
-          <w:color w:val="EE0000"/>
-          <w:sz w:val="28"/>
-          <w:szCs w:val="28"/>
-          <w:rtl/>
-        </w:rPr>
-        <w:t>.</w:t>
+        <w:t xml:space="preserve"> כדי לצמצם את המימדים.</w:t>
       </w:r>
     </w:p>
     <w:p>
@@ -5576,23 +5481,7 @@
           <w:szCs w:val="28"/>
         </w:rPr>
         <w:br/>
-        <w:t xml:space="preserve">The balance between model quality and running cost is still open. The working principle should </w:t>
-      </w:r>
-      <w:proofErr w:type="gramStart"/>
-      <w:r>
-        <w:rPr>
-          <w:sz w:val="28"/>
-          <w:szCs w:val="28"/>
-        </w:rPr>
-        <w:t>be:</w:t>
-      </w:r>
-      <w:proofErr w:type="gramEnd"/>
-      <w:r>
-        <w:rPr>
-          <w:sz w:val="28"/>
-          <w:szCs w:val="28"/>
-        </w:rPr>
-        <w:t xml:space="preserve"> use the simplest model that beats the benchmark after trading costs.</w:t>
+        <w:t>The balance between model quality and running cost is still open. The working principle should be: use the simplest model that beats the benchmark after trading costs.</w:t>
       </w:r>
     </w:p>
     <w:p>
@@ -5714,55 +5603,7 @@
           <w:szCs w:val="28"/>
         </w:rPr>
         <w:br/>
-        <w:t xml:space="preserve">A. Locally for </w:t>
-      </w:r>
-      <w:proofErr w:type="gramStart"/>
-      <w:r>
-        <w:rPr>
-          <w:sz w:val="28"/>
-          <w:szCs w:val="28"/>
-        </w:rPr>
-        <w:t>now, and</w:t>
-      </w:r>
-      <w:proofErr w:type="gramEnd"/>
-      <w:r>
-        <w:rPr>
-          <w:sz w:val="28"/>
-          <w:szCs w:val="28"/>
-        </w:rPr>
-        <w:t xml:space="preserve"> Google </w:t>
-      </w:r>
-      <w:proofErr w:type="spellStart"/>
-      <w:r>
-        <w:rPr>
-          <w:sz w:val="28"/>
-          <w:szCs w:val="28"/>
-        </w:rPr>
-        <w:t>Colab</w:t>
-      </w:r>
-      <w:proofErr w:type="spellEnd"/>
-      <w:r>
-        <w:rPr>
-          <w:sz w:val="28"/>
-          <w:szCs w:val="28"/>
-        </w:rPr>
-        <w:t xml:space="preserve"> </w:t>
-      </w:r>
-      <w:proofErr w:type="gramStart"/>
-      <w:r>
-        <w:rPr>
-          <w:sz w:val="28"/>
-          <w:szCs w:val="28"/>
-        </w:rPr>
-        <w:t>for</w:t>
-      </w:r>
-      <w:proofErr w:type="gramEnd"/>
-      <w:r>
-        <w:rPr>
-          <w:sz w:val="28"/>
-          <w:szCs w:val="28"/>
-        </w:rPr>
-        <w:t xml:space="preserve"> heavier experiments.</w:t>
+        <w:t>A. Locally for now, and Google Colab for heavier experiments.</w:t>
       </w:r>
       <w:r>
         <w:rPr>
@@ -5770,23 +5611,7 @@
           <w:szCs w:val="28"/>
         </w:rPr>
         <w:br/>
-        <w:t xml:space="preserve">Google </w:t>
-      </w:r>
-      <w:proofErr w:type="spellStart"/>
-      <w:r>
-        <w:rPr>
-          <w:sz w:val="28"/>
-          <w:szCs w:val="28"/>
-        </w:rPr>
-        <w:t>Colab</w:t>
-      </w:r>
-      <w:proofErr w:type="spellEnd"/>
-      <w:r>
-        <w:rPr>
-          <w:sz w:val="28"/>
-          <w:szCs w:val="28"/>
-        </w:rPr>
-        <w:t xml:space="preserve"> is officially free to use and provides access to computing resources including GPUs and TPUs, though availability and limits vary. </w:t>
+        <w:t xml:space="preserve">Google Colab is officially free to use and provides access to computing resources including GPUs and TPUs, though availability and limits vary. </w:t>
       </w:r>
     </w:p>
     <w:p>
@@ -5842,23 +5667,7 @@
           <w:sz w:val="28"/>
           <w:szCs w:val="28"/>
         </w:rPr>
-        <w:t xml:space="preserve">Google </w:t>
-      </w:r>
-      <w:proofErr w:type="spellStart"/>
-      <w:r>
-        <w:rPr>
-          <w:sz w:val="28"/>
-          <w:szCs w:val="28"/>
-        </w:rPr>
-        <w:t>Colab</w:t>
-      </w:r>
-      <w:proofErr w:type="spellEnd"/>
-      <w:r>
-        <w:rPr>
-          <w:sz w:val="28"/>
-          <w:szCs w:val="28"/>
-        </w:rPr>
-        <w:t xml:space="preserve"> for training larger models or running longer experiments</w:t>
+        <w:t>Google Colab for training larger models or running longer experiments</w:t>
       </w:r>
     </w:p>
     <w:p>
@@ -5898,23 +5707,7 @@
           <w:szCs w:val="28"/>
         </w:rPr>
         <w:br/>
-        <w:t xml:space="preserve">Python is the correct choice for this project. It is the standard language for market-data work, machine learning, </w:t>
-      </w:r>
-      <w:proofErr w:type="spellStart"/>
-      <w:r>
-        <w:rPr>
-          <w:sz w:val="28"/>
-          <w:szCs w:val="28"/>
-        </w:rPr>
-        <w:t>backtesting</w:t>
-      </w:r>
-      <w:proofErr w:type="spellEnd"/>
-      <w:r>
-        <w:rPr>
-          <w:sz w:val="28"/>
-          <w:szCs w:val="28"/>
-        </w:rPr>
-        <w:t>, and broker API integration. It is fast enough for daily and hourly trading systems.</w:t>
+        <w:t>Python is the correct choice for this project. It is the standard language for market-data work, machine learning, backtesting, and broker API integration. It is fast enough for daily and hourly trading systems.</w:t>
       </w:r>
     </w:p>
     <w:p>
@@ -5972,21 +5765,12 @@
           <w:szCs w:val="28"/>
         </w:rPr>
       </w:pPr>
-      <w:proofErr w:type="gramStart"/>
-      <w:r>
-        <w:rPr>
-          <w:sz w:val="28"/>
-          <w:szCs w:val="28"/>
-        </w:rPr>
-        <w:t>So</w:t>
-      </w:r>
-      <w:proofErr w:type="gramEnd"/>
-      <w:r>
-        <w:rPr>
-          <w:sz w:val="28"/>
-          <w:szCs w:val="28"/>
-        </w:rPr>
-        <w:t xml:space="preserve"> the working conclusion is:</w:t>
+      <w:r>
+        <w:rPr>
+          <w:sz w:val="28"/>
+          <w:szCs w:val="28"/>
+        </w:rPr>
+        <w:t>So the working conclusion is:</w:t>
       </w:r>
       <w:r>
         <w:rPr>
@@ -6042,23 +5826,7 @@
           <w:szCs w:val="28"/>
         </w:rPr>
         <w:br/>
-        <w:t xml:space="preserve">IBKR’s Web API supports trading functionality, market data, and event-driven communication, including WebSocket-based workflows. IBKR also states that its Web API currently enforces a global request rate limit of 10 requests per second per authenticated </w:t>
-      </w:r>
-      <w:proofErr w:type="gramStart"/>
-      <w:r>
-        <w:rPr>
-          <w:sz w:val="28"/>
-          <w:szCs w:val="28"/>
-        </w:rPr>
-        <w:t>session, and</w:t>
-      </w:r>
-      <w:proofErr w:type="gramEnd"/>
-      <w:r>
-        <w:rPr>
-          <w:sz w:val="28"/>
-          <w:szCs w:val="28"/>
-        </w:rPr>
-        <w:t xml:space="preserve"> returns HTTP 429 if the limit is exceeded. </w:t>
+        <w:t xml:space="preserve">IBKR’s Web API supports trading functionality, market data, and event-driven communication, including WebSocket-based workflows. IBKR also states that its Web API currently enforces a global request rate limit of 10 requests per second per authenticated session, and returns HTTP 429 if the limit is exceeded. </w:t>
       </w:r>
     </w:p>
     <w:p>
@@ -6069,21 +5837,12 @@
           <w:szCs w:val="28"/>
         </w:rPr>
       </w:pPr>
-      <w:proofErr w:type="gramStart"/>
-      <w:r>
-        <w:rPr>
-          <w:sz w:val="28"/>
-          <w:szCs w:val="28"/>
-        </w:rPr>
-        <w:t>So</w:t>
-      </w:r>
-      <w:proofErr w:type="gramEnd"/>
-      <w:r>
-        <w:rPr>
-          <w:sz w:val="28"/>
-          <w:szCs w:val="28"/>
-        </w:rPr>
-        <w:t xml:space="preserve"> the plan should assume:</w:t>
+      <w:r>
+        <w:rPr>
+          <w:sz w:val="28"/>
+          <w:szCs w:val="28"/>
+        </w:rPr>
+        <w:t>So the plan should assume:</w:t>
       </w:r>
     </w:p>
     <w:p>
@@ -6183,23 +5942,7 @@
           <w:szCs w:val="28"/>
         </w:rPr>
         <w:br/>
-        <w:t xml:space="preserve">Weights alone are not enough. The saved training data, or at least a reproducible snapshot of it, is needed so the model can be reproduced, audited, compared, and debugged later. Without the data and preprocessing pipeline, the </w:t>
-      </w:r>
-      <w:proofErr w:type="gramStart"/>
-      <w:r>
-        <w:rPr>
-          <w:sz w:val="28"/>
-          <w:szCs w:val="28"/>
-        </w:rPr>
-        <w:t>weights lose</w:t>
-      </w:r>
-      <w:proofErr w:type="gramEnd"/>
-      <w:r>
-        <w:rPr>
-          <w:sz w:val="28"/>
-          <w:szCs w:val="28"/>
-        </w:rPr>
-        <w:t xml:space="preserve"> a lot of practical value.</w:t>
+        <w:t>Weights alone are not enough. The saved training data, or at least a reproducible snapshot of it, is needed so the model can be reproduced, audited, compared, and debugged later. Without the data and preprocessing pipeline, the weights lose a lot of practical value.</w:t>
       </w:r>
     </w:p>
     <w:p>
@@ -6418,7 +6161,6 @@
         </w:rPr>
         <w:t>תחשוב על לשמור את הנתונים ב</w:t>
       </w:r>
-      <w:proofErr w:type="spellStart"/>
       <w:r>
         <w:rPr>
           <w:sz w:val="28"/>
@@ -6426,7 +6168,6 @@
         </w:rPr>
         <w:t>parqut</w:t>
       </w:r>
-      <w:proofErr w:type="spellEnd"/>
       <w:r>
         <w:rPr>
           <w:rFonts w:hint="cs"/>
@@ -6562,23 +6303,7 @@
           <w:sz w:val="28"/>
           <w:szCs w:val="28"/>
         </w:rPr>
-        <w:t xml:space="preserve">max </w:t>
-      </w:r>
-      <w:proofErr w:type="gramStart"/>
-      <w:r>
-        <w:rPr>
-          <w:sz w:val="28"/>
-          <w:szCs w:val="28"/>
-        </w:rPr>
-        <w:t>drawdown</w:t>
-      </w:r>
-      <w:proofErr w:type="gramEnd"/>
-      <w:r>
-        <w:rPr>
-          <w:sz w:val="28"/>
-          <w:szCs w:val="28"/>
-        </w:rPr>
-        <w:t xml:space="preserve"> kill-switch</w:t>
+        <w:t>max drawdown kill-switch</w:t>
       </w:r>
     </w:p>
     <w:p>
@@ -6884,21 +6609,12 @@
           <w:szCs w:val="28"/>
         </w:rPr>
       </w:pPr>
-      <w:proofErr w:type="gramStart"/>
-      <w:r>
-        <w:rPr>
-          <w:sz w:val="28"/>
-          <w:szCs w:val="28"/>
-        </w:rPr>
-        <w:t>first</w:t>
-      </w:r>
-      <w:proofErr w:type="gramEnd"/>
-      <w:r>
-        <w:rPr>
-          <w:sz w:val="28"/>
-          <w:szCs w:val="28"/>
-        </w:rPr>
-        <w:t>, the strategy should beat doing nothing</w:t>
+      <w:r>
+        <w:rPr>
+          <w:sz w:val="28"/>
+          <w:szCs w:val="28"/>
+        </w:rPr>
+        <w:t>first, the strategy should beat doing nothing</w:t>
       </w:r>
     </w:p>
     <w:p>
@@ -6913,21 +6629,12 @@
           <w:szCs w:val="28"/>
         </w:rPr>
       </w:pPr>
-      <w:proofErr w:type="gramStart"/>
-      <w:r>
-        <w:rPr>
-          <w:sz w:val="28"/>
-          <w:szCs w:val="28"/>
-        </w:rPr>
-        <w:t>then</w:t>
-      </w:r>
-      <w:proofErr w:type="gramEnd"/>
-      <w:r>
-        <w:rPr>
-          <w:sz w:val="28"/>
-          <w:szCs w:val="28"/>
-        </w:rPr>
-        <w:t>, it should beat the broad market</w:t>
+      <w:r>
+        <w:rPr>
+          <w:sz w:val="28"/>
+          <w:szCs w:val="28"/>
+        </w:rPr>
+        <w:t>then, it should beat the broad market</w:t>
       </w:r>
     </w:p>
     <w:p>
@@ -6942,21 +6649,12 @@
           <w:szCs w:val="28"/>
         </w:rPr>
       </w:pPr>
-      <w:proofErr w:type="gramStart"/>
-      <w:r>
-        <w:rPr>
-          <w:sz w:val="28"/>
-          <w:szCs w:val="28"/>
-        </w:rPr>
-        <w:t>then</w:t>
-      </w:r>
-      <w:proofErr w:type="gramEnd"/>
-      <w:r>
-        <w:rPr>
-          <w:sz w:val="28"/>
-          <w:szCs w:val="28"/>
-        </w:rPr>
-        <w:t>, it should beat the industry benchmark</w:t>
+      <w:r>
+        <w:rPr>
+          <w:sz w:val="28"/>
+          <w:szCs w:val="28"/>
+        </w:rPr>
+        <w:t>then, it should beat the industry benchmark</w:t>
       </w:r>
     </w:p>
     <w:p>
@@ -7024,23 +6722,7 @@
           <w:sz w:val="28"/>
           <w:szCs w:val="28"/>
         </w:rPr>
-        <w:t xml:space="preserve">A. </w:t>
-      </w:r>
-      <w:proofErr w:type="gramStart"/>
-      <w:r>
-        <w:rPr>
-          <w:sz w:val="28"/>
-          <w:szCs w:val="28"/>
-        </w:rPr>
-        <w:t>Open, but</w:t>
-      </w:r>
-      <w:proofErr w:type="gramEnd"/>
-      <w:r>
-        <w:rPr>
-          <w:sz w:val="28"/>
-          <w:szCs w:val="28"/>
-        </w:rPr>
-        <w:t xml:space="preserve"> must be defined.</w:t>
+        <w:t>A. Open, but must be defined.</w:t>
       </w:r>
       <w:r>
         <w:rPr>
@@ -7195,23 +6877,7 @@
           <w:sz w:val="28"/>
           <w:szCs w:val="28"/>
         </w:rPr>
-        <w:t xml:space="preserve">A. </w:t>
-      </w:r>
-      <w:proofErr w:type="gramStart"/>
-      <w:r>
-        <w:rPr>
-          <w:sz w:val="28"/>
-          <w:szCs w:val="28"/>
-        </w:rPr>
-        <w:t>Open, but</w:t>
-      </w:r>
-      <w:proofErr w:type="gramEnd"/>
-      <w:r>
-        <w:rPr>
-          <w:sz w:val="28"/>
-          <w:szCs w:val="28"/>
-        </w:rPr>
-        <w:t xml:space="preserve"> must be defined.</w:t>
+        <w:t>A. Open, but must be defined.</w:t>
       </w:r>
       <w:r>
         <w:rPr>
@@ -7488,21 +7154,7 @@
         <w:rPr>
           <w:rStyle w:val="30"/>
         </w:rPr>
-        <w:t xml:space="preserve">Q7. How often will the model </w:t>
-      </w:r>
-      <w:proofErr w:type="gramStart"/>
-      <w:r>
-        <w:rPr>
-          <w:rStyle w:val="30"/>
-        </w:rPr>
-        <w:t>retrain</w:t>
-      </w:r>
-      <w:proofErr w:type="gramEnd"/>
-      <w:r>
-        <w:rPr>
-          <w:rStyle w:val="30"/>
-        </w:rPr>
-        <w:t>?</w:t>
+        <w:t>Q7. How often will the model retrain?</w:t>
       </w:r>
       <w:bookmarkEnd w:id="23"/>
       <w:r>
@@ -7620,21 +7272,7 @@
         <w:rPr>
           <w:rStyle w:val="30"/>
         </w:rPr>
-        <w:t xml:space="preserve">Q8. How many trades / what portfolio </w:t>
-      </w:r>
-      <w:proofErr w:type="gramStart"/>
-      <w:r>
-        <w:rPr>
-          <w:rStyle w:val="30"/>
-        </w:rPr>
-        <w:t>structure</w:t>
-      </w:r>
-      <w:proofErr w:type="gramEnd"/>
-      <w:r>
-        <w:rPr>
-          <w:rStyle w:val="30"/>
-        </w:rPr>
-        <w:t>?</w:t>
+        <w:t>Q8. How many trades / what portfolio structure?</w:t>
       </w:r>
       <w:bookmarkEnd w:id="24"/>
       <w:r>
@@ -8012,23 +7650,7 @@
           <w:szCs w:val="28"/>
         </w:rPr>
         <w:br/>
-        <w:t xml:space="preserve">There should be a minimum expected value threshold x. If the </w:t>
-      </w:r>
-      <w:proofErr w:type="gramStart"/>
-      <w:r>
-        <w:rPr>
-          <w:sz w:val="28"/>
-          <w:szCs w:val="28"/>
-        </w:rPr>
-        <w:t>expected next-day</w:t>
-      </w:r>
-      <w:proofErr w:type="gramEnd"/>
-      <w:r>
-        <w:rPr>
-          <w:sz w:val="28"/>
-          <w:szCs w:val="28"/>
-        </w:rPr>
-        <w:t xml:space="preserve"> return is below x, the system does not trade.</w:t>
+        <w:t>There should be a minimum expected value threshold x. If the expected next-day return is below x, the system does not trade.</w:t>
       </w:r>
     </w:p>
     <w:p>
@@ -8061,39 +7683,7 @@
           <w:szCs w:val="28"/>
         </w:rPr>
         <w:lastRenderedPageBreak/>
-        <w:t xml:space="preserve">The current project design </w:t>
-      </w:r>
-      <w:proofErr w:type="gramStart"/>
-      <w:r>
-        <w:rPr>
-          <w:sz w:val="28"/>
-          <w:szCs w:val="28"/>
-        </w:rPr>
-        <w:t>is:</w:t>
-      </w:r>
-      <w:proofErr w:type="gramEnd"/>
-      <w:r>
-        <w:rPr>
-          <w:sz w:val="28"/>
-          <w:szCs w:val="28"/>
-        </w:rPr>
-        <w:t xml:space="preserve"> train a Python-based model on one liquid industry, using mainly free historical price and fundamentals data, starting with daily data and possibly extending to hourly data later. The target is expected one-day-ahead return, the strategy is long-only, and “no trade” is valid unless expected value passes a minimum threshold. Model development should move from simple baselines to more complex neural architectures only if out-of-sample results improve. Validation should use repeated walk-forward time splits and compare results against three benchmark levels: above 0, above the S&amp;P 500, and above the industry benchmark. Local development plus Google </w:t>
-      </w:r>
-      <w:proofErr w:type="spellStart"/>
-      <w:r>
-        <w:rPr>
-          <w:sz w:val="28"/>
-          <w:szCs w:val="28"/>
-        </w:rPr>
-        <w:t>Colab</w:t>
-      </w:r>
-      <w:proofErr w:type="spellEnd"/>
-      <w:r>
-        <w:rPr>
-          <w:sz w:val="28"/>
-          <w:szCs w:val="28"/>
-        </w:rPr>
-        <w:t xml:space="preserve"> is enough for the first phase, and IBKR paper trading can later be used for execution testing, while keeping in mind market-data subscriptions, API pacing, and risk controls.</w:t>
+        <w:t>The current project design is: train a Python-based model on one liquid industry, using mainly free historical price and fundamentals data, starting with daily data and possibly extending to hourly data later. The target is expected one-day-ahead return, the strategy is long-only, and “no trade” is valid unless expected value passes a minimum threshold. Model development should move from simple baselines to more complex neural architectures only if out-of-sample results improve. Validation should use repeated walk-forward time splits and compare results against three benchmark levels: above 0, above the S&amp;P 500, and above the industry benchmark. Local development plus Google Colab is enough for the first phase, and IBKR paper trading can later be used for execution testing, while keeping in mind market-data subscriptions, API pacing, and risk controls.</w:t>
       </w:r>
     </w:p>
     <w:p>
@@ -8109,23 +7699,7 @@
           <w:sz w:val="28"/>
           <w:szCs w:val="28"/>
         </w:rPr>
-        <w:t xml:space="preserve">What does it do in </w:t>
-      </w:r>
-      <w:proofErr w:type="gramStart"/>
-      <w:r>
-        <w:rPr>
-          <w:sz w:val="28"/>
-          <w:szCs w:val="28"/>
-        </w:rPr>
-        <w:t>a line.</w:t>
-      </w:r>
-      <w:proofErr w:type="gramEnd"/>
-      <w:r>
-        <w:rPr>
-          <w:sz w:val="28"/>
-          <w:szCs w:val="28"/>
-        </w:rPr>
-        <w:t xml:space="preserve"> It turns your rough idea into a structured first project spec with the main choices fixed and the remaining open decisions clearly marked.</w:t>
+        <w:t>What does it do in a line. It turns your rough idea into a structured first project spec with the main choices fixed and the remaining open decisions clearly marked.</w:t>
       </w:r>
     </w:p>
     <w:p>
@@ -9257,7 +8831,6 @@
         </w:rPr>
         <w:t>לעשות קוד שבודק מה ההיפר פרמטרים הכי טובים למודל ה</w:t>
       </w:r>
-      <w:proofErr w:type="spellStart"/>
       <w:r>
         <w:rPr>
           <w:sz w:val="28"/>
@@ -9265,7 +8838,6 @@
         </w:rPr>
         <w:t>XGBoost</w:t>
       </w:r>
-      <w:proofErr w:type="spellEnd"/>
       <w:r>
         <w:rPr>
           <w:rFonts w:hint="cs"/>
@@ -9783,43 +9355,33 @@
           <w:u w:val="single"/>
         </w:rPr>
         <w:lastRenderedPageBreak/>
-        <w:t xml:space="preserve">Linear regression vs </w:t>
-      </w:r>
-      <w:proofErr w:type="spellStart"/>
-      <w:r>
-        <w:rPr>
-          <w:u w:val="single"/>
+        <w:t>Linear regression vs XGBoost</w:t>
+      </w:r>
+    </w:p>
+    <w:p>
+      <w:pPr>
+        <w:rPr>
+          <w:sz w:val="28"/>
+          <w:szCs w:val="28"/>
+          <w:rtl/>
+        </w:rPr>
+      </w:pPr>
+      <w:r>
+        <w:rPr>
+          <w:rFonts w:hint="cs"/>
+          <w:sz w:val="28"/>
+          <w:szCs w:val="28"/>
+          <w:rtl/>
+        </w:rPr>
+        <w:t>יוצא כי ה</w:t>
+      </w:r>
+      <w:r>
+        <w:rPr>
+          <w:sz w:val="28"/>
+          <w:szCs w:val="28"/>
         </w:rPr>
         <w:t>XGBoost</w:t>
       </w:r>
-      <w:proofErr w:type="spellEnd"/>
-    </w:p>
-    <w:p>
-      <w:pPr>
-        <w:rPr>
-          <w:sz w:val="28"/>
-          <w:szCs w:val="28"/>
-          <w:rtl/>
-        </w:rPr>
-      </w:pPr>
-      <w:r>
-        <w:rPr>
-          <w:rFonts w:hint="cs"/>
-          <w:sz w:val="28"/>
-          <w:szCs w:val="28"/>
-          <w:rtl/>
-        </w:rPr>
-        <w:t>יוצא כי ה</w:t>
-      </w:r>
-      <w:proofErr w:type="spellStart"/>
-      <w:r>
-        <w:rPr>
-          <w:sz w:val="28"/>
-          <w:szCs w:val="28"/>
-        </w:rPr>
-        <w:t>XGBoost</w:t>
-      </w:r>
-      <w:proofErr w:type="spellEnd"/>
       <w:r>
         <w:rPr>
           <w:rFonts w:hint="cs"/>
@@ -9863,7 +9425,6 @@
         </w:rPr>
         <w:t>בעצם, ה</w:t>
       </w:r>
-      <w:proofErr w:type="spellStart"/>
       <w:r>
         <w:rPr>
           <w:sz w:val="28"/>
@@ -9871,7 +9432,6 @@
         </w:rPr>
         <w:t>lr</w:t>
       </w:r>
-      <w:proofErr w:type="spellEnd"/>
       <w:r>
         <w:rPr>
           <w:rFonts w:hint="cs"/>
@@ -9931,7 +9491,6 @@
         </w:rPr>
         <w:t>זה בגלל ש</w:t>
       </w:r>
-      <w:proofErr w:type="spellStart"/>
       <w:r>
         <w:rPr>
           <w:sz w:val="28"/>
@@ -9939,7 +9498,6 @@
         </w:rPr>
         <w:t>lr</w:t>
       </w:r>
-      <w:proofErr w:type="spellEnd"/>
       <w:r>
         <w:rPr>
           <w:rFonts w:hint="cs"/>
@@ -10323,43 +9881,14 @@
           <w:szCs w:val="28"/>
           <w:rtl/>
         </w:rPr>
-        <w:t xml:space="preserve">זה לא באמת הוגן </w:t>
-      </w:r>
-      <w:proofErr w:type="spellStart"/>
-      <w:r>
-        <w:rPr>
-          <w:rFonts w:hint="cs"/>
-          <w:sz w:val="28"/>
-          <w:szCs w:val="28"/>
-          <w:rtl/>
-        </w:rPr>
-        <w:t>לאמוד</w:t>
-      </w:r>
-      <w:proofErr w:type="spellEnd"/>
-      <w:r>
-        <w:rPr>
-          <w:rFonts w:hint="cs"/>
-          <w:sz w:val="28"/>
-          <w:szCs w:val="28"/>
-          <w:rtl/>
-        </w:rPr>
-        <w:t xml:space="preserve"> את איכות המודל שלך לפי התוצאות על ה</w:t>
-      </w:r>
-      <w:proofErr w:type="spellStart"/>
-      <w:r>
-        <w:rPr>
-          <w:sz w:val="28"/>
-          <w:szCs w:val="28"/>
-        </w:rPr>
-        <w:t>val</w:t>
-      </w:r>
-      <w:proofErr w:type="spellEnd"/>
-      <w:r>
-        <w:rPr>
-          <w:sz w:val="28"/>
-          <w:szCs w:val="28"/>
-        </w:rPr>
-        <w:t xml:space="preserve"> set</w:t>
+        <w:t>זה לא באמת הוגן לאמוד את איכות המודל שלך לפי התוצאות על ה</w:t>
+      </w:r>
+      <w:r>
+        <w:rPr>
+          <w:sz w:val="28"/>
+          <w:szCs w:val="28"/>
+        </w:rPr>
+        <w:t>val set</w:t>
       </w:r>
       <w:r>
         <w:rPr>
@@ -10948,21 +10477,12 @@
         </w:rPr>
         <w:t xml:space="preserve">לנסות לעשות אינטגרציה ע"י </w:t>
       </w:r>
-      <w:proofErr w:type="spellStart"/>
-      <w:r>
-        <w:rPr>
-          <w:sz w:val="28"/>
-          <w:szCs w:val="28"/>
-        </w:rPr>
-        <w:t>multy</w:t>
-      </w:r>
-      <w:proofErr w:type="spellEnd"/>
-      <w:r>
-        <w:rPr>
-          <w:sz w:val="28"/>
-          <w:szCs w:val="28"/>
-        </w:rPr>
-        <w:t xml:space="preserve"> arm bandits</w:t>
+      <w:r>
+        <w:rPr>
+          <w:sz w:val="28"/>
+          <w:szCs w:val="28"/>
+        </w:rPr>
+        <w:t>multy arm bandits</w:t>
       </w:r>
       <w:r>
         <w:rPr>
@@ -11079,23 +10599,7 @@
           <w:sz w:val="28"/>
           <w:szCs w:val="28"/>
         </w:rPr>
-        <w:t xml:space="preserve"> </w:t>
-      </w:r>
-      <w:proofErr w:type="spellStart"/>
-      <w:r>
-        <w:rPr>
-          <w:sz w:val="28"/>
-          <w:szCs w:val="28"/>
-        </w:rPr>
-        <w:t>s&amp;p</w:t>
-      </w:r>
-      <w:proofErr w:type="spellEnd"/>
-      <w:r>
-        <w:rPr>
-          <w:sz w:val="28"/>
-          <w:szCs w:val="28"/>
-        </w:rPr>
-        <w:t xml:space="preserve"> 500</w:t>
+        <w:t xml:space="preserve"> s&amp;p 500</w:t>
       </w:r>
       <w:r>
         <w:rPr>
@@ -11372,15 +10876,7 @@
         <w:t>The Strategy Pattern:</w:t>
       </w:r>
       <w:r>
-        <w:t xml:space="preserve"> Using an if/</w:t>
-      </w:r>
-      <w:proofErr w:type="spellStart"/>
-      <w:r>
-        <w:t>elif</w:t>
-      </w:r>
-      <w:proofErr w:type="spellEnd"/>
-      <w:r>
-        <w:t xml:space="preserve"> flag system is a bit "monolithic." In high-level software engineering, you would use a </w:t>
+        <w:t xml:space="preserve"> Using an if/elif flag system is a bit "monolithic." In high-level software engineering, you would use a </w:t>
       </w:r>
       <w:r>
         <w:rPr>
@@ -11409,23 +10905,7 @@
         <w:t>Parameter Injection:</w:t>
       </w:r>
       <w:r>
-        <w:t xml:space="preserve"> Things like </w:t>
-      </w:r>
-      <w:proofErr w:type="spellStart"/>
-      <w:r>
-        <w:t>n_estimators</w:t>
-      </w:r>
-      <w:proofErr w:type="spellEnd"/>
-      <w:r>
-        <w:t xml:space="preserve">=300 or </w:t>
-      </w:r>
-      <w:proofErr w:type="spellStart"/>
-      <w:r>
-        <w:t>learning_rate</w:t>
-      </w:r>
-      <w:proofErr w:type="spellEnd"/>
-      <w:r>
-        <w:t>=0.05 are currently "hard-coded." A more advanced approach would be to pass a dictionary of hyperparameters into the function so you can experiment without editing the core logic.</w:t>
+        <w:t xml:space="preserve"> Things like n_estimators=300 or learning_rate=0.05 are currently "hard-coded." A more advanced approach would be to pass a dictionary of hyperparameters into the function so you can experiment without editing the core logic.</w:t>
       </w:r>
     </w:p>
     <w:p>
@@ -11444,31 +10924,7 @@
         <w:t>Fit/Predict Coupling:</w:t>
       </w:r>
       <w:r>
-        <w:t xml:space="preserve"> As we discussed, a professional production pipeline usually keeps the "Trainer</w:t>
-      </w:r>
-      <w:proofErr w:type="gramStart"/>
-      <w:r>
-        <w:t>"</w:t>
-      </w:r>
-      <w:proofErr w:type="gramEnd"/>
-      <w:r>
-        <w:t xml:space="preserve"> and the "Predictor" </w:t>
-      </w:r>
-      <w:proofErr w:type="gramStart"/>
-      <w:r>
-        <w:t>completely separate</w:t>
-      </w:r>
-      <w:proofErr w:type="gramEnd"/>
-      <w:r>
-        <w:t xml:space="preserve"> to save on </w:t>
-      </w:r>
-      <w:proofErr w:type="gramStart"/>
-      <w:r>
-        <w:t>compute</w:t>
-      </w:r>
-      <w:proofErr w:type="gramEnd"/>
-      <w:r>
-        <w:t xml:space="preserve"> costs.</w:t>
+        <w:t xml:space="preserve"> As we discussed, a professional production pipeline usually keeps the "Trainer" and the "Predictor" completely separate to save on compute costs.</w:t>
       </w:r>
     </w:p>
     <w:p>
@@ -11621,33 +11077,7 @@
           <w:szCs w:val="28"/>
           <w:rtl/>
         </w:rPr>
-        <w:t xml:space="preserve">והיא לא </w:t>
-      </w:r>
-      <w:proofErr w:type="spellStart"/>
-      <w:r>
-        <w:rPr>
-          <w:rFonts w:hint="cs"/>
-          <w:b/>
-          <w:bCs/>
-          <w:color w:val="EE0000"/>
-          <w:sz w:val="28"/>
-          <w:szCs w:val="28"/>
-          <w:rtl/>
-        </w:rPr>
-        <w:t>מודילורית</w:t>
-      </w:r>
-      <w:proofErr w:type="spellEnd"/>
-      <w:r>
-        <w:rPr>
-          <w:rFonts w:hint="cs"/>
-          <w:b/>
-          <w:bCs/>
-          <w:color w:val="EE0000"/>
-          <w:sz w:val="28"/>
-          <w:szCs w:val="28"/>
-          <w:rtl/>
-        </w:rPr>
-        <w:t>.</w:t>
+        <w:t>והיא לא מודילורית.</w:t>
       </w:r>
     </w:p>
     <w:p>
@@ -12164,27 +11594,7 @@
           <w:szCs w:val="28"/>
           <w:rtl/>
         </w:rPr>
-        <w:t xml:space="preserve">אני כתבתי </w:t>
-      </w:r>
-      <w:proofErr w:type="spellStart"/>
-      <w:r>
-        <w:rPr>
-          <w:rFonts w:hint="cs"/>
-          <w:sz w:val="28"/>
-          <w:szCs w:val="28"/>
-          <w:rtl/>
-        </w:rPr>
-        <w:t>הכל</w:t>
-      </w:r>
-      <w:proofErr w:type="spellEnd"/>
-      <w:r>
-        <w:rPr>
-          <w:rFonts w:hint="cs"/>
-          <w:sz w:val="28"/>
-          <w:szCs w:val="28"/>
-          <w:rtl/>
-        </w:rPr>
-        <w:t xml:space="preserve"> לוקאלי, זאת הייתה טעות.</w:t>
+        <w:t>אני כתבתי הכל לוקאלי, זאת הייתה טעות.</w:t>
       </w:r>
     </w:p>
     <w:p>
@@ -12226,17 +11636,8 @@
           <w:sz w:val="28"/>
           <w:szCs w:val="28"/>
         </w:rPr>
-        <w:t xml:space="preserve">google </w:t>
-      </w:r>
-      <w:proofErr w:type="spellStart"/>
-      <w:r>
-        <w:rPr>
-          <w:sz w:val="28"/>
-          <w:szCs w:val="28"/>
-        </w:rPr>
-        <w:t>colab</w:t>
-      </w:r>
-      <w:proofErr w:type="spellEnd"/>
+        <w:t>google colab</w:t>
+      </w:r>
       <w:r>
         <w:rPr>
           <w:rFonts w:hint="cs"/>
@@ -12526,7 +11927,6 @@
         </w:rPr>
         <w:t xml:space="preserve">בהתאם לכך תבין אם אתה רוצה </w:t>
       </w:r>
-      <w:proofErr w:type="spellStart"/>
       <w:r>
         <w:rPr>
           <w:sz w:val="28"/>
@@ -12534,7 +11934,6 @@
         </w:rPr>
         <w:t>db</w:t>
       </w:r>
-      <w:proofErr w:type="spellEnd"/>
       <w:r>
         <w:rPr>
           <w:rFonts w:hint="cs"/>
@@ -12549,33 +11948,8 @@
           <w:sz w:val="28"/>
           <w:szCs w:val="28"/>
         </w:rPr>
-        <w:t>csv/</w:t>
-      </w:r>
-      <w:proofErr w:type="spellStart"/>
-      <w:r>
-        <w:rPr>
-          <w:sz w:val="28"/>
-          <w:szCs w:val="28"/>
-        </w:rPr>
-        <w:t>json</w:t>
-      </w:r>
-      <w:proofErr w:type="spellEnd"/>
-      <w:r>
-        <w:rPr>
-          <w:sz w:val="28"/>
-          <w:szCs w:val="28"/>
-        </w:rPr>
-        <w:t>/</w:t>
-      </w:r>
-      <w:proofErr w:type="spellStart"/>
-      <w:r>
-        <w:rPr>
-          <w:sz w:val="28"/>
-          <w:szCs w:val="28"/>
-        </w:rPr>
-        <w:t>parqet</w:t>
-      </w:r>
-      <w:proofErr w:type="spellEnd"/>
+        <w:t>csv/json/parqet</w:t>
+      </w:r>
       <w:r>
         <w:rPr>
           <w:rFonts w:hint="cs"/>
@@ -12646,27 +12020,7 @@
           <w:szCs w:val="28"/>
           <w:rtl/>
         </w:rPr>
-        <w:t xml:space="preserve">לעשות מבחני סף שלפיהם אפשר </w:t>
-      </w:r>
-      <w:proofErr w:type="spellStart"/>
-      <w:r>
-        <w:rPr>
-          <w:rFonts w:eastAsiaTheme="minorEastAsia" w:hint="cs"/>
-          <w:sz w:val="28"/>
-          <w:szCs w:val="28"/>
-          <w:rtl/>
-        </w:rPr>
-        <w:t>לאמוד</w:t>
-      </w:r>
-      <w:proofErr w:type="spellEnd"/>
-      <w:r>
-        <w:rPr>
-          <w:rFonts w:eastAsiaTheme="minorEastAsia" w:hint="cs"/>
-          <w:sz w:val="28"/>
-          <w:szCs w:val="28"/>
-          <w:rtl/>
-        </w:rPr>
-        <w:t xml:space="preserve"> את המודל, כמו שפה עשינו:</w:t>
+        <w:t>לעשות מבחני סף שלפיהם אפשר לאמוד את המודל, כמו שפה עשינו:</w:t>
       </w:r>
     </w:p>
     <w:p>
@@ -13401,13 +12755,93 @@
     <w:p>
       <w:pPr>
         <w:pStyle w:val="a9"/>
-        <w:rPr>
-          <w:rFonts w:hint="cs"/>
-          <w:sz w:val="28"/>
-          <w:szCs w:val="28"/>
-          <w:rtl/>
-        </w:rPr>
-      </w:pPr>
+        <w:numPr>
+          <w:ilvl w:val="0"/>
+          <w:numId w:val="25"/>
+        </w:numPr>
+        <w:rPr>
+          <w:sz w:val="28"/>
+          <w:szCs w:val="28"/>
+        </w:rPr>
+      </w:pPr>
+      <w:r>
+        <w:rPr>
+          <w:rFonts w:hint="cs"/>
+          <w:sz w:val="28"/>
+          <w:szCs w:val="28"/>
+          <w:rtl/>
+        </w:rPr>
+        <w:t xml:space="preserve">תעשה קובץ </w:t>
+      </w:r>
+      <w:r>
+        <w:rPr>
+          <w:sz w:val="28"/>
+          <w:szCs w:val="28"/>
+        </w:rPr>
+        <w:t>requirements</w:t>
+      </w:r>
+      <w:r>
+        <w:rPr>
+          <w:sz w:val="28"/>
+          <w:szCs w:val="28"/>
+        </w:rPr>
+        <w:t>.txt</w:t>
+      </w:r>
+      <w:r>
+        <w:rPr>
+          <w:rFonts w:hint="cs"/>
+          <w:sz w:val="28"/>
+          <w:szCs w:val="28"/>
+          <w:rtl/>
+        </w:rPr>
+        <w:t xml:space="preserve"> , יוצרים אותו ב</w:t>
+      </w:r>
+      <w:r>
+        <w:rPr>
+          <w:sz w:val="28"/>
+          <w:szCs w:val="28"/>
+        </w:rPr>
+        <w:t>notepad</w:t>
+      </w:r>
+      <w:r>
+        <w:rPr>
+          <w:rFonts w:hint="cs"/>
+          <w:sz w:val="28"/>
+          <w:szCs w:val="28"/>
+          <w:rtl/>
+        </w:rPr>
+        <w:t>, זה מכל להוריד את כל הספריות שהקוד צריך ואם אתה אי-פעם תרצה להריץ את הקוד בסביבה חדשה, זה יקל על אופן הורדת הספריות הנדרשות.</w:t>
+      </w:r>
+    </w:p>
+    <w:p>
+      <w:pPr>
+        <w:pStyle w:val="a9"/>
+        <w:numPr>
+          <w:ilvl w:val="0"/>
+          <w:numId w:val="25"/>
+        </w:numPr>
+        <w:rPr>
+          <w:rFonts w:hint="cs"/>
+          <w:sz w:val="28"/>
+          <w:szCs w:val="28"/>
+        </w:rPr>
+      </w:pPr>
+      <w:r>
+        <w:rPr>
+          <w:sz w:val="28"/>
+          <w:szCs w:val="28"/>
+        </w:rPr>
+        <w:t>Copilot</w:t>
+      </w:r>
+      <w:r>
+        <w:rPr>
+          <w:rFonts w:hint="cs"/>
+          <w:sz w:val="28"/>
+          <w:szCs w:val="28"/>
+          <w:rtl/>
+        </w:rPr>
+        <w:t xml:space="preserve"> הכי חלש בקוד בפער, תשתמש בו רק בדברים מאוד קלים.</w:t>
+      </w:r>
     </w:p>
     <w:p>
       <w:pPr>
@@ -16999,7 +16433,6 @@
   <w:style w:type="character" w:default="1" w:styleId="a0">
     <w:name w:val="Default Paragraph Font"/>
     <w:uiPriority w:val="1"/>
-    <w:semiHidden/>
     <w:unhideWhenUsed/>
   </w:style>
   <w:style w:type="table" w:default="1" w:styleId="a1">

</xml_diff>

<commit_message>
Updated the trading logic and fixed paths
</commit_message>
<xml_diff>
--- a/stock algo trading project.docx
+++ b/stock algo trading project.docx
@@ -4401,7 +4401,23 @@
                 <w:noProof/>
                 <w:rtl/>
               </w:rPr>
-              <w:t>מטלות להמשך</w:t>
+              <w:t>מטלות לה</w:t>
+            </w:r>
+            <w:r>
+              <w:rPr>
+                <w:rStyle w:val="Hyperlink"/>
+                <w:noProof/>
+                <w:rtl/>
+              </w:rPr>
+              <w:t>מ</w:t>
+            </w:r>
+            <w:r>
+              <w:rPr>
+                <w:rStyle w:val="Hyperlink"/>
+                <w:noProof/>
+                <w:rtl/>
+              </w:rPr>
+              <w:t>שך</w:t>
             </w:r>
             <w:r>
               <w:rPr>
@@ -4478,7 +4494,7 @@
                 <w:webHidden/>
                 <w:rtl/>
               </w:rPr>
-              <w:t>15</w:t>
+              <w:t>18</w:t>
             </w:r>
             <w:r>
               <w:rPr>
@@ -4753,7 +4769,23 @@
           <w:szCs w:val="28"/>
         </w:rPr>
         <w:br/>
-        <w:t>The project will focus on one industry rather than one stock or the whole market. This gives more training examples than a single stock, while still keeping the stocks somewhat comparable in behavior, news flow, and market structure. A practical first version is to choose one liquid U.S. industry and train one model across all stocks in that industry.</w:t>
+        <w:t xml:space="preserve">The project will focus on one industry rather than one stock or the whole market. This gives more training examples than a single stock, while </w:t>
+      </w:r>
+      <w:proofErr w:type="gramStart"/>
+      <w:r>
+        <w:rPr>
+          <w:sz w:val="28"/>
+          <w:szCs w:val="28"/>
+        </w:rPr>
+        <w:t>still keeping</w:t>
+      </w:r>
+      <w:proofErr w:type="gramEnd"/>
+      <w:r>
+        <w:rPr>
+          <w:sz w:val="28"/>
+          <w:szCs w:val="28"/>
+        </w:rPr>
+        <w:t xml:space="preserve"> the stocks somewhat comparable in behavior, news flow, and market structure. A practical first version is to choose one liquid U.S. industry and train one model across all stocks in that industry.</w:t>
       </w:r>
     </w:p>
     <w:p>
@@ -4825,7 +4857,23 @@
           <w:sz w:val="28"/>
           <w:szCs w:val="28"/>
         </w:rPr>
-        <w:t xml:space="preserve">SEC EDGAR / data.sec.gov for filings and fundamentals. The SEC provides public APIs and XBRL company facts data through data.sec.gov and related developer resources. </w:t>
+        <w:t xml:space="preserve">SEC EDGAR / data.sec.gov for filings and fundamentals. The SEC provides public APIs and XBRL </w:t>
+      </w:r>
+      <w:proofErr w:type="gramStart"/>
+      <w:r>
+        <w:rPr>
+          <w:sz w:val="28"/>
+          <w:szCs w:val="28"/>
+        </w:rPr>
+        <w:t>company facts</w:t>
+      </w:r>
+      <w:proofErr w:type="gramEnd"/>
+      <w:r>
+        <w:rPr>
+          <w:sz w:val="28"/>
+          <w:szCs w:val="28"/>
+        </w:rPr>
+        <w:t xml:space="preserve"> data through data.sec.gov and related developer resources. </w:t>
       </w:r>
     </w:p>
     <w:p>
@@ -4938,7 +4986,23 @@
           <w:szCs w:val="28"/>
         </w:rPr>
         <w:br/>
-        <w:t>For predicting next-day return directly.</w:t>
+        <w:t xml:space="preserve">For predicting </w:t>
+      </w:r>
+      <w:proofErr w:type="gramStart"/>
+      <w:r>
+        <w:rPr>
+          <w:sz w:val="28"/>
+          <w:szCs w:val="28"/>
+        </w:rPr>
+        <w:t>next-day</w:t>
+      </w:r>
+      <w:proofErr w:type="gramEnd"/>
+      <w:r>
+        <w:rPr>
+          <w:sz w:val="28"/>
+          <w:szCs w:val="28"/>
+        </w:rPr>
+        <w:t xml:space="preserve"> return directly.</w:t>
       </w:r>
     </w:p>
     <w:p>
@@ -4986,8 +5050,33 @@
           <w:sz w:val="28"/>
           <w:szCs w:val="28"/>
         </w:rPr>
-        <w:t>Tree-based model such as XGBoost or LightGBM</w:t>
-      </w:r>
+        <w:t xml:space="preserve">Tree-based model such as </w:t>
+      </w:r>
+      <w:proofErr w:type="spellStart"/>
+      <w:r>
+        <w:rPr>
+          <w:sz w:val="28"/>
+          <w:szCs w:val="28"/>
+        </w:rPr>
+        <w:t>XGBoost</w:t>
+      </w:r>
+      <w:proofErr w:type="spellEnd"/>
+      <w:r>
+        <w:rPr>
+          <w:sz w:val="28"/>
+          <w:szCs w:val="28"/>
+        </w:rPr>
+        <w:t xml:space="preserve"> or </w:t>
+      </w:r>
+      <w:proofErr w:type="spellStart"/>
+      <w:r>
+        <w:rPr>
+          <w:sz w:val="28"/>
+          <w:szCs w:val="28"/>
+        </w:rPr>
+        <w:t>LightGBM</w:t>
+      </w:r>
+      <w:proofErr w:type="spellEnd"/>
       <w:r>
         <w:rPr>
           <w:sz w:val="28"/>
@@ -5345,7 +5434,29 @@
           <w:szCs w:val="28"/>
           <w:rtl/>
         </w:rPr>
-        <w:t xml:space="preserve"> כדי לצמצם את המימדים.</w:t>
+        <w:t xml:space="preserve"> כדי לצמצם את </w:t>
+      </w:r>
+      <w:proofErr w:type="spellStart"/>
+      <w:r>
+        <w:rPr>
+          <w:rFonts w:hint="cs"/>
+          <w:color w:val="EE0000"/>
+          <w:sz w:val="28"/>
+          <w:szCs w:val="28"/>
+          <w:rtl/>
+        </w:rPr>
+        <w:t>המימדים</w:t>
+      </w:r>
+      <w:proofErr w:type="spellEnd"/>
+      <w:r>
+        <w:rPr>
+          <w:rFonts w:hint="cs"/>
+          <w:color w:val="EE0000"/>
+          <w:sz w:val="28"/>
+          <w:szCs w:val="28"/>
+          <w:rtl/>
+        </w:rPr>
+        <w:t>.</w:t>
       </w:r>
     </w:p>
     <w:p>
@@ -5481,7 +5592,23 @@
           <w:szCs w:val="28"/>
         </w:rPr>
         <w:br/>
-        <w:t>The balance between model quality and running cost is still open. The working principle should be: use the simplest model that beats the benchmark after trading costs.</w:t>
+        <w:t xml:space="preserve">The balance between model quality and running cost is still open. The working principle should </w:t>
+      </w:r>
+      <w:proofErr w:type="gramStart"/>
+      <w:r>
+        <w:rPr>
+          <w:sz w:val="28"/>
+          <w:szCs w:val="28"/>
+        </w:rPr>
+        <w:t>be:</w:t>
+      </w:r>
+      <w:proofErr w:type="gramEnd"/>
+      <w:r>
+        <w:rPr>
+          <w:sz w:val="28"/>
+          <w:szCs w:val="28"/>
+        </w:rPr>
+        <w:t xml:space="preserve"> use the simplest model that beats the benchmark after trading costs.</w:t>
       </w:r>
     </w:p>
     <w:p>
@@ -5603,7 +5730,55 @@
           <w:szCs w:val="28"/>
         </w:rPr>
         <w:br/>
-        <w:t>A. Locally for now, and Google Colab for heavier experiments.</w:t>
+        <w:t xml:space="preserve">A. Locally for </w:t>
+      </w:r>
+      <w:proofErr w:type="gramStart"/>
+      <w:r>
+        <w:rPr>
+          <w:sz w:val="28"/>
+          <w:szCs w:val="28"/>
+        </w:rPr>
+        <w:t>now, and</w:t>
+      </w:r>
+      <w:proofErr w:type="gramEnd"/>
+      <w:r>
+        <w:rPr>
+          <w:sz w:val="28"/>
+          <w:szCs w:val="28"/>
+        </w:rPr>
+        <w:t xml:space="preserve"> Google </w:t>
+      </w:r>
+      <w:proofErr w:type="spellStart"/>
+      <w:r>
+        <w:rPr>
+          <w:sz w:val="28"/>
+          <w:szCs w:val="28"/>
+        </w:rPr>
+        <w:t>Colab</w:t>
+      </w:r>
+      <w:proofErr w:type="spellEnd"/>
+      <w:r>
+        <w:rPr>
+          <w:sz w:val="28"/>
+          <w:szCs w:val="28"/>
+        </w:rPr>
+        <w:t xml:space="preserve"> </w:t>
+      </w:r>
+      <w:proofErr w:type="gramStart"/>
+      <w:r>
+        <w:rPr>
+          <w:sz w:val="28"/>
+          <w:szCs w:val="28"/>
+        </w:rPr>
+        <w:t>for</w:t>
+      </w:r>
+      <w:proofErr w:type="gramEnd"/>
+      <w:r>
+        <w:rPr>
+          <w:sz w:val="28"/>
+          <w:szCs w:val="28"/>
+        </w:rPr>
+        <w:t xml:space="preserve"> heavier experiments.</w:t>
       </w:r>
       <w:r>
         <w:rPr>
@@ -5611,7 +5786,23 @@
           <w:szCs w:val="28"/>
         </w:rPr>
         <w:br/>
-        <w:t xml:space="preserve">Google Colab is officially free to use and provides access to computing resources including GPUs and TPUs, though availability and limits vary. </w:t>
+        <w:t xml:space="preserve">Google </w:t>
+      </w:r>
+      <w:proofErr w:type="spellStart"/>
+      <w:r>
+        <w:rPr>
+          <w:sz w:val="28"/>
+          <w:szCs w:val="28"/>
+        </w:rPr>
+        <w:t>Colab</w:t>
+      </w:r>
+      <w:proofErr w:type="spellEnd"/>
+      <w:r>
+        <w:rPr>
+          <w:sz w:val="28"/>
+          <w:szCs w:val="28"/>
+        </w:rPr>
+        <w:t xml:space="preserve"> is officially free to use and provides access to computing resources including GPUs and TPUs, though availability and limits vary. </w:t>
       </w:r>
     </w:p>
     <w:p>
@@ -5667,7 +5858,23 @@
           <w:sz w:val="28"/>
           <w:szCs w:val="28"/>
         </w:rPr>
-        <w:t>Google Colab for training larger models or running longer experiments</w:t>
+        <w:t xml:space="preserve">Google </w:t>
+      </w:r>
+      <w:proofErr w:type="spellStart"/>
+      <w:r>
+        <w:rPr>
+          <w:sz w:val="28"/>
+          <w:szCs w:val="28"/>
+        </w:rPr>
+        <w:t>Colab</w:t>
+      </w:r>
+      <w:proofErr w:type="spellEnd"/>
+      <w:r>
+        <w:rPr>
+          <w:sz w:val="28"/>
+          <w:szCs w:val="28"/>
+        </w:rPr>
+        <w:t xml:space="preserve"> for training larger models or running longer experiments</w:t>
       </w:r>
     </w:p>
     <w:p>
@@ -5707,7 +5914,23 @@
           <w:szCs w:val="28"/>
         </w:rPr>
         <w:br/>
-        <w:t>Python is the correct choice for this project. It is the standard language for market-data work, machine learning, backtesting, and broker API integration. It is fast enough for daily and hourly trading systems.</w:t>
+        <w:t xml:space="preserve">Python is the correct choice for this project. It is the standard language for market-data work, machine learning, </w:t>
+      </w:r>
+      <w:proofErr w:type="spellStart"/>
+      <w:r>
+        <w:rPr>
+          <w:sz w:val="28"/>
+          <w:szCs w:val="28"/>
+        </w:rPr>
+        <w:t>backtesting</w:t>
+      </w:r>
+      <w:proofErr w:type="spellEnd"/>
+      <w:r>
+        <w:rPr>
+          <w:sz w:val="28"/>
+          <w:szCs w:val="28"/>
+        </w:rPr>
+        <w:t>, and broker API integration. It is fast enough for daily and hourly trading systems.</w:t>
       </w:r>
     </w:p>
     <w:p>
@@ -5765,12 +5988,21 @@
           <w:szCs w:val="28"/>
         </w:rPr>
       </w:pPr>
-      <w:r>
-        <w:rPr>
-          <w:sz w:val="28"/>
-          <w:szCs w:val="28"/>
-        </w:rPr>
-        <w:t>So the working conclusion is:</w:t>
+      <w:proofErr w:type="gramStart"/>
+      <w:r>
+        <w:rPr>
+          <w:sz w:val="28"/>
+          <w:szCs w:val="28"/>
+        </w:rPr>
+        <w:t>So</w:t>
+      </w:r>
+      <w:proofErr w:type="gramEnd"/>
+      <w:r>
+        <w:rPr>
+          <w:sz w:val="28"/>
+          <w:szCs w:val="28"/>
+        </w:rPr>
+        <w:t xml:space="preserve"> the working conclusion is:</w:t>
       </w:r>
       <w:r>
         <w:rPr>
@@ -5826,7 +6058,23 @@
           <w:szCs w:val="28"/>
         </w:rPr>
         <w:br/>
-        <w:t xml:space="preserve">IBKR’s Web API supports trading functionality, market data, and event-driven communication, including WebSocket-based workflows. IBKR also states that its Web API currently enforces a global request rate limit of 10 requests per second per authenticated session, and returns HTTP 429 if the limit is exceeded. </w:t>
+        <w:t xml:space="preserve">IBKR’s Web API supports trading functionality, market data, and event-driven communication, including WebSocket-based workflows. IBKR also states that its Web API currently enforces a global request rate limit of 10 requests per second per authenticated </w:t>
+      </w:r>
+      <w:proofErr w:type="gramStart"/>
+      <w:r>
+        <w:rPr>
+          <w:sz w:val="28"/>
+          <w:szCs w:val="28"/>
+        </w:rPr>
+        <w:t>session, and</w:t>
+      </w:r>
+      <w:proofErr w:type="gramEnd"/>
+      <w:r>
+        <w:rPr>
+          <w:sz w:val="28"/>
+          <w:szCs w:val="28"/>
+        </w:rPr>
+        <w:t xml:space="preserve"> returns HTTP 429 if the limit is exceeded. </w:t>
       </w:r>
     </w:p>
     <w:p>
@@ -5837,12 +6085,21 @@
           <w:szCs w:val="28"/>
         </w:rPr>
       </w:pPr>
-      <w:r>
-        <w:rPr>
-          <w:sz w:val="28"/>
-          <w:szCs w:val="28"/>
-        </w:rPr>
-        <w:t>So the plan should assume:</w:t>
+      <w:proofErr w:type="gramStart"/>
+      <w:r>
+        <w:rPr>
+          <w:sz w:val="28"/>
+          <w:szCs w:val="28"/>
+        </w:rPr>
+        <w:t>So</w:t>
+      </w:r>
+      <w:proofErr w:type="gramEnd"/>
+      <w:r>
+        <w:rPr>
+          <w:sz w:val="28"/>
+          <w:szCs w:val="28"/>
+        </w:rPr>
+        <w:t xml:space="preserve"> the plan should assume:</w:t>
       </w:r>
     </w:p>
     <w:p>
@@ -5942,7 +6199,23 @@
           <w:szCs w:val="28"/>
         </w:rPr>
         <w:br/>
-        <w:t>Weights alone are not enough. The saved training data, or at least a reproducible snapshot of it, is needed so the model can be reproduced, audited, compared, and debugged later. Without the data and preprocessing pipeline, the weights lose a lot of practical value.</w:t>
+        <w:t xml:space="preserve">Weights alone are not enough. The saved training data, or at least a reproducible snapshot of it, is needed so the model can be reproduced, audited, compared, and debugged later. Without the data and preprocessing pipeline, the </w:t>
+      </w:r>
+      <w:proofErr w:type="gramStart"/>
+      <w:r>
+        <w:rPr>
+          <w:sz w:val="28"/>
+          <w:szCs w:val="28"/>
+        </w:rPr>
+        <w:t>weights lose</w:t>
+      </w:r>
+      <w:proofErr w:type="gramEnd"/>
+      <w:r>
+        <w:rPr>
+          <w:sz w:val="28"/>
+          <w:szCs w:val="28"/>
+        </w:rPr>
+        <w:t xml:space="preserve"> a lot of practical value.</w:t>
       </w:r>
     </w:p>
     <w:p>
@@ -6161,6 +6434,7 @@
         </w:rPr>
         <w:t>תחשוב על לשמור את הנתונים ב</w:t>
       </w:r>
+      <w:proofErr w:type="spellStart"/>
       <w:r>
         <w:rPr>
           <w:sz w:val="28"/>
@@ -6168,6 +6442,7 @@
         </w:rPr>
         <w:t>parqut</w:t>
       </w:r>
+      <w:proofErr w:type="spellEnd"/>
       <w:r>
         <w:rPr>
           <w:rFonts w:hint="cs"/>
@@ -6303,7 +6578,23 @@
           <w:sz w:val="28"/>
           <w:szCs w:val="28"/>
         </w:rPr>
-        <w:t>max drawdown kill-switch</w:t>
+        <w:t xml:space="preserve">max </w:t>
+      </w:r>
+      <w:proofErr w:type="gramStart"/>
+      <w:r>
+        <w:rPr>
+          <w:sz w:val="28"/>
+          <w:szCs w:val="28"/>
+        </w:rPr>
+        <w:t>drawdown</w:t>
+      </w:r>
+      <w:proofErr w:type="gramEnd"/>
+      <w:r>
+        <w:rPr>
+          <w:sz w:val="28"/>
+          <w:szCs w:val="28"/>
+        </w:rPr>
+        <w:t xml:space="preserve"> kill-switch</w:t>
       </w:r>
     </w:p>
     <w:p>
@@ -6609,12 +6900,21 @@
           <w:szCs w:val="28"/>
         </w:rPr>
       </w:pPr>
-      <w:r>
-        <w:rPr>
-          <w:sz w:val="28"/>
-          <w:szCs w:val="28"/>
-        </w:rPr>
-        <w:t>first, the strategy should beat doing nothing</w:t>
+      <w:proofErr w:type="gramStart"/>
+      <w:r>
+        <w:rPr>
+          <w:sz w:val="28"/>
+          <w:szCs w:val="28"/>
+        </w:rPr>
+        <w:t>first</w:t>
+      </w:r>
+      <w:proofErr w:type="gramEnd"/>
+      <w:r>
+        <w:rPr>
+          <w:sz w:val="28"/>
+          <w:szCs w:val="28"/>
+        </w:rPr>
+        <w:t>, the strategy should beat doing nothing</w:t>
       </w:r>
     </w:p>
     <w:p>
@@ -6629,12 +6929,21 @@
           <w:szCs w:val="28"/>
         </w:rPr>
       </w:pPr>
-      <w:r>
-        <w:rPr>
-          <w:sz w:val="28"/>
-          <w:szCs w:val="28"/>
-        </w:rPr>
-        <w:t>then, it should beat the broad market</w:t>
+      <w:proofErr w:type="gramStart"/>
+      <w:r>
+        <w:rPr>
+          <w:sz w:val="28"/>
+          <w:szCs w:val="28"/>
+        </w:rPr>
+        <w:t>then</w:t>
+      </w:r>
+      <w:proofErr w:type="gramEnd"/>
+      <w:r>
+        <w:rPr>
+          <w:sz w:val="28"/>
+          <w:szCs w:val="28"/>
+        </w:rPr>
+        <w:t>, it should beat the broad market</w:t>
       </w:r>
     </w:p>
     <w:p>
@@ -6649,12 +6958,21 @@
           <w:szCs w:val="28"/>
         </w:rPr>
       </w:pPr>
-      <w:r>
-        <w:rPr>
-          <w:sz w:val="28"/>
-          <w:szCs w:val="28"/>
-        </w:rPr>
-        <w:t>then, it should beat the industry benchmark</w:t>
+      <w:proofErr w:type="gramStart"/>
+      <w:r>
+        <w:rPr>
+          <w:sz w:val="28"/>
+          <w:szCs w:val="28"/>
+        </w:rPr>
+        <w:t>then</w:t>
+      </w:r>
+      <w:proofErr w:type="gramEnd"/>
+      <w:r>
+        <w:rPr>
+          <w:sz w:val="28"/>
+          <w:szCs w:val="28"/>
+        </w:rPr>
+        <w:t>, it should beat the industry benchmark</w:t>
       </w:r>
     </w:p>
     <w:p>
@@ -6722,7 +7040,23 @@
           <w:sz w:val="28"/>
           <w:szCs w:val="28"/>
         </w:rPr>
-        <w:t>A. Open, but must be defined.</w:t>
+        <w:t xml:space="preserve">A. </w:t>
+      </w:r>
+      <w:proofErr w:type="gramStart"/>
+      <w:r>
+        <w:rPr>
+          <w:sz w:val="28"/>
+          <w:szCs w:val="28"/>
+        </w:rPr>
+        <w:t>Open, but</w:t>
+      </w:r>
+      <w:proofErr w:type="gramEnd"/>
+      <w:r>
+        <w:rPr>
+          <w:sz w:val="28"/>
+          <w:szCs w:val="28"/>
+        </w:rPr>
+        <w:t xml:space="preserve"> must be defined.</w:t>
       </w:r>
       <w:r>
         <w:rPr>
@@ -6877,7 +7211,23 @@
           <w:sz w:val="28"/>
           <w:szCs w:val="28"/>
         </w:rPr>
-        <w:t>A. Open, but must be defined.</w:t>
+        <w:t xml:space="preserve">A. </w:t>
+      </w:r>
+      <w:proofErr w:type="gramStart"/>
+      <w:r>
+        <w:rPr>
+          <w:sz w:val="28"/>
+          <w:szCs w:val="28"/>
+        </w:rPr>
+        <w:t>Open, but</w:t>
+      </w:r>
+      <w:proofErr w:type="gramEnd"/>
+      <w:r>
+        <w:rPr>
+          <w:sz w:val="28"/>
+          <w:szCs w:val="28"/>
+        </w:rPr>
+        <w:t xml:space="preserve"> must be defined.</w:t>
       </w:r>
       <w:r>
         <w:rPr>
@@ -7154,7 +7504,21 @@
         <w:rPr>
           <w:rStyle w:val="30"/>
         </w:rPr>
-        <w:t>Q7. How often will the model retrain?</w:t>
+        <w:t xml:space="preserve">Q7. How often will the model </w:t>
+      </w:r>
+      <w:proofErr w:type="gramStart"/>
+      <w:r>
+        <w:rPr>
+          <w:rStyle w:val="30"/>
+        </w:rPr>
+        <w:t>retrain</w:t>
+      </w:r>
+      <w:proofErr w:type="gramEnd"/>
+      <w:r>
+        <w:rPr>
+          <w:rStyle w:val="30"/>
+        </w:rPr>
+        <w:t>?</w:t>
       </w:r>
       <w:bookmarkEnd w:id="23"/>
       <w:r>
@@ -7272,7 +7636,21 @@
         <w:rPr>
           <w:rStyle w:val="30"/>
         </w:rPr>
-        <w:t>Q8. How many trades / what portfolio structure?</w:t>
+        <w:t xml:space="preserve">Q8. How many trades / what portfolio </w:t>
+      </w:r>
+      <w:proofErr w:type="gramStart"/>
+      <w:r>
+        <w:rPr>
+          <w:rStyle w:val="30"/>
+        </w:rPr>
+        <w:t>structure</w:t>
+      </w:r>
+      <w:proofErr w:type="gramEnd"/>
+      <w:r>
+        <w:rPr>
+          <w:rStyle w:val="30"/>
+        </w:rPr>
+        <w:t>?</w:t>
       </w:r>
       <w:bookmarkEnd w:id="24"/>
       <w:r>
@@ -7650,7 +8028,23 @@
           <w:szCs w:val="28"/>
         </w:rPr>
         <w:br/>
-        <w:t>There should be a minimum expected value threshold x. If the expected next-day return is below x, the system does not trade.</w:t>
+        <w:t xml:space="preserve">There should be a minimum expected value threshold x. If the </w:t>
+      </w:r>
+      <w:proofErr w:type="gramStart"/>
+      <w:r>
+        <w:rPr>
+          <w:sz w:val="28"/>
+          <w:szCs w:val="28"/>
+        </w:rPr>
+        <w:t>expected next-day</w:t>
+      </w:r>
+      <w:proofErr w:type="gramEnd"/>
+      <w:r>
+        <w:rPr>
+          <w:sz w:val="28"/>
+          <w:szCs w:val="28"/>
+        </w:rPr>
+        <w:t xml:space="preserve"> return is below x, the system does not trade.</w:t>
       </w:r>
     </w:p>
     <w:p>
@@ -7683,7 +8077,39 @@
           <w:szCs w:val="28"/>
         </w:rPr>
         <w:lastRenderedPageBreak/>
-        <w:t>The current project design is: train a Python-based model on one liquid industry, using mainly free historical price and fundamentals data, starting with daily data and possibly extending to hourly data later. The target is expected one-day-ahead return, the strategy is long-only, and “no trade” is valid unless expected value passes a minimum threshold. Model development should move from simple baselines to more complex neural architectures only if out-of-sample results improve. Validation should use repeated walk-forward time splits and compare results against three benchmark levels: above 0, above the S&amp;P 500, and above the industry benchmark. Local development plus Google Colab is enough for the first phase, and IBKR paper trading can later be used for execution testing, while keeping in mind market-data subscriptions, API pacing, and risk controls.</w:t>
+        <w:t xml:space="preserve">The current project design </w:t>
+      </w:r>
+      <w:proofErr w:type="gramStart"/>
+      <w:r>
+        <w:rPr>
+          <w:sz w:val="28"/>
+          <w:szCs w:val="28"/>
+        </w:rPr>
+        <w:t>is:</w:t>
+      </w:r>
+      <w:proofErr w:type="gramEnd"/>
+      <w:r>
+        <w:rPr>
+          <w:sz w:val="28"/>
+          <w:szCs w:val="28"/>
+        </w:rPr>
+        <w:t xml:space="preserve"> train a Python-based model on one liquid industry, using mainly free historical price and fundamentals data, starting with daily data and possibly extending to hourly data later. The target is expected one-day-ahead return, the strategy is long-only, and “no trade” is valid unless expected value passes a minimum threshold. Model development should move from simple baselines to more complex neural architectures only if out-of-sample results improve. Validation should use repeated walk-forward time splits and compare results against three benchmark levels: above 0, above the S&amp;P 500, and above the industry benchmark. Local development plus Google </w:t>
+      </w:r>
+      <w:proofErr w:type="spellStart"/>
+      <w:r>
+        <w:rPr>
+          <w:sz w:val="28"/>
+          <w:szCs w:val="28"/>
+        </w:rPr>
+        <w:t>Colab</w:t>
+      </w:r>
+      <w:proofErr w:type="spellEnd"/>
+      <w:r>
+        <w:rPr>
+          <w:sz w:val="28"/>
+          <w:szCs w:val="28"/>
+        </w:rPr>
+        <w:t xml:space="preserve"> is enough for the first phase, and IBKR paper trading can later be used for execution testing, while keeping in mind market-data subscriptions, API pacing, and risk controls.</w:t>
       </w:r>
     </w:p>
     <w:p>
@@ -7699,7 +8125,23 @@
           <w:sz w:val="28"/>
           <w:szCs w:val="28"/>
         </w:rPr>
-        <w:t>What does it do in a line. It turns your rough idea into a structured first project spec with the main choices fixed and the remaining open decisions clearly marked.</w:t>
+        <w:t xml:space="preserve">What does it do in </w:t>
+      </w:r>
+      <w:proofErr w:type="gramStart"/>
+      <w:r>
+        <w:rPr>
+          <w:sz w:val="28"/>
+          <w:szCs w:val="28"/>
+        </w:rPr>
+        <w:t>a line.</w:t>
+      </w:r>
+      <w:proofErr w:type="gramEnd"/>
+      <w:r>
+        <w:rPr>
+          <w:sz w:val="28"/>
+          <w:szCs w:val="28"/>
+        </w:rPr>
+        <w:t xml:space="preserve"> It turns your rough idea into a structured first project spec with the main choices fixed and the remaining open decisions clearly marked.</w:t>
       </w:r>
     </w:p>
     <w:p>
@@ -8831,6 +9273,7 @@
         </w:rPr>
         <w:t>לעשות קוד שבודק מה ההיפר פרמטרים הכי טובים למודל ה</w:t>
       </w:r>
+      <w:proofErr w:type="spellStart"/>
       <w:r>
         <w:rPr>
           <w:sz w:val="28"/>
@@ -8838,6 +9281,7 @@
         </w:rPr>
         <w:t>XGBoost</w:t>
       </w:r>
+      <w:proofErr w:type="spellEnd"/>
       <w:r>
         <w:rPr>
           <w:rFonts w:hint="cs"/>
@@ -9355,8 +9799,16 @@
           <w:u w:val="single"/>
         </w:rPr>
         <w:lastRenderedPageBreak/>
-        <w:t>Linear regression vs XGBoost</w:t>
-      </w:r>
+        <w:t xml:space="preserve">Linear regression vs </w:t>
+      </w:r>
+      <w:proofErr w:type="spellStart"/>
+      <w:r>
+        <w:rPr>
+          <w:u w:val="single"/>
+        </w:rPr>
+        <w:t>XGBoost</w:t>
+      </w:r>
+      <w:proofErr w:type="spellEnd"/>
     </w:p>
     <w:p>
       <w:pPr>
@@ -9375,6 +9827,7 @@
         </w:rPr>
         <w:t>יוצא כי ה</w:t>
       </w:r>
+      <w:proofErr w:type="spellStart"/>
       <w:r>
         <w:rPr>
           <w:sz w:val="28"/>
@@ -9382,6 +9835,7 @@
         </w:rPr>
         <w:t>XGBoost</w:t>
       </w:r>
+      <w:proofErr w:type="spellEnd"/>
       <w:r>
         <w:rPr>
           <w:rFonts w:hint="cs"/>
@@ -9425,6 +9879,7 @@
         </w:rPr>
         <w:t>בעצם, ה</w:t>
       </w:r>
+      <w:proofErr w:type="spellStart"/>
       <w:r>
         <w:rPr>
           <w:sz w:val="28"/>
@@ -9432,6 +9887,7 @@
         </w:rPr>
         <w:t>lr</w:t>
       </w:r>
+      <w:proofErr w:type="spellEnd"/>
       <w:r>
         <w:rPr>
           <w:rFonts w:hint="cs"/>
@@ -9491,6 +9947,7 @@
         </w:rPr>
         <w:t>זה בגלל ש</w:t>
       </w:r>
+      <w:proofErr w:type="spellStart"/>
       <w:r>
         <w:rPr>
           <w:sz w:val="28"/>
@@ -9498,6 +9955,7 @@
         </w:rPr>
         <w:t>lr</w:t>
       </w:r>
+      <w:proofErr w:type="spellEnd"/>
       <w:r>
         <w:rPr>
           <w:rFonts w:hint="cs"/>
@@ -9881,14 +10339,43 @@
           <w:szCs w:val="28"/>
           <w:rtl/>
         </w:rPr>
-        <w:t>זה לא באמת הוגן לאמוד את איכות המודל שלך לפי התוצאות על ה</w:t>
-      </w:r>
-      <w:r>
-        <w:rPr>
-          <w:sz w:val="28"/>
-          <w:szCs w:val="28"/>
-        </w:rPr>
-        <w:t>val set</w:t>
+        <w:t xml:space="preserve">זה לא באמת הוגן </w:t>
+      </w:r>
+      <w:proofErr w:type="spellStart"/>
+      <w:r>
+        <w:rPr>
+          <w:rFonts w:hint="cs"/>
+          <w:sz w:val="28"/>
+          <w:szCs w:val="28"/>
+          <w:rtl/>
+        </w:rPr>
+        <w:t>לאמוד</w:t>
+      </w:r>
+      <w:proofErr w:type="spellEnd"/>
+      <w:r>
+        <w:rPr>
+          <w:rFonts w:hint="cs"/>
+          <w:sz w:val="28"/>
+          <w:szCs w:val="28"/>
+          <w:rtl/>
+        </w:rPr>
+        <w:t xml:space="preserve"> את איכות המודל שלך לפי התוצאות על ה</w:t>
+      </w:r>
+      <w:proofErr w:type="spellStart"/>
+      <w:r>
+        <w:rPr>
+          <w:sz w:val="28"/>
+          <w:szCs w:val="28"/>
+        </w:rPr>
+        <w:t>val</w:t>
+      </w:r>
+      <w:proofErr w:type="spellEnd"/>
+      <w:r>
+        <w:rPr>
+          <w:sz w:val="28"/>
+          <w:szCs w:val="28"/>
+        </w:rPr>
+        <w:t xml:space="preserve"> set</w:t>
       </w:r>
       <w:r>
         <w:rPr>
@@ -10477,12 +10964,21 @@
         </w:rPr>
         <w:t xml:space="preserve">לנסות לעשות אינטגרציה ע"י </w:t>
       </w:r>
-      <w:r>
-        <w:rPr>
-          <w:sz w:val="28"/>
-          <w:szCs w:val="28"/>
-        </w:rPr>
-        <w:t>multy arm bandits</w:t>
+      <w:proofErr w:type="spellStart"/>
+      <w:r>
+        <w:rPr>
+          <w:sz w:val="28"/>
+          <w:szCs w:val="28"/>
+        </w:rPr>
+        <w:t>multy</w:t>
+      </w:r>
+      <w:proofErr w:type="spellEnd"/>
+      <w:r>
+        <w:rPr>
+          <w:sz w:val="28"/>
+          <w:szCs w:val="28"/>
+        </w:rPr>
+        <w:t xml:space="preserve"> arm bandits</w:t>
       </w:r>
       <w:r>
         <w:rPr>
@@ -10599,7 +11095,23 @@
           <w:sz w:val="28"/>
           <w:szCs w:val="28"/>
         </w:rPr>
-        <w:t xml:space="preserve"> s&amp;p 500</w:t>
+        <w:t xml:space="preserve"> </w:t>
+      </w:r>
+      <w:proofErr w:type="spellStart"/>
+      <w:r>
+        <w:rPr>
+          <w:sz w:val="28"/>
+          <w:szCs w:val="28"/>
+        </w:rPr>
+        <w:t>s&amp;p</w:t>
+      </w:r>
+      <w:proofErr w:type="spellEnd"/>
+      <w:r>
+        <w:rPr>
+          <w:sz w:val="28"/>
+          <w:szCs w:val="28"/>
+        </w:rPr>
+        <w:t xml:space="preserve"> 500</w:t>
       </w:r>
       <w:r>
         <w:rPr>
@@ -10876,7 +11388,15 @@
         <w:t>The Strategy Pattern:</w:t>
       </w:r>
       <w:r>
-        <w:t xml:space="preserve"> Using an if/elif flag system is a bit "monolithic." In high-level software engineering, you would use a </w:t>
+        <w:t xml:space="preserve"> Using an if/</w:t>
+      </w:r>
+      <w:proofErr w:type="spellStart"/>
+      <w:r>
+        <w:t>elif</w:t>
+      </w:r>
+      <w:proofErr w:type="spellEnd"/>
+      <w:r>
+        <w:t xml:space="preserve"> flag system is a bit "monolithic." In high-level software engineering, you would use a </w:t>
       </w:r>
       <w:r>
         <w:rPr>
@@ -10905,7 +11425,23 @@
         <w:t>Parameter Injection:</w:t>
       </w:r>
       <w:r>
-        <w:t xml:space="preserve"> Things like n_estimators=300 or learning_rate=0.05 are currently "hard-coded." A more advanced approach would be to pass a dictionary of hyperparameters into the function so you can experiment without editing the core logic.</w:t>
+        <w:t xml:space="preserve"> Things like </w:t>
+      </w:r>
+      <w:proofErr w:type="spellStart"/>
+      <w:r>
+        <w:t>n_estimators</w:t>
+      </w:r>
+      <w:proofErr w:type="spellEnd"/>
+      <w:r>
+        <w:t xml:space="preserve">=300 or </w:t>
+      </w:r>
+      <w:proofErr w:type="spellStart"/>
+      <w:r>
+        <w:t>learning_rate</w:t>
+      </w:r>
+      <w:proofErr w:type="spellEnd"/>
+      <w:r>
+        <w:t>=0.05 are currently "hard-coded." A more advanced approach would be to pass a dictionary of hyperparameters into the function so you can experiment without editing the core logic.</w:t>
       </w:r>
     </w:p>
     <w:p>
@@ -10924,7 +11460,31 @@
         <w:t>Fit/Predict Coupling:</w:t>
       </w:r>
       <w:r>
-        <w:t xml:space="preserve"> As we discussed, a professional production pipeline usually keeps the "Trainer" and the "Predictor" completely separate to save on compute costs.</w:t>
+        <w:t xml:space="preserve"> As we discussed, a professional production pipeline usually keeps the "Trainer</w:t>
+      </w:r>
+      <w:proofErr w:type="gramStart"/>
+      <w:r>
+        <w:t>"</w:t>
+      </w:r>
+      <w:proofErr w:type="gramEnd"/>
+      <w:r>
+        <w:t xml:space="preserve"> and the "Predictor" </w:t>
+      </w:r>
+      <w:proofErr w:type="gramStart"/>
+      <w:r>
+        <w:t>completely separate</w:t>
+      </w:r>
+      <w:proofErr w:type="gramEnd"/>
+      <w:r>
+        <w:t xml:space="preserve"> to save on </w:t>
+      </w:r>
+      <w:proofErr w:type="gramStart"/>
+      <w:r>
+        <w:t>compute</w:t>
+      </w:r>
+      <w:proofErr w:type="gramEnd"/>
+      <w:r>
+        <w:t xml:space="preserve"> costs.</w:t>
       </w:r>
     </w:p>
     <w:p>
@@ -11077,7 +11637,33 @@
           <w:szCs w:val="28"/>
           <w:rtl/>
         </w:rPr>
-        <w:t>והיא לא מודילורית.</w:t>
+        <w:t xml:space="preserve">והיא לא </w:t>
+      </w:r>
+      <w:proofErr w:type="spellStart"/>
+      <w:r>
+        <w:rPr>
+          <w:rFonts w:hint="cs"/>
+          <w:b/>
+          <w:bCs/>
+          <w:color w:val="EE0000"/>
+          <w:sz w:val="28"/>
+          <w:szCs w:val="28"/>
+          <w:rtl/>
+        </w:rPr>
+        <w:t>מודילורית</w:t>
+      </w:r>
+      <w:proofErr w:type="spellEnd"/>
+      <w:r>
+        <w:rPr>
+          <w:rFonts w:hint="cs"/>
+          <w:b/>
+          <w:bCs/>
+          <w:color w:val="EE0000"/>
+          <w:sz w:val="28"/>
+          <w:szCs w:val="28"/>
+          <w:rtl/>
+        </w:rPr>
+        <w:t>.</w:t>
       </w:r>
     </w:p>
     <w:p>
@@ -11540,7 +12126,6 @@
       <w:pPr>
         <w:pStyle w:val="a9"/>
         <w:rPr>
-          <w:rFonts w:hint="cs"/>
           <w:sz w:val="28"/>
           <w:szCs w:val="28"/>
           <w:rtl/>
@@ -11594,7 +12179,27 @@
           <w:szCs w:val="28"/>
           <w:rtl/>
         </w:rPr>
-        <w:t>אני כתבתי הכל לוקאלי, זאת הייתה טעות.</w:t>
+        <w:t xml:space="preserve">אני כתבתי </w:t>
+      </w:r>
+      <w:proofErr w:type="spellStart"/>
+      <w:r>
+        <w:rPr>
+          <w:rFonts w:hint="cs"/>
+          <w:sz w:val="28"/>
+          <w:szCs w:val="28"/>
+          <w:rtl/>
+        </w:rPr>
+        <w:t>הכל</w:t>
+      </w:r>
+      <w:proofErr w:type="spellEnd"/>
+      <w:r>
+        <w:rPr>
+          <w:rFonts w:hint="cs"/>
+          <w:sz w:val="28"/>
+          <w:szCs w:val="28"/>
+          <w:rtl/>
+        </w:rPr>
+        <w:t xml:space="preserve"> לוקאלי, זאת הייתה טעות.</w:t>
       </w:r>
     </w:p>
     <w:p>
@@ -11636,8 +12241,17 @@
           <w:sz w:val="28"/>
           <w:szCs w:val="28"/>
         </w:rPr>
-        <w:t>google colab</w:t>
-      </w:r>
+        <w:t xml:space="preserve">google </w:t>
+      </w:r>
+      <w:proofErr w:type="spellStart"/>
+      <w:r>
+        <w:rPr>
+          <w:sz w:val="28"/>
+          <w:szCs w:val="28"/>
+        </w:rPr>
+        <w:t>colab</w:t>
+      </w:r>
+      <w:proofErr w:type="spellEnd"/>
       <w:r>
         <w:rPr>
           <w:rFonts w:hint="cs"/>
@@ -11836,7 +12450,6 @@
           <w:numId w:val="25"/>
         </w:numPr>
         <w:rPr>
-          <w:rFonts w:hint="cs"/>
           <w:sz w:val="28"/>
           <w:szCs w:val="28"/>
           <w:rtl/>
@@ -11927,6 +12540,7 @@
         </w:rPr>
         <w:t xml:space="preserve">בהתאם לכך תבין אם אתה רוצה </w:t>
       </w:r>
+      <w:proofErr w:type="spellStart"/>
       <w:r>
         <w:rPr>
           <w:sz w:val="28"/>
@@ -11934,6 +12548,7 @@
         </w:rPr>
         <w:t>db</w:t>
       </w:r>
+      <w:proofErr w:type="spellEnd"/>
       <w:r>
         <w:rPr>
           <w:rFonts w:hint="cs"/>
@@ -11948,8 +12563,33 @@
           <w:sz w:val="28"/>
           <w:szCs w:val="28"/>
         </w:rPr>
-        <w:t>csv/json/parqet</w:t>
-      </w:r>
+        <w:t>csv/</w:t>
+      </w:r>
+      <w:proofErr w:type="spellStart"/>
+      <w:r>
+        <w:rPr>
+          <w:sz w:val="28"/>
+          <w:szCs w:val="28"/>
+        </w:rPr>
+        <w:t>json</w:t>
+      </w:r>
+      <w:proofErr w:type="spellEnd"/>
+      <w:r>
+        <w:rPr>
+          <w:sz w:val="28"/>
+          <w:szCs w:val="28"/>
+        </w:rPr>
+        <w:t>/</w:t>
+      </w:r>
+      <w:proofErr w:type="spellStart"/>
+      <w:r>
+        <w:rPr>
+          <w:sz w:val="28"/>
+          <w:szCs w:val="28"/>
+        </w:rPr>
+        <w:t>parqet</w:t>
+      </w:r>
+      <w:proofErr w:type="spellEnd"/>
       <w:r>
         <w:rPr>
           <w:rFonts w:hint="cs"/>
@@ -12020,7 +12660,27 @@
           <w:szCs w:val="28"/>
           <w:rtl/>
         </w:rPr>
-        <w:t>לעשות מבחני סף שלפיהם אפשר לאמוד את המודל, כמו שפה עשינו:</w:t>
+        <w:t xml:space="preserve">לעשות מבחני סף שלפיהם אפשר </w:t>
+      </w:r>
+      <w:proofErr w:type="spellStart"/>
+      <w:r>
+        <w:rPr>
+          <w:rFonts w:eastAsiaTheme="minorEastAsia" w:hint="cs"/>
+          <w:sz w:val="28"/>
+          <w:szCs w:val="28"/>
+          <w:rtl/>
+        </w:rPr>
+        <w:t>לאמוד</w:t>
+      </w:r>
+      <w:proofErr w:type="spellEnd"/>
+      <w:r>
+        <w:rPr>
+          <w:rFonts w:eastAsiaTheme="minorEastAsia" w:hint="cs"/>
+          <w:sz w:val="28"/>
+          <w:szCs w:val="28"/>
+          <w:rtl/>
+        </w:rPr>
+        <w:t xml:space="preserve"> את המודל, כמו שפה עשינו:</w:t>
       </w:r>
     </w:p>
     <w:p>
@@ -12132,16 +12792,7 @@
           <w:rtl/>
         </w:rPr>
         <w:lastRenderedPageBreak/>
-        <w:t xml:space="preserve">לעשות בחותמת של הקוד את סוג המידע שהפונקציה מקבלת, </w:t>
-      </w:r>
-      <w:r>
-        <w:rPr>
-          <w:rFonts w:hint="cs"/>
-          <w:sz w:val="28"/>
-          <w:szCs w:val="28"/>
-          <w:rtl/>
-        </w:rPr>
-        <w:t>עוזר ב</w:t>
+        <w:t>לעשות בחותמת של הקוד את סוג המידע שהפונקציה מקבלת, עוזר ב</w:t>
       </w:r>
       <w:r>
         <w:rPr>
@@ -12821,7 +13472,6 @@
           <w:numId w:val="25"/>
         </w:numPr>
         <w:rPr>
-          <w:rFonts w:hint="cs"/>
           <w:sz w:val="28"/>
           <w:szCs w:val="28"/>
         </w:rPr>
@@ -12845,29 +13495,146 @@
     </w:p>
     <w:p>
       <w:pPr>
-        <w:rPr>
-          <w:rFonts w:hint="cs"/>
-          <w:sz w:val="28"/>
-          <w:szCs w:val="28"/>
-          <w:rtl/>
-        </w:rPr>
-      </w:pPr>
-    </w:p>
-    <w:p>
-      <w:pPr>
         <w:pStyle w:val="a9"/>
-        <w:rPr>
-          <w:sz w:val="28"/>
-          <w:szCs w:val="28"/>
-          <w:rtl/>
-        </w:rPr>
-      </w:pPr>
+        <w:numPr>
+          <w:ilvl w:val="0"/>
+          <w:numId w:val="25"/>
+        </w:numPr>
+        <w:rPr>
+          <w:sz w:val="28"/>
+          <w:szCs w:val="28"/>
+        </w:rPr>
+      </w:pPr>
+      <w:r>
+        <w:rPr>
+          <w:rFonts w:hint="cs"/>
+          <w:sz w:val="28"/>
+          <w:szCs w:val="28"/>
+          <w:rtl/>
+        </w:rPr>
+        <w:t xml:space="preserve">תתחיל את הפרויקט בצורה של </w:t>
+      </w:r>
+      <w:r>
+        <w:rPr>
+          <w:sz w:val="28"/>
+          <w:szCs w:val="28"/>
+        </w:rPr>
+        <w:t>if name == __main:</w:t>
+      </w:r>
     </w:p>
     <w:p>
       <w:pPr>
         <w:pStyle w:val="a9"/>
-        <w:rPr>
-          <w:rFonts w:hint="cs"/>
+        <w:numPr>
+          <w:ilvl w:val="0"/>
+          <w:numId w:val="25"/>
+        </w:numPr>
+        <w:rPr>
+          <w:sz w:val="28"/>
+          <w:szCs w:val="28"/>
+        </w:rPr>
+      </w:pPr>
+      <w:r>
+        <w:rPr>
+          <w:rFonts w:hint="cs"/>
+          <w:sz w:val="28"/>
+          <w:szCs w:val="28"/>
+          <w:rtl/>
+        </w:rPr>
+        <w:t>תעשה בצ'אט תיקייה לפרויקט שאתה יוצר.</w:t>
+      </w:r>
+    </w:p>
+    <w:p>
+      <w:pPr>
+        <w:pStyle w:val="a9"/>
+        <w:numPr>
+          <w:ilvl w:val="1"/>
+          <w:numId w:val="25"/>
+        </w:numPr>
+        <w:rPr>
+          <w:sz w:val="28"/>
+          <w:szCs w:val="28"/>
+        </w:rPr>
+      </w:pPr>
+      <w:r>
+        <w:rPr>
+          <w:rFonts w:hint="cs"/>
+          <w:sz w:val="28"/>
+          <w:szCs w:val="28"/>
+          <w:rtl/>
+        </w:rPr>
+        <w:t>תעשה שיחה לכל חלק של הפרויקט בתיקייה.</w:t>
+      </w:r>
+    </w:p>
+    <w:p>
+      <w:pPr>
+        <w:pStyle w:val="a9"/>
+        <w:numPr>
+          <w:ilvl w:val="1"/>
+          <w:numId w:val="25"/>
+        </w:numPr>
+        <w:rPr>
+          <w:sz w:val="28"/>
+          <w:szCs w:val="28"/>
+        </w:rPr>
+      </w:pPr>
+      <w:r>
+        <w:rPr>
+          <w:rFonts w:hint="cs"/>
+          <w:sz w:val="28"/>
+          <w:szCs w:val="28"/>
+          <w:rtl/>
+        </w:rPr>
+        <w:t>תעדכן כל הזמן ב</w:t>
+      </w:r>
+      <w:r>
+        <w:rPr>
+          <w:sz w:val="28"/>
+          <w:szCs w:val="28"/>
+        </w:rPr>
+        <w:t>"sources"</w:t>
+      </w:r>
+      <w:r>
+        <w:rPr>
+          <w:rFonts w:hint="cs"/>
+          <w:sz w:val="28"/>
+          <w:szCs w:val="28"/>
+          <w:rtl/>
+        </w:rPr>
+        <w:t xml:space="preserve"> את קבצי הקוד.</w:t>
+      </w:r>
+    </w:p>
+    <w:p>
+      <w:pPr>
+        <w:rPr>
+          <w:sz w:val="28"/>
+          <w:szCs w:val="28"/>
+        </w:rPr>
+      </w:pPr>
+    </w:p>
+    <w:p>
+      <w:pPr>
+        <w:rPr>
+          <w:sz w:val="28"/>
+          <w:szCs w:val="28"/>
+          <w:rtl/>
+        </w:rPr>
+      </w:pPr>
+    </w:p>
+    <w:p>
+      <w:pPr>
+        <w:pStyle w:val="a9"/>
+        <w:rPr>
+          <w:sz w:val="28"/>
+          <w:szCs w:val="28"/>
+          <w:rtl/>
+        </w:rPr>
+      </w:pPr>
+    </w:p>
+    <w:p>
+      <w:pPr>
+        <w:pStyle w:val="a9"/>
+        <w:rPr>
           <w:sz w:val="28"/>
           <w:szCs w:val="28"/>
           <w:u w:val="single"/>
@@ -16433,6 +17200,7 @@
   <w:style w:type="character" w:default="1" w:styleId="a0">
     <w:name w:val="Default Paragraph Font"/>
     <w:uiPriority w:val="1"/>
+    <w:semiHidden/>
     <w:unhideWhenUsed/>
   </w:style>
   <w:style w:type="table" w:default="1" w:styleId="a1">

</xml_diff>

<commit_message>
Add a new version of the code, it is not fully tested yet. There are more changes I need to do to the FCNN and fields of the table
</commit_message>
<xml_diff>
--- a/stock algo trading project.docx
+++ b/stock algo trading project.docx
@@ -10,7 +10,7 @@
           <w:u w:val="single"/>
         </w:rPr>
       </w:pPr>
-      <w:bookmarkStart w:id="0" w:name="_Toc226822507"/>
+      <w:bookmarkStart w:id="0" w:name="_Toc230686537"/>
       <w:r>
         <w:rPr>
           <w:u w:val="single"/>
@@ -80,7 +80,7 @@
           <w:r>
             <w:fldChar w:fldCharType="separate"/>
           </w:r>
-          <w:hyperlink w:anchor="_Toc226822507" w:history="1">
+          <w:hyperlink w:anchor="_Toc230686537" w:history="1">
             <w:r>
               <w:rPr>
                 <w:rStyle w:val="Hyperlink"/>
@@ -132,7 +132,7 @@
                 <w:noProof/>
                 <w:webHidden/>
               </w:rPr>
-              <w:instrText>Toc226822507 \h</w:instrText>
+              <w:instrText>Toc230686537 \h</w:instrText>
             </w:r>
             <w:r>
               <w:rPr>
@@ -189,32 +189,14 @@
               <w:rtl/>
             </w:rPr>
           </w:pPr>
-          <w:hyperlink w:anchor="_Toc226822508" w:history="1">
-            <w:r>
-              <w:rPr>
-                <w:rStyle w:val="Hyperlink"/>
-                <w:rFonts w:hint="eastAsia"/>
-                <w:noProof/>
-                <w:rtl/>
-              </w:rPr>
-              <w:t>תכנון</w:t>
-            </w:r>
-            <w:r>
-              <w:rPr>
-                <w:rStyle w:val="Hyperlink"/>
-                <w:noProof/>
-                <w:rtl/>
-              </w:rPr>
-              <w:t xml:space="preserve"> </w:t>
-            </w:r>
-            <w:r>
-              <w:rPr>
-                <w:rStyle w:val="Hyperlink"/>
-                <w:rFonts w:hint="eastAsia"/>
-                <w:noProof/>
-                <w:rtl/>
-              </w:rPr>
-              <w:t>הפרויקט</w:t>
+          <w:hyperlink w:anchor="_Toc230686538" w:history="1">
+            <w:r>
+              <w:rPr>
+                <w:rStyle w:val="Hyperlink"/>
+                <w:noProof/>
+                <w:rtl/>
+              </w:rPr>
+              <w:t>תכנון הפרויקט</w:t>
             </w:r>
             <w:r>
               <w:rPr>
@@ -260,7 +242,7 @@
                 <w:noProof/>
                 <w:webHidden/>
               </w:rPr>
-              <w:instrText>Toc226822508 \h</w:instrText>
+              <w:instrText>Toc230686538 \h</w:instrText>
             </w:r>
             <w:r>
               <w:rPr>
@@ -317,7 +299,7 @@
               <w:rtl/>
             </w:rPr>
           </w:pPr>
-          <w:hyperlink w:anchor="_Toc226822509" w:history="1">
+          <w:hyperlink w:anchor="_Toc230686539" w:history="1">
             <w:r>
               <w:rPr>
                 <w:rStyle w:val="Hyperlink"/>
@@ -369,7 +351,7 @@
                 <w:noProof/>
                 <w:webHidden/>
               </w:rPr>
-              <w:instrText>Toc226822509 \h</w:instrText>
+              <w:instrText>Toc230686539 \h</w:instrText>
             </w:r>
             <w:r>
               <w:rPr>
@@ -426,7 +408,7 @@
               <w:rtl/>
             </w:rPr>
           </w:pPr>
-          <w:hyperlink w:anchor="_Toc226822510" w:history="1">
+          <w:hyperlink w:anchor="_Toc230686540" w:history="1">
             <w:r>
               <w:rPr>
                 <w:rStyle w:val="Hyperlink"/>
@@ -478,7 +460,7 @@
                 <w:noProof/>
                 <w:webHidden/>
               </w:rPr>
-              <w:instrText>Toc226822510 \h</w:instrText>
+              <w:instrText>Toc230686540 \h</w:instrText>
             </w:r>
             <w:r>
               <w:rPr>
@@ -535,7 +517,7 @@
               <w:rtl/>
             </w:rPr>
           </w:pPr>
-          <w:hyperlink w:anchor="_Toc226822511" w:history="1">
+          <w:hyperlink w:anchor="_Toc230686541" w:history="1">
             <w:r>
               <w:rPr>
                 <w:rStyle w:val="Hyperlink"/>
@@ -587,7 +569,7 @@
                 <w:noProof/>
                 <w:webHidden/>
               </w:rPr>
-              <w:instrText>Toc226822511 \h</w:instrText>
+              <w:instrText>Toc230686541 \h</w:instrText>
             </w:r>
             <w:r>
               <w:rPr>
@@ -644,40 +626,14 @@
               <w:rtl/>
             </w:rPr>
           </w:pPr>
-          <w:hyperlink w:anchor="_Toc226822512" w:history="1">
-            <w:r>
-              <w:rPr>
-                <w:rStyle w:val="Hyperlink"/>
-                <w:rFonts w:hint="eastAsia"/>
-                <w:noProof/>
-                <w:rtl/>
-              </w:rPr>
-              <w:t>הערות</w:t>
-            </w:r>
-            <w:r>
-              <w:rPr>
-                <w:rStyle w:val="Hyperlink"/>
-                <w:noProof/>
-                <w:rtl/>
-              </w:rPr>
-              <w:t xml:space="preserve"> </w:t>
-            </w:r>
-            <w:r>
-              <w:rPr>
-                <w:rStyle w:val="Hyperlink"/>
-                <w:rFonts w:hint="eastAsia"/>
-                <w:noProof/>
-                <w:rtl/>
-              </w:rPr>
-              <w:t>לבדיקה</w:t>
-            </w:r>
-            <w:r>
-              <w:rPr>
-                <w:rStyle w:val="Hyperlink"/>
-                <w:noProof/>
-                <w:rtl/>
-              </w:rPr>
-              <w:t>:</w:t>
+          <w:hyperlink w:anchor="_Toc230686542" w:history="1">
+            <w:r>
+              <w:rPr>
+                <w:rStyle w:val="Hyperlink"/>
+                <w:noProof/>
+                <w:rtl/>
+              </w:rPr>
+              <w:t>הערות לבדיקה:</w:t>
             </w:r>
             <w:r>
               <w:rPr>
@@ -723,7 +679,7 @@
                 <w:noProof/>
                 <w:webHidden/>
               </w:rPr>
-              <w:instrText>Toc226822512 \h</w:instrText>
+              <w:instrText>Toc230686542 \h</w:instrText>
             </w:r>
             <w:r>
               <w:rPr>
@@ -780,7 +736,7 @@
               <w:rtl/>
             </w:rPr>
           </w:pPr>
-          <w:hyperlink w:anchor="_Toc226822513" w:history="1">
+          <w:hyperlink w:anchor="_Toc230686543" w:history="1">
             <w:r>
               <w:rPr>
                 <w:rStyle w:val="Hyperlink"/>
@@ -832,7 +788,7 @@
                 <w:noProof/>
                 <w:webHidden/>
               </w:rPr>
-              <w:instrText>Toc226822513 \h</w:instrText>
+              <w:instrText>Toc230686543 \h</w:instrText>
             </w:r>
             <w:r>
               <w:rPr>
@@ -889,7 +845,7 @@
               <w:rtl/>
             </w:rPr>
           </w:pPr>
-          <w:hyperlink w:anchor="_Toc226822514" w:history="1">
+          <w:hyperlink w:anchor="_Toc230686544" w:history="1">
             <w:r>
               <w:rPr>
                 <w:rStyle w:val="Hyperlink"/>
@@ -941,7 +897,7 @@
                 <w:noProof/>
                 <w:webHidden/>
               </w:rPr>
-              <w:instrText>Toc226822514 \h</w:instrText>
+              <w:instrText>Toc230686544 \h</w:instrText>
             </w:r>
             <w:r>
               <w:rPr>
@@ -998,7 +954,7 @@
               <w:rtl/>
             </w:rPr>
           </w:pPr>
-          <w:hyperlink w:anchor="_Toc226822515" w:history="1">
+          <w:hyperlink w:anchor="_Toc230686545" w:history="1">
             <w:r>
               <w:rPr>
                 <w:rStyle w:val="Hyperlink"/>
@@ -1050,7 +1006,7 @@
                 <w:noProof/>
                 <w:webHidden/>
               </w:rPr>
-              <w:instrText>Toc226822515 \h</w:instrText>
+              <w:instrText>Toc230686545 \h</w:instrText>
             </w:r>
             <w:r>
               <w:rPr>
@@ -1107,7 +1063,7 @@
               <w:rtl/>
             </w:rPr>
           </w:pPr>
-          <w:hyperlink w:anchor="_Toc226822516" w:history="1">
+          <w:hyperlink w:anchor="_Toc230686546" w:history="1">
             <w:r>
               <w:rPr>
                 <w:rStyle w:val="Hyperlink"/>
@@ -1159,7 +1115,7 @@
                 <w:noProof/>
                 <w:webHidden/>
               </w:rPr>
-              <w:instrText>Toc226822516 \h</w:instrText>
+              <w:instrText>Toc230686546 \h</w:instrText>
             </w:r>
             <w:r>
               <w:rPr>
@@ -1216,7 +1172,7 @@
               <w:rtl/>
             </w:rPr>
           </w:pPr>
-          <w:hyperlink w:anchor="_Toc226822517" w:history="1">
+          <w:hyperlink w:anchor="_Toc230686547" w:history="1">
             <w:r>
               <w:rPr>
                 <w:rStyle w:val="Hyperlink"/>
@@ -1268,7 +1224,7 @@
                 <w:noProof/>
                 <w:webHidden/>
               </w:rPr>
-              <w:instrText>Toc226822517 \h</w:instrText>
+              <w:instrText>Toc230686547 \h</w:instrText>
             </w:r>
             <w:r>
               <w:rPr>
@@ -1325,7 +1281,7 @@
               <w:rtl/>
             </w:rPr>
           </w:pPr>
-          <w:hyperlink w:anchor="_Toc226822518" w:history="1">
+          <w:hyperlink w:anchor="_Toc230686548" w:history="1">
             <w:r>
               <w:rPr>
                 <w:rStyle w:val="Hyperlink"/>
@@ -1377,7 +1333,7 @@
                 <w:noProof/>
                 <w:webHidden/>
               </w:rPr>
-              <w:instrText>Toc226822518 \h</w:instrText>
+              <w:instrText>Toc230686548 \h</w:instrText>
             </w:r>
             <w:r>
               <w:rPr>
@@ -1434,7 +1390,7 @@
               <w:rtl/>
             </w:rPr>
           </w:pPr>
-          <w:hyperlink w:anchor="_Toc226822519" w:history="1">
+          <w:hyperlink w:anchor="_Toc230686549" w:history="1">
             <w:r>
               <w:rPr>
                 <w:rStyle w:val="Hyperlink"/>
@@ -1486,7 +1442,7 @@
                 <w:noProof/>
                 <w:webHidden/>
               </w:rPr>
-              <w:instrText>Toc226822519 \h</w:instrText>
+              <w:instrText>Toc230686549 \h</w:instrText>
             </w:r>
             <w:r>
               <w:rPr>
@@ -1543,23 +1499,14 @@
               <w:rtl/>
             </w:rPr>
           </w:pPr>
-          <w:hyperlink w:anchor="_Toc226822520" w:history="1">
-            <w:r>
-              <w:rPr>
-                <w:rStyle w:val="Hyperlink"/>
-                <w:rFonts w:hint="eastAsia"/>
-                <w:noProof/>
-                <w:rtl/>
-              </w:rPr>
-              <w:t>הערות</w:t>
-            </w:r>
-            <w:r>
-              <w:rPr>
-                <w:rStyle w:val="Hyperlink"/>
-                <w:noProof/>
-                <w:rtl/>
-              </w:rPr>
-              <w:t>:</w:t>
+          <w:hyperlink w:anchor="_Toc230686550" w:history="1">
+            <w:r>
+              <w:rPr>
+                <w:rStyle w:val="Hyperlink"/>
+                <w:noProof/>
+                <w:rtl/>
+              </w:rPr>
+              <w:t>הערות:</w:t>
             </w:r>
             <w:r>
               <w:rPr>
@@ -1605,7 +1552,7 @@
                 <w:noProof/>
                 <w:webHidden/>
               </w:rPr>
-              <w:instrText>Toc226822520 \h</w:instrText>
+              <w:instrText>Toc230686550 \h</w:instrText>
             </w:r>
             <w:r>
               <w:rPr>
@@ -1662,7 +1609,7 @@
               <w:rtl/>
             </w:rPr>
           </w:pPr>
-          <w:hyperlink w:anchor="_Toc226822521" w:history="1">
+          <w:hyperlink w:anchor="_Toc230686551" w:history="1">
             <w:r>
               <w:rPr>
                 <w:rStyle w:val="Hyperlink"/>
@@ -1714,7 +1661,7 @@
                 <w:noProof/>
                 <w:webHidden/>
               </w:rPr>
-              <w:instrText>Toc226822521 \h</w:instrText>
+              <w:instrText>Toc230686551 \h</w:instrText>
             </w:r>
             <w:r>
               <w:rPr>
@@ -1771,7 +1718,7 @@
               <w:rtl/>
             </w:rPr>
           </w:pPr>
-          <w:hyperlink w:anchor="_Toc226822522" w:history="1">
+          <w:hyperlink w:anchor="_Toc230686552" w:history="1">
             <w:r>
               <w:rPr>
                 <w:rStyle w:val="Hyperlink"/>
@@ -1823,7 +1770,7 @@
                 <w:noProof/>
                 <w:webHidden/>
               </w:rPr>
-              <w:instrText>Toc226822522 \h</w:instrText>
+              <w:instrText>Toc230686552 \h</w:instrText>
             </w:r>
             <w:r>
               <w:rPr>
@@ -1880,7 +1827,7 @@
               <w:rtl/>
             </w:rPr>
           </w:pPr>
-          <w:hyperlink w:anchor="_Toc226822523" w:history="1">
+          <w:hyperlink w:anchor="_Toc230686553" w:history="1">
             <w:r>
               <w:rPr>
                 <w:rStyle w:val="Hyperlink"/>
@@ -1932,7 +1879,7 @@
                 <w:noProof/>
                 <w:webHidden/>
               </w:rPr>
-              <w:instrText>Toc226822523 \h</w:instrText>
+              <w:instrText>Toc230686553 \h</w:instrText>
             </w:r>
             <w:r>
               <w:rPr>
@@ -1989,7 +1936,7 @@
               <w:rtl/>
             </w:rPr>
           </w:pPr>
-          <w:hyperlink w:anchor="_Toc226822524" w:history="1">
+          <w:hyperlink w:anchor="_Toc230686554" w:history="1">
             <w:r>
               <w:rPr>
                 <w:rStyle w:val="Hyperlink"/>
@@ -2041,7 +1988,7 @@
                 <w:noProof/>
                 <w:webHidden/>
               </w:rPr>
-              <w:instrText>Toc226822524 \h</w:instrText>
+              <w:instrText>Toc230686554 \h</w:instrText>
             </w:r>
             <w:r>
               <w:rPr>
@@ -2098,7 +2045,7 @@
               <w:rtl/>
             </w:rPr>
           </w:pPr>
-          <w:hyperlink w:anchor="_Toc226822525" w:history="1">
+          <w:hyperlink w:anchor="_Toc230686555" w:history="1">
             <w:r>
               <w:rPr>
                 <w:rStyle w:val="Hyperlink"/>
@@ -2150,7 +2097,7 @@
                 <w:noProof/>
                 <w:webHidden/>
               </w:rPr>
-              <w:instrText>Toc226822525 \h</w:instrText>
+              <w:instrText>Toc230686555 \h</w:instrText>
             </w:r>
             <w:r>
               <w:rPr>
@@ -2207,7 +2154,7 @@
               <w:rtl/>
             </w:rPr>
           </w:pPr>
-          <w:hyperlink w:anchor="_Toc226822526" w:history="1">
+          <w:hyperlink w:anchor="_Toc230686556" w:history="1">
             <w:r>
               <w:rPr>
                 <w:rStyle w:val="Hyperlink"/>
@@ -2259,7 +2206,7 @@
                 <w:noProof/>
                 <w:webHidden/>
               </w:rPr>
-              <w:instrText>Toc226822526 \h</w:instrText>
+              <w:instrText>Toc230686556 \h</w:instrText>
             </w:r>
             <w:r>
               <w:rPr>
@@ -2316,7 +2263,7 @@
               <w:rtl/>
             </w:rPr>
           </w:pPr>
-          <w:hyperlink w:anchor="_Toc226822527" w:history="1">
+          <w:hyperlink w:anchor="_Toc230686557" w:history="1">
             <w:r>
               <w:rPr>
                 <w:rStyle w:val="Hyperlink"/>
@@ -2368,7 +2315,7 @@
                 <w:noProof/>
                 <w:webHidden/>
               </w:rPr>
-              <w:instrText>Toc226822527 \h</w:instrText>
+              <w:instrText>Toc230686557 \h</w:instrText>
             </w:r>
             <w:r>
               <w:rPr>
@@ -2425,7 +2372,7 @@
               <w:rtl/>
             </w:rPr>
           </w:pPr>
-          <w:hyperlink w:anchor="_Toc226822528" w:history="1">
+          <w:hyperlink w:anchor="_Toc230686558" w:history="1">
             <w:r>
               <w:rPr>
                 <w:rStyle w:val="Hyperlink"/>
@@ -2477,7 +2424,7 @@
                 <w:noProof/>
                 <w:webHidden/>
               </w:rPr>
-              <w:instrText>Toc226822528 \h</w:instrText>
+              <w:instrText>Toc230686558 \h</w:instrText>
             </w:r>
             <w:r>
               <w:rPr>
@@ -2534,7 +2481,7 @@
               <w:rtl/>
             </w:rPr>
           </w:pPr>
-          <w:hyperlink w:anchor="_Toc226822529" w:history="1">
+          <w:hyperlink w:anchor="_Toc230686559" w:history="1">
             <w:r>
               <w:rPr>
                 <w:rStyle w:val="Hyperlink"/>
@@ -2586,7 +2533,7 @@
                 <w:noProof/>
                 <w:webHidden/>
               </w:rPr>
-              <w:instrText>Toc226822529 \h</w:instrText>
+              <w:instrText>Toc230686559 \h</w:instrText>
             </w:r>
             <w:r>
               <w:rPr>
@@ -2643,7 +2590,7 @@
               <w:rtl/>
             </w:rPr>
           </w:pPr>
-          <w:hyperlink w:anchor="_Toc226822530" w:history="1">
+          <w:hyperlink w:anchor="_Toc230686560" w:history="1">
             <w:r>
               <w:rPr>
                 <w:rStyle w:val="Hyperlink"/>
@@ -2695,7 +2642,7 @@
                 <w:noProof/>
                 <w:webHidden/>
               </w:rPr>
-              <w:instrText>Toc226822530 \h</w:instrText>
+              <w:instrText>Toc230686560 \h</w:instrText>
             </w:r>
             <w:r>
               <w:rPr>
@@ -2752,7 +2699,7 @@
               <w:rtl/>
             </w:rPr>
           </w:pPr>
-          <w:hyperlink w:anchor="_Toc226822531" w:history="1">
+          <w:hyperlink w:anchor="_Toc230686561" w:history="1">
             <w:r>
               <w:rPr>
                 <w:rStyle w:val="Hyperlink"/>
@@ -2804,7 +2751,7 @@
                 <w:noProof/>
                 <w:webHidden/>
               </w:rPr>
-              <w:instrText>Toc226822531 \h</w:instrText>
+              <w:instrText>Toc230686561 \h</w:instrText>
             </w:r>
             <w:r>
               <w:rPr>
@@ -2861,7 +2808,7 @@
               <w:rtl/>
             </w:rPr>
           </w:pPr>
-          <w:hyperlink w:anchor="_Toc226822532" w:history="1">
+          <w:hyperlink w:anchor="_Toc230686562" w:history="1">
             <w:r>
               <w:rPr>
                 <w:rStyle w:val="Hyperlink"/>
@@ -2913,7 +2860,7 @@
                 <w:noProof/>
                 <w:webHidden/>
               </w:rPr>
-              <w:instrText>Toc226822532 \h</w:instrText>
+              <w:instrText>Toc230686562 \h</w:instrText>
             </w:r>
             <w:r>
               <w:rPr>
@@ -2970,7 +2917,7 @@
               <w:rtl/>
             </w:rPr>
           </w:pPr>
-          <w:hyperlink w:anchor="_Toc226822533" w:history="1">
+          <w:hyperlink w:anchor="_Toc230686563" w:history="1">
             <w:r>
               <w:rPr>
                 <w:rStyle w:val="Hyperlink"/>
@@ -3022,7 +2969,7 @@
                 <w:noProof/>
                 <w:webHidden/>
               </w:rPr>
-              <w:instrText>Toc226822533 \h</w:instrText>
+              <w:instrText>Toc230686563 \h</w:instrText>
             </w:r>
             <w:r>
               <w:rPr>
@@ -3079,7 +3026,7 @@
               <w:rtl/>
             </w:rPr>
           </w:pPr>
-          <w:hyperlink w:anchor="_Toc226822534" w:history="1">
+          <w:hyperlink w:anchor="_Toc230686564" w:history="1">
             <w:r>
               <w:rPr>
                 <w:rStyle w:val="Hyperlink"/>
@@ -3131,7 +3078,7 @@
                 <w:noProof/>
                 <w:webHidden/>
               </w:rPr>
-              <w:instrText>Toc226822534 \h</w:instrText>
+              <w:instrText>Toc230686564 \h</w:instrText>
             </w:r>
             <w:r>
               <w:rPr>
@@ -3188,7 +3135,7 @@
               <w:rtl/>
             </w:rPr>
           </w:pPr>
-          <w:hyperlink w:anchor="_Toc226822535" w:history="1">
+          <w:hyperlink w:anchor="_Toc230686565" w:history="1">
             <w:r>
               <w:rPr>
                 <w:rStyle w:val="Hyperlink"/>
@@ -3240,7 +3187,7 @@
                 <w:noProof/>
                 <w:webHidden/>
               </w:rPr>
-              <w:instrText>Toc226822535 \h</w:instrText>
+              <w:instrText>Toc230686565 \h</w:instrText>
             </w:r>
             <w:r>
               <w:rPr>
@@ -3297,32 +3244,14 @@
               <w:rtl/>
             </w:rPr>
           </w:pPr>
-          <w:hyperlink w:anchor="_Toc226822536" w:history="1">
-            <w:r>
-              <w:rPr>
-                <w:rStyle w:val="Hyperlink"/>
-                <w:rFonts w:hint="eastAsia"/>
-                <w:noProof/>
-                <w:rtl/>
-              </w:rPr>
-              <w:t>מבנה</w:t>
-            </w:r>
-            <w:r>
-              <w:rPr>
-                <w:rStyle w:val="Hyperlink"/>
-                <w:noProof/>
-                <w:rtl/>
-              </w:rPr>
-              <w:t xml:space="preserve"> </w:t>
-            </w:r>
-            <w:r>
-              <w:rPr>
-                <w:rStyle w:val="Hyperlink"/>
-                <w:rFonts w:hint="eastAsia"/>
-                <w:noProof/>
-                <w:rtl/>
-              </w:rPr>
-              <w:t>הפרויקט</w:t>
+          <w:hyperlink w:anchor="_Toc230686566" w:history="1">
+            <w:r>
+              <w:rPr>
+                <w:rStyle w:val="Hyperlink"/>
+                <w:noProof/>
+                <w:rtl/>
+              </w:rPr>
+              <w:t>מבנה הפרויקט</w:t>
             </w:r>
             <w:r>
               <w:rPr>
@@ -3368,7 +3297,7 @@
                 <w:noProof/>
                 <w:webHidden/>
               </w:rPr>
-              <w:instrText>Toc226822536 \h</w:instrText>
+              <w:instrText>Toc230686566 \h</w:instrText>
             </w:r>
             <w:r>
               <w:rPr>
@@ -3425,40 +3354,14 @@
               <w:rtl/>
             </w:rPr>
           </w:pPr>
-          <w:hyperlink w:anchor="_Toc226822537" w:history="1">
-            <w:r>
-              <w:rPr>
-                <w:rStyle w:val="Hyperlink"/>
-                <w:rFonts w:hint="eastAsia"/>
-                <w:noProof/>
-                <w:rtl/>
-              </w:rPr>
-              <w:t>בחירת</w:t>
-            </w:r>
-            <w:r>
-              <w:rPr>
-                <w:rStyle w:val="Hyperlink"/>
-                <w:noProof/>
-                <w:rtl/>
-              </w:rPr>
-              <w:t xml:space="preserve"> </w:t>
-            </w:r>
-            <w:r>
-              <w:rPr>
-                <w:rStyle w:val="Hyperlink"/>
-                <w:rFonts w:hint="eastAsia"/>
-                <w:noProof/>
-                <w:rtl/>
-              </w:rPr>
-              <w:t>מניות</w:t>
-            </w:r>
-            <w:r>
-              <w:rPr>
-                <w:rStyle w:val="Hyperlink"/>
-                <w:noProof/>
-                <w:rtl/>
-              </w:rPr>
-              <w:t>:</w:t>
+          <w:hyperlink w:anchor="_Toc230686567" w:history="1">
+            <w:r>
+              <w:rPr>
+                <w:rStyle w:val="Hyperlink"/>
+                <w:noProof/>
+                <w:rtl/>
+              </w:rPr>
+              <w:t>בחירת מניות:</w:t>
             </w:r>
             <w:r>
               <w:rPr>
@@ -3504,7 +3407,7 @@
                 <w:noProof/>
                 <w:webHidden/>
               </w:rPr>
-              <w:instrText>Toc226822537 \h</w:instrText>
+              <w:instrText>Toc230686567 \h</w:instrText>
             </w:r>
             <w:r>
               <w:rPr>
@@ -3561,40 +3464,14 @@
               <w:rtl/>
             </w:rPr>
           </w:pPr>
-          <w:hyperlink w:anchor="_Toc226822538" w:history="1">
-            <w:r>
-              <w:rPr>
-                <w:rStyle w:val="Hyperlink"/>
-                <w:rFonts w:hint="eastAsia"/>
-                <w:noProof/>
-                <w:rtl/>
-              </w:rPr>
-              <w:t>מהות</w:t>
-            </w:r>
-            <w:r>
-              <w:rPr>
-                <w:rStyle w:val="Hyperlink"/>
-                <w:noProof/>
-                <w:rtl/>
-              </w:rPr>
-              <w:t xml:space="preserve"> </w:t>
-            </w:r>
-            <w:r>
-              <w:rPr>
-                <w:rStyle w:val="Hyperlink"/>
-                <w:rFonts w:hint="eastAsia"/>
-                <w:noProof/>
-                <w:rtl/>
-              </w:rPr>
-              <w:t>המודל</w:t>
-            </w:r>
-            <w:r>
-              <w:rPr>
-                <w:rStyle w:val="Hyperlink"/>
-                <w:noProof/>
-                <w:rtl/>
-              </w:rPr>
-              <w:t xml:space="preserve"> - </w:t>
+          <w:hyperlink w:anchor="_Toc230686568" w:history="1">
+            <w:r>
+              <w:rPr>
+                <w:rStyle w:val="Hyperlink"/>
+                <w:noProof/>
+                <w:rtl/>
+              </w:rPr>
+              <w:t xml:space="preserve">מהות המודל - </w:t>
             </w:r>
             <w:r>
               <w:rPr>
@@ -3655,7 +3532,7 @@
                 <w:noProof/>
                 <w:webHidden/>
               </w:rPr>
-              <w:instrText>Toc226822538 \h</w:instrText>
+              <w:instrText>Toc230686568 \h</w:instrText>
             </w:r>
             <w:r>
               <w:rPr>
@@ -3712,57 +3589,14 @@
               <w:rtl/>
             </w:rPr>
           </w:pPr>
-          <w:hyperlink w:anchor="_Toc226822539" w:history="1">
-            <w:r>
-              <w:rPr>
-                <w:rStyle w:val="Hyperlink"/>
-                <w:rFonts w:hint="eastAsia"/>
-                <w:noProof/>
-                <w:rtl/>
-              </w:rPr>
-              <w:t>מבחני</w:t>
-            </w:r>
-            <w:r>
-              <w:rPr>
-                <w:rStyle w:val="Hyperlink"/>
-                <w:noProof/>
-                <w:rtl/>
-              </w:rPr>
-              <w:t xml:space="preserve"> </w:t>
-            </w:r>
-            <w:r>
-              <w:rPr>
-                <w:rStyle w:val="Hyperlink"/>
-                <w:rFonts w:hint="eastAsia"/>
-                <w:noProof/>
-                <w:rtl/>
-              </w:rPr>
-              <w:t>סף</w:t>
-            </w:r>
-            <w:r>
-              <w:rPr>
-                <w:rStyle w:val="Hyperlink"/>
-                <w:noProof/>
-                <w:rtl/>
-              </w:rPr>
-              <w:t xml:space="preserve"> </w:t>
-            </w:r>
-            <w:r>
-              <w:rPr>
-                <w:rStyle w:val="Hyperlink"/>
-                <w:rFonts w:hint="eastAsia"/>
-                <w:noProof/>
-                <w:rtl/>
-              </w:rPr>
-              <w:t>למודל</w:t>
-            </w:r>
-            <w:r>
-              <w:rPr>
-                <w:rStyle w:val="Hyperlink"/>
-                <w:noProof/>
-                <w:rtl/>
-              </w:rPr>
-              <w:t>:</w:t>
+          <w:hyperlink w:anchor="_Toc230686569" w:history="1">
+            <w:r>
+              <w:rPr>
+                <w:rStyle w:val="Hyperlink"/>
+                <w:noProof/>
+                <w:rtl/>
+              </w:rPr>
+              <w:t>מבחני סף למודל:</w:t>
             </w:r>
             <w:r>
               <w:rPr>
@@ -3808,7 +3642,7 @@
                 <w:noProof/>
                 <w:webHidden/>
               </w:rPr>
-              <w:instrText>Toc226822539 \h</w:instrText>
+              <w:instrText>Toc230686569 \h</w:instrText>
             </w:r>
             <w:r>
               <w:rPr>
@@ -3865,40 +3699,14 @@
               <w:rtl/>
             </w:rPr>
           </w:pPr>
-          <w:hyperlink w:anchor="_Toc226822540" w:history="1">
-            <w:r>
-              <w:rPr>
-                <w:rStyle w:val="Hyperlink"/>
-                <w:rFonts w:hint="eastAsia"/>
-                <w:noProof/>
-                <w:rtl/>
-              </w:rPr>
-              <w:t>כלל</w:t>
-            </w:r>
-            <w:r>
-              <w:rPr>
-                <w:rStyle w:val="Hyperlink"/>
-                <w:noProof/>
-                <w:rtl/>
-              </w:rPr>
-              <w:t xml:space="preserve"> </w:t>
-            </w:r>
-            <w:r>
-              <w:rPr>
-                <w:rStyle w:val="Hyperlink"/>
-                <w:rFonts w:hint="eastAsia"/>
-                <w:noProof/>
-                <w:rtl/>
-              </w:rPr>
-              <w:t>קנייה</w:t>
-            </w:r>
-            <w:r>
-              <w:rPr>
-                <w:rStyle w:val="Hyperlink"/>
-                <w:noProof/>
-                <w:rtl/>
-              </w:rPr>
-              <w:t>:</w:t>
+          <w:hyperlink w:anchor="_Toc230686570" w:history="1">
+            <w:r>
+              <w:rPr>
+                <w:rStyle w:val="Hyperlink"/>
+                <w:noProof/>
+                <w:rtl/>
+              </w:rPr>
+              <w:t>כלל קנייה:</w:t>
             </w:r>
             <w:r>
               <w:rPr>
@@ -3944,7 +3752,7 @@
                 <w:noProof/>
                 <w:webHidden/>
               </w:rPr>
-              <w:instrText>Toc226822540 \h</w:instrText>
+              <w:instrText>Toc230686570 \h</w:instrText>
             </w:r>
             <w:r>
               <w:rPr>
@@ -4001,49 +3809,14 @@
               <w:rtl/>
             </w:rPr>
           </w:pPr>
-          <w:hyperlink w:anchor="_Toc226822541" w:history="1">
-            <w:r>
-              <w:rPr>
-                <w:rStyle w:val="Hyperlink"/>
-                <w:rFonts w:hint="eastAsia"/>
-                <w:noProof/>
-                <w:rtl/>
-              </w:rPr>
-              <w:t>שלבי</w:t>
-            </w:r>
-            <w:r>
-              <w:rPr>
-                <w:rStyle w:val="Hyperlink"/>
-                <w:noProof/>
-                <w:rtl/>
-              </w:rPr>
-              <w:t xml:space="preserve"> </w:t>
-            </w:r>
-            <w:r>
-              <w:rPr>
-                <w:rStyle w:val="Hyperlink"/>
-                <w:rFonts w:hint="eastAsia"/>
-                <w:noProof/>
-                <w:rtl/>
-              </w:rPr>
-              <w:t>ביצוע</w:t>
-            </w:r>
-            <w:r>
-              <w:rPr>
-                <w:rStyle w:val="Hyperlink"/>
-                <w:noProof/>
-                <w:rtl/>
-              </w:rPr>
-              <w:t xml:space="preserve"> </w:t>
-            </w:r>
-            <w:r>
-              <w:rPr>
-                <w:rStyle w:val="Hyperlink"/>
-                <w:rFonts w:hint="eastAsia"/>
-                <w:noProof/>
-                <w:rtl/>
-              </w:rPr>
-              <w:t>המודל</w:t>
+          <w:hyperlink w:anchor="_Toc230686571" w:history="1">
+            <w:r>
+              <w:rPr>
+                <w:rStyle w:val="Hyperlink"/>
+                <w:noProof/>
+                <w:rtl/>
+              </w:rPr>
+              <w:t>שלבי ביצוע המודל</w:t>
             </w:r>
             <w:r>
               <w:rPr>
@@ -4089,7 +3862,7 @@
                 <w:noProof/>
                 <w:webHidden/>
               </w:rPr>
-              <w:instrText>Toc226822541 \h</w:instrText>
+              <w:instrText>Toc230686571 \h</w:instrText>
             </w:r>
             <w:r>
               <w:rPr>
@@ -4146,8 +3919,8 @@
               <w:rtl/>
             </w:rPr>
           </w:pPr>
-          <w:hyperlink w:anchor="_Toc226822542" w:history="1">
-            <w:bookmarkStart w:id="1" w:name="_Toc225179045"/>
+          <w:hyperlink w:anchor="_Toc230686572" w:history="1">
+            <w:bookmarkStart w:id="1" w:name="_Toc226822542"/>
             <w:r>
               <w:rPr>
                 <w:rStyle w:val="Hyperlink"/>
@@ -4156,10 +3929,10 @@
                 <w:rtl/>
               </w:rPr>
               <w:drawing>
-                <wp:inline distT="0" distB="0" distL="0" distR="0" wp14:anchorId="35483311" wp14:editId="2DDBE9CB">
+                <wp:inline distT="0" distB="0" distL="0" distR="0" wp14:anchorId="2421C4C8" wp14:editId="3E86FAF5">
                   <wp:extent cx="4277322" cy="5877745"/>
                   <wp:effectExtent l="0" t="0" r="9525" b="8890"/>
-                  <wp:docPr id="1729677361" name="תמונה 1"/>
+                  <wp:docPr id="1532028953" name="תמונה 1"/>
                   <wp:cNvGraphicFramePr>
                     <a:graphicFrameLocks xmlns:a="http://schemas.openxmlformats.org/drawingml/2006/main" noChangeAspect="1"/>
                   </wp:cNvGraphicFramePr>
@@ -4236,7 +4009,7 @@
                 <w:noProof/>
                 <w:webHidden/>
               </w:rPr>
-              <w:instrText>Toc226822542 \h</w:instrText>
+              <w:instrText>Toc230686572 \h</w:instrText>
             </w:r>
             <w:r>
               <w:rPr>
@@ -4293,74 +4066,14 @@
               <w:rtl/>
             </w:rPr>
           </w:pPr>
-          <w:hyperlink w:anchor="_Toc226822543" w:history="1">
-            <w:r>
-              <w:rPr>
-                <w:rStyle w:val="Hyperlink"/>
-                <w:rFonts w:hint="eastAsia"/>
-                <w:noProof/>
-                <w:rtl/>
-              </w:rPr>
-              <w:t>השגת</w:t>
-            </w:r>
-            <w:r>
-              <w:rPr>
-                <w:rStyle w:val="Hyperlink"/>
-                <w:noProof/>
-                <w:rtl/>
-              </w:rPr>
-              <w:t xml:space="preserve"> </w:t>
-            </w:r>
-            <w:r>
-              <w:rPr>
-                <w:rStyle w:val="Hyperlink"/>
-                <w:rFonts w:hint="eastAsia"/>
-                <w:noProof/>
-                <w:rtl/>
-              </w:rPr>
-              <w:t>הנתונים</w:t>
-            </w:r>
-            <w:r>
-              <w:rPr>
-                <w:rStyle w:val="Hyperlink"/>
-                <w:noProof/>
-                <w:rtl/>
-              </w:rPr>
-              <w:t xml:space="preserve"> </w:t>
-            </w:r>
-            <w:r>
-              <w:rPr>
-                <w:rStyle w:val="Hyperlink"/>
-                <w:rFonts w:hint="eastAsia"/>
-                <w:noProof/>
-                <w:rtl/>
-              </w:rPr>
-              <w:t>וניקוי</w:t>
-            </w:r>
-            <w:r>
-              <w:rPr>
-                <w:rStyle w:val="Hyperlink"/>
-                <w:noProof/>
-                <w:rtl/>
-              </w:rPr>
-              <w:t xml:space="preserve"> </w:t>
-            </w:r>
-            <w:r>
-              <w:rPr>
-                <w:rStyle w:val="Hyperlink"/>
-                <w:rFonts w:hint="eastAsia"/>
-                <w:noProof/>
-                <w:rtl/>
-              </w:rPr>
-              <w:t>הנתונים</w:t>
-            </w:r>
-            <w:r>
-              <w:rPr>
-                <w:rStyle w:val="Hyperlink"/>
-                <w:noProof/>
-                <w:rtl/>
-              </w:rPr>
-              <w:t>:</w:t>
+          <w:hyperlink w:anchor="_Toc230686573" w:history="1">
+            <w:r>
+              <w:rPr>
+                <w:rStyle w:val="Hyperlink"/>
+                <w:noProof/>
+                <w:rtl/>
+              </w:rPr>
+              <w:t>השגת הנתונים וניקוי הנתונים:</w:t>
             </w:r>
             <w:r>
               <w:rPr>
@@ -4406,7 +4119,7 @@
                 <w:noProof/>
                 <w:webHidden/>
               </w:rPr>
-              <w:instrText>Toc226822543 \h</w:instrText>
+              <w:instrText>Toc230686573 \h</w:instrText>
             </w:r>
             <w:r>
               <w:rPr>
@@ -4463,40 +4176,14 @@
               <w:rtl/>
             </w:rPr>
           </w:pPr>
-          <w:hyperlink w:anchor="_Toc226822544" w:history="1">
-            <w:r>
-              <w:rPr>
-                <w:rStyle w:val="Hyperlink"/>
-                <w:rFonts w:hint="eastAsia"/>
-                <w:noProof/>
-                <w:rtl/>
-              </w:rPr>
-              <w:t>מטלות</w:t>
-            </w:r>
-            <w:r>
-              <w:rPr>
-                <w:rStyle w:val="Hyperlink"/>
-                <w:noProof/>
-                <w:rtl/>
-              </w:rPr>
-              <w:t xml:space="preserve"> </w:t>
-            </w:r>
-            <w:r>
-              <w:rPr>
-                <w:rStyle w:val="Hyperlink"/>
-                <w:rFonts w:hint="eastAsia"/>
-                <w:noProof/>
-                <w:rtl/>
-              </w:rPr>
-              <w:t>להיום</w:t>
-            </w:r>
-            <w:r>
-              <w:rPr>
-                <w:rStyle w:val="Hyperlink"/>
-                <w:noProof/>
-                <w:rtl/>
-              </w:rPr>
-              <w:t xml:space="preserve"> – 22.03.2026:</w:t>
+          <w:hyperlink w:anchor="_Toc230686574" w:history="1">
+            <w:r>
+              <w:rPr>
+                <w:rStyle w:val="Hyperlink"/>
+                <w:noProof/>
+                <w:rtl/>
+              </w:rPr>
+              <w:t>מטלות להיום – 22.03.2026:</w:t>
             </w:r>
             <w:r>
               <w:rPr>
@@ -4542,7 +4229,7 @@
                 <w:noProof/>
                 <w:webHidden/>
               </w:rPr>
-              <w:instrText>Toc226822544 \h</w:instrText>
+              <w:instrText>Toc230686574 \h</w:instrText>
             </w:r>
             <w:r>
               <w:rPr>
@@ -4599,66 +4286,14 @@
               <w:rtl/>
             </w:rPr>
           </w:pPr>
-          <w:hyperlink w:anchor="_Toc226822545" w:history="1">
-            <w:r>
-              <w:rPr>
-                <w:rStyle w:val="Hyperlink"/>
-                <w:rFonts w:hint="eastAsia"/>
-                <w:noProof/>
-                <w:rtl/>
-              </w:rPr>
-              <w:t>סף</w:t>
-            </w:r>
-            <w:r>
-              <w:rPr>
-                <w:rStyle w:val="Hyperlink"/>
-                <w:noProof/>
-                <w:rtl/>
-              </w:rPr>
-              <w:t xml:space="preserve"> </w:t>
-            </w:r>
-            <w:r>
-              <w:rPr>
-                <w:rStyle w:val="Hyperlink"/>
-                <w:rFonts w:hint="eastAsia"/>
-                <w:noProof/>
-                <w:rtl/>
-              </w:rPr>
-              <w:t>פעולה</w:t>
-            </w:r>
-            <w:r>
-              <w:rPr>
-                <w:rStyle w:val="Hyperlink"/>
-                <w:noProof/>
-                <w:rtl/>
-              </w:rPr>
-              <w:t xml:space="preserve"> – </w:t>
-            </w:r>
-            <w:r>
-              <w:rPr>
-                <w:rStyle w:val="Hyperlink"/>
-                <w:rFonts w:hint="eastAsia"/>
-                <w:noProof/>
-                <w:rtl/>
-              </w:rPr>
-              <w:t>סטטוס</w:t>
-            </w:r>
-            <w:r>
-              <w:rPr>
-                <w:rStyle w:val="Hyperlink"/>
-                <w:noProof/>
-                <w:rtl/>
-              </w:rPr>
-              <w:t xml:space="preserve">: </w:t>
-            </w:r>
-            <w:r>
-              <w:rPr>
-                <w:rStyle w:val="Hyperlink"/>
-                <w:rFonts w:hint="eastAsia"/>
-                <w:noProof/>
-                <w:rtl/>
-              </w:rPr>
-              <w:t>הושלם</w:t>
+          <w:hyperlink w:anchor="_Toc230686575" w:history="1">
+            <w:r>
+              <w:rPr>
+                <w:rStyle w:val="Hyperlink"/>
+                <w:noProof/>
+                <w:rtl/>
+              </w:rPr>
+              <w:t>סף פעולה – סטטוס: הושלם</w:t>
             </w:r>
             <w:r>
               <w:rPr>
@@ -4704,7 +4339,7 @@
                 <w:noProof/>
                 <w:webHidden/>
               </w:rPr>
-              <w:instrText>Toc226822545 \h</w:instrText>
+              <w:instrText>Toc230686575 \h</w:instrText>
             </w:r>
             <w:r>
               <w:rPr>
@@ -4761,7 +4396,7 @@
               <w:rtl/>
             </w:rPr>
           </w:pPr>
-          <w:hyperlink w:anchor="_Toc226822546" w:history="1">
+          <w:hyperlink w:anchor="_Toc230686576" w:history="1">
             <w:r>
               <w:rPr>
                 <w:rStyle w:val="Hyperlink"/>
@@ -4813,7 +4448,7 @@
                 <w:noProof/>
                 <w:webHidden/>
               </w:rPr>
-              <w:instrText>Toc226822546 \h</w:instrText>
+              <w:instrText>Toc230686576 \h</w:instrText>
             </w:r>
             <w:r>
               <w:rPr>
@@ -4870,7 +4505,7 @@
               <w:rtl/>
             </w:rPr>
           </w:pPr>
-          <w:hyperlink w:anchor="_Toc226822547" w:history="1">
+          <w:hyperlink w:anchor="_Toc230686577" w:history="1">
             <w:r>
               <w:rPr>
                 <w:rStyle w:val="Hyperlink"/>
@@ -4922,7 +4557,7 @@
                 <w:noProof/>
                 <w:webHidden/>
               </w:rPr>
-              <w:instrText>Toc226822547 \h</w:instrText>
+              <w:instrText>Toc230686577 \h</w:instrText>
             </w:r>
             <w:r>
               <w:rPr>
@@ -4979,83 +4614,14 @@
               <w:rtl/>
             </w:rPr>
           </w:pPr>
-          <w:hyperlink w:anchor="_Toc226822548" w:history="1">
-            <w:r>
-              <w:rPr>
-                <w:rStyle w:val="Hyperlink"/>
-                <w:rFonts w:hint="eastAsia"/>
-                <w:noProof/>
-                <w:rtl/>
-              </w:rPr>
-              <w:t>הערכה</w:t>
-            </w:r>
-            <w:r>
-              <w:rPr>
-                <w:rStyle w:val="Hyperlink"/>
-                <w:noProof/>
-                <w:rtl/>
-              </w:rPr>
-              <w:t xml:space="preserve"> </w:t>
-            </w:r>
-            <w:r>
-              <w:rPr>
-                <w:rStyle w:val="Hyperlink"/>
-                <w:rFonts w:hint="eastAsia"/>
-                <w:noProof/>
-                <w:rtl/>
-              </w:rPr>
-              <w:t>של</w:t>
-            </w:r>
-            <w:r>
-              <w:rPr>
-                <w:rStyle w:val="Hyperlink"/>
-                <w:noProof/>
-                <w:rtl/>
-              </w:rPr>
-              <w:t xml:space="preserve"> </w:t>
-            </w:r>
-            <w:r>
-              <w:rPr>
-                <w:rStyle w:val="Hyperlink"/>
-                <w:rFonts w:hint="eastAsia"/>
-                <w:noProof/>
-                <w:rtl/>
-              </w:rPr>
-              <w:t>כמה</w:t>
-            </w:r>
-            <w:r>
-              <w:rPr>
-                <w:rStyle w:val="Hyperlink"/>
-                <w:noProof/>
-                <w:rtl/>
-              </w:rPr>
-              <w:t xml:space="preserve"> </w:t>
-            </w:r>
-            <w:r>
-              <w:rPr>
-                <w:rStyle w:val="Hyperlink"/>
-                <w:rFonts w:hint="eastAsia"/>
-                <w:noProof/>
-                <w:rtl/>
-              </w:rPr>
-              <w:t>מודל</w:t>
-            </w:r>
-            <w:r>
-              <w:rPr>
-                <w:rStyle w:val="Hyperlink"/>
-                <w:noProof/>
-                <w:rtl/>
-              </w:rPr>
-              <w:t xml:space="preserve"> </w:t>
-            </w:r>
-            <w:r>
-              <w:rPr>
-                <w:rStyle w:val="Hyperlink"/>
-                <w:rFonts w:hint="eastAsia"/>
-                <w:noProof/>
-                <w:rtl/>
-              </w:rPr>
-              <w:t>מרוויח</w:t>
+          <w:hyperlink w:anchor="_Toc230686578" w:history="1">
+            <w:r>
+              <w:rPr>
+                <w:rStyle w:val="Hyperlink"/>
+                <w:noProof/>
+                <w:rtl/>
+              </w:rPr>
+              <w:t>הערכה של כמה מודל מרוויח</w:t>
             </w:r>
             <w:r>
               <w:rPr>
@@ -5101,7 +4667,7 @@
                 <w:noProof/>
                 <w:webHidden/>
               </w:rPr>
-              <w:instrText>Toc226822548 \h</w:instrText>
+              <w:instrText>Toc230686578 \h</w:instrText>
             </w:r>
             <w:r>
               <w:rPr>
@@ -5158,32 +4724,14 @@
               <w:rtl/>
             </w:rPr>
           </w:pPr>
-          <w:hyperlink w:anchor="_Toc226822549" w:history="1">
-            <w:r>
-              <w:rPr>
-                <w:rStyle w:val="Hyperlink"/>
-                <w:rFonts w:hint="eastAsia"/>
-                <w:noProof/>
-                <w:rtl/>
-              </w:rPr>
-              <w:t>מטלות</w:t>
-            </w:r>
-            <w:r>
-              <w:rPr>
-                <w:rStyle w:val="Hyperlink"/>
-                <w:noProof/>
-                <w:rtl/>
-              </w:rPr>
-              <w:t xml:space="preserve"> </w:t>
-            </w:r>
-            <w:r>
-              <w:rPr>
-                <w:rStyle w:val="Hyperlink"/>
-                <w:rFonts w:hint="eastAsia"/>
-                <w:noProof/>
-                <w:rtl/>
-              </w:rPr>
-              <w:t>להמשך</w:t>
+          <w:hyperlink w:anchor="_Toc230686579" w:history="1">
+            <w:r>
+              <w:rPr>
+                <w:rStyle w:val="Hyperlink"/>
+                <w:noProof/>
+                <w:rtl/>
+              </w:rPr>
+              <w:t>מטלות להמשך</w:t>
             </w:r>
             <w:r>
               <w:rPr>
@@ -5229,7 +4777,7 @@
                 <w:noProof/>
                 <w:webHidden/>
               </w:rPr>
-              <w:instrText>Toc226822549 \h</w:instrText>
+              <w:instrText>Toc230686579 \h</w:instrText>
             </w:r>
             <w:r>
               <w:rPr>
@@ -5286,117 +4834,14 @@
               <w:rtl/>
             </w:rPr>
           </w:pPr>
-          <w:hyperlink w:anchor="_Toc226822550" w:history="1">
-            <w:r>
-              <w:rPr>
-                <w:rStyle w:val="Hyperlink"/>
-                <w:rFonts w:hint="eastAsia"/>
-                <w:noProof/>
-                <w:rtl/>
-              </w:rPr>
-              <w:t>מה</w:t>
-            </w:r>
-            <w:r>
-              <w:rPr>
-                <w:rStyle w:val="Hyperlink"/>
-                <w:noProof/>
-                <w:rtl/>
-              </w:rPr>
-              <w:t xml:space="preserve"> </w:t>
-            </w:r>
-            <w:r>
-              <w:rPr>
-                <w:rStyle w:val="Hyperlink"/>
-                <w:rFonts w:hint="eastAsia"/>
-                <w:noProof/>
-                <w:rtl/>
-              </w:rPr>
-              <w:t>עדיין</w:t>
-            </w:r>
-            <w:r>
-              <w:rPr>
-                <w:rStyle w:val="Hyperlink"/>
-                <w:noProof/>
-                <w:rtl/>
-              </w:rPr>
-              <w:t xml:space="preserve"> </w:t>
-            </w:r>
-            <w:r>
-              <w:rPr>
-                <w:rStyle w:val="Hyperlink"/>
-                <w:rFonts w:hint="eastAsia"/>
-                <w:noProof/>
-                <w:rtl/>
-              </w:rPr>
-              <w:t>מונע</w:t>
-            </w:r>
-            <w:r>
-              <w:rPr>
-                <w:rStyle w:val="Hyperlink"/>
-                <w:noProof/>
-                <w:rtl/>
-              </w:rPr>
-              <w:t xml:space="preserve"> </w:t>
-            </w:r>
-            <w:r>
-              <w:rPr>
-                <w:rStyle w:val="Hyperlink"/>
-                <w:rFonts w:hint="eastAsia"/>
-                <w:noProof/>
-                <w:rtl/>
-              </w:rPr>
-              <w:t>מהקוד</w:t>
-            </w:r>
-            <w:r>
-              <w:rPr>
-                <w:rStyle w:val="Hyperlink"/>
-                <w:noProof/>
-                <w:rtl/>
-              </w:rPr>
-              <w:t xml:space="preserve"> </w:t>
-            </w:r>
-            <w:r>
-              <w:rPr>
-                <w:rStyle w:val="Hyperlink"/>
-                <w:rFonts w:hint="eastAsia"/>
-                <w:noProof/>
-                <w:rtl/>
-              </w:rPr>
-              <w:t>להיות</w:t>
-            </w:r>
-            <w:r>
-              <w:rPr>
-                <w:rStyle w:val="Hyperlink"/>
-                <w:noProof/>
-                <w:rtl/>
-              </w:rPr>
-              <w:t xml:space="preserve"> </w:t>
-            </w:r>
-            <w:r>
-              <w:rPr>
-                <w:rStyle w:val="Hyperlink"/>
-                <w:rFonts w:hint="eastAsia"/>
-                <w:noProof/>
-                <w:rtl/>
-              </w:rPr>
-              <w:t>ברמה</w:t>
-            </w:r>
-            <w:r>
-              <w:rPr>
-                <w:rStyle w:val="Hyperlink"/>
-                <w:noProof/>
-                <w:rtl/>
-              </w:rPr>
-              <w:t xml:space="preserve"> </w:t>
-            </w:r>
-            <w:r>
-              <w:rPr>
-                <w:rStyle w:val="Hyperlink"/>
-                <w:rFonts w:hint="eastAsia"/>
-                <w:noProof/>
-                <w:rtl/>
-              </w:rPr>
-              <w:t>גבוהה</w:t>
+          <w:hyperlink w:anchor="_Toc230686580" w:history="1">
+            <w:r>
+              <w:rPr>
+                <w:rStyle w:val="Hyperlink"/>
+                <w:noProof/>
+                <w:rtl/>
+              </w:rPr>
+              <w:t>מה עדיין מונע מהקוד להיות ברמה גבוהה</w:t>
             </w:r>
             <w:r>
               <w:rPr>
@@ -5442,7 +4887,7 @@
                 <w:noProof/>
                 <w:webHidden/>
               </w:rPr>
-              <w:instrText>Toc226822550 \h</w:instrText>
+              <w:instrText>Toc230686580 \h</w:instrText>
             </w:r>
             <w:r>
               <w:rPr>
@@ -5499,7 +4944,7 @@
               <w:rtl/>
             </w:rPr>
           </w:pPr>
-          <w:hyperlink w:anchor="_Toc226822551" w:history="1">
+          <w:hyperlink w:anchor="_Toc230686581" w:history="1">
             <w:r>
               <w:rPr>
                 <w:rStyle w:val="Hyperlink"/>
@@ -5551,7 +4996,7 @@
                 <w:noProof/>
                 <w:webHidden/>
               </w:rPr>
-              <w:instrText>Toc226822551 \h</w:instrText>
+              <w:instrText>Toc230686581 \h</w:instrText>
             </w:r>
             <w:r>
               <w:rPr>
@@ -5608,67 +5053,21 @@
               <w:rtl/>
             </w:rPr>
           </w:pPr>
-          <w:hyperlink w:anchor="_Toc226822552" w:history="1">
-            <w:r>
-              <w:rPr>
-                <w:rStyle w:val="Hyperlink"/>
-                <w:rFonts w:hint="eastAsia"/>
-                <w:noProof/>
-                <w:rtl/>
-              </w:rPr>
-              <w:t>תובנות</w:t>
-            </w:r>
-            <w:r>
-              <w:rPr>
-                <w:rStyle w:val="Hyperlink"/>
-                <w:noProof/>
-                <w:rtl/>
-              </w:rPr>
-              <w:t xml:space="preserve">/ </w:t>
-            </w:r>
-            <w:r>
-              <w:rPr>
-                <w:rStyle w:val="Hyperlink"/>
-                <w:rFonts w:hint="eastAsia"/>
-                <w:noProof/>
-                <w:rtl/>
-              </w:rPr>
-              <w:t>מסקנות</w:t>
-            </w:r>
-            <w:r>
-              <w:rPr>
-                <w:rStyle w:val="Hyperlink"/>
-                <w:noProof/>
-                <w:rtl/>
-              </w:rPr>
-              <w:t xml:space="preserve"> </w:t>
-            </w:r>
-            <w:r>
-              <w:rPr>
-                <w:rStyle w:val="Hyperlink"/>
-                <w:rFonts w:hint="eastAsia"/>
-                <w:noProof/>
-                <w:rtl/>
-              </w:rPr>
-              <w:t>מה</w:t>
-            </w:r>
-            <w:r>
-              <w:rPr>
-                <w:rStyle w:val="Hyperlink"/>
-                <w:rFonts w:hint="eastAsia"/>
-                <w:noProof/>
-                <w:rtl/>
-              </w:rPr>
-              <w:t>פ</w:t>
-            </w:r>
-            <w:r>
-              <w:rPr>
-                <w:rStyle w:val="Hyperlink"/>
-                <w:rFonts w:hint="eastAsia"/>
-                <w:noProof/>
-                <w:rtl/>
-              </w:rPr>
-              <w:t>רויקט</w:t>
+          <w:hyperlink w:anchor="_Toc230686582" w:history="1">
+            <w:r>
+              <w:rPr>
+                <w:rStyle w:val="Hyperlink"/>
+                <w:noProof/>
+                <w:rtl/>
+              </w:rPr>
+              <w:t xml:space="preserve">העלאת/ עדכון הקבצים בחשבון </w:t>
+            </w:r>
+            <w:r>
+              <w:rPr>
+                <w:rStyle w:val="Hyperlink"/>
+                <w:noProof/>
+              </w:rPr>
+              <w:t>GitHub</w:t>
             </w:r>
             <w:r>
               <w:rPr>
@@ -5714,7 +5113,7 @@
                 <w:noProof/>
                 <w:webHidden/>
               </w:rPr>
-              <w:instrText>Toc226822552 \h</w:instrText>
+              <w:instrText>Toc230686582 \h</w:instrText>
             </w:r>
             <w:r>
               <w:rPr>
@@ -5746,6 +5145,336 @@
                 <w:rtl/>
               </w:rPr>
               <w:t>20</w:t>
+            </w:r>
+            <w:r>
+              <w:rPr>
+                <w:rStyle w:val="Hyperlink"/>
+                <w:noProof/>
+                <w:rtl/>
+              </w:rPr>
+              <w:fldChar w:fldCharType="end"/>
+            </w:r>
+          </w:hyperlink>
+        </w:p>
+        <w:p>
+          <w:pPr>
+            <w:pStyle w:val="TOC1"/>
+            <w:tabs>
+              <w:tab w:val="right" w:leader="dot" w:pos="8296"/>
+            </w:tabs>
+            <w:rPr>
+              <w:rFonts w:eastAsiaTheme="minorEastAsia"/>
+              <w:noProof/>
+              <w:sz w:val="24"/>
+              <w:szCs w:val="24"/>
+              <w:rtl/>
+            </w:rPr>
+          </w:pPr>
+          <w:hyperlink w:anchor="_Toc230686583" w:history="1">
+            <w:r>
+              <w:rPr>
+                <w:rStyle w:val="Hyperlink"/>
+                <w:noProof/>
+                <w:rtl/>
+              </w:rPr>
+              <w:t>תובנות/ מסקנות מהפרויקט</w:t>
+            </w:r>
+            <w:r>
+              <w:rPr>
+                <w:noProof/>
+                <w:webHidden/>
+                <w:rtl/>
+              </w:rPr>
+              <w:tab/>
+            </w:r>
+            <w:r>
+              <w:rPr>
+                <w:rStyle w:val="Hyperlink"/>
+                <w:noProof/>
+                <w:rtl/>
+              </w:rPr>
+              <w:fldChar w:fldCharType="begin"/>
+            </w:r>
+            <w:r>
+              <w:rPr>
+                <w:noProof/>
+                <w:webHidden/>
+                <w:rtl/>
+              </w:rPr>
+              <w:instrText xml:space="preserve"> </w:instrText>
+            </w:r>
+            <w:r>
+              <w:rPr>
+                <w:noProof/>
+                <w:webHidden/>
+              </w:rPr>
+              <w:instrText>PAGEREF</w:instrText>
+            </w:r>
+            <w:r>
+              <w:rPr>
+                <w:noProof/>
+                <w:webHidden/>
+                <w:rtl/>
+              </w:rPr>
+              <w:instrText xml:space="preserve"> _</w:instrText>
+            </w:r>
+            <w:r>
+              <w:rPr>
+                <w:noProof/>
+                <w:webHidden/>
+              </w:rPr>
+              <w:instrText>Toc230686583 \h</w:instrText>
+            </w:r>
+            <w:r>
+              <w:rPr>
+                <w:noProof/>
+                <w:webHidden/>
+                <w:rtl/>
+              </w:rPr>
+              <w:instrText xml:space="preserve"> </w:instrText>
+            </w:r>
+            <w:r>
+              <w:rPr>
+                <w:rStyle w:val="Hyperlink"/>
+                <w:noProof/>
+                <w:rtl/>
+              </w:rPr>
+            </w:r>
+            <w:r>
+              <w:rPr>
+                <w:rStyle w:val="Hyperlink"/>
+                <w:noProof/>
+                <w:rtl/>
+              </w:rPr>
+              <w:fldChar w:fldCharType="separate"/>
+            </w:r>
+            <w:r>
+              <w:rPr>
+                <w:noProof/>
+                <w:webHidden/>
+                <w:rtl/>
+              </w:rPr>
+              <w:t>21</w:t>
+            </w:r>
+            <w:r>
+              <w:rPr>
+                <w:rStyle w:val="Hyperlink"/>
+                <w:noProof/>
+                <w:rtl/>
+              </w:rPr>
+              <w:fldChar w:fldCharType="end"/>
+            </w:r>
+          </w:hyperlink>
+        </w:p>
+        <w:p>
+          <w:pPr>
+            <w:pStyle w:val="TOC1"/>
+            <w:tabs>
+              <w:tab w:val="right" w:leader="dot" w:pos="8296"/>
+            </w:tabs>
+            <w:rPr>
+              <w:rFonts w:eastAsiaTheme="minorEastAsia"/>
+              <w:noProof/>
+              <w:sz w:val="24"/>
+              <w:szCs w:val="24"/>
+              <w:rtl/>
+            </w:rPr>
+          </w:pPr>
+          <w:hyperlink w:anchor="_Toc230686584" w:history="1">
+            <w:r>
+              <w:rPr>
+                <w:rStyle w:val="Hyperlink"/>
+                <w:noProof/>
+                <w:rtl/>
+              </w:rPr>
+              <w:t>משימות</w:t>
+            </w:r>
+            <w:r>
+              <w:rPr>
+                <w:noProof/>
+                <w:webHidden/>
+                <w:rtl/>
+              </w:rPr>
+              <w:tab/>
+            </w:r>
+            <w:r>
+              <w:rPr>
+                <w:rStyle w:val="Hyperlink"/>
+                <w:noProof/>
+                <w:rtl/>
+              </w:rPr>
+              <w:fldChar w:fldCharType="begin"/>
+            </w:r>
+            <w:r>
+              <w:rPr>
+                <w:noProof/>
+                <w:webHidden/>
+                <w:rtl/>
+              </w:rPr>
+              <w:instrText xml:space="preserve"> </w:instrText>
+            </w:r>
+            <w:r>
+              <w:rPr>
+                <w:noProof/>
+                <w:webHidden/>
+              </w:rPr>
+              <w:instrText>PAGEREF</w:instrText>
+            </w:r>
+            <w:r>
+              <w:rPr>
+                <w:noProof/>
+                <w:webHidden/>
+                <w:rtl/>
+              </w:rPr>
+              <w:instrText xml:space="preserve"> _</w:instrText>
+            </w:r>
+            <w:r>
+              <w:rPr>
+                <w:noProof/>
+                <w:webHidden/>
+              </w:rPr>
+              <w:instrText>Toc230686584 \h</w:instrText>
+            </w:r>
+            <w:r>
+              <w:rPr>
+                <w:noProof/>
+                <w:webHidden/>
+                <w:rtl/>
+              </w:rPr>
+              <w:instrText xml:space="preserve"> </w:instrText>
+            </w:r>
+            <w:r>
+              <w:rPr>
+                <w:rStyle w:val="Hyperlink"/>
+                <w:noProof/>
+                <w:rtl/>
+              </w:rPr>
+            </w:r>
+            <w:r>
+              <w:rPr>
+                <w:rStyle w:val="Hyperlink"/>
+                <w:noProof/>
+                <w:rtl/>
+              </w:rPr>
+              <w:fldChar w:fldCharType="separate"/>
+            </w:r>
+            <w:r>
+              <w:rPr>
+                <w:noProof/>
+                <w:webHidden/>
+                <w:rtl/>
+              </w:rPr>
+              <w:t>24</w:t>
+            </w:r>
+            <w:r>
+              <w:rPr>
+                <w:rStyle w:val="Hyperlink"/>
+                <w:noProof/>
+                <w:rtl/>
+              </w:rPr>
+              <w:fldChar w:fldCharType="end"/>
+            </w:r>
+          </w:hyperlink>
+        </w:p>
+        <w:p>
+          <w:pPr>
+            <w:pStyle w:val="TOC2"/>
+            <w:tabs>
+              <w:tab w:val="right" w:leader="dot" w:pos="8296"/>
+            </w:tabs>
+            <w:rPr>
+              <w:rFonts w:eastAsiaTheme="minorEastAsia"/>
+              <w:noProof/>
+              <w:sz w:val="24"/>
+              <w:szCs w:val="24"/>
+              <w:rtl/>
+            </w:rPr>
+          </w:pPr>
+          <w:hyperlink w:anchor="_Toc230686585" w:history="1">
+            <w:r>
+              <w:rPr>
+                <w:rStyle w:val="Hyperlink"/>
+                <w:noProof/>
+                <w:rtl/>
+              </w:rPr>
+              <w:t>מבנה של כל קובץ חדש שאתה יוצר</w:t>
+            </w:r>
+            <w:r>
+              <w:rPr>
+                <w:noProof/>
+                <w:webHidden/>
+                <w:rtl/>
+              </w:rPr>
+              <w:tab/>
+            </w:r>
+            <w:r>
+              <w:rPr>
+                <w:rStyle w:val="Hyperlink"/>
+                <w:noProof/>
+                <w:rtl/>
+              </w:rPr>
+              <w:fldChar w:fldCharType="begin"/>
+            </w:r>
+            <w:r>
+              <w:rPr>
+                <w:noProof/>
+                <w:webHidden/>
+                <w:rtl/>
+              </w:rPr>
+              <w:instrText xml:space="preserve"> </w:instrText>
+            </w:r>
+            <w:r>
+              <w:rPr>
+                <w:noProof/>
+                <w:webHidden/>
+              </w:rPr>
+              <w:instrText>PAGEREF</w:instrText>
+            </w:r>
+            <w:r>
+              <w:rPr>
+                <w:noProof/>
+                <w:webHidden/>
+                <w:rtl/>
+              </w:rPr>
+              <w:instrText xml:space="preserve"> _</w:instrText>
+            </w:r>
+            <w:r>
+              <w:rPr>
+                <w:noProof/>
+                <w:webHidden/>
+              </w:rPr>
+              <w:instrText>Toc230686585 \h</w:instrText>
+            </w:r>
+            <w:r>
+              <w:rPr>
+                <w:noProof/>
+                <w:webHidden/>
+                <w:rtl/>
+              </w:rPr>
+              <w:instrText xml:space="preserve"> </w:instrText>
+            </w:r>
+            <w:r>
+              <w:rPr>
+                <w:rStyle w:val="Hyperlink"/>
+                <w:noProof/>
+                <w:rtl/>
+              </w:rPr>
+            </w:r>
+            <w:r>
+              <w:rPr>
+                <w:rStyle w:val="Hyperlink"/>
+                <w:noProof/>
+                <w:rtl/>
+              </w:rPr>
+              <w:fldChar w:fldCharType="separate"/>
+            </w:r>
+            <w:r>
+              <w:rPr>
+                <w:noProof/>
+                <w:webHidden/>
+                <w:rtl/>
+              </w:rPr>
+              <w:t>24</w:t>
             </w:r>
             <w:r>
               <w:rPr>
@@ -5931,40 +5660,10 @@
     </w:p>
     <w:p>
       <w:pPr>
-        <w:rPr>
-          <w:sz w:val="40"/>
-          <w:szCs w:val="40"/>
+        <w:pStyle w:val="1"/>
+        <w:rPr>
           <w:u w:val="single"/>
           <w:rtl/>
-        </w:rPr>
-      </w:pPr>
-    </w:p>
-    <w:p>
-      <w:pPr>
-        <w:rPr>
-          <w:sz w:val="40"/>
-          <w:szCs w:val="40"/>
-          <w:u w:val="single"/>
-          <w:rtl/>
-        </w:rPr>
-      </w:pPr>
-    </w:p>
-    <w:p>
-      <w:pPr>
-        <w:rPr>
-          <w:sz w:val="40"/>
-          <w:szCs w:val="40"/>
-          <w:u w:val="single"/>
-          <w:rtl/>
-        </w:rPr>
-      </w:pPr>
-    </w:p>
-    <w:p>
-      <w:pPr>
-        <w:rPr>
-          <w:sz w:val="40"/>
-          <w:szCs w:val="40"/>
-          <w:u w:val="single"/>
         </w:rPr>
       </w:pPr>
     </w:p>
@@ -5977,7 +5676,7 @@
           <w:rtl/>
         </w:rPr>
       </w:pPr>
-      <w:bookmarkStart w:id="2" w:name="_Toc226822508"/>
+      <w:bookmarkStart w:id="2" w:name="_Toc230686538"/>
       <w:r>
         <w:rPr>
           <w:rFonts w:hint="cs"/>
@@ -5996,7 +5695,7 @@
           <w:szCs w:val="28"/>
         </w:rPr>
       </w:pPr>
-      <w:bookmarkStart w:id="3" w:name="_Toc226822509"/>
+      <w:bookmarkStart w:id="3" w:name="_Toc230686539"/>
       <w:r>
         <w:rPr>
           <w:rStyle w:val="20"/>
@@ -6046,7 +5745,7 @@
           <w:szCs w:val="28"/>
         </w:rPr>
       </w:pPr>
-      <w:bookmarkStart w:id="4" w:name="_Toc226822510"/>
+      <w:bookmarkStart w:id="4" w:name="_Toc230686540"/>
       <w:r>
         <w:rPr>
           <w:rStyle w:val="20"/>
@@ -6170,7 +5869,7 @@
           <w:szCs w:val="28"/>
         </w:rPr>
       </w:pPr>
-      <w:bookmarkStart w:id="5" w:name="_Toc226822511"/>
+      <w:bookmarkStart w:id="5" w:name="_Toc230686541"/>
       <w:r>
         <w:rPr>
           <w:rStyle w:val="20"/>
@@ -6500,7 +6199,7 @@
           <w:rtl/>
         </w:rPr>
       </w:pPr>
-      <w:bookmarkStart w:id="6" w:name="_Toc226822512"/>
+      <w:bookmarkStart w:id="6" w:name="_Toc230686542"/>
       <w:r>
         <w:rPr>
           <w:rFonts w:hint="cs"/>
@@ -6818,7 +6517,7 @@
           <w:szCs w:val="28"/>
         </w:rPr>
       </w:pPr>
-      <w:bookmarkStart w:id="7" w:name="_Toc226822513"/>
+      <w:bookmarkStart w:id="7" w:name="_Toc230686543"/>
       <w:r>
         <w:rPr>
           <w:rStyle w:val="20"/>
@@ -6868,7 +6567,7 @@
           <w:szCs w:val="28"/>
         </w:rPr>
       </w:pPr>
-      <w:bookmarkStart w:id="8" w:name="_Toc226822514"/>
+      <w:bookmarkStart w:id="8" w:name="_Toc230686544"/>
       <w:r>
         <w:rPr>
           <w:rStyle w:val="20"/>
@@ -6964,7 +6663,7 @@
           <w:szCs w:val="28"/>
         </w:rPr>
       </w:pPr>
-      <w:bookmarkStart w:id="9" w:name="_Toc226822515"/>
+      <w:bookmarkStart w:id="9" w:name="_Toc230686545"/>
       <w:r>
         <w:rPr>
           <w:rStyle w:val="20"/>
@@ -7134,7 +6833,7 @@
           <w:szCs w:val="28"/>
         </w:rPr>
       </w:pPr>
-      <w:bookmarkStart w:id="10" w:name="_Toc226822516"/>
+      <w:bookmarkStart w:id="10" w:name="_Toc230686546"/>
       <w:r>
         <w:rPr>
           <w:rStyle w:val="20"/>
@@ -7190,7 +6889,7 @@
           <w:szCs w:val="28"/>
         </w:rPr>
       </w:pPr>
-      <w:bookmarkStart w:id="11" w:name="_Toc226822517"/>
+      <w:bookmarkStart w:id="11" w:name="_Toc230686547"/>
       <w:r>
         <w:rPr>
           <w:rStyle w:val="20"/>
@@ -7279,7 +6978,7 @@
           <w:szCs w:val="28"/>
         </w:rPr>
       </w:pPr>
-      <w:bookmarkStart w:id="12" w:name="_Toc226822518"/>
+      <w:bookmarkStart w:id="12" w:name="_Toc230686548"/>
       <w:r>
         <w:rPr>
           <w:rStyle w:val="20"/>
@@ -7420,7 +7119,7 @@
           <w:szCs w:val="28"/>
         </w:rPr>
       </w:pPr>
-      <w:bookmarkStart w:id="13" w:name="_Toc226822519"/>
+      <w:bookmarkStart w:id="13" w:name="_Toc230686549"/>
       <w:r>
         <w:rPr>
           <w:rStyle w:val="20"/>
@@ -7653,7 +7352,7 @@
           <w:rtl/>
         </w:rPr>
       </w:pPr>
-      <w:bookmarkStart w:id="14" w:name="_Toc226822520"/>
+      <w:bookmarkStart w:id="14" w:name="_Toc230686550"/>
       <w:r>
         <w:rPr>
           <w:rFonts w:hint="cs"/>
@@ -7727,7 +7426,7 @@
           <w:szCs w:val="28"/>
         </w:rPr>
       </w:pPr>
-      <w:bookmarkStart w:id="15" w:name="_Toc226822521"/>
+      <w:bookmarkStart w:id="15" w:name="_Toc230686551"/>
       <w:r>
         <w:rPr>
           <w:rStyle w:val="20"/>
@@ -7991,7 +7690,7 @@
           <w:u w:val="single"/>
         </w:rPr>
       </w:pPr>
-      <w:bookmarkStart w:id="16" w:name="_Toc226822522"/>
+      <w:bookmarkStart w:id="16" w:name="_Toc230686552"/>
       <w:r>
         <w:rPr>
           <w:u w:val="single"/>
@@ -8025,7 +7724,7 @@
           <w:u w:val="single"/>
         </w:rPr>
       </w:pPr>
-      <w:bookmarkStart w:id="17" w:name="_Toc226822523"/>
+      <w:bookmarkStart w:id="17" w:name="_Toc230686553"/>
       <w:r>
         <w:rPr>
           <w:u w:val="single"/>
@@ -8043,7 +7742,7 @@
           <w:szCs w:val="28"/>
         </w:rPr>
       </w:pPr>
-      <w:bookmarkStart w:id="18" w:name="_Toc226822524"/>
+      <w:bookmarkStart w:id="18" w:name="_Toc230686554"/>
       <w:r>
         <w:rPr>
           <w:rStyle w:val="30"/>
@@ -8081,7 +7780,7 @@
           <w:szCs w:val="28"/>
         </w:rPr>
       </w:pPr>
-      <w:bookmarkStart w:id="19" w:name="_Toc226822525"/>
+      <w:bookmarkStart w:id="19" w:name="_Toc230686555"/>
       <w:r>
         <w:rPr>
           <w:rStyle w:val="20"/>
@@ -8233,7 +7932,7 @@
           <w:szCs w:val="28"/>
         </w:rPr>
       </w:pPr>
-      <w:bookmarkStart w:id="20" w:name="_Toc226822526"/>
+      <w:bookmarkStart w:id="20" w:name="_Toc230686556"/>
       <w:r>
         <w:rPr>
           <w:rStyle w:val="30"/>
@@ -8271,7 +7970,7 @@
           <w:szCs w:val="28"/>
         </w:rPr>
       </w:pPr>
-      <w:bookmarkStart w:id="21" w:name="_Toc226822527"/>
+      <w:bookmarkStart w:id="21" w:name="_Toc230686557"/>
       <w:r>
         <w:rPr>
           <w:rStyle w:val="30"/>
@@ -8441,7 +8140,7 @@
           <w:szCs w:val="28"/>
         </w:rPr>
       </w:pPr>
-      <w:bookmarkStart w:id="22" w:name="_Toc226822528"/>
+      <w:bookmarkStart w:id="22" w:name="_Toc230686558"/>
       <w:r>
         <w:rPr>
           <w:rStyle w:val="30"/>
@@ -8592,7 +8291,7 @@
           <w:szCs w:val="28"/>
         </w:rPr>
       </w:pPr>
-      <w:bookmarkStart w:id="23" w:name="_Toc226822529"/>
+      <w:bookmarkStart w:id="23" w:name="_Toc230686559"/>
       <w:r>
         <w:rPr>
           <w:rStyle w:val="30"/>
@@ -8749,7 +8448,7 @@
           <w:szCs w:val="28"/>
         </w:rPr>
       </w:pPr>
-      <w:bookmarkStart w:id="24" w:name="_Toc226822530"/>
+      <w:bookmarkStart w:id="24" w:name="_Toc230686560"/>
       <w:r>
         <w:rPr>
           <w:rStyle w:val="30"/>
@@ -8881,7 +8580,7 @@
           <w:szCs w:val="28"/>
         </w:rPr>
       </w:pPr>
-      <w:bookmarkStart w:id="25" w:name="_Toc226822531"/>
+      <w:bookmarkStart w:id="25" w:name="_Toc230686561"/>
       <w:r>
         <w:rPr>
           <w:rStyle w:val="30"/>
@@ -9030,7 +8729,7 @@
           <w:szCs w:val="28"/>
         </w:rPr>
       </w:pPr>
-      <w:bookmarkStart w:id="26" w:name="_Toc226822532"/>
+      <w:bookmarkStart w:id="26" w:name="_Toc230686562"/>
       <w:r>
         <w:rPr>
           <w:rStyle w:val="30"/>
@@ -9180,7 +8879,7 @@
           <w:szCs w:val="28"/>
         </w:rPr>
       </w:pPr>
-      <w:bookmarkStart w:id="27" w:name="_Toc226822533"/>
+      <w:bookmarkStart w:id="27" w:name="_Toc230686563"/>
       <w:r>
         <w:rPr>
           <w:rStyle w:val="30"/>
@@ -9213,7 +8912,7 @@
           <w:szCs w:val="28"/>
         </w:rPr>
       </w:pPr>
-      <w:bookmarkStart w:id="28" w:name="_Toc226822534"/>
+      <w:bookmarkStart w:id="28" w:name="_Toc230686564"/>
       <w:r>
         <w:rPr>
           <w:rStyle w:val="30"/>
@@ -9251,7 +8950,7 @@
           <w:szCs w:val="28"/>
         </w:rPr>
       </w:pPr>
-      <w:bookmarkStart w:id="29" w:name="_Toc226822535"/>
+      <w:bookmarkStart w:id="29" w:name="_Toc230686565"/>
       <w:r>
         <w:rPr>
           <w:rStyle w:val="30"/>
@@ -9529,7 +9228,7 @@
           <w:rtl/>
         </w:rPr>
       </w:pPr>
-      <w:bookmarkStart w:id="30" w:name="_Toc226822536"/>
+      <w:bookmarkStart w:id="30" w:name="_Toc230686566"/>
       <w:r>
         <w:rPr>
           <w:rFonts w:hint="cs"/>
@@ -9548,7 +9247,7 @@
           <w:rtl/>
         </w:rPr>
       </w:pPr>
-      <w:bookmarkStart w:id="31" w:name="_Toc226822537"/>
+      <w:bookmarkStart w:id="31" w:name="_Toc230686567"/>
       <w:r>
         <w:rPr>
           <w:rFonts w:hint="cs"/>
@@ -9609,7 +9308,7 @@
           <w:rtl/>
         </w:rPr>
       </w:pPr>
-      <w:bookmarkStart w:id="32" w:name="_Toc226822538"/>
+      <w:bookmarkStart w:id="32" w:name="_Toc230686568"/>
       <w:r>
         <w:rPr>
           <w:rFonts w:hint="cs"/>
@@ -9919,7 +9618,7 @@
           <w:rtl/>
         </w:rPr>
       </w:pPr>
-      <w:bookmarkStart w:id="33" w:name="_Toc226822539"/>
+      <w:bookmarkStart w:id="33" w:name="_Toc230686569"/>
       <w:r>
         <w:rPr>
           <w:rFonts w:hint="cs"/>
@@ -10083,7 +9782,7 @@
           <w:rtl/>
         </w:rPr>
       </w:pPr>
-      <w:bookmarkStart w:id="34" w:name="_Toc226822540"/>
+      <w:bookmarkStart w:id="34" w:name="_Toc230686570"/>
       <w:r>
         <w:rPr>
           <w:rFonts w:eastAsiaTheme="minorEastAsia" w:hint="cs"/>
@@ -10248,7 +9947,7 @@
           <w:rtl/>
         </w:rPr>
       </w:pPr>
-      <w:bookmarkStart w:id="35" w:name="_Toc226822541"/>
+      <w:bookmarkStart w:id="35" w:name="_Toc230686571"/>
       <w:r>
         <w:rPr>
           <w:rFonts w:hint="cs"/>
@@ -10268,7 +9967,7 @@
           <w:rtl/>
         </w:rPr>
       </w:pPr>
-      <w:bookmarkStart w:id="36" w:name="_Toc226822542"/>
+      <w:bookmarkStart w:id="36" w:name="_Toc230686572"/>
       <w:r>
         <w:rPr>
           <w:rFonts w:cs="Times New Roman"/>
@@ -10321,7 +10020,7 @@
           <w:rtl/>
         </w:rPr>
       </w:pPr>
-      <w:bookmarkStart w:id="37" w:name="_Toc226822543"/>
+      <w:bookmarkStart w:id="37" w:name="_Toc230686573"/>
       <w:r>
         <w:rPr>
           <w:rFonts w:hint="cs"/>
@@ -10451,7 +10150,7 @@
           <w:rtl/>
         </w:rPr>
       </w:pPr>
-      <w:bookmarkStart w:id="38" w:name="_Toc226822544"/>
+      <w:bookmarkStart w:id="38" w:name="_Toc230686574"/>
       <w:r>
         <w:rPr>
           <w:rFonts w:hint="cs"/>
@@ -10669,7 +10368,7 @@
           <w:rtl/>
         </w:rPr>
       </w:pPr>
-      <w:bookmarkStart w:id="39" w:name="_Toc226822545"/>
+      <w:bookmarkStart w:id="39" w:name="_Toc230686575"/>
       <w:r>
         <w:rPr>
           <w:rFonts w:hint="cs"/>
@@ -11044,7 +10743,7 @@
           <w:u w:val="single"/>
         </w:rPr>
       </w:pPr>
-      <w:bookmarkStart w:id="40" w:name="_Toc226822546"/>
+      <w:bookmarkStart w:id="40" w:name="_Toc230686576"/>
       <w:r>
         <w:rPr>
           <w:u w:val="single"/>
@@ -11484,7 +11183,7 @@
           <w:rtl/>
         </w:rPr>
       </w:pPr>
-      <w:bookmarkStart w:id="41" w:name="_Toc226822547"/>
+      <w:bookmarkStart w:id="41" w:name="_Toc230686577"/>
       <w:r>
         <w:rPr>
           <w:u w:val="single"/>
@@ -11756,7 +11455,7 @@
           <w:rtl/>
         </w:rPr>
       </w:pPr>
-      <w:bookmarkStart w:id="42" w:name="_Toc226822548"/>
+      <w:bookmarkStart w:id="42" w:name="_Toc230686578"/>
       <w:r>
         <w:rPr>
           <w:rFonts w:hint="cs"/>
@@ -12111,7 +11810,7 @@
           <w:rtl/>
         </w:rPr>
       </w:pPr>
-      <w:bookmarkStart w:id="43" w:name="_Toc226822549"/>
+      <w:bookmarkStart w:id="43" w:name="_Toc230686579"/>
       <w:r>
         <w:rPr>
           <w:rFonts w:hint="cs"/>
@@ -12460,6 +12159,97 @@
     </w:p>
     <w:p>
       <w:pPr>
+        <w:pStyle w:val="a9"/>
+        <w:numPr>
+          <w:ilvl w:val="0"/>
+          <w:numId w:val="20"/>
+        </w:numPr>
+        <w:rPr>
+          <w:sz w:val="28"/>
+          <w:szCs w:val="28"/>
+        </w:rPr>
+      </w:pPr>
+      <w:r>
+        <w:rPr>
+          <w:rFonts w:hint="cs"/>
+          <w:sz w:val="28"/>
+          <w:szCs w:val="28"/>
+          <w:rtl/>
+        </w:rPr>
+        <w:t>תסיים את התיקונים של ה</w:t>
+      </w:r>
+      <w:r>
+        <w:rPr>
+          <w:sz w:val="28"/>
+          <w:szCs w:val="28"/>
+        </w:rPr>
+        <w:t>refactor</w:t>
+      </w:r>
+      <w:r>
+        <w:rPr>
+          <w:rFonts w:hint="cs"/>
+          <w:sz w:val="28"/>
+          <w:szCs w:val="28"/>
+          <w:rtl/>
+        </w:rPr>
+        <w:t xml:space="preserve"> של הצ'אט.</w:t>
+      </w:r>
+    </w:p>
+    <w:p>
+      <w:pPr>
+        <w:pStyle w:val="2"/>
+        <w:rPr>
+          <w:u w:val="single"/>
+          <w:rtl/>
+        </w:rPr>
+      </w:pPr>
+      <w:r>
+        <w:rPr>
+          <w:u w:val="single"/>
+        </w:rPr>
+        <w:t>Testing</w:t>
+      </w:r>
+      <w:r>
+        <w:rPr>
+          <w:rFonts w:hint="cs"/>
+          <w:u w:val="single"/>
+          <w:rtl/>
+        </w:rPr>
+        <w:t>:</w:t>
+      </w:r>
+    </w:p>
+    <w:p>
+      <w:pPr>
+        <w:pStyle w:val="a9"/>
+        <w:numPr>
+          <w:ilvl w:val="1"/>
+          <w:numId w:val="12"/>
+        </w:numPr>
+      </w:pPr>
+      <w:r>
+        <w:rPr>
+          <w:rFonts w:hint="cs"/>
+          <w:sz w:val="28"/>
+          <w:szCs w:val="28"/>
+          <w:rtl/>
+        </w:rPr>
+        <w:t>צריך לעשות מבחנים לקוד, לראות שכל פונקציה שהגדרנו עושה את מה שהיא אמורה לעשות.</w:t>
+      </w:r>
+    </w:p>
+    <w:p>
+      <w:pPr>
+        <w:pStyle w:val="a9"/>
+        <w:numPr>
+          <w:ilvl w:val="1"/>
+          <w:numId w:val="12"/>
+        </w:numPr>
+        <w:rPr>
+          <w:rtl/>
+        </w:rPr>
+      </w:pPr>
+    </w:p>
+    <w:p>
+      <w:pPr>
         <w:rPr>
           <w:sz w:val="28"/>
           <w:szCs w:val="28"/>
@@ -12602,14 +12392,13 @@
           <w:rtl/>
         </w:rPr>
       </w:pPr>
-      <w:bookmarkStart w:id="44" w:name="_Toc226822550"/>
+      <w:bookmarkStart w:id="44" w:name="_Toc230686580"/>
       <w:r>
         <w:rPr>
           <w:rFonts w:hint="cs"/>
           <w:u w:val="single"/>
           <w:rtl/>
         </w:rPr>
-        <w:lastRenderedPageBreak/>
         <w:t>מה עדיין מונע מהקוד להיות ברמה גבוהה</w:t>
       </w:r>
       <w:bookmarkEnd w:id="44"/>
@@ -12734,15 +12523,7 @@
       </w:r>
       <w:proofErr w:type="gramEnd"/>
       <w:r>
-        <w:t xml:space="preserve"> to save on </w:t>
-      </w:r>
-      <w:proofErr w:type="gramStart"/>
-      <w:r>
-        <w:t>compute</w:t>
-      </w:r>
-      <w:proofErr w:type="gramEnd"/>
-      <w:r>
-        <w:t xml:space="preserve"> costs.</w:t>
+        <w:t xml:space="preserve"> to save on compute costs.</w:t>
       </w:r>
     </w:p>
     <w:p>
@@ -12753,7 +12534,7 @@
           <w:u w:val="single"/>
         </w:rPr>
       </w:pPr>
-      <w:bookmarkStart w:id="45" w:name="_Toc226822551"/>
+      <w:bookmarkStart w:id="45" w:name="_Toc230686581"/>
       <w:r>
         <w:rPr>
           <w:u w:val="single"/>
@@ -13108,13 +12889,13 @@
           <w:rtl/>
         </w:rPr>
       </w:pPr>
+      <w:bookmarkStart w:id="46" w:name="_Toc230686582"/>
       <w:r>
         <w:rPr>
           <w:rFonts w:hint="cs"/>
           <w:u w:val="single"/>
           <w:rtl/>
         </w:rPr>
-        <w:lastRenderedPageBreak/>
         <w:t xml:space="preserve">העלאת/ עדכון הקבצים בחשבון </w:t>
       </w:r>
       <w:r>
@@ -13123,6 +12904,7 @@
         </w:rPr>
         <w:t>GitHub</w:t>
       </w:r>
+      <w:bookmarkEnd w:id="46"/>
     </w:p>
     <w:p>
       <w:pPr>
@@ -13205,7 +12987,6 @@
         <w:pStyle w:val="a9"/>
         <w:ind w:left="1440"/>
         <w:rPr>
-          <w:rFonts w:hint="cs"/>
           <w:sz w:val="28"/>
           <w:szCs w:val="28"/>
           <w:rtl/>
@@ -13214,6 +12995,7 @@
       <w:r>
         <w:rPr>
           <w:rFonts w:cs="Arial"/>
+          <w:noProof/>
           <w:sz w:val="28"/>
           <w:szCs w:val="28"/>
           <w:rtl/>
@@ -13315,6 +13097,7 @@
       <w:r>
         <w:rPr>
           <w:rFonts w:cs="Arial"/>
+          <w:noProof/>
           <w:sz w:val="28"/>
           <w:szCs w:val="28"/>
           <w:rtl/>
@@ -13390,6 +13173,7 @@
       <w:r>
         <w:rPr>
           <w:rFonts w:cs="Arial"/>
+          <w:noProof/>
           <w:sz w:val="28"/>
           <w:szCs w:val="28"/>
           <w:rtl/>
@@ -13453,6 +13237,25 @@
     <w:p>
       <w:pPr>
         <w:pStyle w:val="a9"/>
+        <w:rPr>
+          <w:sz w:val="28"/>
+          <w:szCs w:val="28"/>
+        </w:rPr>
+      </w:pPr>
+      <w:r>
+        <w:rPr>
+          <w:rFonts w:hint="cs"/>
+          <w:sz w:val="28"/>
+          <w:szCs w:val="28"/>
+          <w:rtl/>
+        </w:rPr>
+        <w:lastRenderedPageBreak/>
+        <w:t>אם אתה רוצה קובץ מסוים ולא את כולם, אתה מחליף את ה "." בשם של הקובץ.</w:t>
+      </w:r>
+    </w:p>
+    <w:p>
+      <w:pPr>
+        <w:pStyle w:val="a9"/>
         <w:numPr>
           <w:ilvl w:val="0"/>
           <w:numId w:val="12"/>
@@ -13484,6 +13287,7 @@
       <w:r>
         <w:rPr>
           <w:rFonts w:cs="Arial"/>
+          <w:noProof/>
           <w:sz w:val="28"/>
           <w:szCs w:val="28"/>
           <w:rtl/>
@@ -13567,7 +13371,6 @@
       <w:pPr>
         <w:pStyle w:val="a9"/>
         <w:rPr>
-          <w:rFonts w:hint="cs"/>
           <w:sz w:val="28"/>
           <w:szCs w:val="28"/>
           <w:rtl/>
@@ -13576,11 +13379,11 @@
       <w:r>
         <w:rPr>
           <w:rFonts w:cs="Arial"/>
-          <w:sz w:val="28"/>
-          <w:szCs w:val="28"/>
-          <w:rtl/>
-        </w:rPr>
-        <w:lastRenderedPageBreak/>
+          <w:noProof/>
+          <w:sz w:val="28"/>
+          <w:szCs w:val="28"/>
+          <w:rtl/>
+        </w:rPr>
         <w:drawing>
           <wp:inline distT="0" distB="0" distL="0" distR="0" wp14:anchorId="4248944B" wp14:editId="756DDFE1">
             <wp:extent cx="4725059" cy="1467055"/>
@@ -13679,6 +13482,79 @@
     <w:p>
       <w:pPr>
         <w:pStyle w:val="a9"/>
+        <w:rPr>
+          <w:sz w:val="28"/>
+          <w:szCs w:val="28"/>
+          <w:rtl/>
+        </w:rPr>
+      </w:pPr>
+      <w:r>
+        <w:rPr>
+          <w:rFonts w:cs="Arial"/>
+          <w:noProof/>
+          <w:sz w:val="28"/>
+          <w:szCs w:val="28"/>
+          <w:rtl/>
+        </w:rPr>
+        <w:drawing>
+          <wp:inline distT="0" distB="0" distL="0" distR="0" wp14:anchorId="109A059C" wp14:editId="6F9BE237">
+            <wp:extent cx="5274310" cy="396240"/>
+            <wp:effectExtent l="0" t="0" r="2540" b="3810"/>
+            <wp:docPr id="1254948919" name="תמונה 1"/>
+            <wp:cNvGraphicFramePr>
+              <a:graphicFrameLocks xmlns:a="http://schemas.openxmlformats.org/drawingml/2006/main" noChangeAspect="1"/>
+            </wp:cNvGraphicFramePr>
+            <a:graphic xmlns:a="http://schemas.openxmlformats.org/drawingml/2006/main">
+              <a:graphicData uri="http://schemas.openxmlformats.org/drawingml/2006/picture">
+                <pic:pic xmlns:pic="http://schemas.openxmlformats.org/drawingml/2006/picture">
+                  <pic:nvPicPr>
+                    <pic:cNvPr id="1254948919" name=""/>
+                    <pic:cNvPicPr/>
+                  </pic:nvPicPr>
+                  <pic:blipFill>
+                    <a:blip r:embed="rId13"/>
+                    <a:stretch>
+                      <a:fillRect/>
+                    </a:stretch>
+                  </pic:blipFill>
+                  <pic:spPr>
+                    <a:xfrm>
+                      <a:off x="0" y="0"/>
+                      <a:ext cx="5274310" cy="396240"/>
+                    </a:xfrm>
+                    <a:prstGeom prst="rect">
+                      <a:avLst/>
+                    </a:prstGeom>
+                  </pic:spPr>
+                </pic:pic>
+              </a:graphicData>
+            </a:graphic>
+          </wp:inline>
+        </w:drawing>
+      </w:r>
+    </w:p>
+    <w:p>
+      <w:pPr>
+        <w:pStyle w:val="a9"/>
+        <w:rPr>
+          <w:sz w:val="28"/>
+          <w:szCs w:val="28"/>
+          <w:rtl/>
+        </w:rPr>
+      </w:pPr>
+      <w:r>
+        <w:rPr>
+          <w:rFonts w:hint="cs"/>
+          <w:sz w:val="28"/>
+          <w:szCs w:val="28"/>
+          <w:rtl/>
+        </w:rPr>
+        <w:t>אפשר לראות כי מופיע לנו שהקבצים עודכנו.</w:t>
+      </w:r>
+    </w:p>
+    <w:p>
+      <w:pPr>
+        <w:pStyle w:val="a9"/>
         <w:numPr>
           <w:ilvl w:val="0"/>
           <w:numId w:val="12"/>
@@ -13751,7 +13627,7 @@
           <w:rtl/>
         </w:rPr>
       </w:pPr>
-      <w:bookmarkStart w:id="46" w:name="_Toc226822552"/>
+      <w:bookmarkStart w:id="47" w:name="_Toc230686583"/>
       <w:r>
         <w:rPr>
           <w:rFonts w:hint="cs"/>
@@ -13760,7 +13636,7 @@
         </w:rPr>
         <w:t>תובנות/ מסקנות מהפרויקט</w:t>
       </w:r>
-      <w:bookmarkEnd w:id="46"/>
+      <w:bookmarkEnd w:id="47"/>
     </w:p>
     <w:p>
       <w:pPr>
@@ -13991,6 +13867,7 @@
           <w:szCs w:val="28"/>
           <w:rtl/>
         </w:rPr>
+        <w:lastRenderedPageBreak/>
         <w:t>קובץ אחד הוא על ה</w:t>
       </w:r>
       <w:r>
@@ -14289,7 +14166,6 @@
           <w:szCs w:val="28"/>
           <w:rtl/>
         </w:rPr>
-        <w:lastRenderedPageBreak/>
         <w:t>אם זה היה קריטי, אולי הייתי עובר ל</w:t>
       </w:r>
       <w:r>
@@ -14997,6 +14873,7 @@
           <w:szCs w:val="28"/>
           <w:rtl/>
         </w:rPr>
+        <w:lastRenderedPageBreak/>
         <w:t xml:space="preserve">מודולריות של קוד </w:t>
       </w:r>
       <w:r>
@@ -15069,7 +14946,25 @@
           <w:szCs w:val="28"/>
           <w:rtl/>
         </w:rPr>
-        <w:t xml:space="preserve"> גם אם מדובר בפונקציה שלדתך היא חד פעמית, תעשה אותה הכי טובה שאפשר, ובצורה הכי יעילה שאפשר.</w:t>
+        <w:t xml:space="preserve"> גם אם מדובר בפונקציה שלד</w:t>
+      </w:r>
+      <w:r>
+        <w:rPr>
+          <w:rFonts w:hint="cs"/>
+          <w:sz w:val="28"/>
+          <w:szCs w:val="28"/>
+          <w:rtl/>
+        </w:rPr>
+        <w:t>ע</w:t>
+      </w:r>
+      <w:r>
+        <w:rPr>
+          <w:rFonts w:hint="cs"/>
+          <w:sz w:val="28"/>
+          <w:szCs w:val="28"/>
+          <w:rtl/>
+        </w:rPr>
+        <w:t>תך היא חד פעמית, תעשה אותה הכי טובה שאפשר, ובצורה הכי יעילה שאפשר.</w:t>
       </w:r>
     </w:p>
     <w:p>
@@ -15365,17 +15260,7 @@
           <w:szCs w:val="28"/>
           <w:rtl/>
         </w:rPr>
-        <w:t xml:space="preserve">, זה מכל להוריד את כל הספריות שהקוד צריך ואם אתה אי-פעם תרצה </w:t>
-      </w:r>
-      <w:r>
-        <w:rPr>
-          <w:rFonts w:hint="cs"/>
-          <w:sz w:val="28"/>
-          <w:szCs w:val="28"/>
-          <w:rtl/>
-        </w:rPr>
-        <w:lastRenderedPageBreak/>
-        <w:t>להריץ את הקוד בסביבה חדשה, זה יקל על אופן הורדת הספריות הנדרשות.</w:t>
+        <w:t>, זה מכל להוריד את כל הספריות שהקוד צריך ואם אתה אי-פעם תרצה להריץ את הקוד בסביבה חדשה, זה יקל על אופן הורדת הספריות הנדרשות.</w:t>
       </w:r>
     </w:p>
     <w:p>
@@ -15439,6 +15324,154 @@
     <w:p>
       <w:pPr>
         <w:pStyle w:val="a9"/>
+        <w:rPr>
+          <w:sz w:val="28"/>
+          <w:szCs w:val="28"/>
+          <w:rtl/>
+        </w:rPr>
+      </w:pPr>
+      <w:r>
+        <w:rPr>
+          <w:rFonts w:hint="cs"/>
+          <w:sz w:val="28"/>
+          <w:szCs w:val="28"/>
+          <w:rtl/>
+        </w:rPr>
+        <w:t>כל קובץ שיפעל בצורה הזאת כך שמחוץ ל</w:t>
+      </w:r>
+      <w:r>
+        <w:rPr>
+          <w:sz w:val="28"/>
+          <w:szCs w:val="28"/>
+        </w:rPr>
+        <w:t xml:space="preserve"> if name == __main__:</w:t>
+      </w:r>
+      <w:r>
+        <w:rPr>
+          <w:rFonts w:hint="cs"/>
+          <w:sz w:val="28"/>
+          <w:szCs w:val="28"/>
+          <w:rtl/>
+        </w:rPr>
+        <w:t xml:space="preserve"> </w:t>
+      </w:r>
+    </w:p>
+    <w:p>
+      <w:pPr>
+        <w:pStyle w:val="a9"/>
+        <w:rPr>
+          <w:sz w:val="28"/>
+          <w:szCs w:val="28"/>
+          <w:rtl/>
+        </w:rPr>
+      </w:pPr>
+      <w:r>
+        <w:rPr>
+          <w:rFonts w:hint="cs"/>
+          <w:sz w:val="28"/>
+          <w:szCs w:val="28"/>
+          <w:rtl/>
+        </w:rPr>
+        <w:t>תכתוב את כל הפונקציות ותגדיר את המשתנים, ובתוכו תכתוב את כל הדברים שאתה רוצה שירוצו כאשר מפעילי את הקובץ.</w:t>
+      </w:r>
+    </w:p>
+    <w:p>
+      <w:pPr>
+        <w:pStyle w:val="a9"/>
+        <w:rPr>
+          <w:sz w:val="28"/>
+          <w:szCs w:val="28"/>
+          <w:rtl/>
+        </w:rPr>
+      </w:pPr>
+      <w:r>
+        <w:rPr>
+          <w:rFonts w:hint="cs"/>
+          <w:b/>
+          <w:bCs/>
+          <w:sz w:val="28"/>
+          <w:szCs w:val="28"/>
+          <w:rtl/>
+        </w:rPr>
+        <w:t>זה קריטי</w:t>
+      </w:r>
+      <w:r>
+        <w:rPr>
+          <w:rFonts w:hint="cs"/>
+          <w:sz w:val="28"/>
+          <w:szCs w:val="28"/>
+          <w:rtl/>
+        </w:rPr>
+        <w:t xml:space="preserve">, אם לא בכל פעם שאתה מייבא את קובץ </w:t>
+      </w:r>
+      <w:r>
+        <w:rPr>
+          <w:sz w:val="28"/>
+          <w:szCs w:val="28"/>
+        </w:rPr>
+        <w:t>x</w:t>
+      </w:r>
+      <w:r>
+        <w:rPr>
+          <w:rFonts w:hint="cs"/>
+          <w:sz w:val="28"/>
+          <w:szCs w:val="28"/>
+          <w:rtl/>
+        </w:rPr>
+        <w:t xml:space="preserve"> לקובץ </w:t>
+      </w:r>
+      <w:r>
+        <w:rPr>
+          <w:sz w:val="28"/>
+          <w:szCs w:val="28"/>
+        </w:rPr>
+        <w:t>y</w:t>
+      </w:r>
+      <w:r>
+        <w:rPr>
+          <w:rFonts w:hint="cs"/>
+          <w:sz w:val="28"/>
+          <w:szCs w:val="28"/>
+          <w:rtl/>
+        </w:rPr>
+        <w:t xml:space="preserve"> ואתה מריץ את קובץ </w:t>
+      </w:r>
+      <w:r>
+        <w:rPr>
+          <w:sz w:val="28"/>
+          <w:szCs w:val="28"/>
+        </w:rPr>
+        <w:t>y</w:t>
+      </w:r>
+      <w:r>
+        <w:rPr>
+          <w:rFonts w:hint="cs"/>
+          <w:sz w:val="28"/>
+          <w:szCs w:val="28"/>
+          <w:rtl/>
+        </w:rPr>
+        <w:t xml:space="preserve">, אז כל הקוד של קובץ </w:t>
+      </w:r>
+      <w:r>
+        <w:rPr>
+          <w:sz w:val="28"/>
+          <w:szCs w:val="28"/>
+        </w:rPr>
+        <w:t>x</w:t>
+      </w:r>
+      <w:r>
+        <w:rPr>
+          <w:rFonts w:hint="cs"/>
+          <w:sz w:val="28"/>
+          <w:szCs w:val="28"/>
+          <w:rtl/>
+        </w:rPr>
+        <w:t xml:space="preserve"> גם ירוץ.</w:t>
+      </w:r>
+    </w:p>
+    <w:p>
+      <w:pPr>
+        <w:pStyle w:val="a9"/>
         <w:numPr>
           <w:ilvl w:val="0"/>
           <w:numId w:val="25"/>
@@ -15518,6 +15551,493 @@
         <w:t xml:space="preserve"> את קבצי הקוד.</w:t>
       </w:r>
     </w:p>
+    <w:p>
+      <w:pPr>
+        <w:pStyle w:val="a9"/>
+        <w:numPr>
+          <w:ilvl w:val="1"/>
+          <w:numId w:val="25"/>
+        </w:numPr>
+        <w:rPr>
+          <w:sz w:val="28"/>
+          <w:szCs w:val="28"/>
+        </w:rPr>
+      </w:pPr>
+      <w:r>
+        <w:rPr>
+          <w:rFonts w:hint="cs"/>
+          <w:sz w:val="28"/>
+          <w:szCs w:val="28"/>
+          <w:rtl/>
+        </w:rPr>
+        <w:t xml:space="preserve">תשנה את העמודה "תאריך" למשהו כמו </w:t>
+      </w:r>
+      <w:r>
+        <w:rPr>
+          <w:sz w:val="28"/>
+          <w:szCs w:val="28"/>
+        </w:rPr>
+        <w:t>one hot encoding</w:t>
+      </w:r>
+      <w:r>
+        <w:rPr>
+          <w:rFonts w:hint="cs"/>
+          <w:sz w:val="28"/>
+          <w:szCs w:val="28"/>
+          <w:rtl/>
+        </w:rPr>
+        <w:t xml:space="preserve"> או משהו כזה, כרגע זה באמת לא שדה הגיוני.</w:t>
+      </w:r>
+    </w:p>
+    <w:p>
+      <w:pPr>
+        <w:pStyle w:val="a9"/>
+        <w:numPr>
+          <w:ilvl w:val="1"/>
+          <w:numId w:val="25"/>
+        </w:numPr>
+        <w:rPr>
+          <w:sz w:val="28"/>
+          <w:szCs w:val="28"/>
+        </w:rPr>
+      </w:pPr>
+    </w:p>
+    <w:p>
+      <w:pPr>
+        <w:rPr>
+          <w:sz w:val="28"/>
+          <w:szCs w:val="28"/>
+          <w:rtl/>
+        </w:rPr>
+      </w:pPr>
+    </w:p>
+    <w:p>
+      <w:pPr>
+        <w:rPr>
+          <w:sz w:val="28"/>
+          <w:szCs w:val="28"/>
+          <w:rtl/>
+        </w:rPr>
+      </w:pPr>
+    </w:p>
+    <w:p>
+      <w:pPr>
+        <w:rPr>
+          <w:sz w:val="28"/>
+          <w:szCs w:val="28"/>
+          <w:rtl/>
+        </w:rPr>
+      </w:pPr>
+    </w:p>
+    <w:p>
+      <w:pPr>
+        <w:rPr>
+          <w:sz w:val="28"/>
+          <w:szCs w:val="28"/>
+          <w:rtl/>
+        </w:rPr>
+      </w:pPr>
+    </w:p>
+    <w:p>
+      <w:pPr>
+        <w:rPr>
+          <w:sz w:val="28"/>
+          <w:szCs w:val="28"/>
+          <w:rtl/>
+        </w:rPr>
+      </w:pPr>
+    </w:p>
+    <w:p>
+      <w:pPr>
+        <w:rPr>
+          <w:sz w:val="28"/>
+          <w:szCs w:val="28"/>
+          <w:rtl/>
+        </w:rPr>
+      </w:pPr>
+    </w:p>
+    <w:p>
+      <w:pPr>
+        <w:rPr>
+          <w:sz w:val="28"/>
+          <w:szCs w:val="28"/>
+          <w:rtl/>
+        </w:rPr>
+      </w:pPr>
+    </w:p>
+    <w:p>
+      <w:pPr>
+        <w:rPr>
+          <w:sz w:val="28"/>
+          <w:szCs w:val="28"/>
+          <w:rtl/>
+        </w:rPr>
+      </w:pPr>
+    </w:p>
+    <w:p>
+      <w:pPr>
+        <w:rPr>
+          <w:sz w:val="28"/>
+          <w:szCs w:val="28"/>
+          <w:rtl/>
+        </w:rPr>
+      </w:pPr>
+    </w:p>
+    <w:p>
+      <w:pPr>
+        <w:rPr>
+          <w:sz w:val="28"/>
+          <w:szCs w:val="28"/>
+          <w:rtl/>
+        </w:rPr>
+      </w:pPr>
+    </w:p>
+    <w:p>
+      <w:pPr>
+        <w:rPr>
+          <w:sz w:val="28"/>
+          <w:szCs w:val="28"/>
+          <w:rtl/>
+        </w:rPr>
+      </w:pPr>
+    </w:p>
+    <w:p>
+      <w:pPr>
+        <w:rPr>
+          <w:sz w:val="28"/>
+          <w:szCs w:val="28"/>
+          <w:rtl/>
+        </w:rPr>
+      </w:pPr>
+    </w:p>
+    <w:p>
+      <w:pPr>
+        <w:rPr>
+          <w:sz w:val="28"/>
+          <w:szCs w:val="28"/>
+          <w:rtl/>
+        </w:rPr>
+      </w:pPr>
+    </w:p>
+    <w:p>
+      <w:pPr>
+        <w:rPr>
+          <w:sz w:val="28"/>
+          <w:szCs w:val="28"/>
+          <w:rtl/>
+        </w:rPr>
+      </w:pPr>
+    </w:p>
+    <w:p>
+      <w:pPr>
+        <w:pStyle w:val="1"/>
+        <w:jc w:val="center"/>
+        <w:rPr>
+          <w:u w:val="single"/>
+          <w:rtl/>
+        </w:rPr>
+      </w:pPr>
+      <w:bookmarkStart w:id="48" w:name="_Toc230686585"/>
+      <w:r>
+        <w:rPr>
+          <w:rFonts w:hint="cs"/>
+          <w:u w:val="single"/>
+          <w:rtl/>
+        </w:rPr>
+        <w:t>מבנה של כל קובץ חדש שאתה יוצר</w:t>
+      </w:r>
+      <w:bookmarkEnd w:id="48"/>
+    </w:p>
+    <w:p>
+      <w:pPr>
+        <w:jc w:val="right"/>
+        <w:rPr>
+          <w:sz w:val="28"/>
+          <w:szCs w:val="28"/>
+        </w:rPr>
+      </w:pPr>
+      <w:r>
+        <w:rPr>
+          <w:rFonts w:cs="Arial"/>
+          <w:sz w:val="28"/>
+          <w:szCs w:val="28"/>
+          <w:rtl/>
+        </w:rPr>
+        <w:t xml:space="preserve"># </w:t>
+      </w:r>
+      <w:r>
+        <w:rPr>
+          <w:sz w:val="28"/>
+          <w:szCs w:val="28"/>
+        </w:rPr>
+        <w:t>imports</w:t>
+      </w:r>
+    </w:p>
+    <w:p>
+      <w:pPr>
+        <w:jc w:val="right"/>
+        <w:rPr>
+          <w:sz w:val="28"/>
+          <w:szCs w:val="28"/>
+          <w:rtl/>
+        </w:rPr>
+      </w:pPr>
+    </w:p>
+    <w:p>
+      <w:pPr>
+        <w:jc w:val="right"/>
+        <w:rPr>
+          <w:sz w:val="28"/>
+          <w:szCs w:val="28"/>
+        </w:rPr>
+      </w:pPr>
+      <w:r>
+        <w:rPr>
+          <w:rFonts w:cs="Arial"/>
+          <w:sz w:val="28"/>
+          <w:szCs w:val="28"/>
+          <w:rtl/>
+        </w:rPr>
+        <w:t xml:space="preserve"># </w:t>
+      </w:r>
+      <w:r>
+        <w:rPr>
+          <w:sz w:val="28"/>
+          <w:szCs w:val="28"/>
+        </w:rPr>
+        <w:t>constants</w:t>
+      </w:r>
+    </w:p>
+    <w:p>
+      <w:pPr>
+        <w:jc w:val="right"/>
+        <w:rPr>
+          <w:sz w:val="28"/>
+          <w:szCs w:val="28"/>
+          <w:rtl/>
+        </w:rPr>
+      </w:pPr>
+    </w:p>
+    <w:p>
+      <w:pPr>
+        <w:jc w:val="right"/>
+        <w:rPr>
+          <w:sz w:val="28"/>
+          <w:szCs w:val="28"/>
+        </w:rPr>
+      </w:pPr>
+      <w:r>
+        <w:rPr>
+          <w:rFonts w:cs="Arial"/>
+          <w:sz w:val="28"/>
+          <w:szCs w:val="28"/>
+          <w:rtl/>
+        </w:rPr>
+        <w:t xml:space="preserve"># </w:t>
+      </w:r>
+      <w:r>
+        <w:rPr>
+          <w:sz w:val="28"/>
+          <w:szCs w:val="28"/>
+        </w:rPr>
+        <w:t>class definitions</w:t>
+      </w:r>
+    </w:p>
+    <w:p>
+      <w:pPr>
+        <w:jc w:val="right"/>
+        <w:rPr>
+          <w:sz w:val="28"/>
+          <w:szCs w:val="28"/>
+          <w:rtl/>
+        </w:rPr>
+      </w:pPr>
+    </w:p>
+    <w:p>
+      <w:pPr>
+        <w:jc w:val="right"/>
+        <w:rPr>
+          <w:sz w:val="28"/>
+          <w:szCs w:val="28"/>
+        </w:rPr>
+      </w:pPr>
+      <w:r>
+        <w:rPr>
+          <w:rFonts w:cs="Arial"/>
+          <w:sz w:val="28"/>
+          <w:szCs w:val="28"/>
+          <w:rtl/>
+        </w:rPr>
+        <w:t xml:space="preserve"># </w:t>
+      </w:r>
+      <w:r>
+        <w:rPr>
+          <w:sz w:val="28"/>
+          <w:szCs w:val="28"/>
+        </w:rPr>
+        <w:t>function definitions</w:t>
+      </w:r>
+    </w:p>
+    <w:p>
+      <w:pPr>
+        <w:jc w:val="right"/>
+        <w:rPr>
+          <w:sz w:val="28"/>
+          <w:szCs w:val="28"/>
+          <w:rtl/>
+        </w:rPr>
+      </w:pPr>
+    </w:p>
+    <w:p>
+      <w:pPr>
+        <w:jc w:val="right"/>
+        <w:rPr>
+          <w:sz w:val="28"/>
+          <w:szCs w:val="28"/>
+        </w:rPr>
+      </w:pPr>
+      <w:r>
+        <w:rPr>
+          <w:sz w:val="28"/>
+          <w:szCs w:val="28"/>
+        </w:rPr>
+        <w:t xml:space="preserve">def </w:t>
+      </w:r>
+      <w:proofErr w:type="gramStart"/>
+      <w:r>
+        <w:rPr>
+          <w:sz w:val="28"/>
+          <w:szCs w:val="28"/>
+        </w:rPr>
+        <w:t>main</w:t>
+      </w:r>
+      <w:r>
+        <w:rPr>
+          <w:rFonts w:cs="Arial"/>
+          <w:sz w:val="28"/>
+          <w:szCs w:val="28"/>
+          <w:rtl/>
+        </w:rPr>
+        <w:t>(</w:t>
+      </w:r>
+      <w:proofErr w:type="gramEnd"/>
+      <w:r>
+        <w:rPr>
+          <w:rFonts w:cs="Arial"/>
+          <w:sz w:val="28"/>
+          <w:szCs w:val="28"/>
+          <w:rtl/>
+        </w:rPr>
+        <w:t>):</w:t>
+      </w:r>
+    </w:p>
+    <w:p>
+      <w:pPr>
+        <w:jc w:val="right"/>
+        <w:rPr>
+          <w:sz w:val="28"/>
+          <w:szCs w:val="28"/>
+        </w:rPr>
+      </w:pPr>
+      <w:r>
+        <w:rPr>
+          <w:rFonts w:cs="Arial"/>
+          <w:sz w:val="28"/>
+          <w:szCs w:val="28"/>
+          <w:rtl/>
+        </w:rPr>
+        <w:t xml:space="preserve">    # </w:t>
+      </w:r>
+      <w:r>
+        <w:rPr>
+          <w:sz w:val="28"/>
+          <w:szCs w:val="28"/>
+        </w:rPr>
+        <w:t>code that actually runs</w:t>
+      </w:r>
+    </w:p>
+    <w:p>
+      <w:pPr>
+        <w:jc w:val="right"/>
+        <w:rPr>
+          <w:sz w:val="28"/>
+          <w:szCs w:val="28"/>
+          <w:rtl/>
+        </w:rPr>
+      </w:pPr>
+    </w:p>
+    <w:p>
+      <w:pPr>
+        <w:jc w:val="right"/>
+        <w:rPr>
+          <w:sz w:val="28"/>
+          <w:szCs w:val="28"/>
+        </w:rPr>
+      </w:pPr>
+      <w:r>
+        <w:rPr>
+          <w:sz w:val="28"/>
+          <w:szCs w:val="28"/>
+        </w:rPr>
+        <w:t>if __name__ == "__main</w:t>
+      </w:r>
+      <w:r>
+        <w:rPr>
+          <w:rFonts w:cs="Arial"/>
+          <w:sz w:val="28"/>
+          <w:szCs w:val="28"/>
+          <w:rtl/>
+        </w:rPr>
+        <w:t>__":</w:t>
+      </w:r>
+    </w:p>
+    <w:p>
+      <w:pPr>
+        <w:jc w:val="right"/>
+        <w:rPr>
+          <w:sz w:val="28"/>
+          <w:szCs w:val="28"/>
+          <w:rtl/>
+        </w:rPr>
+      </w:pPr>
+      <w:r>
+        <w:rPr>
+          <w:rFonts w:cs="Arial"/>
+          <w:sz w:val="28"/>
+          <w:szCs w:val="28"/>
+          <w:rtl/>
+        </w:rPr>
+        <w:t xml:space="preserve">    </w:t>
+      </w:r>
+      <w:proofErr w:type="gramStart"/>
+      <w:r>
+        <w:rPr>
+          <w:sz w:val="28"/>
+          <w:szCs w:val="28"/>
+        </w:rPr>
+        <w:t>main</w:t>
+      </w:r>
+      <w:r>
+        <w:rPr>
+          <w:rFonts w:cs="Arial"/>
+          <w:sz w:val="28"/>
+          <w:szCs w:val="28"/>
+          <w:rtl/>
+        </w:rPr>
+        <w:t>(</w:t>
+      </w:r>
+      <w:proofErr w:type="gramEnd"/>
+      <w:r>
+        <w:rPr>
+          <w:rFonts w:cs="Arial"/>
+          <w:sz w:val="28"/>
+          <w:szCs w:val="28"/>
+          <w:rtl/>
+        </w:rPr>
+        <w:t>)</w:t>
+      </w:r>
+    </w:p>
+    <w:p/>
     <w:p>
       <w:pPr>
         <w:rPr>
@@ -18408,7 +18928,7 @@
   <w:abstractNum w:abstractNumId="26" w15:restartNumberingAfterBreak="0">
     <w:nsid w:val="7B68191B"/>
     <w:multiLevelType w:val="multilevel"/>
-    <w:tmpl w:val="AA748DCC"/>
+    <w:tmpl w:val="6A9C6722"/>
     <w:lvl w:ilvl="0">
       <w:start w:val="1"/>
       <w:numFmt w:val="decimal"/>
@@ -18431,6 +18951,8 @@
       </w:pPr>
       <w:rPr>
         <w:rFonts w:hint="default"/>
+        <w:sz w:val="28"/>
+        <w:szCs w:val="28"/>
       </w:rPr>
     </w:lvl>
     <w:lvl w:ilvl="2" w:tentative="1">

</xml_diff>

<commit_message>
Add the dependabot.yml so we have an auto check for the newsest libraries
</commit_message>
<xml_diff>
--- a/stock algo trading project.docx
+++ b/stock algo trading project.docx
@@ -10,7 +10,7 @@
           <w:u w:val="single"/>
         </w:rPr>
       </w:pPr>
-      <w:bookmarkStart w:id="0" w:name="_Toc230686537"/>
+      <w:bookmarkStart w:id="0" w:name="_Toc234741684"/>
       <w:r>
         <w:rPr>
           <w:u w:val="single"/>
@@ -47,6 +47,7 @@
           <w:pPr>
             <w:pStyle w:val="ae"/>
             <w:rPr>
+              <w:rFonts w:hint="cs"/>
               <w:cs w:val="0"/>
             </w:rPr>
           </w:pPr>
@@ -80,7 +81,7 @@
           <w:r>
             <w:fldChar w:fldCharType="separate"/>
           </w:r>
-          <w:hyperlink w:anchor="_Toc230686537" w:history="1">
+          <w:hyperlink w:anchor="_Toc234741684" w:history="1">
             <w:r>
               <w:rPr>
                 <w:rStyle w:val="Hyperlink"/>
@@ -132,7 +133,7 @@
                 <w:noProof/>
                 <w:webHidden/>
               </w:rPr>
-              <w:instrText>Toc230686537 \h</w:instrText>
+              <w:instrText>Toc234741684 \h</w:instrText>
             </w:r>
             <w:r>
               <w:rPr>
@@ -189,7 +190,7 @@
               <w:rtl/>
             </w:rPr>
           </w:pPr>
-          <w:hyperlink w:anchor="_Toc230686538" w:history="1">
+          <w:hyperlink w:anchor="_Toc234741685" w:history="1">
             <w:r>
               <w:rPr>
                 <w:rStyle w:val="Hyperlink"/>
@@ -242,7 +243,7 @@
                 <w:noProof/>
                 <w:webHidden/>
               </w:rPr>
-              <w:instrText>Toc230686538 \h</w:instrText>
+              <w:instrText>Toc234741685 \h</w:instrText>
             </w:r>
             <w:r>
               <w:rPr>
@@ -299,7 +300,7 @@
               <w:rtl/>
             </w:rPr>
           </w:pPr>
-          <w:hyperlink w:anchor="_Toc230686539" w:history="1">
+          <w:hyperlink w:anchor="_Toc234741686" w:history="1">
             <w:r>
               <w:rPr>
                 <w:rStyle w:val="Hyperlink"/>
@@ -351,7 +352,7 @@
                 <w:noProof/>
                 <w:webHidden/>
               </w:rPr>
-              <w:instrText>Toc230686539 \h</w:instrText>
+              <w:instrText>Toc234741686 \h</w:instrText>
             </w:r>
             <w:r>
               <w:rPr>
@@ -408,7 +409,7 @@
               <w:rtl/>
             </w:rPr>
           </w:pPr>
-          <w:hyperlink w:anchor="_Toc230686540" w:history="1">
+          <w:hyperlink w:anchor="_Toc234741687" w:history="1">
             <w:r>
               <w:rPr>
                 <w:rStyle w:val="Hyperlink"/>
@@ -460,7 +461,7 @@
                 <w:noProof/>
                 <w:webHidden/>
               </w:rPr>
-              <w:instrText>Toc230686540 \h</w:instrText>
+              <w:instrText>Toc234741687 \h</w:instrText>
             </w:r>
             <w:r>
               <w:rPr>
@@ -517,7 +518,7 @@
               <w:rtl/>
             </w:rPr>
           </w:pPr>
-          <w:hyperlink w:anchor="_Toc230686541" w:history="1">
+          <w:hyperlink w:anchor="_Toc234741688" w:history="1">
             <w:r>
               <w:rPr>
                 <w:rStyle w:val="Hyperlink"/>
@@ -569,7 +570,7 @@
                 <w:noProof/>
                 <w:webHidden/>
               </w:rPr>
-              <w:instrText>Toc230686541 \h</w:instrText>
+              <w:instrText>Toc234741688 \h</w:instrText>
             </w:r>
             <w:r>
               <w:rPr>
@@ -600,7 +601,7 @@
                 <w:webHidden/>
                 <w:rtl/>
               </w:rPr>
-              <w:t>4</w:t>
+              <w:t>5</w:t>
             </w:r>
             <w:r>
               <w:rPr>
@@ -626,7 +627,7 @@
               <w:rtl/>
             </w:rPr>
           </w:pPr>
-          <w:hyperlink w:anchor="_Toc230686542" w:history="1">
+          <w:hyperlink w:anchor="_Toc234741689" w:history="1">
             <w:r>
               <w:rPr>
                 <w:rStyle w:val="Hyperlink"/>
@@ -679,7 +680,7 @@
                 <w:noProof/>
                 <w:webHidden/>
               </w:rPr>
-              <w:instrText>Toc230686542 \h</w:instrText>
+              <w:instrText>Toc234741689 \h</w:instrText>
             </w:r>
             <w:r>
               <w:rPr>
@@ -736,7 +737,7 @@
               <w:rtl/>
             </w:rPr>
           </w:pPr>
-          <w:hyperlink w:anchor="_Toc230686543" w:history="1">
+          <w:hyperlink w:anchor="_Toc234741690" w:history="1">
             <w:r>
               <w:rPr>
                 <w:rStyle w:val="Hyperlink"/>
@@ -788,7 +789,7 @@
                 <w:noProof/>
                 <w:webHidden/>
               </w:rPr>
-              <w:instrText>Toc230686543 \h</w:instrText>
+              <w:instrText>Toc234741690 \h</w:instrText>
             </w:r>
             <w:r>
               <w:rPr>
@@ -845,7 +846,7 @@
               <w:rtl/>
             </w:rPr>
           </w:pPr>
-          <w:hyperlink w:anchor="_Toc230686544" w:history="1">
+          <w:hyperlink w:anchor="_Toc234741691" w:history="1">
             <w:r>
               <w:rPr>
                 <w:rStyle w:val="Hyperlink"/>
@@ -897,7 +898,7 @@
                 <w:noProof/>
                 <w:webHidden/>
               </w:rPr>
-              <w:instrText>Toc230686544 \h</w:instrText>
+              <w:instrText>Toc234741691 \h</w:instrText>
             </w:r>
             <w:r>
               <w:rPr>
@@ -954,7 +955,7 @@
               <w:rtl/>
             </w:rPr>
           </w:pPr>
-          <w:hyperlink w:anchor="_Toc230686545" w:history="1">
+          <w:hyperlink w:anchor="_Toc234741692" w:history="1">
             <w:r>
               <w:rPr>
                 <w:rStyle w:val="Hyperlink"/>
@@ -1006,7 +1007,7 @@
                 <w:noProof/>
                 <w:webHidden/>
               </w:rPr>
-              <w:instrText>Toc230686545 \h</w:instrText>
+              <w:instrText>Toc234741692 \h</w:instrText>
             </w:r>
             <w:r>
               <w:rPr>
@@ -1063,7 +1064,7 @@
               <w:rtl/>
             </w:rPr>
           </w:pPr>
-          <w:hyperlink w:anchor="_Toc230686546" w:history="1">
+          <w:hyperlink w:anchor="_Toc234741693" w:history="1">
             <w:r>
               <w:rPr>
                 <w:rStyle w:val="Hyperlink"/>
@@ -1115,7 +1116,7 @@
                 <w:noProof/>
                 <w:webHidden/>
               </w:rPr>
-              <w:instrText>Toc230686546 \h</w:instrText>
+              <w:instrText>Toc234741693 \h</w:instrText>
             </w:r>
             <w:r>
               <w:rPr>
@@ -1172,7 +1173,7 @@
               <w:rtl/>
             </w:rPr>
           </w:pPr>
-          <w:hyperlink w:anchor="_Toc230686547" w:history="1">
+          <w:hyperlink w:anchor="_Toc234741694" w:history="1">
             <w:r>
               <w:rPr>
                 <w:rStyle w:val="Hyperlink"/>
@@ -1224,7 +1225,7 @@
                 <w:noProof/>
                 <w:webHidden/>
               </w:rPr>
-              <w:instrText>Toc230686547 \h</w:instrText>
+              <w:instrText>Toc234741694 \h</w:instrText>
             </w:r>
             <w:r>
               <w:rPr>
@@ -1255,7 +1256,7 @@
                 <w:webHidden/>
                 <w:rtl/>
               </w:rPr>
-              <w:t>6</w:t>
+              <w:t>7</w:t>
             </w:r>
             <w:r>
               <w:rPr>
@@ -1281,7 +1282,7 @@
               <w:rtl/>
             </w:rPr>
           </w:pPr>
-          <w:hyperlink w:anchor="_Toc230686548" w:history="1">
+          <w:hyperlink w:anchor="_Toc234741695" w:history="1">
             <w:r>
               <w:rPr>
                 <w:rStyle w:val="Hyperlink"/>
@@ -1333,7 +1334,7 @@
                 <w:noProof/>
                 <w:webHidden/>
               </w:rPr>
-              <w:instrText>Toc230686548 \h</w:instrText>
+              <w:instrText>Toc234741695 \h</w:instrText>
             </w:r>
             <w:r>
               <w:rPr>
@@ -1390,7 +1391,7 @@
               <w:rtl/>
             </w:rPr>
           </w:pPr>
-          <w:hyperlink w:anchor="_Toc230686549" w:history="1">
+          <w:hyperlink w:anchor="_Toc234741696" w:history="1">
             <w:r>
               <w:rPr>
                 <w:rStyle w:val="Hyperlink"/>
@@ -1442,7 +1443,7 @@
                 <w:noProof/>
                 <w:webHidden/>
               </w:rPr>
-              <w:instrText>Toc230686549 \h</w:instrText>
+              <w:instrText>Toc234741696 \h</w:instrText>
             </w:r>
             <w:r>
               <w:rPr>
@@ -1499,7 +1500,7 @@
               <w:rtl/>
             </w:rPr>
           </w:pPr>
-          <w:hyperlink w:anchor="_Toc230686550" w:history="1">
+          <w:hyperlink w:anchor="_Toc234741697" w:history="1">
             <w:r>
               <w:rPr>
                 <w:rStyle w:val="Hyperlink"/>
@@ -1552,7 +1553,7 @@
                 <w:noProof/>
                 <w:webHidden/>
               </w:rPr>
-              <w:instrText>Toc230686550 \h</w:instrText>
+              <w:instrText>Toc234741697 \h</w:instrText>
             </w:r>
             <w:r>
               <w:rPr>
@@ -1609,7 +1610,7 @@
               <w:rtl/>
             </w:rPr>
           </w:pPr>
-          <w:hyperlink w:anchor="_Toc230686551" w:history="1">
+          <w:hyperlink w:anchor="_Toc234741698" w:history="1">
             <w:r>
               <w:rPr>
                 <w:rStyle w:val="Hyperlink"/>
@@ -1661,7 +1662,7 @@
                 <w:noProof/>
                 <w:webHidden/>
               </w:rPr>
-              <w:instrText>Toc230686551 \h</w:instrText>
+              <w:instrText>Toc234741698 \h</w:instrText>
             </w:r>
             <w:r>
               <w:rPr>
@@ -1718,7 +1719,7 @@
               <w:rtl/>
             </w:rPr>
           </w:pPr>
-          <w:hyperlink w:anchor="_Toc230686552" w:history="1">
+          <w:hyperlink w:anchor="_Toc234741699" w:history="1">
             <w:r>
               <w:rPr>
                 <w:rStyle w:val="Hyperlink"/>
@@ -1770,7 +1771,7 @@
                 <w:noProof/>
                 <w:webHidden/>
               </w:rPr>
-              <w:instrText>Toc230686552 \h</w:instrText>
+              <w:instrText>Toc234741699 \h</w:instrText>
             </w:r>
             <w:r>
               <w:rPr>
@@ -1801,7 +1802,7 @@
                 <w:webHidden/>
                 <w:rtl/>
               </w:rPr>
-              <w:t>8</w:t>
+              <w:t>9</w:t>
             </w:r>
             <w:r>
               <w:rPr>
@@ -1827,7 +1828,7 @@
               <w:rtl/>
             </w:rPr>
           </w:pPr>
-          <w:hyperlink w:anchor="_Toc230686553" w:history="1">
+          <w:hyperlink w:anchor="_Toc234741700" w:history="1">
             <w:r>
               <w:rPr>
                 <w:rStyle w:val="Hyperlink"/>
@@ -1879,7 +1880,7 @@
                 <w:noProof/>
                 <w:webHidden/>
               </w:rPr>
-              <w:instrText>Toc230686553 \h</w:instrText>
+              <w:instrText>Toc234741700 \h</w:instrText>
             </w:r>
             <w:r>
               <w:rPr>
@@ -1936,7 +1937,7 @@
               <w:rtl/>
             </w:rPr>
           </w:pPr>
-          <w:hyperlink w:anchor="_Toc230686554" w:history="1">
+          <w:hyperlink w:anchor="_Toc234741701" w:history="1">
             <w:r>
               <w:rPr>
                 <w:rStyle w:val="Hyperlink"/>
@@ -1988,7 +1989,7 @@
                 <w:noProof/>
                 <w:webHidden/>
               </w:rPr>
-              <w:instrText>Toc230686554 \h</w:instrText>
+              <w:instrText>Toc234741701 \h</w:instrText>
             </w:r>
             <w:r>
               <w:rPr>
@@ -2045,7 +2046,7 @@
               <w:rtl/>
             </w:rPr>
           </w:pPr>
-          <w:hyperlink w:anchor="_Toc230686555" w:history="1">
+          <w:hyperlink w:anchor="_Toc234741702" w:history="1">
             <w:r>
               <w:rPr>
                 <w:rStyle w:val="Hyperlink"/>
@@ -2097,7 +2098,7 @@
                 <w:noProof/>
                 <w:webHidden/>
               </w:rPr>
-              <w:instrText>Toc230686555 \h</w:instrText>
+              <w:instrText>Toc234741702 \h</w:instrText>
             </w:r>
             <w:r>
               <w:rPr>
@@ -2154,7 +2155,7 @@
               <w:rtl/>
             </w:rPr>
           </w:pPr>
-          <w:hyperlink w:anchor="_Toc230686556" w:history="1">
+          <w:hyperlink w:anchor="_Toc234741703" w:history="1">
             <w:r>
               <w:rPr>
                 <w:rStyle w:val="Hyperlink"/>
@@ -2206,7 +2207,7 @@
                 <w:noProof/>
                 <w:webHidden/>
               </w:rPr>
-              <w:instrText>Toc230686556 \h</w:instrText>
+              <w:instrText>Toc234741703 \h</w:instrText>
             </w:r>
             <w:r>
               <w:rPr>
@@ -2263,7 +2264,7 @@
               <w:rtl/>
             </w:rPr>
           </w:pPr>
-          <w:hyperlink w:anchor="_Toc230686557" w:history="1">
+          <w:hyperlink w:anchor="_Toc234741704" w:history="1">
             <w:r>
               <w:rPr>
                 <w:rStyle w:val="Hyperlink"/>
@@ -2315,7 +2316,7 @@
                 <w:noProof/>
                 <w:webHidden/>
               </w:rPr>
-              <w:instrText>Toc230686557 \h</w:instrText>
+              <w:instrText>Toc234741704 \h</w:instrText>
             </w:r>
             <w:r>
               <w:rPr>
@@ -2372,7 +2373,7 @@
               <w:rtl/>
             </w:rPr>
           </w:pPr>
-          <w:hyperlink w:anchor="_Toc230686558" w:history="1">
+          <w:hyperlink w:anchor="_Toc234741705" w:history="1">
             <w:r>
               <w:rPr>
                 <w:rStyle w:val="Hyperlink"/>
@@ -2424,7 +2425,7 @@
                 <w:noProof/>
                 <w:webHidden/>
               </w:rPr>
-              <w:instrText>Toc230686558 \h</w:instrText>
+              <w:instrText>Toc234741705 \h</w:instrText>
             </w:r>
             <w:r>
               <w:rPr>
@@ -2481,7 +2482,7 @@
               <w:rtl/>
             </w:rPr>
           </w:pPr>
-          <w:hyperlink w:anchor="_Toc230686559" w:history="1">
+          <w:hyperlink w:anchor="_Toc234741706" w:history="1">
             <w:r>
               <w:rPr>
                 <w:rStyle w:val="Hyperlink"/>
@@ -2533,7 +2534,7 @@
                 <w:noProof/>
                 <w:webHidden/>
               </w:rPr>
-              <w:instrText>Toc230686559 \h</w:instrText>
+              <w:instrText>Toc234741706 \h</w:instrText>
             </w:r>
             <w:r>
               <w:rPr>
@@ -2590,7 +2591,7 @@
               <w:rtl/>
             </w:rPr>
           </w:pPr>
-          <w:hyperlink w:anchor="_Toc230686560" w:history="1">
+          <w:hyperlink w:anchor="_Toc234741707" w:history="1">
             <w:r>
               <w:rPr>
                 <w:rStyle w:val="Hyperlink"/>
@@ -2642,7 +2643,7 @@
                 <w:noProof/>
                 <w:webHidden/>
               </w:rPr>
-              <w:instrText>Toc230686560 \h</w:instrText>
+              <w:instrText>Toc234741707 \h</w:instrText>
             </w:r>
             <w:r>
               <w:rPr>
@@ -2699,7 +2700,7 @@
               <w:rtl/>
             </w:rPr>
           </w:pPr>
-          <w:hyperlink w:anchor="_Toc230686561" w:history="1">
+          <w:hyperlink w:anchor="_Toc234741708" w:history="1">
             <w:r>
               <w:rPr>
                 <w:rStyle w:val="Hyperlink"/>
@@ -2751,7 +2752,7 @@
                 <w:noProof/>
                 <w:webHidden/>
               </w:rPr>
-              <w:instrText>Toc230686561 \h</w:instrText>
+              <w:instrText>Toc234741708 \h</w:instrText>
             </w:r>
             <w:r>
               <w:rPr>
@@ -2782,7 +2783,7 @@
                 <w:webHidden/>
                 <w:rtl/>
               </w:rPr>
-              <w:t>10</w:t>
+              <w:t>11</w:t>
             </w:r>
             <w:r>
               <w:rPr>
@@ -2808,7 +2809,7 @@
               <w:rtl/>
             </w:rPr>
           </w:pPr>
-          <w:hyperlink w:anchor="_Toc230686562" w:history="1">
+          <w:hyperlink w:anchor="_Toc234741709" w:history="1">
             <w:r>
               <w:rPr>
                 <w:rStyle w:val="Hyperlink"/>
@@ -2860,7 +2861,7 @@
                 <w:noProof/>
                 <w:webHidden/>
               </w:rPr>
-              <w:instrText>Toc230686562 \h</w:instrText>
+              <w:instrText>Toc234741709 \h</w:instrText>
             </w:r>
             <w:r>
               <w:rPr>
@@ -2917,7 +2918,7 @@
               <w:rtl/>
             </w:rPr>
           </w:pPr>
-          <w:hyperlink w:anchor="_Toc230686563" w:history="1">
+          <w:hyperlink w:anchor="_Toc234741710" w:history="1">
             <w:r>
               <w:rPr>
                 <w:rStyle w:val="Hyperlink"/>
@@ -2969,7 +2970,7 @@
                 <w:noProof/>
                 <w:webHidden/>
               </w:rPr>
-              <w:instrText>Toc230686563 \h</w:instrText>
+              <w:instrText>Toc234741710 \h</w:instrText>
             </w:r>
             <w:r>
               <w:rPr>
@@ -3026,7 +3027,7 @@
               <w:rtl/>
             </w:rPr>
           </w:pPr>
-          <w:hyperlink w:anchor="_Toc230686564" w:history="1">
+          <w:hyperlink w:anchor="_Toc234741711" w:history="1">
             <w:r>
               <w:rPr>
                 <w:rStyle w:val="Hyperlink"/>
@@ -3078,7 +3079,7 @@
                 <w:noProof/>
                 <w:webHidden/>
               </w:rPr>
-              <w:instrText>Toc230686564 \h</w:instrText>
+              <w:instrText>Toc234741711 \h</w:instrText>
             </w:r>
             <w:r>
               <w:rPr>
@@ -3135,7 +3136,7 @@
               <w:rtl/>
             </w:rPr>
           </w:pPr>
-          <w:hyperlink w:anchor="_Toc230686565" w:history="1">
+          <w:hyperlink w:anchor="_Toc234741712" w:history="1">
             <w:r>
               <w:rPr>
                 <w:rStyle w:val="Hyperlink"/>
@@ -3187,7 +3188,7 @@
                 <w:noProof/>
                 <w:webHidden/>
               </w:rPr>
-              <w:instrText>Toc230686565 \h</w:instrText>
+              <w:instrText>Toc234741712 \h</w:instrText>
             </w:r>
             <w:r>
               <w:rPr>
@@ -3218,7 +3219,7 @@
                 <w:webHidden/>
                 <w:rtl/>
               </w:rPr>
-              <w:t>11</w:t>
+              <w:t>12</w:t>
             </w:r>
             <w:r>
               <w:rPr>
@@ -3244,7 +3245,7 @@
               <w:rtl/>
             </w:rPr>
           </w:pPr>
-          <w:hyperlink w:anchor="_Toc230686566" w:history="1">
+          <w:hyperlink w:anchor="_Toc234741713" w:history="1">
             <w:r>
               <w:rPr>
                 <w:rStyle w:val="Hyperlink"/>
@@ -3297,7 +3298,7 @@
                 <w:noProof/>
                 <w:webHidden/>
               </w:rPr>
-              <w:instrText>Toc230686566 \h</w:instrText>
+              <w:instrText>Toc234741713 \h</w:instrText>
             </w:r>
             <w:r>
               <w:rPr>
@@ -3354,7 +3355,7 @@
               <w:rtl/>
             </w:rPr>
           </w:pPr>
-          <w:hyperlink w:anchor="_Toc230686567" w:history="1">
+          <w:hyperlink w:anchor="_Toc234741714" w:history="1">
             <w:r>
               <w:rPr>
                 <w:rStyle w:val="Hyperlink"/>
@@ -3407,7 +3408,7 @@
                 <w:noProof/>
                 <w:webHidden/>
               </w:rPr>
-              <w:instrText>Toc230686567 \h</w:instrText>
+              <w:instrText>Toc234741714 \h</w:instrText>
             </w:r>
             <w:r>
               <w:rPr>
@@ -3464,7 +3465,7 @@
               <w:rtl/>
             </w:rPr>
           </w:pPr>
-          <w:hyperlink w:anchor="_Toc230686568" w:history="1">
+          <w:hyperlink w:anchor="_Toc234741715" w:history="1">
             <w:r>
               <w:rPr>
                 <w:rStyle w:val="Hyperlink"/>
@@ -3532,7 +3533,7 @@
                 <w:noProof/>
                 <w:webHidden/>
               </w:rPr>
-              <w:instrText>Toc230686568 \h</w:instrText>
+              <w:instrText>Toc234741715 \h</w:instrText>
             </w:r>
             <w:r>
               <w:rPr>
@@ -3589,7 +3590,7 @@
               <w:rtl/>
             </w:rPr>
           </w:pPr>
-          <w:hyperlink w:anchor="_Toc230686569" w:history="1">
+          <w:hyperlink w:anchor="_Toc234741716" w:history="1">
             <w:r>
               <w:rPr>
                 <w:rStyle w:val="Hyperlink"/>
@@ -3642,7 +3643,7 @@
                 <w:noProof/>
                 <w:webHidden/>
               </w:rPr>
-              <w:instrText>Toc230686569 \h</w:instrText>
+              <w:instrText>Toc234741716 \h</w:instrText>
             </w:r>
             <w:r>
               <w:rPr>
@@ -3699,7 +3700,7 @@
               <w:rtl/>
             </w:rPr>
           </w:pPr>
-          <w:hyperlink w:anchor="_Toc230686570" w:history="1">
+          <w:hyperlink w:anchor="_Toc234741717" w:history="1">
             <w:r>
               <w:rPr>
                 <w:rStyle w:val="Hyperlink"/>
@@ -3752,7 +3753,7 @@
                 <w:noProof/>
                 <w:webHidden/>
               </w:rPr>
-              <w:instrText>Toc230686570 \h</w:instrText>
+              <w:instrText>Toc234741717 \h</w:instrText>
             </w:r>
             <w:r>
               <w:rPr>
@@ -3809,7 +3810,7 @@
               <w:rtl/>
             </w:rPr>
           </w:pPr>
-          <w:hyperlink w:anchor="_Toc230686571" w:history="1">
+          <w:hyperlink w:anchor="_Toc234741718" w:history="1">
             <w:r>
               <w:rPr>
                 <w:rStyle w:val="Hyperlink"/>
@@ -3862,7 +3863,7 @@
                 <w:noProof/>
                 <w:webHidden/>
               </w:rPr>
-              <w:instrText>Toc230686571 \h</w:instrText>
+              <w:instrText>Toc234741718 \h</w:instrText>
             </w:r>
             <w:r>
               <w:rPr>
@@ -3919,8 +3920,8 @@
               <w:rtl/>
             </w:rPr>
           </w:pPr>
-          <w:hyperlink w:anchor="_Toc230686572" w:history="1">
-            <w:bookmarkStart w:id="1" w:name="_Toc226822542"/>
+          <w:hyperlink w:anchor="_Toc234741719" w:history="1">
+            <w:bookmarkStart w:id="1" w:name="_Toc234741665"/>
             <w:r>
               <w:rPr>
                 <w:rStyle w:val="Hyperlink"/>
@@ -3929,10 +3930,10 @@
                 <w:rtl/>
               </w:rPr>
               <w:drawing>
-                <wp:inline distT="0" distB="0" distL="0" distR="0" wp14:anchorId="2421C4C8" wp14:editId="3E86FAF5">
+                <wp:inline distT="0" distB="0" distL="0" distR="0" wp14:anchorId="11ECB87C" wp14:editId="416E22EC">
                   <wp:extent cx="4277322" cy="5877745"/>
                   <wp:effectExtent l="0" t="0" r="9525" b="8890"/>
-                  <wp:docPr id="1532028953" name="תמונה 1"/>
+                  <wp:docPr id="1064996370" name="תמונה 1"/>
                   <wp:cNvGraphicFramePr>
                     <a:graphicFrameLocks xmlns:a="http://schemas.openxmlformats.org/drawingml/2006/main" noChangeAspect="1"/>
                   </wp:cNvGraphicFramePr>
@@ -4009,7 +4010,7 @@
                 <w:noProof/>
                 <w:webHidden/>
               </w:rPr>
-              <w:instrText>Toc230686572 \h</w:instrText>
+              <w:instrText>Toc234741719 \h</w:instrText>
             </w:r>
             <w:r>
               <w:rPr>
@@ -4066,7 +4067,7 @@
               <w:rtl/>
             </w:rPr>
           </w:pPr>
-          <w:hyperlink w:anchor="_Toc230686573" w:history="1">
+          <w:hyperlink w:anchor="_Toc234741720" w:history="1">
             <w:r>
               <w:rPr>
                 <w:rStyle w:val="Hyperlink"/>
@@ -4119,7 +4120,7 @@
                 <w:noProof/>
                 <w:webHidden/>
               </w:rPr>
-              <w:instrText>Toc230686573 \h</w:instrText>
+              <w:instrText>Toc234741720 \h</w:instrText>
             </w:r>
             <w:r>
               <w:rPr>
@@ -4176,7 +4177,7 @@
               <w:rtl/>
             </w:rPr>
           </w:pPr>
-          <w:hyperlink w:anchor="_Toc230686574" w:history="1">
+          <w:hyperlink w:anchor="_Toc234741721" w:history="1">
             <w:r>
               <w:rPr>
                 <w:rStyle w:val="Hyperlink"/>
@@ -4229,7 +4230,7 @@
                 <w:noProof/>
                 <w:webHidden/>
               </w:rPr>
-              <w:instrText>Toc230686574 \h</w:instrText>
+              <w:instrText>Toc234741721 \h</w:instrText>
             </w:r>
             <w:r>
               <w:rPr>
@@ -4286,7 +4287,7 @@
               <w:rtl/>
             </w:rPr>
           </w:pPr>
-          <w:hyperlink w:anchor="_Toc230686575" w:history="1">
+          <w:hyperlink w:anchor="_Toc234741722" w:history="1">
             <w:r>
               <w:rPr>
                 <w:rStyle w:val="Hyperlink"/>
@@ -4339,7 +4340,7 @@
                 <w:noProof/>
                 <w:webHidden/>
               </w:rPr>
-              <w:instrText>Toc230686575 \h</w:instrText>
+              <w:instrText>Toc234741722 \h</w:instrText>
             </w:r>
             <w:r>
               <w:rPr>
@@ -4396,7 +4397,7 @@
               <w:rtl/>
             </w:rPr>
           </w:pPr>
-          <w:hyperlink w:anchor="_Toc230686576" w:history="1">
+          <w:hyperlink w:anchor="_Toc234741723" w:history="1">
             <w:r>
               <w:rPr>
                 <w:rStyle w:val="Hyperlink"/>
@@ -4448,7 +4449,7 @@
                 <w:noProof/>
                 <w:webHidden/>
               </w:rPr>
-              <w:instrText>Toc230686576 \h</w:instrText>
+              <w:instrText>Toc234741723 \h</w:instrText>
             </w:r>
             <w:r>
               <w:rPr>
@@ -4505,7 +4506,7 @@
               <w:rtl/>
             </w:rPr>
           </w:pPr>
-          <w:hyperlink w:anchor="_Toc230686577" w:history="1">
+          <w:hyperlink w:anchor="_Toc234741724" w:history="1">
             <w:r>
               <w:rPr>
                 <w:rStyle w:val="Hyperlink"/>
@@ -4557,7 +4558,7 @@
                 <w:noProof/>
                 <w:webHidden/>
               </w:rPr>
-              <w:instrText>Toc230686577 \h</w:instrText>
+              <w:instrText>Toc234741724 \h</w:instrText>
             </w:r>
             <w:r>
               <w:rPr>
@@ -4614,7 +4615,7 @@
               <w:rtl/>
             </w:rPr>
           </w:pPr>
-          <w:hyperlink w:anchor="_Toc230686578" w:history="1">
+          <w:hyperlink w:anchor="_Toc234741725" w:history="1">
             <w:r>
               <w:rPr>
                 <w:rStyle w:val="Hyperlink"/>
@@ -4667,7 +4668,7 @@
                 <w:noProof/>
                 <w:webHidden/>
               </w:rPr>
-              <w:instrText>Toc230686578 \h</w:instrText>
+              <w:instrText>Toc234741725 \h</w:instrText>
             </w:r>
             <w:r>
               <w:rPr>
@@ -4724,7 +4725,7 @@
               <w:rtl/>
             </w:rPr>
           </w:pPr>
-          <w:hyperlink w:anchor="_Toc230686579" w:history="1">
+          <w:hyperlink w:anchor="_Toc234741726" w:history="1">
             <w:r>
               <w:rPr>
                 <w:rStyle w:val="Hyperlink"/>
@@ -4777,7 +4778,7 @@
                 <w:noProof/>
                 <w:webHidden/>
               </w:rPr>
-              <w:instrText>Toc230686579 \h</w:instrText>
+              <w:instrText>Toc234741726 \h</w:instrText>
             </w:r>
             <w:r>
               <w:rPr>
@@ -4834,7 +4835,124 @@
               <w:rtl/>
             </w:rPr>
           </w:pPr>
-          <w:hyperlink w:anchor="_Toc230686580" w:history="1">
+          <w:hyperlink w:anchor="_Toc234741727" w:history="1">
+            <w:r>
+              <w:rPr>
+                <w:rStyle w:val="Hyperlink"/>
+                <w:noProof/>
+              </w:rPr>
+              <w:t>Testing</w:t>
+            </w:r>
+            <w:r>
+              <w:rPr>
+                <w:rStyle w:val="Hyperlink"/>
+                <w:noProof/>
+                <w:rtl/>
+              </w:rPr>
+              <w:t>:</w:t>
+            </w:r>
+            <w:r>
+              <w:rPr>
+                <w:noProof/>
+                <w:webHidden/>
+                <w:rtl/>
+              </w:rPr>
+              <w:tab/>
+            </w:r>
+            <w:r>
+              <w:rPr>
+                <w:rStyle w:val="Hyperlink"/>
+                <w:noProof/>
+                <w:rtl/>
+              </w:rPr>
+              <w:fldChar w:fldCharType="begin"/>
+            </w:r>
+            <w:r>
+              <w:rPr>
+                <w:noProof/>
+                <w:webHidden/>
+                <w:rtl/>
+              </w:rPr>
+              <w:instrText xml:space="preserve"> </w:instrText>
+            </w:r>
+            <w:r>
+              <w:rPr>
+                <w:noProof/>
+                <w:webHidden/>
+              </w:rPr>
+              <w:instrText>PAGEREF</w:instrText>
+            </w:r>
+            <w:r>
+              <w:rPr>
+                <w:noProof/>
+                <w:webHidden/>
+                <w:rtl/>
+              </w:rPr>
+              <w:instrText xml:space="preserve"> _</w:instrText>
+            </w:r>
+            <w:r>
+              <w:rPr>
+                <w:noProof/>
+                <w:webHidden/>
+              </w:rPr>
+              <w:instrText>Toc234741727 \h</w:instrText>
+            </w:r>
+            <w:r>
+              <w:rPr>
+                <w:noProof/>
+                <w:webHidden/>
+                <w:rtl/>
+              </w:rPr>
+              <w:instrText xml:space="preserve"> </w:instrText>
+            </w:r>
+            <w:r>
+              <w:rPr>
+                <w:rStyle w:val="Hyperlink"/>
+                <w:noProof/>
+                <w:rtl/>
+              </w:rPr>
+            </w:r>
+            <w:r>
+              <w:rPr>
+                <w:rStyle w:val="Hyperlink"/>
+                <w:noProof/>
+                <w:rtl/>
+              </w:rPr>
+              <w:fldChar w:fldCharType="separate"/>
+            </w:r>
+            <w:r>
+              <w:rPr>
+                <w:noProof/>
+                <w:webHidden/>
+                <w:rtl/>
+              </w:rPr>
+              <w:t>18</w:t>
+            </w:r>
+            <w:r>
+              <w:rPr>
+                <w:rStyle w:val="Hyperlink"/>
+                <w:noProof/>
+                <w:rtl/>
+              </w:rPr>
+              <w:fldChar w:fldCharType="end"/>
+            </w:r>
+          </w:hyperlink>
+        </w:p>
+        <w:p>
+          <w:pPr>
+            <w:pStyle w:val="TOC2"/>
+            <w:tabs>
+              <w:tab w:val="right" w:leader="dot" w:pos="8296"/>
+            </w:tabs>
+            <w:rPr>
+              <w:rFonts w:eastAsiaTheme="minorEastAsia"/>
+              <w:noProof/>
+              <w:sz w:val="24"/>
+              <w:szCs w:val="24"/>
+              <w:rtl/>
+            </w:rPr>
+          </w:pPr>
+          <w:hyperlink w:anchor="_Toc234741728" w:history="1">
             <w:r>
               <w:rPr>
                 <w:rStyle w:val="Hyperlink"/>
@@ -4887,7 +5005,7 @@
                 <w:noProof/>
                 <w:webHidden/>
               </w:rPr>
-              <w:instrText>Toc230686580 \h</w:instrText>
+              <w:instrText>Toc234741728 \h</w:instrText>
             </w:r>
             <w:r>
               <w:rPr>
@@ -4944,7 +5062,7 @@
               <w:rtl/>
             </w:rPr>
           </w:pPr>
-          <w:hyperlink w:anchor="_Toc230686581" w:history="1">
+          <w:hyperlink w:anchor="_Toc234741729" w:history="1">
             <w:r>
               <w:rPr>
                 <w:rStyle w:val="Hyperlink"/>
@@ -4996,7 +5114,7 @@
                 <w:noProof/>
                 <w:webHidden/>
               </w:rPr>
-              <w:instrText>Toc230686581 \h</w:instrText>
+              <w:instrText>Toc234741729 \h</w:instrText>
             </w:r>
             <w:r>
               <w:rPr>
@@ -5053,7 +5171,7 @@
               <w:rtl/>
             </w:rPr>
           </w:pPr>
-          <w:hyperlink w:anchor="_Toc230686582" w:history="1">
+          <w:hyperlink w:anchor="_Toc234741730" w:history="1">
             <w:r>
               <w:rPr>
                 <w:rStyle w:val="Hyperlink"/>
@@ -5113,7 +5231,7 @@
                 <w:noProof/>
                 <w:webHidden/>
               </w:rPr>
-              <w:instrText>Toc230686582 \h</w:instrText>
+              <w:instrText>Toc234741730 \h</w:instrText>
             </w:r>
             <w:r>
               <w:rPr>
@@ -5170,7 +5288,7 @@
               <w:rtl/>
             </w:rPr>
           </w:pPr>
-          <w:hyperlink w:anchor="_Toc230686583" w:history="1">
+          <w:hyperlink w:anchor="_Toc234741731" w:history="1">
             <w:r>
               <w:rPr>
                 <w:rStyle w:val="Hyperlink"/>
@@ -5223,7 +5341,7 @@
                 <w:noProof/>
                 <w:webHidden/>
               </w:rPr>
-              <w:instrText>Toc230686583 \h</w:instrText>
+              <w:instrText>Toc234741731 \h</w:instrText>
             </w:r>
             <w:r>
               <w:rPr>
@@ -5280,14 +5398,14 @@
               <w:rtl/>
             </w:rPr>
           </w:pPr>
-          <w:hyperlink w:anchor="_Toc230686584" w:history="1">
-            <w:r>
-              <w:rPr>
-                <w:rStyle w:val="Hyperlink"/>
-                <w:noProof/>
-                <w:rtl/>
-              </w:rPr>
-              <w:t>משימות</w:t>
+          <w:hyperlink w:anchor="_Toc234741732" w:history="1">
+            <w:r>
+              <w:rPr>
+                <w:rStyle w:val="Hyperlink"/>
+                <w:noProof/>
+                <w:rtl/>
+              </w:rPr>
+              <w:t>מבנה של כל קובץ חדש שאתה יוצר</w:t>
             </w:r>
             <w:r>
               <w:rPr>
@@ -5333,7 +5451,7 @@
                 <w:noProof/>
                 <w:webHidden/>
               </w:rPr>
-              <w:instrText>Toc230686584 \h</w:instrText>
+              <w:instrText>Toc234741732 \h</w:instrText>
             </w:r>
             <w:r>
               <w:rPr>
@@ -5365,6 +5483,115 @@
                 <w:rtl/>
               </w:rPr>
               <w:t>24</w:t>
+            </w:r>
+            <w:r>
+              <w:rPr>
+                <w:rStyle w:val="Hyperlink"/>
+                <w:noProof/>
+                <w:rtl/>
+              </w:rPr>
+              <w:fldChar w:fldCharType="end"/>
+            </w:r>
+          </w:hyperlink>
+        </w:p>
+        <w:p>
+          <w:pPr>
+            <w:pStyle w:val="TOC1"/>
+            <w:tabs>
+              <w:tab w:val="right" w:leader="dot" w:pos="8296"/>
+            </w:tabs>
+            <w:rPr>
+              <w:rFonts w:eastAsiaTheme="minorEastAsia"/>
+              <w:noProof/>
+              <w:sz w:val="24"/>
+              <w:szCs w:val="24"/>
+              <w:rtl/>
+            </w:rPr>
+          </w:pPr>
+          <w:hyperlink w:anchor="_Toc234741733" w:history="1">
+            <w:r>
+              <w:rPr>
+                <w:rStyle w:val="Hyperlink"/>
+                <w:noProof/>
+              </w:rPr>
+              <w:t>Env + env.exmple</w:t>
+            </w:r>
+            <w:r>
+              <w:rPr>
+                <w:noProof/>
+                <w:webHidden/>
+                <w:rtl/>
+              </w:rPr>
+              <w:tab/>
+            </w:r>
+            <w:r>
+              <w:rPr>
+                <w:rStyle w:val="Hyperlink"/>
+                <w:noProof/>
+                <w:rtl/>
+              </w:rPr>
+              <w:fldChar w:fldCharType="begin"/>
+            </w:r>
+            <w:r>
+              <w:rPr>
+                <w:noProof/>
+                <w:webHidden/>
+                <w:rtl/>
+              </w:rPr>
+              <w:instrText xml:space="preserve"> </w:instrText>
+            </w:r>
+            <w:r>
+              <w:rPr>
+                <w:noProof/>
+                <w:webHidden/>
+              </w:rPr>
+              <w:instrText>PAGEREF</w:instrText>
+            </w:r>
+            <w:r>
+              <w:rPr>
+                <w:noProof/>
+                <w:webHidden/>
+                <w:rtl/>
+              </w:rPr>
+              <w:instrText xml:space="preserve"> _</w:instrText>
+            </w:r>
+            <w:r>
+              <w:rPr>
+                <w:noProof/>
+                <w:webHidden/>
+              </w:rPr>
+              <w:instrText>Toc234741733 \h</w:instrText>
+            </w:r>
+            <w:r>
+              <w:rPr>
+                <w:noProof/>
+                <w:webHidden/>
+                <w:rtl/>
+              </w:rPr>
+              <w:instrText xml:space="preserve"> </w:instrText>
+            </w:r>
+            <w:r>
+              <w:rPr>
+                <w:rStyle w:val="Hyperlink"/>
+                <w:noProof/>
+                <w:rtl/>
+              </w:rPr>
+            </w:r>
+            <w:r>
+              <w:rPr>
+                <w:rStyle w:val="Hyperlink"/>
+                <w:noProof/>
+                <w:rtl/>
+              </w:rPr>
+              <w:fldChar w:fldCharType="separate"/>
+            </w:r>
+            <w:r>
+              <w:rPr>
+                <w:noProof/>
+                <w:webHidden/>
+                <w:rtl/>
+              </w:rPr>
+              <w:t>25</w:t>
             </w:r>
             <w:r>
               <w:rPr>
@@ -5390,14 +5617,21 @@
               <w:rtl/>
             </w:rPr>
           </w:pPr>
-          <w:hyperlink w:anchor="_Toc230686585" w:history="1">
-            <w:r>
-              <w:rPr>
-                <w:rStyle w:val="Hyperlink"/>
-                <w:noProof/>
-                <w:rtl/>
-              </w:rPr>
-              <w:t>מבנה של כל קובץ חדש שאתה יוצר</w:t>
+          <w:hyperlink w:anchor="_Toc234741734" w:history="1">
+            <w:r>
+              <w:rPr>
+                <w:rStyle w:val="Hyperlink"/>
+                <w:noProof/>
+              </w:rPr>
+              <w:t>Env</w:t>
+            </w:r>
+            <w:r>
+              <w:rPr>
+                <w:rStyle w:val="Hyperlink"/>
+                <w:noProof/>
+                <w:rtl/>
+              </w:rPr>
+              <w:t>:</w:t>
             </w:r>
             <w:r>
               <w:rPr>
@@ -5443,7 +5677,7 @@
                 <w:noProof/>
                 <w:webHidden/>
               </w:rPr>
-              <w:instrText>Toc230686585 \h</w:instrText>
+              <w:instrText>Toc234741734 \h</w:instrText>
             </w:r>
             <w:r>
               <w:rPr>
@@ -5474,7 +5708,356 @@
                 <w:webHidden/>
                 <w:rtl/>
               </w:rPr>
-              <w:t>24</w:t>
+              <w:t>25</w:t>
+            </w:r>
+            <w:r>
+              <w:rPr>
+                <w:rStyle w:val="Hyperlink"/>
+                <w:noProof/>
+                <w:rtl/>
+              </w:rPr>
+              <w:fldChar w:fldCharType="end"/>
+            </w:r>
+          </w:hyperlink>
+        </w:p>
+        <w:p>
+          <w:pPr>
+            <w:pStyle w:val="TOC2"/>
+            <w:tabs>
+              <w:tab w:val="right" w:leader="dot" w:pos="8296"/>
+            </w:tabs>
+            <w:rPr>
+              <w:rFonts w:eastAsiaTheme="minorEastAsia"/>
+              <w:noProof/>
+              <w:sz w:val="24"/>
+              <w:szCs w:val="24"/>
+              <w:rtl/>
+            </w:rPr>
+          </w:pPr>
+          <w:hyperlink w:anchor="_Toc234741735" w:history="1">
+            <w:r>
+              <w:rPr>
+                <w:rStyle w:val="Hyperlink"/>
+                <w:noProof/>
+              </w:rPr>
+              <w:t>Env example</w:t>
+            </w:r>
+            <w:r>
+              <w:rPr>
+                <w:rStyle w:val="Hyperlink"/>
+                <w:noProof/>
+                <w:rtl/>
+              </w:rPr>
+              <w:t>:</w:t>
+            </w:r>
+            <w:r>
+              <w:rPr>
+                <w:noProof/>
+                <w:webHidden/>
+                <w:rtl/>
+              </w:rPr>
+              <w:tab/>
+            </w:r>
+            <w:r>
+              <w:rPr>
+                <w:rStyle w:val="Hyperlink"/>
+                <w:noProof/>
+                <w:rtl/>
+              </w:rPr>
+              <w:fldChar w:fldCharType="begin"/>
+            </w:r>
+            <w:r>
+              <w:rPr>
+                <w:noProof/>
+                <w:webHidden/>
+                <w:rtl/>
+              </w:rPr>
+              <w:instrText xml:space="preserve"> </w:instrText>
+            </w:r>
+            <w:r>
+              <w:rPr>
+                <w:noProof/>
+                <w:webHidden/>
+              </w:rPr>
+              <w:instrText>PAGEREF</w:instrText>
+            </w:r>
+            <w:r>
+              <w:rPr>
+                <w:noProof/>
+                <w:webHidden/>
+                <w:rtl/>
+              </w:rPr>
+              <w:instrText xml:space="preserve"> _</w:instrText>
+            </w:r>
+            <w:r>
+              <w:rPr>
+                <w:noProof/>
+                <w:webHidden/>
+              </w:rPr>
+              <w:instrText>Toc234741735 \h</w:instrText>
+            </w:r>
+            <w:r>
+              <w:rPr>
+                <w:noProof/>
+                <w:webHidden/>
+                <w:rtl/>
+              </w:rPr>
+              <w:instrText xml:space="preserve"> </w:instrText>
+            </w:r>
+            <w:r>
+              <w:rPr>
+                <w:rStyle w:val="Hyperlink"/>
+                <w:noProof/>
+                <w:rtl/>
+              </w:rPr>
+            </w:r>
+            <w:r>
+              <w:rPr>
+                <w:rStyle w:val="Hyperlink"/>
+                <w:noProof/>
+                <w:rtl/>
+              </w:rPr>
+              <w:fldChar w:fldCharType="separate"/>
+            </w:r>
+            <w:r>
+              <w:rPr>
+                <w:noProof/>
+                <w:webHidden/>
+                <w:rtl/>
+              </w:rPr>
+              <w:t>25</w:t>
+            </w:r>
+            <w:r>
+              <w:rPr>
+                <w:rStyle w:val="Hyperlink"/>
+                <w:noProof/>
+                <w:rtl/>
+              </w:rPr>
+              <w:fldChar w:fldCharType="end"/>
+            </w:r>
+          </w:hyperlink>
+        </w:p>
+        <w:p>
+          <w:pPr>
+            <w:pStyle w:val="TOC1"/>
+            <w:tabs>
+              <w:tab w:val="right" w:leader="dot" w:pos="8296"/>
+            </w:tabs>
+            <w:rPr>
+              <w:rFonts w:eastAsiaTheme="minorEastAsia"/>
+              <w:noProof/>
+              <w:sz w:val="24"/>
+              <w:szCs w:val="24"/>
+              <w:rtl/>
+            </w:rPr>
+          </w:pPr>
+          <w:hyperlink w:anchor="_Toc234741736" w:history="1">
+            <w:r>
+              <w:rPr>
+                <w:rStyle w:val="Hyperlink"/>
+                <w:noProof/>
+              </w:rPr>
+              <w:t>.gitignore</w:t>
+            </w:r>
+            <w:r>
+              <w:rPr>
+                <w:noProof/>
+                <w:webHidden/>
+                <w:rtl/>
+              </w:rPr>
+              <w:tab/>
+            </w:r>
+            <w:r>
+              <w:rPr>
+                <w:rStyle w:val="Hyperlink"/>
+                <w:noProof/>
+                <w:rtl/>
+              </w:rPr>
+              <w:fldChar w:fldCharType="begin"/>
+            </w:r>
+            <w:r>
+              <w:rPr>
+                <w:noProof/>
+                <w:webHidden/>
+                <w:rtl/>
+              </w:rPr>
+              <w:instrText xml:space="preserve"> </w:instrText>
+            </w:r>
+            <w:r>
+              <w:rPr>
+                <w:noProof/>
+                <w:webHidden/>
+              </w:rPr>
+              <w:instrText>PAGEREF</w:instrText>
+            </w:r>
+            <w:r>
+              <w:rPr>
+                <w:noProof/>
+                <w:webHidden/>
+                <w:rtl/>
+              </w:rPr>
+              <w:instrText xml:space="preserve"> _</w:instrText>
+            </w:r>
+            <w:r>
+              <w:rPr>
+                <w:noProof/>
+                <w:webHidden/>
+              </w:rPr>
+              <w:instrText>Toc234741736 \h</w:instrText>
+            </w:r>
+            <w:r>
+              <w:rPr>
+                <w:noProof/>
+                <w:webHidden/>
+                <w:rtl/>
+              </w:rPr>
+              <w:instrText xml:space="preserve"> </w:instrText>
+            </w:r>
+            <w:r>
+              <w:rPr>
+                <w:rStyle w:val="Hyperlink"/>
+                <w:noProof/>
+                <w:rtl/>
+              </w:rPr>
+            </w:r>
+            <w:r>
+              <w:rPr>
+                <w:rStyle w:val="Hyperlink"/>
+                <w:noProof/>
+                <w:rtl/>
+              </w:rPr>
+              <w:fldChar w:fldCharType="separate"/>
+            </w:r>
+            <w:r>
+              <w:rPr>
+                <w:noProof/>
+                <w:webHidden/>
+                <w:rtl/>
+              </w:rPr>
+              <w:t>26</w:t>
+            </w:r>
+            <w:r>
+              <w:rPr>
+                <w:rStyle w:val="Hyperlink"/>
+                <w:noProof/>
+                <w:rtl/>
+              </w:rPr>
+              <w:fldChar w:fldCharType="end"/>
+            </w:r>
+          </w:hyperlink>
+        </w:p>
+        <w:p>
+          <w:pPr>
+            <w:pStyle w:val="TOC2"/>
+            <w:tabs>
+              <w:tab w:val="right" w:leader="dot" w:pos="8296"/>
+            </w:tabs>
+            <w:rPr>
+              <w:rFonts w:eastAsiaTheme="minorEastAsia"/>
+              <w:noProof/>
+              <w:sz w:val="24"/>
+              <w:szCs w:val="24"/>
+              <w:rtl/>
+            </w:rPr>
+          </w:pPr>
+          <w:hyperlink w:anchor="_Toc234741737" w:history="1">
+            <w:r>
+              <w:rPr>
+                <w:rStyle w:val="Hyperlink"/>
+                <w:noProof/>
+              </w:rPr>
+              <w:t>Path han</w:t>
+            </w:r>
+            <w:r>
+              <w:rPr>
+                <w:rStyle w:val="Hyperlink"/>
+                <w:noProof/>
+              </w:rPr>
+              <w:t>d</w:t>
+            </w:r>
+            <w:r>
+              <w:rPr>
+                <w:rStyle w:val="Hyperlink"/>
+                <w:noProof/>
+              </w:rPr>
+              <w:t>ling</w:t>
+            </w:r>
+            <w:r>
+              <w:rPr>
+                <w:noProof/>
+                <w:webHidden/>
+                <w:rtl/>
+              </w:rPr>
+              <w:tab/>
+            </w:r>
+            <w:r>
+              <w:rPr>
+                <w:rStyle w:val="Hyperlink"/>
+                <w:noProof/>
+                <w:rtl/>
+              </w:rPr>
+              <w:fldChar w:fldCharType="begin"/>
+            </w:r>
+            <w:r>
+              <w:rPr>
+                <w:noProof/>
+                <w:webHidden/>
+                <w:rtl/>
+              </w:rPr>
+              <w:instrText xml:space="preserve"> </w:instrText>
+            </w:r>
+            <w:r>
+              <w:rPr>
+                <w:noProof/>
+                <w:webHidden/>
+              </w:rPr>
+              <w:instrText>PAGEREF</w:instrText>
+            </w:r>
+            <w:r>
+              <w:rPr>
+                <w:noProof/>
+                <w:webHidden/>
+                <w:rtl/>
+              </w:rPr>
+              <w:instrText xml:space="preserve"> _</w:instrText>
+            </w:r>
+            <w:r>
+              <w:rPr>
+                <w:noProof/>
+                <w:webHidden/>
+              </w:rPr>
+              <w:instrText>Toc234741737 \h</w:instrText>
+            </w:r>
+            <w:r>
+              <w:rPr>
+                <w:noProof/>
+                <w:webHidden/>
+                <w:rtl/>
+              </w:rPr>
+              <w:instrText xml:space="preserve"> </w:instrText>
+            </w:r>
+            <w:r>
+              <w:rPr>
+                <w:rStyle w:val="Hyperlink"/>
+                <w:noProof/>
+                <w:rtl/>
+              </w:rPr>
+            </w:r>
+            <w:r>
+              <w:rPr>
+                <w:rStyle w:val="Hyperlink"/>
+                <w:noProof/>
+                <w:rtl/>
+              </w:rPr>
+              <w:fldChar w:fldCharType="separate"/>
+            </w:r>
+            <w:r>
+              <w:rPr>
+                <w:noProof/>
+                <w:webHidden/>
+                <w:rtl/>
+              </w:rPr>
+              <w:t>26</w:t>
             </w:r>
             <w:r>
               <w:rPr>
@@ -5676,7 +6259,7 @@
           <w:rtl/>
         </w:rPr>
       </w:pPr>
-      <w:bookmarkStart w:id="2" w:name="_Toc230686538"/>
+      <w:bookmarkStart w:id="2" w:name="_Toc234741685"/>
       <w:r>
         <w:rPr>
           <w:rFonts w:hint="cs"/>
@@ -5695,7 +6278,7 @@
           <w:szCs w:val="28"/>
         </w:rPr>
       </w:pPr>
-      <w:bookmarkStart w:id="3" w:name="_Toc230686539"/>
+      <w:bookmarkStart w:id="3" w:name="_Toc234741686"/>
       <w:r>
         <w:rPr>
           <w:rStyle w:val="20"/>
@@ -5745,7 +6328,7 @@
           <w:szCs w:val="28"/>
         </w:rPr>
       </w:pPr>
-      <w:bookmarkStart w:id="4" w:name="_Toc230686540"/>
+      <w:bookmarkStart w:id="4" w:name="_Toc234741687"/>
       <w:r>
         <w:rPr>
           <w:rStyle w:val="20"/>
@@ -5869,12 +6452,13 @@
           <w:szCs w:val="28"/>
         </w:rPr>
       </w:pPr>
-      <w:bookmarkStart w:id="5" w:name="_Toc230686541"/>
+      <w:bookmarkStart w:id="5" w:name="_Toc234741688"/>
       <w:r>
         <w:rPr>
           <w:rStyle w:val="20"/>
           <w:u w:val="single"/>
         </w:rPr>
+        <w:lastRenderedPageBreak/>
         <w:t>Q3. What type of model should I use?</w:t>
       </w:r>
       <w:bookmarkEnd w:id="5"/>
@@ -5906,7 +6490,6 @@
           <w:sz w:val="28"/>
           <w:szCs w:val="28"/>
         </w:rPr>
-        <w:lastRenderedPageBreak/>
         <w:t>Suggested order, from easiest to most complex:</w:t>
       </w:r>
     </w:p>
@@ -6199,7 +6782,7 @@
           <w:rtl/>
         </w:rPr>
       </w:pPr>
-      <w:bookmarkStart w:id="6" w:name="_Toc230686542"/>
+      <w:bookmarkStart w:id="6" w:name="_Toc234741689"/>
       <w:r>
         <w:rPr>
           <w:rFonts w:hint="cs"/>
@@ -6429,6 +7012,7 @@
           <w:szCs w:val="28"/>
           <w:rtl/>
         </w:rPr>
+        <w:lastRenderedPageBreak/>
         <w:t>אולי מבני נתונים מהירים לבדיקת מניות וכדומה כמו שראינו במבני נתונים.</w:t>
       </w:r>
     </w:p>
@@ -6517,7 +7101,7 @@
           <w:szCs w:val="28"/>
         </w:rPr>
       </w:pPr>
-      <w:bookmarkStart w:id="7" w:name="_Toc230686543"/>
+      <w:bookmarkStart w:id="7" w:name="_Toc234741690"/>
       <w:r>
         <w:rPr>
           <w:rStyle w:val="20"/>
@@ -6567,7 +7151,7 @@
           <w:szCs w:val="28"/>
         </w:rPr>
       </w:pPr>
-      <w:bookmarkStart w:id="8" w:name="_Toc230686544"/>
+      <w:bookmarkStart w:id="8" w:name="_Toc234741691"/>
       <w:r>
         <w:rPr>
           <w:rStyle w:val="20"/>
@@ -6663,7 +7247,7 @@
           <w:szCs w:val="28"/>
         </w:rPr>
       </w:pPr>
-      <w:bookmarkStart w:id="9" w:name="_Toc230686545"/>
+      <w:bookmarkStart w:id="9" w:name="_Toc234741692"/>
       <w:r>
         <w:rPr>
           <w:rStyle w:val="20"/>
@@ -6833,7 +7417,7 @@
           <w:szCs w:val="28"/>
         </w:rPr>
       </w:pPr>
-      <w:bookmarkStart w:id="10" w:name="_Toc230686546"/>
+      <w:bookmarkStart w:id="10" w:name="_Toc234741693"/>
       <w:r>
         <w:rPr>
           <w:rStyle w:val="20"/>
@@ -6862,7 +7446,15 @@
           <w:szCs w:val="28"/>
         </w:rPr>
         <w:br/>
-        <w:t xml:space="preserve">Python is the correct choice for this project. It is the standard language for market-data work, machine learning, </w:t>
+        <w:t xml:space="preserve">Python is the correct choice for this project. It is the standard </w:t>
+      </w:r>
+      <w:r>
+        <w:rPr>
+          <w:sz w:val="28"/>
+          <w:szCs w:val="28"/>
+        </w:rPr>
+        <w:lastRenderedPageBreak/>
+        <w:t xml:space="preserve">language for market-data work, machine learning, </w:t>
       </w:r>
       <w:proofErr w:type="spellStart"/>
       <w:r>
@@ -6889,7 +7481,7 @@
           <w:szCs w:val="28"/>
         </w:rPr>
       </w:pPr>
-      <w:bookmarkStart w:id="11" w:name="_Toc230686547"/>
+      <w:bookmarkStart w:id="11" w:name="_Toc234741694"/>
       <w:r>
         <w:rPr>
           <w:rStyle w:val="20"/>
@@ -6910,15 +7502,7 @@
           <w:sz w:val="28"/>
           <w:szCs w:val="28"/>
         </w:rPr>
-        <w:t xml:space="preserve">A. Paper trading is included, but real-time market data is not fully </w:t>
-      </w:r>
-      <w:r>
-        <w:rPr>
-          <w:sz w:val="28"/>
-          <w:szCs w:val="28"/>
-        </w:rPr>
-        <w:lastRenderedPageBreak/>
-        <w:t>free.</w:t>
+        <w:t>A. Paper trading is included, but real-time market data is not fully free.</w:t>
       </w:r>
       <w:r>
         <w:rPr>
@@ -6978,7 +7562,7 @@
           <w:szCs w:val="28"/>
         </w:rPr>
       </w:pPr>
-      <w:bookmarkStart w:id="12" w:name="_Toc230686548"/>
+      <w:bookmarkStart w:id="12" w:name="_Toc234741695"/>
       <w:r>
         <w:rPr>
           <w:rStyle w:val="20"/>
@@ -7119,7 +7703,7 @@
           <w:szCs w:val="28"/>
         </w:rPr>
       </w:pPr>
-      <w:bookmarkStart w:id="13" w:name="_Toc230686549"/>
+      <w:bookmarkStart w:id="13" w:name="_Toc234741696"/>
       <w:r>
         <w:rPr>
           <w:rStyle w:val="20"/>
@@ -7148,7 +7732,15 @@
           <w:szCs w:val="28"/>
         </w:rPr>
         <w:br/>
-        <w:t xml:space="preserve">Weights alone are not enough. The saved training data, or at least a reproducible snapshot of it, is needed so the model can be reproduced, audited, compared, and debugged later. Without the data and preprocessing pipeline, the </w:t>
+        <w:t xml:space="preserve">Weights alone are not enough. The saved training data, or at least a reproducible snapshot of it, is needed so the model can be reproduced, audited, compared, and debugged later. Without the </w:t>
+      </w:r>
+      <w:r>
+        <w:rPr>
+          <w:sz w:val="28"/>
+          <w:szCs w:val="28"/>
+        </w:rPr>
+        <w:lastRenderedPageBreak/>
+        <w:t xml:space="preserve">data and preprocessing pipeline, the </w:t>
       </w:r>
       <w:proofErr w:type="gramStart"/>
       <w:r>
@@ -7240,7 +7832,6 @@
           <w:sz w:val="28"/>
           <w:szCs w:val="28"/>
         </w:rPr>
-        <w:lastRenderedPageBreak/>
         <w:t>train/test split dates</w:t>
       </w:r>
     </w:p>
@@ -7352,7 +7943,7 @@
           <w:rtl/>
         </w:rPr>
       </w:pPr>
-      <w:bookmarkStart w:id="14" w:name="_Toc230686550"/>
+      <w:bookmarkStart w:id="14" w:name="_Toc234741697"/>
       <w:r>
         <w:rPr>
           <w:rFonts w:hint="cs"/>
@@ -7426,7 +8017,7 @@
           <w:szCs w:val="28"/>
         </w:rPr>
       </w:pPr>
-      <w:bookmarkStart w:id="15" w:name="_Toc230686551"/>
+      <w:bookmarkStart w:id="15" w:name="_Toc234741698"/>
       <w:r>
         <w:rPr>
           <w:rStyle w:val="20"/>
@@ -7679,6 +8270,7 @@
           <w:sz w:val="28"/>
           <w:szCs w:val="28"/>
         </w:rPr>
+        <w:lastRenderedPageBreak/>
         <w:t>This part should sit outside the prediction model as a hard risk layer.</w:t>
       </w:r>
     </w:p>
@@ -7690,7 +8282,7 @@
           <w:u w:val="single"/>
         </w:rPr>
       </w:pPr>
-      <w:bookmarkStart w:id="16" w:name="_Toc230686552"/>
+      <w:bookmarkStart w:id="16" w:name="_Toc234741699"/>
       <w:r>
         <w:rPr>
           <w:u w:val="single"/>
@@ -7724,12 +8316,11 @@
           <w:u w:val="single"/>
         </w:rPr>
       </w:pPr>
-      <w:bookmarkStart w:id="17" w:name="_Toc230686553"/>
+      <w:bookmarkStart w:id="17" w:name="_Toc234741700"/>
       <w:r>
         <w:rPr>
           <w:u w:val="single"/>
         </w:rPr>
-        <w:lastRenderedPageBreak/>
         <w:t>ADDITIONAL PROJECT QUESTIONS</w:t>
       </w:r>
       <w:bookmarkEnd w:id="17"/>
@@ -7742,7 +8333,7 @@
           <w:szCs w:val="28"/>
         </w:rPr>
       </w:pPr>
-      <w:bookmarkStart w:id="18" w:name="_Toc230686554"/>
+      <w:bookmarkStart w:id="18" w:name="_Toc234741701"/>
       <w:r>
         <w:rPr>
           <w:rStyle w:val="30"/>
@@ -7780,7 +8371,7 @@
           <w:szCs w:val="28"/>
         </w:rPr>
       </w:pPr>
-      <w:bookmarkStart w:id="19" w:name="_Toc230686555"/>
+      <w:bookmarkStart w:id="19" w:name="_Toc234741702"/>
       <w:r>
         <w:rPr>
           <w:rStyle w:val="20"/>
@@ -7932,7 +8523,7 @@
           <w:szCs w:val="28"/>
         </w:rPr>
       </w:pPr>
-      <w:bookmarkStart w:id="20" w:name="_Toc230686556"/>
+      <w:bookmarkStart w:id="20" w:name="_Toc234741703"/>
       <w:r>
         <w:rPr>
           <w:rStyle w:val="30"/>
@@ -7970,7 +8561,7 @@
           <w:szCs w:val="28"/>
         </w:rPr>
       </w:pPr>
-      <w:bookmarkStart w:id="21" w:name="_Toc230686557"/>
+      <w:bookmarkStart w:id="21" w:name="_Toc234741704"/>
       <w:r>
         <w:rPr>
           <w:rStyle w:val="30"/>
@@ -8073,6 +8664,7 @@
           <w:sz w:val="28"/>
           <w:szCs w:val="28"/>
         </w:rPr>
+        <w:lastRenderedPageBreak/>
         <w:t>mergers</w:t>
       </w:r>
     </w:p>
@@ -8140,12 +8732,11 @@
           <w:szCs w:val="28"/>
         </w:rPr>
       </w:pPr>
-      <w:bookmarkStart w:id="22" w:name="_Toc230686558"/>
+      <w:bookmarkStart w:id="22" w:name="_Toc234741705"/>
       <w:r>
         <w:rPr>
           <w:rStyle w:val="30"/>
         </w:rPr>
-        <w:lastRenderedPageBreak/>
         <w:t>Q5. How will trading costs be handled?</w:t>
       </w:r>
       <w:bookmarkEnd w:id="22"/>
@@ -8291,7 +8882,7 @@
           <w:szCs w:val="28"/>
         </w:rPr>
       </w:pPr>
-      <w:bookmarkStart w:id="23" w:name="_Toc230686559"/>
+      <w:bookmarkStart w:id="23" w:name="_Toc234741706"/>
       <w:r>
         <w:rPr>
           <w:rStyle w:val="30"/>
@@ -8448,7 +9039,7 @@
           <w:szCs w:val="28"/>
         </w:rPr>
       </w:pPr>
-      <w:bookmarkStart w:id="24" w:name="_Toc230686560"/>
+      <w:bookmarkStart w:id="24" w:name="_Toc234741707"/>
       <w:r>
         <w:rPr>
           <w:rStyle w:val="30"/>
@@ -8549,6 +9140,7 @@
           <w:sz w:val="28"/>
           <w:szCs w:val="28"/>
         </w:rPr>
+        <w:lastRenderedPageBreak/>
         <w:t>every month</w:t>
       </w:r>
     </w:p>
@@ -8580,7 +9172,7 @@
           <w:szCs w:val="28"/>
         </w:rPr>
       </w:pPr>
-      <w:bookmarkStart w:id="25" w:name="_Toc230686561"/>
+      <w:bookmarkStart w:id="25" w:name="_Toc234741708"/>
       <w:r>
         <w:rPr>
           <w:rStyle w:val="30"/>
@@ -8641,7 +9233,6 @@
           <w:sz w:val="28"/>
           <w:szCs w:val="28"/>
         </w:rPr>
-        <w:lastRenderedPageBreak/>
         <w:t>top 1 stock each day</w:t>
       </w:r>
     </w:p>
@@ -8729,7 +9320,7 @@
           <w:szCs w:val="28"/>
         </w:rPr>
       </w:pPr>
-      <w:bookmarkStart w:id="26" w:name="_Toc230686562"/>
+      <w:bookmarkStart w:id="26" w:name="_Toc234741709"/>
       <w:r>
         <w:rPr>
           <w:rStyle w:val="30"/>
@@ -8879,7 +9470,7 @@
           <w:szCs w:val="28"/>
         </w:rPr>
       </w:pPr>
-      <w:bookmarkStart w:id="27" w:name="_Toc230686563"/>
+      <w:bookmarkStart w:id="27" w:name="_Toc234741710"/>
       <w:r>
         <w:rPr>
           <w:rStyle w:val="30"/>
@@ -8912,7 +9503,7 @@
           <w:szCs w:val="28"/>
         </w:rPr>
       </w:pPr>
-      <w:bookmarkStart w:id="28" w:name="_Toc230686564"/>
+      <w:bookmarkStart w:id="28" w:name="_Toc234741711"/>
       <w:r>
         <w:rPr>
           <w:rStyle w:val="30"/>
@@ -8950,11 +9541,12 @@
           <w:szCs w:val="28"/>
         </w:rPr>
       </w:pPr>
-      <w:bookmarkStart w:id="29" w:name="_Toc230686565"/>
+      <w:bookmarkStart w:id="29" w:name="_Toc234741712"/>
       <w:r>
         <w:rPr>
           <w:rStyle w:val="30"/>
         </w:rPr>
+        <w:lastRenderedPageBreak/>
         <w:t>Q12. What if the model is uncertain?</w:t>
       </w:r>
       <w:bookmarkEnd w:id="29"/>
@@ -9025,7 +9617,6 @@
           <w:sz w:val="28"/>
           <w:szCs w:val="28"/>
         </w:rPr>
-        <w:lastRenderedPageBreak/>
         <w:t xml:space="preserve">The current project design </w:t>
       </w:r>
       <w:proofErr w:type="gramStart"/>
@@ -9228,14 +9819,13 @@
           <w:rtl/>
         </w:rPr>
       </w:pPr>
-      <w:bookmarkStart w:id="30" w:name="_Toc230686566"/>
+      <w:bookmarkStart w:id="30" w:name="_Toc234741713"/>
       <w:r>
         <w:rPr>
           <w:rFonts w:hint="cs"/>
           <w:u w:val="single"/>
           <w:rtl/>
         </w:rPr>
-        <w:lastRenderedPageBreak/>
         <w:t>מבנה הפרויקט</w:t>
       </w:r>
       <w:bookmarkEnd w:id="30"/>
@@ -9247,7 +9837,7 @@
           <w:rtl/>
         </w:rPr>
       </w:pPr>
-      <w:bookmarkStart w:id="31" w:name="_Toc230686567"/>
+      <w:bookmarkStart w:id="31" w:name="_Toc234741714"/>
       <w:r>
         <w:rPr>
           <w:rFonts w:hint="cs"/>
@@ -9308,7 +9898,7 @@
           <w:rtl/>
         </w:rPr>
       </w:pPr>
-      <w:bookmarkStart w:id="32" w:name="_Toc230686568"/>
+      <w:bookmarkStart w:id="32" w:name="_Toc234741715"/>
       <w:r>
         <w:rPr>
           <w:rFonts w:hint="cs"/>
@@ -9618,7 +10208,7 @@
           <w:rtl/>
         </w:rPr>
       </w:pPr>
-      <w:bookmarkStart w:id="33" w:name="_Toc230686569"/>
+      <w:bookmarkStart w:id="33" w:name="_Toc234741716"/>
       <w:r>
         <w:rPr>
           <w:rFonts w:hint="cs"/>
@@ -9782,7 +10372,7 @@
           <w:rtl/>
         </w:rPr>
       </w:pPr>
-      <w:bookmarkStart w:id="34" w:name="_Toc230686570"/>
+      <w:bookmarkStart w:id="34" w:name="_Toc234741717"/>
       <w:r>
         <w:rPr>
           <w:rFonts w:eastAsiaTheme="minorEastAsia" w:hint="cs"/>
@@ -9947,14 +10537,13 @@
           <w:rtl/>
         </w:rPr>
       </w:pPr>
-      <w:bookmarkStart w:id="35" w:name="_Toc230686571"/>
+      <w:bookmarkStart w:id="35" w:name="_Toc234741718"/>
       <w:r>
         <w:rPr>
           <w:rFonts w:hint="cs"/>
           <w:u w:val="single"/>
           <w:rtl/>
         </w:rPr>
-        <w:lastRenderedPageBreak/>
         <w:t>שלבי ביצוע המודל</w:t>
       </w:r>
       <w:bookmarkEnd w:id="35"/>
@@ -9967,7 +10556,7 @@
           <w:rtl/>
         </w:rPr>
       </w:pPr>
-      <w:bookmarkStart w:id="36" w:name="_Toc230686572"/>
+      <w:bookmarkStart w:id="36" w:name="_Toc234741719"/>
       <w:r>
         <w:rPr>
           <w:rFonts w:cs="Times New Roman"/>
@@ -10020,7 +10609,7 @@
           <w:rtl/>
         </w:rPr>
       </w:pPr>
-      <w:bookmarkStart w:id="37" w:name="_Toc230686573"/>
+      <w:bookmarkStart w:id="37" w:name="_Toc234741720"/>
       <w:r>
         <w:rPr>
           <w:rFonts w:hint="cs"/>
@@ -10150,14 +10739,13 @@
           <w:rtl/>
         </w:rPr>
       </w:pPr>
-      <w:bookmarkStart w:id="38" w:name="_Toc230686574"/>
+      <w:bookmarkStart w:id="38" w:name="_Toc234741721"/>
       <w:r>
         <w:rPr>
           <w:rFonts w:hint="cs"/>
           <w:u w:val="single"/>
           <w:rtl/>
         </w:rPr>
-        <w:lastRenderedPageBreak/>
         <w:t xml:space="preserve">מטלות להיום </w:t>
       </w:r>
       <w:r>
@@ -10368,7 +10956,7 @@
           <w:rtl/>
         </w:rPr>
       </w:pPr>
-      <w:bookmarkStart w:id="39" w:name="_Toc230686575"/>
+      <w:bookmarkStart w:id="39" w:name="_Toc234741722"/>
       <w:r>
         <w:rPr>
           <w:rFonts w:hint="cs"/>
@@ -10743,12 +11331,11 @@
           <w:u w:val="single"/>
         </w:rPr>
       </w:pPr>
-      <w:bookmarkStart w:id="40" w:name="_Toc230686576"/>
+      <w:bookmarkStart w:id="40" w:name="_Toc234741723"/>
       <w:r>
         <w:rPr>
           <w:u w:val="single"/>
         </w:rPr>
-        <w:lastRenderedPageBreak/>
         <w:t xml:space="preserve">Linear regression vs </w:t>
       </w:r>
       <w:proofErr w:type="spellStart"/>
@@ -11183,12 +11770,11 @@
           <w:rtl/>
         </w:rPr>
       </w:pPr>
-      <w:bookmarkStart w:id="41" w:name="_Toc230686577"/>
+      <w:bookmarkStart w:id="41" w:name="_Toc234741724"/>
       <w:r>
         <w:rPr>
           <w:u w:val="single"/>
         </w:rPr>
-        <w:lastRenderedPageBreak/>
         <w:t>Train – 70%, validation -15%, test – 15%</w:t>
       </w:r>
       <w:bookmarkEnd w:id="41"/>
@@ -11455,7 +12041,7 @@
           <w:rtl/>
         </w:rPr>
       </w:pPr>
-      <w:bookmarkStart w:id="42" w:name="_Toc230686578"/>
+      <w:bookmarkStart w:id="42" w:name="_Toc234741725"/>
       <w:r>
         <w:rPr>
           <w:rFonts w:hint="cs"/>
@@ -11700,6 +12286,7 @@
                 <w:szCs w:val="28"/>
                 <w:rtl/>
               </w:rPr>
+              <w:lastRenderedPageBreak/>
               <w:t>3</w:t>
             </w:r>
           </w:p>
@@ -11810,7 +12397,7 @@
           <w:rtl/>
         </w:rPr>
       </w:pPr>
-      <w:bookmarkStart w:id="43" w:name="_Toc230686579"/>
+      <w:bookmarkStart w:id="43" w:name="_Toc234741726"/>
       <w:r>
         <w:rPr>
           <w:rFonts w:hint="cs"/>
@@ -12203,6 +12790,7 @@
           <w:rtl/>
         </w:rPr>
       </w:pPr>
+      <w:bookmarkStart w:id="44" w:name="_Toc234741727"/>
       <w:r>
         <w:rPr>
           <w:u w:val="single"/>
@@ -12217,6 +12805,7 @@
         </w:rPr>
         <w:t>:</w:t>
       </w:r>
+      <w:bookmarkEnd w:id="44"/>
     </w:p>
     <w:p>
       <w:pPr>
@@ -12392,7 +12981,7 @@
           <w:rtl/>
         </w:rPr>
       </w:pPr>
-      <w:bookmarkStart w:id="44" w:name="_Toc230686580"/>
+      <w:bookmarkStart w:id="45" w:name="_Toc234741728"/>
       <w:r>
         <w:rPr>
           <w:rFonts w:hint="cs"/>
@@ -12401,7 +12990,7 @@
         </w:rPr>
         <w:t>מה עדיין מונע מהקוד להיות ברמה גבוהה</w:t>
       </w:r>
-      <w:bookmarkEnd w:id="44"/>
+      <w:bookmarkEnd w:id="45"/>
     </w:p>
     <w:p>
       <w:pPr>
@@ -12534,14 +13123,14 @@
           <w:u w:val="single"/>
         </w:rPr>
       </w:pPr>
-      <w:bookmarkStart w:id="45" w:name="_Toc230686581"/>
+      <w:bookmarkStart w:id="46" w:name="_Toc234741729"/>
       <w:r>
         <w:rPr>
           <w:u w:val="single"/>
         </w:rPr>
         <w:t>Object oriented programming -&gt; the solution</w:t>
       </w:r>
-      <w:bookmarkEnd w:id="45"/>
+      <w:bookmarkEnd w:id="46"/>
     </w:p>
     <w:p>
       <w:pPr>
@@ -12791,6 +13380,7 @@
           <w:szCs w:val="28"/>
           <w:rtl/>
         </w:rPr>
+        <w:lastRenderedPageBreak/>
         <w:t xml:space="preserve">נשים מודלים מאותו נושא ביחד לדוגמא </w:t>
       </w:r>
       <m:oMath>
@@ -12889,7 +13479,7 @@
           <w:rtl/>
         </w:rPr>
       </w:pPr>
-      <w:bookmarkStart w:id="46" w:name="_Toc230686582"/>
+      <w:bookmarkStart w:id="47" w:name="_Toc234741730"/>
       <w:r>
         <w:rPr>
           <w:rFonts w:hint="cs"/>
@@ -12904,7 +13494,7 @@
         </w:rPr>
         <w:t>GitHub</w:t>
       </w:r>
-      <w:bookmarkEnd w:id="46"/>
+      <w:bookmarkEnd w:id="47"/>
     </w:p>
     <w:p>
       <w:pPr>
@@ -13102,6 +13692,7 @@
           <w:szCs w:val="28"/>
           <w:rtl/>
         </w:rPr>
+        <w:lastRenderedPageBreak/>
         <w:drawing>
           <wp:inline distT="0" distB="0" distL="0" distR="0" wp14:anchorId="6B7F5251" wp14:editId="694B5469">
             <wp:extent cx="5274310" cy="539750"/>
@@ -13249,7 +13840,6 @@
           <w:szCs w:val="28"/>
           <w:rtl/>
         </w:rPr>
-        <w:lastRenderedPageBreak/>
         <w:t>אם אתה רוצה קובץ מסוים ולא את כולם, אתה מחליף את ה "." בשם של הקובץ.</w:t>
       </w:r>
     </w:p>
@@ -13627,7 +14217,7 @@
           <w:rtl/>
         </w:rPr>
       </w:pPr>
-      <w:bookmarkStart w:id="47" w:name="_Toc230686583"/>
+      <w:bookmarkStart w:id="48" w:name="_Toc234741731"/>
       <w:r>
         <w:rPr>
           <w:rFonts w:hint="cs"/>
@@ -13636,7 +14226,7 @@
         </w:rPr>
         <w:t>תובנות/ מסקנות מהפרויקט</w:t>
       </w:r>
-      <w:bookmarkEnd w:id="47"/>
+      <w:bookmarkEnd w:id="48"/>
     </w:p>
     <w:p>
       <w:pPr>
@@ -13769,6 +14359,7 @@
           <w:szCs w:val="28"/>
           <w:rtl/>
         </w:rPr>
+        <w:lastRenderedPageBreak/>
         <w:t>להתחיל יש מהסגנון הנכון.</w:t>
       </w:r>
     </w:p>
@@ -13867,7 +14458,6 @@
           <w:szCs w:val="28"/>
           <w:rtl/>
         </w:rPr>
-        <w:lastRenderedPageBreak/>
         <w:t>קובץ אחד הוא על ה</w:t>
       </w:r>
       <w:r>
@@ -14789,6 +15379,7 @@
           <w:szCs w:val="28"/>
           <w:rtl/>
         </w:rPr>
+        <w:lastRenderedPageBreak/>
         <w:t xml:space="preserve">שאתה עושה </w:t>
       </w:r>
       <w:r>
@@ -14873,7 +15464,6 @@
           <w:szCs w:val="28"/>
           <w:rtl/>
         </w:rPr>
-        <w:lastRenderedPageBreak/>
         <w:t xml:space="preserve">מודולריות של קוד </w:t>
       </w:r>
       <w:r>
@@ -15737,7 +16327,7 @@
           <w:rtl/>
         </w:rPr>
       </w:pPr>
-      <w:bookmarkStart w:id="48" w:name="_Toc230686585"/>
+      <w:bookmarkStart w:id="49" w:name="_Toc234741732"/>
       <w:r>
         <w:rPr>
           <w:rFonts w:hint="cs"/>
@@ -15746,7 +16336,7 @@
         </w:rPr>
         <w:t>מבנה של כל קובץ חדש שאתה יוצר</w:t>
       </w:r>
-      <w:bookmarkEnd w:id="48"/>
+      <w:bookmarkEnd w:id="49"/>
     </w:p>
     <w:p>
       <w:pPr>
@@ -16038,6 +16628,1471 @@
       </w:r>
     </w:p>
     <w:p/>
+    <w:p>
+      <w:pPr>
+        <w:rPr>
+          <w:sz w:val="28"/>
+          <w:szCs w:val="28"/>
+          <w:rtl/>
+        </w:rPr>
+      </w:pPr>
+    </w:p>
+    <w:p>
+      <w:pPr>
+        <w:rPr>
+          <w:sz w:val="28"/>
+          <w:szCs w:val="28"/>
+          <w:rtl/>
+        </w:rPr>
+      </w:pPr>
+    </w:p>
+    <w:p>
+      <w:pPr>
+        <w:rPr>
+          <w:sz w:val="28"/>
+          <w:szCs w:val="28"/>
+          <w:rtl/>
+        </w:rPr>
+      </w:pPr>
+    </w:p>
+    <w:p>
+      <w:pPr>
+        <w:rPr>
+          <w:sz w:val="28"/>
+          <w:szCs w:val="28"/>
+          <w:rtl/>
+        </w:rPr>
+      </w:pPr>
+    </w:p>
+    <w:p>
+      <w:pPr>
+        <w:pStyle w:val="1"/>
+        <w:jc w:val="center"/>
+        <w:rPr>
+          <w:u w:val="single"/>
+          <w:rtl/>
+        </w:rPr>
+      </w:pPr>
+      <w:bookmarkStart w:id="50" w:name="_Toc234741733"/>
+      <w:r>
+        <w:rPr>
+          <w:u w:val="single"/>
+        </w:rPr>
+        <w:t xml:space="preserve">Env + </w:t>
+      </w:r>
+      <w:proofErr w:type="spellStart"/>
+      <w:proofErr w:type="gramStart"/>
+      <w:r>
+        <w:rPr>
+          <w:u w:val="single"/>
+        </w:rPr>
+        <w:t>env.exmple</w:t>
+      </w:r>
+      <w:bookmarkEnd w:id="50"/>
+      <w:proofErr w:type="spellEnd"/>
+      <w:proofErr w:type="gramEnd"/>
+    </w:p>
+    <w:p>
+      <w:pPr>
+        <w:rPr>
+          <w:sz w:val="28"/>
+          <w:szCs w:val="28"/>
+          <w:rtl/>
+        </w:rPr>
+      </w:pPr>
+      <w:r>
+        <w:rPr>
+          <w:rFonts w:hint="cs"/>
+          <w:sz w:val="28"/>
+          <w:szCs w:val="28"/>
+          <w:rtl/>
+        </w:rPr>
+        <w:t xml:space="preserve">אתה לא רוצה לשמור ערכים חשובים כמו סיסמה או </w:t>
+      </w:r>
+      <w:r>
+        <w:rPr>
+          <w:sz w:val="28"/>
+          <w:szCs w:val="28"/>
+        </w:rPr>
+        <w:t>API key</w:t>
+      </w:r>
+      <w:r>
+        <w:rPr>
+          <w:rFonts w:hint="cs"/>
+          <w:sz w:val="28"/>
+          <w:szCs w:val="28"/>
+          <w:rtl/>
+        </w:rPr>
+        <w:t xml:space="preserve"> ישירות בקוד, כי אז אם מישהו מסתכל על הקוד או אתה שולח אותו, לכן אתה יוצר את הקבצים נפרדים לנתונים האלו.</w:t>
+      </w:r>
+    </w:p>
+    <w:p>
+      <w:pPr>
+        <w:rPr>
+          <w:sz w:val="28"/>
+          <w:szCs w:val="28"/>
+          <w:rtl/>
+        </w:rPr>
+      </w:pPr>
+      <w:r>
+        <w:rPr>
+          <w:rFonts w:hint="cs"/>
+          <w:sz w:val="28"/>
+          <w:szCs w:val="28"/>
+          <w:rtl/>
+        </w:rPr>
+        <w:t>כך אתה מגן על עצמך ועדיין יכול לפרסם את הקוד</w:t>
+      </w:r>
+      <w:r>
+        <w:rPr>
+          <w:rFonts w:hint="cs"/>
+          <w:sz w:val="28"/>
+          <w:szCs w:val="28"/>
+          <w:rtl/>
+        </w:rPr>
+        <w:t>.</w:t>
+      </w:r>
+    </w:p>
+    <w:p>
+      <w:pPr>
+        <w:rPr>
+          <w:sz w:val="28"/>
+          <w:szCs w:val="28"/>
+        </w:rPr>
+      </w:pPr>
+      <w:r>
+        <w:rPr>
+          <w:rFonts w:hint="cs"/>
+          <w:sz w:val="28"/>
+          <w:szCs w:val="28"/>
+          <w:rtl/>
+        </w:rPr>
+        <w:t>אתה גם שומר משתנים כללים על סביבת ההרצה.</w:t>
+      </w:r>
+    </w:p>
+    <w:p>
+      <w:pPr>
+        <w:rPr>
+          <w:sz w:val="28"/>
+          <w:szCs w:val="28"/>
+        </w:rPr>
+      </w:pPr>
+      <w:r>
+        <w:rPr>
+          <w:sz w:val="28"/>
+          <w:szCs w:val="28"/>
+          <w:rtl/>
+        </w:rPr>
+        <w:t xml:space="preserve">עדיף להגדיר משתנים כמו </w:t>
+      </w:r>
+      <w:r>
+        <w:rPr>
+          <w:sz w:val="28"/>
+          <w:szCs w:val="28"/>
+        </w:rPr>
+        <w:t xml:space="preserve">HOST, PORT </w:t>
+      </w:r>
+      <w:r>
+        <w:rPr>
+          <w:sz w:val="28"/>
+          <w:szCs w:val="28"/>
+          <w:rtl/>
+        </w:rPr>
+        <w:t>ו</w:t>
+      </w:r>
+      <w:r>
+        <w:rPr>
+          <w:sz w:val="28"/>
+          <w:szCs w:val="28"/>
+        </w:rPr>
+        <w:t xml:space="preserve">-FLASK_DEBUG </w:t>
+      </w:r>
+      <w:r>
+        <w:rPr>
+          <w:sz w:val="28"/>
+          <w:szCs w:val="28"/>
+          <w:rtl/>
+        </w:rPr>
+        <w:t xml:space="preserve">בקובץ </w:t>
+      </w:r>
+      <w:r>
+        <w:rPr>
+          <w:sz w:val="28"/>
+          <w:szCs w:val="28"/>
+        </w:rPr>
+        <w:t xml:space="preserve">.env </w:t>
+      </w:r>
+      <w:r>
+        <w:rPr>
+          <w:sz w:val="28"/>
+          <w:szCs w:val="28"/>
+          <w:rtl/>
+        </w:rPr>
+        <w:t xml:space="preserve">ולא בתוך </w:t>
+      </w:r>
+      <w:r>
+        <w:rPr>
+          <w:sz w:val="28"/>
+          <w:szCs w:val="28"/>
+        </w:rPr>
+        <w:t xml:space="preserve">main.py, </w:t>
+      </w:r>
+      <w:r>
+        <w:rPr>
+          <w:sz w:val="28"/>
+          <w:szCs w:val="28"/>
+          <w:rtl/>
+        </w:rPr>
+        <w:t xml:space="preserve">כי כך מפרידים בין </w:t>
+      </w:r>
+      <w:r>
+        <w:rPr>
+          <w:b/>
+          <w:bCs/>
+          <w:sz w:val="28"/>
+          <w:szCs w:val="28"/>
+          <w:rtl/>
+        </w:rPr>
+        <w:t>הקוד</w:t>
+      </w:r>
+      <w:r>
+        <w:rPr>
+          <w:sz w:val="28"/>
+          <w:szCs w:val="28"/>
+          <w:rtl/>
+        </w:rPr>
+        <w:t xml:space="preserve"> לבין </w:t>
+      </w:r>
+      <w:r>
+        <w:rPr>
+          <w:b/>
+          <w:bCs/>
+          <w:sz w:val="28"/>
+          <w:szCs w:val="28"/>
+          <w:rtl/>
+        </w:rPr>
+        <w:t>ההגדרות של סביבת ההרצה</w:t>
+      </w:r>
+      <w:r>
+        <w:rPr>
+          <w:sz w:val="28"/>
+          <w:szCs w:val="28"/>
+        </w:rPr>
+        <w:t xml:space="preserve">. </w:t>
+      </w:r>
+      <w:r>
+        <w:rPr>
+          <w:sz w:val="28"/>
+          <w:szCs w:val="28"/>
+          <w:rtl/>
+        </w:rPr>
+        <w:t>זה מאפשר להשתמש בדיוק באותו קוד בסביבות שונות (פיתוח, בדיקות וייצור) בלי לשנות את הקוד עצמו</w:t>
+      </w:r>
+      <w:r>
+        <w:rPr>
+          <w:sz w:val="28"/>
+          <w:szCs w:val="28"/>
+        </w:rPr>
+        <w:t>.</w:t>
+      </w:r>
+    </w:p>
+    <w:p>
+      <w:pPr>
+        <w:rPr>
+          <w:sz w:val="28"/>
+          <w:szCs w:val="28"/>
+        </w:rPr>
+      </w:pPr>
+      <w:r>
+        <w:rPr>
+          <w:sz w:val="28"/>
+          <w:szCs w:val="28"/>
+          <w:rtl/>
+        </w:rPr>
+        <w:t>בנוסף, כאשר עובדים בצוות או מעלים את האפליקציה לשרת, אפשר לשנות הגדרות בקלות דרך משתני סביבה בלי לערוך את קבצי הפרויקט. זה גם חשוב במיוחד עבור מידע רגיש כמו מפתחות</w:t>
+      </w:r>
+      <w:r>
+        <w:rPr>
+          <w:sz w:val="28"/>
+          <w:szCs w:val="28"/>
+        </w:rPr>
+        <w:t xml:space="preserve"> API, </w:t>
+      </w:r>
+      <w:r>
+        <w:rPr>
+          <w:sz w:val="28"/>
+          <w:szCs w:val="28"/>
+          <w:rtl/>
+        </w:rPr>
+        <w:t>סיסמאות ומחרוזות חיבור למסד נתונים, שלא מומלץ לשמור בתוך הקוד</w:t>
+      </w:r>
+      <w:r>
+        <w:rPr>
+          <w:sz w:val="28"/>
+          <w:szCs w:val="28"/>
+        </w:rPr>
+        <w:t>.</w:t>
+      </w:r>
+    </w:p>
+    <w:p>
+      <w:pPr>
+        <w:rPr>
+          <w:sz w:val="28"/>
+          <w:szCs w:val="28"/>
+        </w:rPr>
+      </w:pPr>
+      <w:r>
+        <w:rPr>
+          <w:sz w:val="28"/>
+          <w:szCs w:val="28"/>
+          <w:rtl/>
+        </w:rPr>
+        <w:t>בפרויקטים קטנים או לצורכי למידה אפשר בהחלט להגדיר את הערכים ישירות ב־</w:t>
+      </w:r>
+      <w:r>
+        <w:rPr>
+          <w:sz w:val="28"/>
+          <w:szCs w:val="28"/>
+        </w:rPr>
+        <w:t xml:space="preserve">main.py, </w:t>
+      </w:r>
+      <w:r>
+        <w:rPr>
+          <w:sz w:val="28"/>
+          <w:szCs w:val="28"/>
+          <w:rtl/>
+        </w:rPr>
+        <w:t>אבל בפרויקטים אמיתיים השימוש ב־</w:t>
+      </w:r>
+      <w:r>
+        <w:rPr>
+          <w:sz w:val="28"/>
+          <w:szCs w:val="28"/>
+        </w:rPr>
+        <w:t xml:space="preserve">.env </w:t>
+      </w:r>
+      <w:r>
+        <w:rPr>
+          <w:sz w:val="28"/>
+          <w:szCs w:val="28"/>
+          <w:rtl/>
+        </w:rPr>
+        <w:t>נחשב לפתרון גמיש, מאובטח ותחזוקתי יותר</w:t>
+      </w:r>
+      <w:r>
+        <w:rPr>
+          <w:sz w:val="28"/>
+          <w:szCs w:val="28"/>
+        </w:rPr>
+        <w:t>.</w:t>
+      </w:r>
+    </w:p>
+    <w:p>
+      <w:pPr>
+        <w:rPr>
+          <w:sz w:val="28"/>
+          <w:szCs w:val="28"/>
+        </w:rPr>
+      </w:pPr>
+    </w:p>
+    <w:p>
+      <w:pPr>
+        <w:pStyle w:val="2"/>
+        <w:rPr>
+          <w:rtl/>
+        </w:rPr>
+      </w:pPr>
+      <w:bookmarkStart w:id="51" w:name="_Toc234741734"/>
+      <w:r>
+        <w:rPr>
+          <w:u w:val="single"/>
+        </w:rPr>
+        <w:t>Env</w:t>
+      </w:r>
+      <w:r>
+        <w:rPr>
+          <w:rFonts w:hint="cs"/>
+          <w:rtl/>
+        </w:rPr>
+        <w:t>:</w:t>
+      </w:r>
+      <w:bookmarkEnd w:id="51"/>
+    </w:p>
+    <w:p>
+      <w:pPr>
+        <w:rPr>
+          <w:b/>
+          <w:bCs/>
+          <w:sz w:val="28"/>
+          <w:szCs w:val="28"/>
+          <w:rtl/>
+        </w:rPr>
+      </w:pPr>
+      <w:r>
+        <w:rPr>
+          <w:rFonts w:hint="cs"/>
+          <w:sz w:val="28"/>
+          <w:szCs w:val="28"/>
+          <w:rtl/>
+        </w:rPr>
+        <w:t xml:space="preserve">אתה שומר בו את כל המשתנים שלך, </w:t>
+      </w:r>
+      <w:r>
+        <w:rPr>
+          <w:rFonts w:hint="cs"/>
+          <w:b/>
+          <w:bCs/>
+          <w:color w:val="EE0000"/>
+          <w:sz w:val="28"/>
+          <w:szCs w:val="28"/>
+          <w:rtl/>
+        </w:rPr>
+        <w:t>אותו אסור לעלות ל</w:t>
+      </w:r>
+      <w:r>
+        <w:rPr>
+          <w:b/>
+          <w:bCs/>
+          <w:color w:val="EE0000"/>
+          <w:sz w:val="28"/>
+          <w:szCs w:val="28"/>
+        </w:rPr>
+        <w:t>git</w:t>
+      </w:r>
+      <w:r>
+        <w:rPr>
+          <w:rFonts w:hint="cs"/>
+          <w:b/>
+          <w:bCs/>
+          <w:color w:val="EE0000"/>
+          <w:sz w:val="28"/>
+          <w:szCs w:val="28"/>
+          <w:rtl/>
+        </w:rPr>
+        <w:t xml:space="preserve"> או לשלוח אותו למישהו!</w:t>
+      </w:r>
+    </w:p>
+    <w:p>
+      <w:pPr>
+        <w:pStyle w:val="2"/>
+        <w:rPr>
+          <w:u w:val="single"/>
+          <w:rtl/>
+        </w:rPr>
+      </w:pPr>
+      <w:bookmarkStart w:id="52" w:name="_Toc234741735"/>
+      <w:r>
+        <w:rPr>
+          <w:u w:val="single"/>
+        </w:rPr>
+        <w:t>Env example</w:t>
+      </w:r>
+      <w:r>
+        <w:rPr>
+          <w:rFonts w:hint="cs"/>
+          <w:u w:val="single"/>
+          <w:rtl/>
+        </w:rPr>
+        <w:t>:</w:t>
+      </w:r>
+      <w:bookmarkEnd w:id="52"/>
+    </w:p>
+    <w:p>
+      <w:pPr>
+        <w:rPr>
+          <w:sz w:val="28"/>
+          <w:szCs w:val="28"/>
+          <w:rtl/>
+        </w:rPr>
+      </w:pPr>
+      <w:r>
+        <w:rPr>
+          <w:rFonts w:hint="cs"/>
+          <w:sz w:val="28"/>
+          <w:szCs w:val="28"/>
+          <w:rtl/>
+        </w:rPr>
+        <w:t>אתה לא יכול לעלות את ה</w:t>
+      </w:r>
+      <w:r>
+        <w:rPr>
+          <w:sz w:val="28"/>
+          <w:szCs w:val="28"/>
+        </w:rPr>
+        <w:t>env</w:t>
+      </w:r>
+      <w:r>
+        <w:rPr>
+          <w:rFonts w:hint="cs"/>
+          <w:sz w:val="28"/>
+          <w:szCs w:val="28"/>
+          <w:rtl/>
+        </w:rPr>
+        <w:t xml:space="preserve"> ל</w:t>
+      </w:r>
+      <w:r>
+        <w:rPr>
+          <w:sz w:val="28"/>
+          <w:szCs w:val="28"/>
+        </w:rPr>
+        <w:t>git</w:t>
+      </w:r>
+      <w:r>
+        <w:rPr>
+          <w:rFonts w:hint="cs"/>
+          <w:sz w:val="28"/>
+          <w:szCs w:val="28"/>
+          <w:rtl/>
+        </w:rPr>
+        <w:t>, אבל אתה עדיין רוצה שאנשים יוכלו לראות אלו משתנים של עצמם הם צריכים להגדיר, לכן אתה יוצר את הקובץ הזה שהוא מכיל את אותם שמות של המשתנים רק עם ערכים פיקטיביים.</w:t>
+      </w:r>
+    </w:p>
+    <w:p>
+      <w:pPr>
+        <w:rPr>
+          <w:b/>
+          <w:bCs/>
+          <w:color w:val="4EA72E" w:themeColor="accent6"/>
+          <w:sz w:val="28"/>
+          <w:szCs w:val="28"/>
+        </w:rPr>
+      </w:pPr>
+      <w:r>
+        <w:rPr>
+          <w:rFonts w:hint="cs"/>
+          <w:b/>
+          <w:bCs/>
+          <w:color w:val="4EA72E" w:themeColor="accent6"/>
+          <w:sz w:val="28"/>
+          <w:szCs w:val="28"/>
+          <w:rtl/>
+        </w:rPr>
+        <w:t>אותו אתה כן מעלה ל</w:t>
+      </w:r>
+      <w:r>
+        <w:rPr>
+          <w:b/>
+          <w:bCs/>
+          <w:color w:val="4EA72E" w:themeColor="accent6"/>
+          <w:sz w:val="28"/>
+          <w:szCs w:val="28"/>
+        </w:rPr>
+        <w:t>git</w:t>
+      </w:r>
+      <w:r>
+        <w:rPr>
+          <w:rFonts w:hint="cs"/>
+          <w:b/>
+          <w:bCs/>
+          <w:color w:val="4EA72E" w:themeColor="accent6"/>
+          <w:sz w:val="28"/>
+          <w:szCs w:val="28"/>
+          <w:rtl/>
+        </w:rPr>
+        <w:t>.</w:t>
+      </w:r>
+    </w:p>
+    <w:p>
+      <w:pPr>
+        <w:pStyle w:val="1"/>
+        <w:jc w:val="center"/>
+        <w:rPr>
+          <w:u w:val="single"/>
+          <w:rtl/>
+        </w:rPr>
+      </w:pPr>
+      <w:bookmarkStart w:id="53" w:name="_Toc234741736"/>
+      <w:proofErr w:type="gramStart"/>
+      <w:r>
+        <w:rPr>
+          <w:u w:val="single"/>
+        </w:rPr>
+        <w:lastRenderedPageBreak/>
+        <w:t>.</w:t>
+      </w:r>
+      <w:proofErr w:type="spellStart"/>
+      <w:r>
+        <w:rPr>
+          <w:u w:val="single"/>
+        </w:rPr>
+        <w:t>gitignore</w:t>
+      </w:r>
+      <w:bookmarkEnd w:id="53"/>
+      <w:proofErr w:type="spellEnd"/>
+      <w:proofErr w:type="gramEnd"/>
+    </w:p>
+    <w:p>
+      <w:pPr>
+        <w:rPr>
+          <w:sz w:val="28"/>
+          <w:szCs w:val="28"/>
+          <w:rtl/>
+        </w:rPr>
+      </w:pPr>
+      <w:r>
+        <w:rPr>
+          <w:rFonts w:hint="cs"/>
+          <w:sz w:val="28"/>
+          <w:szCs w:val="28"/>
+          <w:rtl/>
+        </w:rPr>
+        <w:t>זה קובץ שאומר ל</w:t>
+      </w:r>
+      <w:r>
+        <w:rPr>
+          <w:sz w:val="28"/>
+          <w:szCs w:val="28"/>
+        </w:rPr>
+        <w:t>git</w:t>
+      </w:r>
+      <w:r>
+        <w:rPr>
+          <w:rFonts w:hint="cs"/>
+          <w:sz w:val="28"/>
+          <w:szCs w:val="28"/>
+          <w:rtl/>
+        </w:rPr>
+        <w:t xml:space="preserve"> על אלו מסמכים הוא לא צריך לעקוב ולא לעדכן אותם שאני עושה </w:t>
+      </w:r>
+      <w:r>
+        <w:rPr>
+          <w:sz w:val="28"/>
+          <w:szCs w:val="28"/>
+        </w:rPr>
+        <w:t>push</w:t>
+      </w:r>
+      <w:r>
+        <w:rPr>
+          <w:rFonts w:hint="cs"/>
+          <w:sz w:val="28"/>
+          <w:szCs w:val="28"/>
+          <w:rtl/>
+        </w:rPr>
+        <w:t xml:space="preserve"> של </w:t>
+      </w:r>
+      <w:r>
+        <w:rPr>
+          <w:sz w:val="28"/>
+          <w:szCs w:val="28"/>
+        </w:rPr>
+        <w:t>folder</w:t>
+      </w:r>
+      <w:r>
+        <w:rPr>
+          <w:rFonts w:hint="cs"/>
+          <w:sz w:val="28"/>
+          <w:szCs w:val="28"/>
+          <w:rtl/>
+        </w:rPr>
+        <w:t xml:space="preserve"> כלשהו.</w:t>
+      </w:r>
+    </w:p>
+    <w:p>
+      <w:pPr>
+        <w:rPr>
+          <w:sz w:val="28"/>
+          <w:szCs w:val="28"/>
+          <w:rtl/>
+        </w:rPr>
+      </w:pPr>
+      <w:r>
+        <w:rPr>
+          <w:rFonts w:hint="cs"/>
+          <w:sz w:val="28"/>
+          <w:szCs w:val="28"/>
+          <w:rtl/>
+        </w:rPr>
+        <w:t>זה רלוונטי ל</w:t>
+      </w:r>
+      <w:r>
+        <w:rPr>
+          <w:sz w:val="28"/>
+          <w:szCs w:val="28"/>
+        </w:rPr>
+        <w:t>env</w:t>
+      </w:r>
+      <w:r>
+        <w:rPr>
+          <w:rFonts w:hint="cs"/>
+          <w:sz w:val="28"/>
+          <w:szCs w:val="28"/>
+          <w:rtl/>
+        </w:rPr>
+        <w:t>, כי אני לא רוצה לעלות אותו ל</w:t>
+      </w:r>
+      <w:r>
+        <w:rPr>
+          <w:sz w:val="28"/>
+          <w:szCs w:val="28"/>
+        </w:rPr>
+        <w:t>git</w:t>
+      </w:r>
+      <w:r>
+        <w:rPr>
+          <w:rFonts w:hint="cs"/>
+          <w:sz w:val="28"/>
+          <w:szCs w:val="28"/>
+          <w:rtl/>
+        </w:rPr>
+        <w:t>.</w:t>
+      </w:r>
+    </w:p>
+    <w:p>
+      <w:pPr>
+        <w:rPr>
+          <w:sz w:val="28"/>
+          <w:szCs w:val="28"/>
+          <w:rtl/>
+        </w:rPr>
+      </w:pPr>
+    </w:p>
+    <w:p>
+      <w:pPr>
+        <w:pStyle w:val="2"/>
+        <w:jc w:val="center"/>
+        <w:rPr>
+          <w:u w:val="single"/>
+          <w:rtl/>
+        </w:rPr>
+      </w:pPr>
+      <w:bookmarkStart w:id="54" w:name="_Toc234741737"/>
+      <w:r>
+        <w:rPr>
+          <w:u w:val="single"/>
+        </w:rPr>
+        <w:t>Path handling</w:t>
+      </w:r>
+      <w:bookmarkEnd w:id="54"/>
+    </w:p>
+    <w:p>
+      <w:pPr>
+        <w:rPr>
+          <w:sz w:val="28"/>
+          <w:szCs w:val="28"/>
+          <w:rtl/>
+        </w:rPr>
+      </w:pPr>
+      <w:r>
+        <w:rPr>
+          <w:rFonts w:hint="cs"/>
+          <w:sz w:val="28"/>
+          <w:szCs w:val="28"/>
+          <w:rtl/>
+        </w:rPr>
+        <w:t>בפרויקט גדול, אתה לא כותב את ה</w:t>
+      </w:r>
+      <w:r>
+        <w:rPr>
+          <w:sz w:val="28"/>
+          <w:szCs w:val="28"/>
+        </w:rPr>
+        <w:t>paths</w:t>
+      </w:r>
+      <w:r>
+        <w:rPr>
+          <w:rFonts w:hint="cs"/>
+          <w:sz w:val="28"/>
+          <w:szCs w:val="28"/>
+          <w:rtl/>
+        </w:rPr>
+        <w:t xml:space="preserve"> המלאים של המחשב שלך, אתה צריך שזה יהיה ורסטילי, לכן צריך להשתמש ב</w:t>
+      </w:r>
+      <w:r>
+        <w:rPr>
+          <w:sz w:val="28"/>
+          <w:szCs w:val="28"/>
+        </w:rPr>
+        <w:t>relative paths</w:t>
+      </w:r>
+      <w:r>
+        <w:rPr>
+          <w:rFonts w:hint="cs"/>
+          <w:sz w:val="28"/>
+          <w:szCs w:val="28"/>
+          <w:rtl/>
+        </w:rPr>
+        <w:t>.</w:t>
+      </w:r>
+    </w:p>
+    <w:p>
+      <w:pPr>
+        <w:rPr>
+          <w:sz w:val="28"/>
+          <w:szCs w:val="28"/>
+          <w:rtl/>
+        </w:rPr>
+      </w:pPr>
+    </w:p>
+    <w:p>
+      <w:pPr>
+        <w:rPr>
+          <w:sz w:val="28"/>
+          <w:szCs w:val="28"/>
+          <w:rtl/>
+        </w:rPr>
+      </w:pPr>
+    </w:p>
+    <w:p>
+      <w:pPr>
+        <w:jc w:val="center"/>
+        <w:rPr>
+          <w:sz w:val="28"/>
+          <w:szCs w:val="28"/>
+          <w:rtl/>
+        </w:rPr>
+      </w:pPr>
+      <w:r>
+        <w:rPr>
+          <w:rFonts w:asciiTheme="majorHAnsi" w:eastAsiaTheme="majorEastAsia" w:hAnsiTheme="majorHAnsi" w:cstheme="majorBidi"/>
+          <w:color w:val="0F4761" w:themeColor="accent1" w:themeShade="BF"/>
+          <w:sz w:val="32"/>
+          <w:szCs w:val="32"/>
+          <w:u w:val="single"/>
+        </w:rPr>
+        <w:t>Lazy initialization</w:t>
+      </w:r>
+    </w:p>
+    <w:p>
+      <w:pPr>
+        <w:rPr>
+          <w:sz w:val="28"/>
+          <w:szCs w:val="28"/>
+          <w:rtl/>
+        </w:rPr>
+      </w:pPr>
+      <w:r>
+        <w:rPr>
+          <w:rFonts w:hint="cs"/>
+          <w:sz w:val="28"/>
+          <w:szCs w:val="28"/>
+          <w:rtl/>
+        </w:rPr>
+        <w:t>זה אומר שלא לאתחל משהו ישר שהקובץ שבו הוא מוגדר נטען, אלא, לעשות את זה רק שבאופן אקטיבי מבקשים אותו.</w:t>
+      </w:r>
+    </w:p>
+    <w:p>
+      <w:pPr>
+        <w:rPr>
+          <w:sz w:val="28"/>
+          <w:szCs w:val="28"/>
+          <w:rtl/>
+        </w:rPr>
+      </w:pPr>
+      <w:r>
+        <w:rPr>
+          <w:rFonts w:hint="cs"/>
+          <w:sz w:val="28"/>
+          <w:szCs w:val="28"/>
+          <w:rtl/>
+        </w:rPr>
+        <w:t>נעשה את זה לגבי ה</w:t>
+      </w:r>
+      <w:proofErr w:type="spellStart"/>
+      <w:r>
+        <w:rPr>
+          <w:sz w:val="28"/>
+          <w:szCs w:val="28"/>
+        </w:rPr>
+        <w:t>TDClient</w:t>
+      </w:r>
+      <w:proofErr w:type="spellEnd"/>
+      <w:r>
+        <w:rPr>
+          <w:rFonts w:hint="cs"/>
+          <w:sz w:val="28"/>
+          <w:szCs w:val="28"/>
+          <w:rtl/>
+        </w:rPr>
+        <w:t>.</w:t>
+      </w:r>
+    </w:p>
+    <w:p>
+      <w:pPr>
+        <w:rPr>
+          <w:sz w:val="28"/>
+          <w:szCs w:val="28"/>
+          <w:rtl/>
+        </w:rPr>
+      </w:pPr>
+      <w:r>
+        <w:rPr>
+          <w:rFonts w:hint="cs"/>
+          <w:sz w:val="28"/>
+          <w:szCs w:val="28"/>
+          <w:rtl/>
+        </w:rPr>
+        <w:t>זה חשוב כי כרגע שאנחנו מייבאים את הקובץ הזה אנחנו יוצרים את הלקוח, ואין צורך לעשות את הקריאה הזו ל</w:t>
+      </w:r>
+      <w:r>
+        <w:rPr>
+          <w:sz w:val="28"/>
+          <w:szCs w:val="28"/>
+        </w:rPr>
+        <w:t>API</w:t>
+      </w:r>
+      <w:r>
+        <w:rPr>
+          <w:rFonts w:hint="cs"/>
+          <w:sz w:val="28"/>
+          <w:szCs w:val="28"/>
+          <w:rtl/>
+        </w:rPr>
+        <w:t>. זה חשוב כי זה מאפשר לנו להריץ פונקציות שלא צריכות את הקריאה ל</w:t>
+      </w:r>
+      <w:r>
+        <w:rPr>
+          <w:sz w:val="28"/>
+          <w:szCs w:val="28"/>
+        </w:rPr>
+        <w:t>API</w:t>
+      </w:r>
+      <w:r>
+        <w:rPr>
+          <w:rFonts w:hint="cs"/>
+          <w:sz w:val="28"/>
+          <w:szCs w:val="28"/>
+          <w:rtl/>
+        </w:rPr>
+        <w:t xml:space="preserve"> מקבצים אחרים שמייבאים את הקובץ הזה.</w:t>
+      </w:r>
+    </w:p>
+    <w:p>
+      <w:pPr>
+        <w:pStyle w:val="1"/>
+        <w:jc w:val="center"/>
+        <w:rPr>
+          <w:u w:val="single"/>
+        </w:rPr>
+      </w:pPr>
+      <w:r>
+        <w:rPr>
+          <w:u w:val="single"/>
+        </w:rPr>
+        <w:t>YAML</w:t>
+      </w:r>
+    </w:p>
+    <w:p>
+      <w:pPr>
+        <w:rPr>
+          <w:sz w:val="28"/>
+          <w:szCs w:val="28"/>
+        </w:rPr>
+      </w:pPr>
+      <w:r>
+        <w:rPr>
+          <w:sz w:val="28"/>
+          <w:szCs w:val="28"/>
+          <w:rtl/>
+        </w:rPr>
+        <w:t xml:space="preserve">קבצי </w:t>
+      </w:r>
+      <w:r>
+        <w:rPr>
+          <w:sz w:val="28"/>
+          <w:szCs w:val="28"/>
+        </w:rPr>
+        <w:t xml:space="preserve">YAML (YAML </w:t>
+      </w:r>
+      <w:proofErr w:type="spellStart"/>
+      <w:r>
+        <w:rPr>
+          <w:sz w:val="28"/>
+          <w:szCs w:val="28"/>
+        </w:rPr>
+        <w:t>Ain't</w:t>
+      </w:r>
+      <w:proofErr w:type="spellEnd"/>
+      <w:r>
+        <w:rPr>
+          <w:sz w:val="28"/>
+          <w:szCs w:val="28"/>
+        </w:rPr>
+        <w:t xml:space="preserve"> Markup Language)</w:t>
+      </w:r>
+      <w:r>
+        <w:rPr>
+          <w:sz w:val="28"/>
+          <w:szCs w:val="28"/>
+          <w:rtl/>
+        </w:rPr>
+        <w:t xml:space="preserve"> הם מסמכי טקסט רגילים המשמשים בעיקר לאחסון וארגון נתונים. מפתחים ומנהלי מערכת משתמשים בהם עבור קבצי תצורה, סקריפטים לאוטומציה וחילופי נתונים מכיוון שהם קלים לקריאה עבור בני אדם.</w:t>
+      </w:r>
+    </w:p>
+    <w:p>
+      <w:pPr>
+        <w:rPr>
+          <w:sz w:val="28"/>
+          <w:szCs w:val="28"/>
+          <w:rtl/>
+        </w:rPr>
+      </w:pPr>
+      <w:r>
+        <w:rPr>
+          <w:rFonts w:hint="cs"/>
+          <w:sz w:val="28"/>
+          <w:szCs w:val="28"/>
+          <w:rtl/>
+        </w:rPr>
+        <w:t xml:space="preserve">אז שיש </w:t>
+      </w:r>
+      <w:proofErr w:type="spellStart"/>
+      <w:r>
+        <w:rPr>
+          <w:rFonts w:hint="cs"/>
+          <w:sz w:val="28"/>
+          <w:szCs w:val="28"/>
+          <w:rtl/>
+        </w:rPr>
+        <w:t>אוטומציות</w:t>
+      </w:r>
+      <w:proofErr w:type="spellEnd"/>
+      <w:r>
+        <w:rPr>
+          <w:rFonts w:hint="cs"/>
+          <w:sz w:val="28"/>
+          <w:szCs w:val="28"/>
+          <w:rtl/>
+        </w:rPr>
+        <w:t xml:space="preserve"> שאנחנו רוצים להריץ, לדוגמא שבכל פעם שאנחנו עושים </w:t>
+      </w:r>
+      <w:r>
+        <w:rPr>
+          <w:sz w:val="28"/>
+          <w:szCs w:val="28"/>
+        </w:rPr>
+        <w:t>push</w:t>
+      </w:r>
+      <w:r>
+        <w:rPr>
+          <w:rFonts w:hint="cs"/>
+          <w:sz w:val="28"/>
+          <w:szCs w:val="28"/>
+          <w:rtl/>
+        </w:rPr>
+        <w:t xml:space="preserve"> ל</w:t>
+      </w:r>
+      <w:r>
+        <w:rPr>
+          <w:sz w:val="28"/>
+          <w:szCs w:val="28"/>
+        </w:rPr>
+        <w:t>git</w:t>
+      </w:r>
+      <w:r>
+        <w:rPr>
+          <w:rFonts w:hint="cs"/>
+          <w:sz w:val="28"/>
+          <w:szCs w:val="28"/>
+          <w:rtl/>
+        </w:rPr>
+        <w:t xml:space="preserve"> אז אנחנו בודקים את כל המבחנים שלנו לפני שאנחנו מאשרים את השינוי בקוד, נשתמש ב</w:t>
+      </w:r>
+      <w:r>
+        <w:rPr>
+          <w:sz w:val="28"/>
+          <w:szCs w:val="28"/>
+        </w:rPr>
+        <w:t>YAML</w:t>
+      </w:r>
+      <w:r>
+        <w:rPr>
+          <w:rFonts w:hint="cs"/>
+          <w:sz w:val="28"/>
+          <w:szCs w:val="28"/>
+          <w:rtl/>
+        </w:rPr>
+        <w:t>.</w:t>
+      </w:r>
+    </w:p>
+    <w:p>
+      <w:pPr>
+        <w:rPr>
+          <w:rFonts w:hint="cs"/>
+          <w:sz w:val="28"/>
+          <w:szCs w:val="28"/>
+          <w:rtl/>
+        </w:rPr>
+      </w:pPr>
+    </w:p>
+    <w:p>
+      <w:pPr>
+        <w:rPr>
+          <w:sz w:val="28"/>
+          <w:szCs w:val="28"/>
+          <w:rtl/>
+        </w:rPr>
+      </w:pPr>
+    </w:p>
+    <w:p>
+      <w:pPr>
+        <w:pStyle w:val="1"/>
+        <w:jc w:val="center"/>
+        <w:rPr>
+          <w:u w:val="single"/>
+        </w:rPr>
+      </w:pPr>
+      <w:r>
+        <w:rPr>
+          <w:u w:val="single"/>
+        </w:rPr>
+        <w:lastRenderedPageBreak/>
+        <w:t>CI and CD</w:t>
+      </w:r>
+    </w:p>
+    <w:p>
+      <w:pPr>
+        <w:rPr>
+          <w:sz w:val="28"/>
+          <w:szCs w:val="28"/>
+          <w:rtl/>
+        </w:rPr>
+      </w:pPr>
+      <w:r>
+        <w:rPr>
+          <w:rFonts w:hint="cs"/>
+          <w:sz w:val="28"/>
+          <w:szCs w:val="28"/>
+          <w:rtl/>
+        </w:rPr>
+        <w:t>אלו שני מושגים חשובים ברמות בפרויקטים גדולים.</w:t>
+      </w:r>
+    </w:p>
+    <w:p>
+      <w:pPr>
+        <w:pStyle w:val="2"/>
+        <w:rPr>
+          <w:u w:val="single"/>
+          <w:rtl/>
+        </w:rPr>
+      </w:pPr>
+      <w:r>
+        <w:rPr>
+          <w:u w:val="single"/>
+        </w:rPr>
+        <w:t xml:space="preserve">Ci - </w:t>
+      </w:r>
+      <w:r>
+        <w:rPr>
+          <w:u w:val="single"/>
+        </w:rPr>
+        <w:t>Continuous Integration</w:t>
+      </w:r>
+      <w:r>
+        <w:rPr>
+          <w:rFonts w:hint="cs"/>
+          <w:u w:val="single"/>
+          <w:rtl/>
+        </w:rPr>
+        <w:t>:</w:t>
+      </w:r>
+    </w:p>
+    <w:p>
+      <w:pPr>
+        <w:rPr>
+          <w:sz w:val="28"/>
+          <w:szCs w:val="28"/>
+          <w:rtl/>
+        </w:rPr>
+      </w:pPr>
+      <w:r>
+        <w:rPr>
+          <w:rFonts w:hint="cs"/>
+          <w:sz w:val="28"/>
+          <w:szCs w:val="28"/>
+          <w:rtl/>
+        </w:rPr>
+        <w:t xml:space="preserve">בכל פעם שאתה עושה </w:t>
+      </w:r>
+      <w:r>
+        <w:rPr>
+          <w:sz w:val="28"/>
+          <w:szCs w:val="28"/>
+        </w:rPr>
+        <w:t>push</w:t>
+      </w:r>
+      <w:r>
+        <w:rPr>
+          <w:rFonts w:hint="cs"/>
+          <w:sz w:val="28"/>
+          <w:szCs w:val="28"/>
+          <w:rtl/>
+        </w:rPr>
+        <w:t xml:space="preserve"> לקוד ל</w:t>
+      </w:r>
+      <w:r>
+        <w:rPr>
+          <w:sz w:val="28"/>
+          <w:szCs w:val="28"/>
+        </w:rPr>
+        <w:t>git</w:t>
+      </w:r>
+      <w:r>
+        <w:rPr>
+          <w:rFonts w:hint="cs"/>
+          <w:sz w:val="28"/>
+          <w:szCs w:val="28"/>
+          <w:rtl/>
+        </w:rPr>
+        <w:t>, אז הקוד עובר סידרה של מבחנים לבדוק שהוא עובד כנדרש, ורק אם הוא עובר את כל המבחנים, אז פעולת ה</w:t>
+      </w:r>
+      <w:r>
+        <w:rPr>
+          <w:sz w:val="28"/>
+          <w:szCs w:val="28"/>
+        </w:rPr>
+        <w:t>push</w:t>
+      </w:r>
+      <w:r>
+        <w:rPr>
+          <w:rFonts w:hint="cs"/>
+          <w:sz w:val="28"/>
+          <w:szCs w:val="28"/>
+          <w:rtl/>
+        </w:rPr>
+        <w:t xml:space="preserve"> מתבצעת.</w:t>
+      </w:r>
+    </w:p>
+    <w:p>
+      <w:pPr>
+        <w:rPr>
+          <w:sz w:val="28"/>
+          <w:szCs w:val="28"/>
+          <w:rtl/>
+        </w:rPr>
+      </w:pPr>
+      <w:r>
+        <w:rPr>
+          <w:rFonts w:hint="cs"/>
+          <w:sz w:val="28"/>
+          <w:szCs w:val="28"/>
+          <w:rtl/>
+        </w:rPr>
+        <w:t xml:space="preserve">אז בעצם בכל </w:t>
+      </w:r>
+      <w:r>
+        <w:rPr>
+          <w:sz w:val="28"/>
+          <w:szCs w:val="28"/>
+        </w:rPr>
+        <w:t>push</w:t>
+      </w:r>
+      <w:r>
+        <w:rPr>
+          <w:rFonts w:hint="cs"/>
+          <w:sz w:val="28"/>
+          <w:szCs w:val="28"/>
+          <w:rtl/>
+        </w:rPr>
+        <w:t xml:space="preserve"> זה יריץ את כל המבחנים שהגדרתי, לדוגמא המבחנים ב</w:t>
+      </w:r>
+      <w:proofErr w:type="spellStart"/>
+      <w:r>
+        <w:rPr>
+          <w:sz w:val="28"/>
+          <w:szCs w:val="28"/>
+        </w:rPr>
+        <w:t>pytest</w:t>
+      </w:r>
+      <w:proofErr w:type="spellEnd"/>
+      <w:r>
+        <w:rPr>
+          <w:rFonts w:hint="cs"/>
+          <w:sz w:val="28"/>
+          <w:szCs w:val="28"/>
+          <w:rtl/>
+        </w:rPr>
+        <w:t>.</w:t>
+      </w:r>
+    </w:p>
+    <w:p>
+      <w:pPr>
+        <w:rPr>
+          <w:rFonts w:hint="cs"/>
+          <w:sz w:val="28"/>
+          <w:szCs w:val="28"/>
+        </w:rPr>
+      </w:pPr>
+    </w:p>
+    <w:p>
+      <w:pPr>
+        <w:pStyle w:val="2"/>
+        <w:rPr>
+          <w:u w:val="single"/>
+          <w:rtl/>
+        </w:rPr>
+      </w:pPr>
+      <w:r>
+        <w:rPr>
+          <w:u w:val="single"/>
+        </w:rPr>
+        <w:t xml:space="preserve">CD </w:t>
+      </w:r>
+      <w:proofErr w:type="gramStart"/>
+      <w:r>
+        <w:rPr>
+          <w:u w:val="single"/>
+        </w:rPr>
+        <w:t xml:space="preserve">- </w:t>
+      </w:r>
+      <w:r>
+        <w:rPr>
+          <w:rFonts w:hint="cs"/>
+          <w:u w:val="single"/>
+          <w:rtl/>
+        </w:rPr>
+        <w:t>:</w:t>
+      </w:r>
+      <w:proofErr w:type="gramEnd"/>
+    </w:p>
+    <w:p>
+      <w:pPr>
+        <w:rPr>
+          <w:rtl/>
+        </w:rPr>
+      </w:pPr>
+    </w:p>
+    <w:p>
+      <w:pPr>
+        <w:pStyle w:val="2"/>
+        <w:rPr>
+          <w:u w:val="single"/>
+          <w:rtl/>
+        </w:rPr>
+      </w:pPr>
+      <w:r>
+        <w:rPr>
+          <w:u w:val="single"/>
+        </w:rPr>
+        <w:t>GitHub Actions Folder</w:t>
+      </w:r>
+      <w:r>
+        <w:rPr>
+          <w:rFonts w:hint="cs"/>
+          <w:u w:val="single"/>
+          <w:rtl/>
+        </w:rPr>
+        <w:t>:</w:t>
+      </w:r>
+    </w:p>
+    <w:p>
+      <w:pPr>
+        <w:rPr>
+          <w:sz w:val="28"/>
+          <w:szCs w:val="28"/>
+          <w:rtl/>
+        </w:rPr>
+      </w:pPr>
+      <w:r>
+        <w:rPr>
+          <w:rFonts w:hint="cs"/>
+          <w:sz w:val="28"/>
+          <w:szCs w:val="28"/>
+          <w:rtl/>
+        </w:rPr>
+        <w:t xml:space="preserve">תיקייה שבה אנו כותבים את הפעולות שאנחנו רוצים שירצו באופן אוטומטי בעת עדכון הקוד, כמו לעשות את כל המבחנים שעושים </w:t>
+      </w:r>
+      <w:r>
+        <w:rPr>
+          <w:sz w:val="28"/>
+          <w:szCs w:val="28"/>
+        </w:rPr>
+        <w:t>push</w:t>
+      </w:r>
+      <w:r>
+        <w:rPr>
+          <w:rFonts w:hint="cs"/>
+          <w:sz w:val="28"/>
+          <w:szCs w:val="28"/>
+          <w:rtl/>
+        </w:rPr>
+        <w:t>.</w:t>
+      </w:r>
+    </w:p>
+    <w:p>
+      <w:pPr>
+        <w:rPr>
+          <w:sz w:val="28"/>
+          <w:szCs w:val="28"/>
+          <w:rtl/>
+        </w:rPr>
+      </w:pPr>
+      <w:r>
+        <w:rPr>
+          <w:rFonts w:hint="cs"/>
+          <w:sz w:val="28"/>
+          <w:szCs w:val="28"/>
+          <w:rtl/>
+        </w:rPr>
+        <w:t xml:space="preserve">אחראי שאתה יוצר את התיקיות והקובץ </w:t>
+      </w:r>
+      <w:r>
+        <w:rPr>
+          <w:sz w:val="28"/>
+          <w:szCs w:val="28"/>
+        </w:rPr>
+        <w:t>YML</w:t>
+      </w:r>
+      <w:r>
+        <w:rPr>
+          <w:rFonts w:hint="cs"/>
+          <w:sz w:val="28"/>
+          <w:szCs w:val="28"/>
+          <w:rtl/>
+        </w:rPr>
+        <w:t xml:space="preserve"> עם כל הפעולות שאתה רוצה שיתבצעו באופן אוטומטי, אתה צריך לעשות לזה </w:t>
+      </w:r>
+      <w:r>
+        <w:rPr>
+          <w:sz w:val="28"/>
+          <w:szCs w:val="28"/>
+        </w:rPr>
+        <w:t>push</w:t>
+      </w:r>
+      <w:r>
+        <w:rPr>
+          <w:rFonts w:hint="cs"/>
+          <w:sz w:val="28"/>
+          <w:szCs w:val="28"/>
+          <w:rtl/>
+        </w:rPr>
+        <w:t xml:space="preserve"> ל</w:t>
+      </w:r>
+      <w:r>
+        <w:rPr>
+          <w:sz w:val="28"/>
+          <w:szCs w:val="28"/>
+        </w:rPr>
+        <w:t>git</w:t>
+      </w:r>
+      <w:r>
+        <w:rPr>
+          <w:rFonts w:hint="cs"/>
+          <w:sz w:val="28"/>
+          <w:szCs w:val="28"/>
+          <w:rtl/>
+        </w:rPr>
+        <w:t>.</w:t>
+      </w:r>
+    </w:p>
+    <w:p>
+      <w:pPr>
+        <w:rPr>
+          <w:rFonts w:hint="cs"/>
+          <w:sz w:val="28"/>
+          <w:szCs w:val="28"/>
+          <w:rtl/>
+        </w:rPr>
+      </w:pPr>
+    </w:p>
+    <w:p>
+      <w:pPr>
+        <w:rPr>
+          <w:sz w:val="28"/>
+          <w:szCs w:val="28"/>
+          <w:rtl/>
+        </w:rPr>
+      </w:pPr>
+    </w:p>
     <w:p>
       <w:pPr>
         <w:rPr>
@@ -19728,7 +21783,6 @@
   <w:style w:type="character" w:default="1" w:styleId="a0">
     <w:name w:val="Default Paragraph Font"/>
     <w:uiPriority w:val="1"/>
-    <w:semiHidden/>
     <w:unhideWhenUsed/>
   </w:style>
   <w:style w:type="table" w:default="1" w:styleId="a1">
@@ -20139,6 +22193,36 @@
       </w:tblBorders>
     </w:tblPr>
   </w:style>
+  <w:style w:type="paragraph" w:styleId="HTML">
+    <w:name w:val="HTML Preformatted"/>
+    <w:basedOn w:val="a"/>
+    <w:link w:val="HTML0"/>
+    <w:uiPriority w:val="99"/>
+    <w:semiHidden/>
+    <w:unhideWhenUsed/>
+    <w:rsid w:val="008B373B"/>
+    <w:pPr>
+      <w:spacing w:after="0" w:line="240" w:lineRule="auto"/>
+    </w:pPr>
+    <w:rPr>
+      <w:rFonts w:ascii="Consolas" w:hAnsi="Consolas"/>
+      <w:sz w:val="20"/>
+      <w:szCs w:val="20"/>
+    </w:rPr>
+  </w:style>
+  <w:style w:type="character" w:customStyle="1" w:styleId="HTML0">
+    <w:name w:val="HTML מעוצב מראש תו"/>
+    <w:basedOn w:val="a0"/>
+    <w:link w:val="HTML"/>
+    <w:uiPriority w:val="99"/>
+    <w:semiHidden/>
+    <w:rsid w:val="008B373B"/>
+    <w:rPr>
+      <w:rFonts w:ascii="Consolas" w:hAnsi="Consolas"/>
+      <w:sz w:val="20"/>
+      <w:szCs w:val="20"/>
+    </w:rPr>
+  </w:style>
 </w:styles>
 </file>
 

</xml_diff>

<commit_message>
Add a fixed version of the dependency automation
</commit_message>
<xml_diff>
--- a/stock algo trading project.docx
+++ b/stock algo trading project.docx
@@ -10,7 +10,7 @@
           <w:u w:val="single"/>
         </w:rPr>
       </w:pPr>
-      <w:bookmarkStart w:id="0" w:name="_Toc234741684"/>
+      <w:bookmarkStart w:id="0" w:name="_Toc234755922"/>
       <w:r>
         <w:rPr>
           <w:u w:val="single"/>
@@ -47,7 +47,6 @@
           <w:pPr>
             <w:pStyle w:val="ae"/>
             <w:rPr>
-              <w:rFonts w:hint="cs"/>
               <w:cs w:val="0"/>
             </w:rPr>
           </w:pPr>
@@ -81,7 +80,7 @@
           <w:r>
             <w:fldChar w:fldCharType="separate"/>
           </w:r>
-          <w:hyperlink w:anchor="_Toc234741684" w:history="1">
+          <w:hyperlink w:anchor="_Toc234755922" w:history="1">
             <w:r>
               <w:rPr>
                 <w:rStyle w:val="Hyperlink"/>
@@ -133,7 +132,7 @@
                 <w:noProof/>
                 <w:webHidden/>
               </w:rPr>
-              <w:instrText>Toc234741684 \h</w:instrText>
+              <w:instrText>Toc234755922 \h</w:instrText>
             </w:r>
             <w:r>
               <w:rPr>
@@ -190,7 +189,7 @@
               <w:rtl/>
             </w:rPr>
           </w:pPr>
-          <w:hyperlink w:anchor="_Toc234741685" w:history="1">
+          <w:hyperlink w:anchor="_Toc234755923" w:history="1">
             <w:r>
               <w:rPr>
                 <w:rStyle w:val="Hyperlink"/>
@@ -243,7 +242,7 @@
                 <w:noProof/>
                 <w:webHidden/>
               </w:rPr>
-              <w:instrText>Toc234741685 \h</w:instrText>
+              <w:instrText>Toc234755923 \h</w:instrText>
             </w:r>
             <w:r>
               <w:rPr>
@@ -300,7 +299,7 @@
               <w:rtl/>
             </w:rPr>
           </w:pPr>
-          <w:hyperlink w:anchor="_Toc234741686" w:history="1">
+          <w:hyperlink w:anchor="_Toc234755924" w:history="1">
             <w:r>
               <w:rPr>
                 <w:rStyle w:val="Hyperlink"/>
@@ -352,7 +351,7 @@
                 <w:noProof/>
                 <w:webHidden/>
               </w:rPr>
-              <w:instrText>Toc234741686 \h</w:instrText>
+              <w:instrText>Toc234755924 \h</w:instrText>
             </w:r>
             <w:r>
               <w:rPr>
@@ -409,7 +408,7 @@
               <w:rtl/>
             </w:rPr>
           </w:pPr>
-          <w:hyperlink w:anchor="_Toc234741687" w:history="1">
+          <w:hyperlink w:anchor="_Toc234755925" w:history="1">
             <w:r>
               <w:rPr>
                 <w:rStyle w:val="Hyperlink"/>
@@ -461,7 +460,7 @@
                 <w:noProof/>
                 <w:webHidden/>
               </w:rPr>
-              <w:instrText>Toc234741687 \h</w:instrText>
+              <w:instrText>Toc234755925 \h</w:instrText>
             </w:r>
             <w:r>
               <w:rPr>
@@ -518,7 +517,7 @@
               <w:rtl/>
             </w:rPr>
           </w:pPr>
-          <w:hyperlink w:anchor="_Toc234741688" w:history="1">
+          <w:hyperlink w:anchor="_Toc234755926" w:history="1">
             <w:r>
               <w:rPr>
                 <w:rStyle w:val="Hyperlink"/>
@@ -570,7 +569,7 @@
                 <w:noProof/>
                 <w:webHidden/>
               </w:rPr>
-              <w:instrText>Toc234741688 \h</w:instrText>
+              <w:instrText>Toc234755926 \h</w:instrText>
             </w:r>
             <w:r>
               <w:rPr>
@@ -627,7 +626,7 @@
               <w:rtl/>
             </w:rPr>
           </w:pPr>
-          <w:hyperlink w:anchor="_Toc234741689" w:history="1">
+          <w:hyperlink w:anchor="_Toc234755927" w:history="1">
             <w:r>
               <w:rPr>
                 <w:rStyle w:val="Hyperlink"/>
@@ -680,7 +679,7 @@
                 <w:noProof/>
                 <w:webHidden/>
               </w:rPr>
-              <w:instrText>Toc234741689 \h</w:instrText>
+              <w:instrText>Toc234755927 \h</w:instrText>
             </w:r>
             <w:r>
               <w:rPr>
@@ -737,7 +736,7 @@
               <w:rtl/>
             </w:rPr>
           </w:pPr>
-          <w:hyperlink w:anchor="_Toc234741690" w:history="1">
+          <w:hyperlink w:anchor="_Toc234755928" w:history="1">
             <w:r>
               <w:rPr>
                 <w:rStyle w:val="Hyperlink"/>
@@ -789,7 +788,7 @@
                 <w:noProof/>
                 <w:webHidden/>
               </w:rPr>
-              <w:instrText>Toc234741690 \h</w:instrText>
+              <w:instrText>Toc234755928 \h</w:instrText>
             </w:r>
             <w:r>
               <w:rPr>
@@ -846,7 +845,7 @@
               <w:rtl/>
             </w:rPr>
           </w:pPr>
-          <w:hyperlink w:anchor="_Toc234741691" w:history="1">
+          <w:hyperlink w:anchor="_Toc234755929" w:history="1">
             <w:r>
               <w:rPr>
                 <w:rStyle w:val="Hyperlink"/>
@@ -898,7 +897,7 @@
                 <w:noProof/>
                 <w:webHidden/>
               </w:rPr>
-              <w:instrText>Toc234741691 \h</w:instrText>
+              <w:instrText>Toc234755929 \h</w:instrText>
             </w:r>
             <w:r>
               <w:rPr>
@@ -955,7 +954,7 @@
               <w:rtl/>
             </w:rPr>
           </w:pPr>
-          <w:hyperlink w:anchor="_Toc234741692" w:history="1">
+          <w:hyperlink w:anchor="_Toc234755930" w:history="1">
             <w:r>
               <w:rPr>
                 <w:rStyle w:val="Hyperlink"/>
@@ -1007,7 +1006,7 @@
                 <w:noProof/>
                 <w:webHidden/>
               </w:rPr>
-              <w:instrText>Toc234741692 \h</w:instrText>
+              <w:instrText>Toc234755930 \h</w:instrText>
             </w:r>
             <w:r>
               <w:rPr>
@@ -1064,7 +1063,7 @@
               <w:rtl/>
             </w:rPr>
           </w:pPr>
-          <w:hyperlink w:anchor="_Toc234741693" w:history="1">
+          <w:hyperlink w:anchor="_Toc234755931" w:history="1">
             <w:r>
               <w:rPr>
                 <w:rStyle w:val="Hyperlink"/>
@@ -1116,7 +1115,7 @@
                 <w:noProof/>
                 <w:webHidden/>
               </w:rPr>
-              <w:instrText>Toc234741693 \h</w:instrText>
+              <w:instrText>Toc234755931 \h</w:instrText>
             </w:r>
             <w:r>
               <w:rPr>
@@ -1147,7 +1146,7 @@
                 <w:webHidden/>
                 <w:rtl/>
               </w:rPr>
-              <w:t>6</w:t>
+              <w:t>7</w:t>
             </w:r>
             <w:r>
               <w:rPr>
@@ -1173,7 +1172,7 @@
               <w:rtl/>
             </w:rPr>
           </w:pPr>
-          <w:hyperlink w:anchor="_Toc234741694" w:history="1">
+          <w:hyperlink w:anchor="_Toc234755932" w:history="1">
             <w:r>
               <w:rPr>
                 <w:rStyle w:val="Hyperlink"/>
@@ -1225,7 +1224,7 @@
                 <w:noProof/>
                 <w:webHidden/>
               </w:rPr>
-              <w:instrText>Toc234741694 \h</w:instrText>
+              <w:instrText>Toc234755932 \h</w:instrText>
             </w:r>
             <w:r>
               <w:rPr>
@@ -1282,7 +1281,7 @@
               <w:rtl/>
             </w:rPr>
           </w:pPr>
-          <w:hyperlink w:anchor="_Toc234741695" w:history="1">
+          <w:hyperlink w:anchor="_Toc234755933" w:history="1">
             <w:r>
               <w:rPr>
                 <w:rStyle w:val="Hyperlink"/>
@@ -1334,7 +1333,7 @@
                 <w:noProof/>
                 <w:webHidden/>
               </w:rPr>
-              <w:instrText>Toc234741695 \h</w:instrText>
+              <w:instrText>Toc234755933 \h</w:instrText>
             </w:r>
             <w:r>
               <w:rPr>
@@ -1391,7 +1390,7 @@
               <w:rtl/>
             </w:rPr>
           </w:pPr>
-          <w:hyperlink w:anchor="_Toc234741696" w:history="1">
+          <w:hyperlink w:anchor="_Toc234755934" w:history="1">
             <w:r>
               <w:rPr>
                 <w:rStyle w:val="Hyperlink"/>
@@ -1443,7 +1442,7 @@
                 <w:noProof/>
                 <w:webHidden/>
               </w:rPr>
-              <w:instrText>Toc234741696 \h</w:instrText>
+              <w:instrText>Toc234755934 \h</w:instrText>
             </w:r>
             <w:r>
               <w:rPr>
@@ -1500,7 +1499,7 @@
               <w:rtl/>
             </w:rPr>
           </w:pPr>
-          <w:hyperlink w:anchor="_Toc234741697" w:history="1">
+          <w:hyperlink w:anchor="_Toc234755935" w:history="1">
             <w:r>
               <w:rPr>
                 <w:rStyle w:val="Hyperlink"/>
@@ -1553,7 +1552,7 @@
                 <w:noProof/>
                 <w:webHidden/>
               </w:rPr>
-              <w:instrText>Toc234741697 \h</w:instrText>
+              <w:instrText>Toc234755935 \h</w:instrText>
             </w:r>
             <w:r>
               <w:rPr>
@@ -1610,7 +1609,7 @@
               <w:rtl/>
             </w:rPr>
           </w:pPr>
-          <w:hyperlink w:anchor="_Toc234741698" w:history="1">
+          <w:hyperlink w:anchor="_Toc234755936" w:history="1">
             <w:r>
               <w:rPr>
                 <w:rStyle w:val="Hyperlink"/>
@@ -1662,7 +1661,7 @@
                 <w:noProof/>
                 <w:webHidden/>
               </w:rPr>
-              <w:instrText>Toc234741698 \h</w:instrText>
+              <w:instrText>Toc234755936 \h</w:instrText>
             </w:r>
             <w:r>
               <w:rPr>
@@ -1719,7 +1718,7 @@
               <w:rtl/>
             </w:rPr>
           </w:pPr>
-          <w:hyperlink w:anchor="_Toc234741699" w:history="1">
+          <w:hyperlink w:anchor="_Toc234755937" w:history="1">
             <w:r>
               <w:rPr>
                 <w:rStyle w:val="Hyperlink"/>
@@ -1771,7 +1770,7 @@
                 <w:noProof/>
                 <w:webHidden/>
               </w:rPr>
-              <w:instrText>Toc234741699 \h</w:instrText>
+              <w:instrText>Toc234755937 \h</w:instrText>
             </w:r>
             <w:r>
               <w:rPr>
@@ -1828,7 +1827,7 @@
               <w:rtl/>
             </w:rPr>
           </w:pPr>
-          <w:hyperlink w:anchor="_Toc234741700" w:history="1">
+          <w:hyperlink w:anchor="_Toc234755938" w:history="1">
             <w:r>
               <w:rPr>
                 <w:rStyle w:val="Hyperlink"/>
@@ -1880,7 +1879,7 @@
                 <w:noProof/>
                 <w:webHidden/>
               </w:rPr>
-              <w:instrText>Toc234741700 \h</w:instrText>
+              <w:instrText>Toc234755938 \h</w:instrText>
             </w:r>
             <w:r>
               <w:rPr>
@@ -1937,7 +1936,7 @@
               <w:rtl/>
             </w:rPr>
           </w:pPr>
-          <w:hyperlink w:anchor="_Toc234741701" w:history="1">
+          <w:hyperlink w:anchor="_Toc234755939" w:history="1">
             <w:r>
               <w:rPr>
                 <w:rStyle w:val="Hyperlink"/>
@@ -1989,7 +1988,7 @@
                 <w:noProof/>
                 <w:webHidden/>
               </w:rPr>
-              <w:instrText>Toc234741701 \h</w:instrText>
+              <w:instrText>Toc234755939 \h</w:instrText>
             </w:r>
             <w:r>
               <w:rPr>
@@ -2046,7 +2045,7 @@
               <w:rtl/>
             </w:rPr>
           </w:pPr>
-          <w:hyperlink w:anchor="_Toc234741702" w:history="1">
+          <w:hyperlink w:anchor="_Toc234755940" w:history="1">
             <w:r>
               <w:rPr>
                 <w:rStyle w:val="Hyperlink"/>
@@ -2098,7 +2097,7 @@
                 <w:noProof/>
                 <w:webHidden/>
               </w:rPr>
-              <w:instrText>Toc234741702 \h</w:instrText>
+              <w:instrText>Toc234755940 \h</w:instrText>
             </w:r>
             <w:r>
               <w:rPr>
@@ -2155,7 +2154,7 @@
               <w:rtl/>
             </w:rPr>
           </w:pPr>
-          <w:hyperlink w:anchor="_Toc234741703" w:history="1">
+          <w:hyperlink w:anchor="_Toc234755941" w:history="1">
             <w:r>
               <w:rPr>
                 <w:rStyle w:val="Hyperlink"/>
@@ -2207,7 +2206,7 @@
                 <w:noProof/>
                 <w:webHidden/>
               </w:rPr>
-              <w:instrText>Toc234741703 \h</w:instrText>
+              <w:instrText>Toc234755941 \h</w:instrText>
             </w:r>
             <w:r>
               <w:rPr>
@@ -2264,7 +2263,7 @@
               <w:rtl/>
             </w:rPr>
           </w:pPr>
-          <w:hyperlink w:anchor="_Toc234741704" w:history="1">
+          <w:hyperlink w:anchor="_Toc234755942" w:history="1">
             <w:r>
               <w:rPr>
                 <w:rStyle w:val="Hyperlink"/>
@@ -2316,7 +2315,7 @@
                 <w:noProof/>
                 <w:webHidden/>
               </w:rPr>
-              <w:instrText>Toc234741704 \h</w:instrText>
+              <w:instrText>Toc234755942 \h</w:instrText>
             </w:r>
             <w:r>
               <w:rPr>
@@ -2373,7 +2372,7 @@
               <w:rtl/>
             </w:rPr>
           </w:pPr>
-          <w:hyperlink w:anchor="_Toc234741705" w:history="1">
+          <w:hyperlink w:anchor="_Toc234755943" w:history="1">
             <w:r>
               <w:rPr>
                 <w:rStyle w:val="Hyperlink"/>
@@ -2425,7 +2424,7 @@
                 <w:noProof/>
                 <w:webHidden/>
               </w:rPr>
-              <w:instrText>Toc234741705 \h</w:instrText>
+              <w:instrText>Toc234755943 \h</w:instrText>
             </w:r>
             <w:r>
               <w:rPr>
@@ -2482,7 +2481,7 @@
               <w:rtl/>
             </w:rPr>
           </w:pPr>
-          <w:hyperlink w:anchor="_Toc234741706" w:history="1">
+          <w:hyperlink w:anchor="_Toc234755944" w:history="1">
             <w:r>
               <w:rPr>
                 <w:rStyle w:val="Hyperlink"/>
@@ -2534,7 +2533,7 @@
                 <w:noProof/>
                 <w:webHidden/>
               </w:rPr>
-              <w:instrText>Toc234741706 \h</w:instrText>
+              <w:instrText>Toc234755944 \h</w:instrText>
             </w:r>
             <w:r>
               <w:rPr>
@@ -2591,7 +2590,7 @@
               <w:rtl/>
             </w:rPr>
           </w:pPr>
-          <w:hyperlink w:anchor="_Toc234741707" w:history="1">
+          <w:hyperlink w:anchor="_Toc234755945" w:history="1">
             <w:r>
               <w:rPr>
                 <w:rStyle w:val="Hyperlink"/>
@@ -2643,7 +2642,7 @@
                 <w:noProof/>
                 <w:webHidden/>
               </w:rPr>
-              <w:instrText>Toc234741707 \h</w:instrText>
+              <w:instrText>Toc234755945 \h</w:instrText>
             </w:r>
             <w:r>
               <w:rPr>
@@ -2700,7 +2699,7 @@
               <w:rtl/>
             </w:rPr>
           </w:pPr>
-          <w:hyperlink w:anchor="_Toc234741708" w:history="1">
+          <w:hyperlink w:anchor="_Toc234755946" w:history="1">
             <w:r>
               <w:rPr>
                 <w:rStyle w:val="Hyperlink"/>
@@ -2752,7 +2751,7 @@
                 <w:noProof/>
                 <w:webHidden/>
               </w:rPr>
-              <w:instrText>Toc234741708 \h</w:instrText>
+              <w:instrText>Toc234755946 \h</w:instrText>
             </w:r>
             <w:r>
               <w:rPr>
@@ -2809,7 +2808,7 @@
               <w:rtl/>
             </w:rPr>
           </w:pPr>
-          <w:hyperlink w:anchor="_Toc234741709" w:history="1">
+          <w:hyperlink w:anchor="_Toc234755947" w:history="1">
             <w:r>
               <w:rPr>
                 <w:rStyle w:val="Hyperlink"/>
@@ -2861,7 +2860,7 @@
                 <w:noProof/>
                 <w:webHidden/>
               </w:rPr>
-              <w:instrText>Toc234741709 \h</w:instrText>
+              <w:instrText>Toc234755947 \h</w:instrText>
             </w:r>
             <w:r>
               <w:rPr>
@@ -2918,7 +2917,7 @@
               <w:rtl/>
             </w:rPr>
           </w:pPr>
-          <w:hyperlink w:anchor="_Toc234741710" w:history="1">
+          <w:hyperlink w:anchor="_Toc234755948" w:history="1">
             <w:r>
               <w:rPr>
                 <w:rStyle w:val="Hyperlink"/>
@@ -2970,7 +2969,7 @@
                 <w:noProof/>
                 <w:webHidden/>
               </w:rPr>
-              <w:instrText>Toc234741710 \h</w:instrText>
+              <w:instrText>Toc234755948 \h</w:instrText>
             </w:r>
             <w:r>
               <w:rPr>
@@ -3027,7 +3026,7 @@
               <w:rtl/>
             </w:rPr>
           </w:pPr>
-          <w:hyperlink w:anchor="_Toc234741711" w:history="1">
+          <w:hyperlink w:anchor="_Toc234755949" w:history="1">
             <w:r>
               <w:rPr>
                 <w:rStyle w:val="Hyperlink"/>
@@ -3079,7 +3078,7 @@
                 <w:noProof/>
                 <w:webHidden/>
               </w:rPr>
-              <w:instrText>Toc234741711 \h</w:instrText>
+              <w:instrText>Toc234755949 \h</w:instrText>
             </w:r>
             <w:r>
               <w:rPr>
@@ -3136,7 +3135,7 @@
               <w:rtl/>
             </w:rPr>
           </w:pPr>
-          <w:hyperlink w:anchor="_Toc234741712" w:history="1">
+          <w:hyperlink w:anchor="_Toc234755950" w:history="1">
             <w:r>
               <w:rPr>
                 <w:rStyle w:val="Hyperlink"/>
@@ -3188,7 +3187,7 @@
                 <w:noProof/>
                 <w:webHidden/>
               </w:rPr>
-              <w:instrText>Toc234741712 \h</w:instrText>
+              <w:instrText>Toc234755950 \h</w:instrText>
             </w:r>
             <w:r>
               <w:rPr>
@@ -3245,7 +3244,7 @@
               <w:rtl/>
             </w:rPr>
           </w:pPr>
-          <w:hyperlink w:anchor="_Toc234741713" w:history="1">
+          <w:hyperlink w:anchor="_Toc234755951" w:history="1">
             <w:r>
               <w:rPr>
                 <w:rStyle w:val="Hyperlink"/>
@@ -3298,7 +3297,7 @@
                 <w:noProof/>
                 <w:webHidden/>
               </w:rPr>
-              <w:instrText>Toc234741713 \h</w:instrText>
+              <w:instrText>Toc234755951 \h</w:instrText>
             </w:r>
             <w:r>
               <w:rPr>
@@ -3355,7 +3354,7 @@
               <w:rtl/>
             </w:rPr>
           </w:pPr>
-          <w:hyperlink w:anchor="_Toc234741714" w:history="1">
+          <w:hyperlink w:anchor="_Toc234755952" w:history="1">
             <w:r>
               <w:rPr>
                 <w:rStyle w:val="Hyperlink"/>
@@ -3408,7 +3407,7 @@
                 <w:noProof/>
                 <w:webHidden/>
               </w:rPr>
-              <w:instrText>Toc234741714 \h</w:instrText>
+              <w:instrText>Toc234755952 \h</w:instrText>
             </w:r>
             <w:r>
               <w:rPr>
@@ -3465,7 +3464,7 @@
               <w:rtl/>
             </w:rPr>
           </w:pPr>
-          <w:hyperlink w:anchor="_Toc234741715" w:history="1">
+          <w:hyperlink w:anchor="_Toc234755953" w:history="1">
             <w:r>
               <w:rPr>
                 <w:rStyle w:val="Hyperlink"/>
@@ -3533,7 +3532,7 @@
                 <w:noProof/>
                 <w:webHidden/>
               </w:rPr>
-              <w:instrText>Toc234741715 \h</w:instrText>
+              <w:instrText>Toc234755953 \h</w:instrText>
             </w:r>
             <w:r>
               <w:rPr>
@@ -3590,7 +3589,7 @@
               <w:rtl/>
             </w:rPr>
           </w:pPr>
-          <w:hyperlink w:anchor="_Toc234741716" w:history="1">
+          <w:hyperlink w:anchor="_Toc234755954" w:history="1">
             <w:r>
               <w:rPr>
                 <w:rStyle w:val="Hyperlink"/>
@@ -3643,7 +3642,7 @@
                 <w:noProof/>
                 <w:webHidden/>
               </w:rPr>
-              <w:instrText>Toc234741716 \h</w:instrText>
+              <w:instrText>Toc234755954 \h</w:instrText>
             </w:r>
             <w:r>
               <w:rPr>
@@ -3700,7 +3699,7 @@
               <w:rtl/>
             </w:rPr>
           </w:pPr>
-          <w:hyperlink w:anchor="_Toc234741717" w:history="1">
+          <w:hyperlink w:anchor="_Toc234755955" w:history="1">
             <w:r>
               <w:rPr>
                 <w:rStyle w:val="Hyperlink"/>
@@ -3753,7 +3752,7 @@
                 <w:noProof/>
                 <w:webHidden/>
               </w:rPr>
-              <w:instrText>Toc234741717 \h</w:instrText>
+              <w:instrText>Toc234755955 \h</w:instrText>
             </w:r>
             <w:r>
               <w:rPr>
@@ -3810,7 +3809,7 @@
               <w:rtl/>
             </w:rPr>
           </w:pPr>
-          <w:hyperlink w:anchor="_Toc234741718" w:history="1">
+          <w:hyperlink w:anchor="_Toc234755956" w:history="1">
             <w:r>
               <w:rPr>
                 <w:rStyle w:val="Hyperlink"/>
@@ -3863,7 +3862,7 @@
                 <w:noProof/>
                 <w:webHidden/>
               </w:rPr>
-              <w:instrText>Toc234741718 \h</w:instrText>
+              <w:instrText>Toc234755956 \h</w:instrText>
             </w:r>
             <w:r>
               <w:rPr>
@@ -3894,7 +3893,7 @@
                 <w:webHidden/>
                 <w:rtl/>
               </w:rPr>
-              <w:t>14</w:t>
+              <w:t>15</w:t>
             </w:r>
             <w:r>
               <w:rPr>
@@ -3920,8 +3919,8 @@
               <w:rtl/>
             </w:rPr>
           </w:pPr>
-          <w:hyperlink w:anchor="_Toc234741719" w:history="1">
-            <w:bookmarkStart w:id="1" w:name="_Toc234741665"/>
+          <w:hyperlink w:anchor="_Toc234755957" w:history="1">
+            <w:bookmarkStart w:id="1" w:name="_Toc234741719"/>
             <w:r>
               <w:rPr>
                 <w:rStyle w:val="Hyperlink"/>
@@ -3930,10 +3929,10 @@
                 <w:rtl/>
               </w:rPr>
               <w:drawing>
-                <wp:inline distT="0" distB="0" distL="0" distR="0" wp14:anchorId="11ECB87C" wp14:editId="416E22EC">
+                <wp:inline distT="0" distB="0" distL="0" distR="0" wp14:anchorId="0E6AC4BA" wp14:editId="3109D057">
                   <wp:extent cx="4277322" cy="5877745"/>
                   <wp:effectExtent l="0" t="0" r="9525" b="8890"/>
-                  <wp:docPr id="1064996370" name="תמונה 1"/>
+                  <wp:docPr id="912846461" name="תמונה 1"/>
                   <wp:cNvGraphicFramePr>
                     <a:graphicFrameLocks xmlns:a="http://schemas.openxmlformats.org/drawingml/2006/main" noChangeAspect="1"/>
                   </wp:cNvGraphicFramePr>
@@ -4010,7 +4009,7 @@
                 <w:noProof/>
                 <w:webHidden/>
               </w:rPr>
-              <w:instrText>Toc234741719 \h</w:instrText>
+              <w:instrText>Toc234755957 \h</w:instrText>
             </w:r>
             <w:r>
               <w:rPr>
@@ -4041,7 +4040,7 @@
                 <w:webHidden/>
                 <w:rtl/>
               </w:rPr>
-              <w:t>14</w:t>
+              <w:t>15</w:t>
             </w:r>
             <w:r>
               <w:rPr>
@@ -4067,7 +4066,7 @@
               <w:rtl/>
             </w:rPr>
           </w:pPr>
-          <w:hyperlink w:anchor="_Toc234741720" w:history="1">
+          <w:hyperlink w:anchor="_Toc234755958" w:history="1">
             <w:r>
               <w:rPr>
                 <w:rStyle w:val="Hyperlink"/>
@@ -4120,7 +4119,7 @@
                 <w:noProof/>
                 <w:webHidden/>
               </w:rPr>
-              <w:instrText>Toc234741720 \h</w:instrText>
+              <w:instrText>Toc234755958 \h</w:instrText>
             </w:r>
             <w:r>
               <w:rPr>
@@ -4151,7 +4150,7 @@
                 <w:webHidden/>
                 <w:rtl/>
               </w:rPr>
-              <w:t>14</w:t>
+              <w:t>15</w:t>
             </w:r>
             <w:r>
               <w:rPr>
@@ -4177,7 +4176,7 @@
               <w:rtl/>
             </w:rPr>
           </w:pPr>
-          <w:hyperlink w:anchor="_Toc234741721" w:history="1">
+          <w:hyperlink w:anchor="_Toc234755959" w:history="1">
             <w:r>
               <w:rPr>
                 <w:rStyle w:val="Hyperlink"/>
@@ -4230,7 +4229,7 @@
                 <w:noProof/>
                 <w:webHidden/>
               </w:rPr>
-              <w:instrText>Toc234741721 \h</w:instrText>
+              <w:instrText>Toc234755959 \h</w:instrText>
             </w:r>
             <w:r>
               <w:rPr>
@@ -4261,7 +4260,7 @@
                 <w:webHidden/>
                 <w:rtl/>
               </w:rPr>
-              <w:t>15</w:t>
+              <w:t>16</w:t>
             </w:r>
             <w:r>
               <w:rPr>
@@ -4287,7 +4286,7 @@
               <w:rtl/>
             </w:rPr>
           </w:pPr>
-          <w:hyperlink w:anchor="_Toc234741722" w:history="1">
+          <w:hyperlink w:anchor="_Toc234755960" w:history="1">
             <w:r>
               <w:rPr>
                 <w:rStyle w:val="Hyperlink"/>
@@ -4340,7 +4339,7 @@
                 <w:noProof/>
                 <w:webHidden/>
               </w:rPr>
-              <w:instrText>Toc234741722 \h</w:instrText>
+              <w:instrText>Toc234755960 \h</w:instrText>
             </w:r>
             <w:r>
               <w:rPr>
@@ -4371,7 +4370,7 @@
                 <w:webHidden/>
                 <w:rtl/>
               </w:rPr>
-              <w:t>15</w:t>
+              <w:t>16</w:t>
             </w:r>
             <w:r>
               <w:rPr>
@@ -4397,7 +4396,7 @@
               <w:rtl/>
             </w:rPr>
           </w:pPr>
-          <w:hyperlink w:anchor="_Toc234741723" w:history="1">
+          <w:hyperlink w:anchor="_Toc234755961" w:history="1">
             <w:r>
               <w:rPr>
                 <w:rStyle w:val="Hyperlink"/>
@@ -4449,7 +4448,7 @@
                 <w:noProof/>
                 <w:webHidden/>
               </w:rPr>
-              <w:instrText>Toc234741723 \h</w:instrText>
+              <w:instrText>Toc234755961 \h</w:instrText>
             </w:r>
             <w:r>
               <w:rPr>
@@ -4480,7 +4479,7 @@
                 <w:webHidden/>
                 <w:rtl/>
               </w:rPr>
-              <w:t>16</w:t>
+              <w:t>17</w:t>
             </w:r>
             <w:r>
               <w:rPr>
@@ -4506,7 +4505,7 @@
               <w:rtl/>
             </w:rPr>
           </w:pPr>
-          <w:hyperlink w:anchor="_Toc234741724" w:history="1">
+          <w:hyperlink w:anchor="_Toc234755962" w:history="1">
             <w:r>
               <w:rPr>
                 <w:rStyle w:val="Hyperlink"/>
@@ -4558,7 +4557,7 @@
                 <w:noProof/>
                 <w:webHidden/>
               </w:rPr>
-              <w:instrText>Toc234741724 \h</w:instrText>
+              <w:instrText>Toc234755962 \h</w:instrText>
             </w:r>
             <w:r>
               <w:rPr>
@@ -4589,7 +4588,7 @@
                 <w:webHidden/>
                 <w:rtl/>
               </w:rPr>
-              <w:t>17</w:t>
+              <w:t>18</w:t>
             </w:r>
             <w:r>
               <w:rPr>
@@ -4615,7 +4614,7 @@
               <w:rtl/>
             </w:rPr>
           </w:pPr>
-          <w:hyperlink w:anchor="_Toc234741725" w:history="1">
+          <w:hyperlink w:anchor="_Toc234755963" w:history="1">
             <w:r>
               <w:rPr>
                 <w:rStyle w:val="Hyperlink"/>
@@ -4668,7 +4667,7 @@
                 <w:noProof/>
                 <w:webHidden/>
               </w:rPr>
-              <w:instrText>Toc234741725 \h</w:instrText>
+              <w:instrText>Toc234755963 \h</w:instrText>
             </w:r>
             <w:r>
               <w:rPr>
@@ -4699,7 +4698,7 @@
                 <w:webHidden/>
                 <w:rtl/>
               </w:rPr>
-              <w:t>17</w:t>
+              <w:t>18</w:t>
             </w:r>
             <w:r>
               <w:rPr>
@@ -4725,7 +4724,7 @@
               <w:rtl/>
             </w:rPr>
           </w:pPr>
-          <w:hyperlink w:anchor="_Toc234741726" w:history="1">
+          <w:hyperlink w:anchor="_Toc234755964" w:history="1">
             <w:r>
               <w:rPr>
                 <w:rStyle w:val="Hyperlink"/>
@@ -4778,7 +4777,7 @@
                 <w:noProof/>
                 <w:webHidden/>
               </w:rPr>
-              <w:instrText>Toc234741726 \h</w:instrText>
+              <w:instrText>Toc234755964 \h</w:instrText>
             </w:r>
             <w:r>
               <w:rPr>
@@ -4809,7 +4808,7 @@
                 <w:webHidden/>
                 <w:rtl/>
               </w:rPr>
-              <w:t>18</w:t>
+              <w:t>19</w:t>
             </w:r>
             <w:r>
               <w:rPr>
@@ -4835,7 +4834,7 @@
               <w:rtl/>
             </w:rPr>
           </w:pPr>
-          <w:hyperlink w:anchor="_Toc234741727" w:history="1">
+          <w:hyperlink w:anchor="_Toc234755965" w:history="1">
             <w:r>
               <w:rPr>
                 <w:rStyle w:val="Hyperlink"/>
@@ -4895,7 +4894,7 @@
                 <w:noProof/>
                 <w:webHidden/>
               </w:rPr>
-              <w:instrText>Toc234741727 \h</w:instrText>
+              <w:instrText>Toc234755965 \h</w:instrText>
             </w:r>
             <w:r>
               <w:rPr>
@@ -4926,7 +4925,7 @@
                 <w:webHidden/>
                 <w:rtl/>
               </w:rPr>
-              <w:t>18</w:t>
+              <w:t>19</w:t>
             </w:r>
             <w:r>
               <w:rPr>
@@ -4952,7 +4951,7 @@
               <w:rtl/>
             </w:rPr>
           </w:pPr>
-          <w:hyperlink w:anchor="_Toc234741728" w:history="1">
+          <w:hyperlink w:anchor="_Toc234755966" w:history="1">
             <w:r>
               <w:rPr>
                 <w:rStyle w:val="Hyperlink"/>
@@ -5005,7 +5004,7 @@
                 <w:noProof/>
                 <w:webHidden/>
               </w:rPr>
-              <w:instrText>Toc234741728 \h</w:instrText>
+              <w:instrText>Toc234755966 \h</w:instrText>
             </w:r>
             <w:r>
               <w:rPr>
@@ -5036,7 +5035,7 @@
                 <w:webHidden/>
                 <w:rtl/>
               </w:rPr>
-              <w:t>19</w:t>
+              <w:t>20</w:t>
             </w:r>
             <w:r>
               <w:rPr>
@@ -5062,7 +5061,7 @@
               <w:rtl/>
             </w:rPr>
           </w:pPr>
-          <w:hyperlink w:anchor="_Toc234741729" w:history="1">
+          <w:hyperlink w:anchor="_Toc234755967" w:history="1">
             <w:r>
               <w:rPr>
                 <w:rStyle w:val="Hyperlink"/>
@@ -5114,7 +5113,7 @@
                 <w:noProof/>
                 <w:webHidden/>
               </w:rPr>
-              <w:instrText>Toc234741729 \h</w:instrText>
+              <w:instrText>Toc234755967 \h</w:instrText>
             </w:r>
             <w:r>
               <w:rPr>
@@ -5145,7 +5144,7 @@
                 <w:webHidden/>
                 <w:rtl/>
               </w:rPr>
-              <w:t>19</w:t>
+              <w:t>20</w:t>
             </w:r>
             <w:r>
               <w:rPr>
@@ -5171,14 +5170,30 @@
               <w:rtl/>
             </w:rPr>
           </w:pPr>
-          <w:hyperlink w:anchor="_Toc234741730" w:history="1">
-            <w:r>
-              <w:rPr>
-                <w:rStyle w:val="Hyperlink"/>
-                <w:noProof/>
-                <w:rtl/>
-              </w:rPr>
-              <w:t xml:space="preserve">העלאת/ עדכון הקבצים בחשבון </w:t>
+          <w:hyperlink w:anchor="_Toc234755968" w:history="1">
+            <w:r>
+              <w:rPr>
+                <w:rStyle w:val="Hyperlink"/>
+                <w:noProof/>
+                <w:rtl/>
+              </w:rPr>
+              <w:t>העלאת/ עדכון הקבצים בחשב</w:t>
+            </w:r>
+            <w:r>
+              <w:rPr>
+                <w:rStyle w:val="Hyperlink"/>
+                <w:noProof/>
+                <w:rtl/>
+              </w:rPr>
+              <w:t>ו</w:t>
+            </w:r>
+            <w:r>
+              <w:rPr>
+                <w:rStyle w:val="Hyperlink"/>
+                <w:noProof/>
+                <w:rtl/>
+              </w:rPr>
+              <w:t xml:space="preserve">ן </w:t>
             </w:r>
             <w:r>
               <w:rPr>
@@ -5231,7 +5246,7 @@
                 <w:noProof/>
                 <w:webHidden/>
               </w:rPr>
-              <w:instrText>Toc234741730 \h</w:instrText>
+              <w:instrText>Toc234755968 \h</w:instrText>
             </w:r>
             <w:r>
               <w:rPr>
@@ -5262,7 +5277,7 @@
                 <w:webHidden/>
                 <w:rtl/>
               </w:rPr>
-              <w:t>20</w:t>
+              <w:t>21</w:t>
             </w:r>
             <w:r>
               <w:rPr>
@@ -5288,7 +5303,7 @@
               <w:rtl/>
             </w:rPr>
           </w:pPr>
-          <w:hyperlink w:anchor="_Toc234741731" w:history="1">
+          <w:hyperlink w:anchor="_Toc234755969" w:history="1">
             <w:r>
               <w:rPr>
                 <w:rStyle w:val="Hyperlink"/>
@@ -5341,7 +5356,7 @@
                 <w:noProof/>
                 <w:webHidden/>
               </w:rPr>
-              <w:instrText>Toc234741731 \h</w:instrText>
+              <w:instrText>Toc234755969 \h</w:instrText>
             </w:r>
             <w:r>
               <w:rPr>
@@ -5372,7 +5387,7 @@
                 <w:webHidden/>
                 <w:rtl/>
               </w:rPr>
-              <w:t>21</w:t>
+              <w:t>22</w:t>
             </w:r>
             <w:r>
               <w:rPr>
@@ -5398,7 +5413,7 @@
               <w:rtl/>
             </w:rPr>
           </w:pPr>
-          <w:hyperlink w:anchor="_Toc234741732" w:history="1">
+          <w:hyperlink w:anchor="_Toc234755970" w:history="1">
             <w:r>
               <w:rPr>
                 <w:rStyle w:val="Hyperlink"/>
@@ -5451,7 +5466,7 @@
                 <w:noProof/>
                 <w:webHidden/>
               </w:rPr>
-              <w:instrText>Toc234741732 \h</w:instrText>
+              <w:instrText>Toc234755970 \h</w:instrText>
             </w:r>
             <w:r>
               <w:rPr>
@@ -5482,7 +5497,7 @@
                 <w:webHidden/>
                 <w:rtl/>
               </w:rPr>
-              <w:t>24</w:t>
+              <w:t>25</w:t>
             </w:r>
             <w:r>
               <w:rPr>
@@ -5508,7 +5523,7 @@
               <w:rtl/>
             </w:rPr>
           </w:pPr>
-          <w:hyperlink w:anchor="_Toc234741733" w:history="1">
+          <w:hyperlink w:anchor="_Toc234755971" w:history="1">
             <w:r>
               <w:rPr>
                 <w:rStyle w:val="Hyperlink"/>
@@ -5560,7 +5575,7 @@
                 <w:noProof/>
                 <w:webHidden/>
               </w:rPr>
-              <w:instrText>Toc234741733 \h</w:instrText>
+              <w:instrText>Toc234755971 \h</w:instrText>
             </w:r>
             <w:r>
               <w:rPr>
@@ -5591,7 +5606,7 @@
                 <w:webHidden/>
                 <w:rtl/>
               </w:rPr>
-              <w:t>25</w:t>
+              <w:t>26</w:t>
             </w:r>
             <w:r>
               <w:rPr>
@@ -5617,7 +5632,7 @@
               <w:rtl/>
             </w:rPr>
           </w:pPr>
-          <w:hyperlink w:anchor="_Toc234741734" w:history="1">
+          <w:hyperlink w:anchor="_Toc234755972" w:history="1">
             <w:r>
               <w:rPr>
                 <w:rStyle w:val="Hyperlink"/>
@@ -5677,7 +5692,7 @@
                 <w:noProof/>
                 <w:webHidden/>
               </w:rPr>
-              <w:instrText>Toc234741734 \h</w:instrText>
+              <w:instrText>Toc234755972 \h</w:instrText>
             </w:r>
             <w:r>
               <w:rPr>
@@ -5708,7 +5723,7 @@
                 <w:webHidden/>
                 <w:rtl/>
               </w:rPr>
-              <w:t>25</w:t>
+              <w:t>26</w:t>
             </w:r>
             <w:r>
               <w:rPr>
@@ -5734,7 +5749,7 @@
               <w:rtl/>
             </w:rPr>
           </w:pPr>
-          <w:hyperlink w:anchor="_Toc234741735" w:history="1">
+          <w:hyperlink w:anchor="_Toc234755973" w:history="1">
             <w:r>
               <w:rPr>
                 <w:rStyle w:val="Hyperlink"/>
@@ -5794,7 +5809,7 @@
                 <w:noProof/>
                 <w:webHidden/>
               </w:rPr>
-              <w:instrText>Toc234741735 \h</w:instrText>
+              <w:instrText>Toc234755973 \h</w:instrText>
             </w:r>
             <w:r>
               <w:rPr>
@@ -5825,7 +5840,7 @@
                 <w:webHidden/>
                 <w:rtl/>
               </w:rPr>
-              <w:t>25</w:t>
+              <w:t>26</w:t>
             </w:r>
             <w:r>
               <w:rPr>
@@ -5851,7 +5866,7 @@
               <w:rtl/>
             </w:rPr>
           </w:pPr>
-          <w:hyperlink w:anchor="_Toc234741736" w:history="1">
+          <w:hyperlink w:anchor="_Toc234755974" w:history="1">
             <w:r>
               <w:rPr>
                 <w:rStyle w:val="Hyperlink"/>
@@ -5903,7 +5918,7 @@
                 <w:noProof/>
                 <w:webHidden/>
               </w:rPr>
-              <w:instrText>Toc234741736 \h</w:instrText>
+              <w:instrText>Toc234755974 \h</w:instrText>
             </w:r>
             <w:r>
               <w:rPr>
@@ -5960,27 +5975,13 @@
               <w:rtl/>
             </w:rPr>
           </w:pPr>
-          <w:hyperlink w:anchor="_Toc234741737" w:history="1">
-            <w:r>
-              <w:rPr>
-                <w:rStyle w:val="Hyperlink"/>
-                <w:noProof/>
-              </w:rPr>
-              <w:t>Path han</w:t>
-            </w:r>
-            <w:r>
-              <w:rPr>
-                <w:rStyle w:val="Hyperlink"/>
-                <w:noProof/>
-              </w:rPr>
-              <w:t>d</w:t>
-            </w:r>
-            <w:r>
-              <w:rPr>
-                <w:rStyle w:val="Hyperlink"/>
-                <w:noProof/>
-              </w:rPr>
-              <w:t>ling</w:t>
+          <w:hyperlink w:anchor="_Toc234755975" w:history="1">
+            <w:r>
+              <w:rPr>
+                <w:rStyle w:val="Hyperlink"/>
+                <w:noProof/>
+              </w:rPr>
+              <w:t>Path handling</w:t>
             </w:r>
             <w:r>
               <w:rPr>
@@ -6026,7 +6027,7 @@
                 <w:noProof/>
                 <w:webHidden/>
               </w:rPr>
-              <w:instrText>Toc234741737 \h</w:instrText>
+              <w:instrText>Toc234755975 \h</w:instrText>
             </w:r>
             <w:r>
               <w:rPr>
@@ -6057,7 +6058,590 @@
                 <w:webHidden/>
                 <w:rtl/>
               </w:rPr>
-              <w:t>26</w:t>
+              <w:t>27</w:t>
+            </w:r>
+            <w:r>
+              <w:rPr>
+                <w:rStyle w:val="Hyperlink"/>
+                <w:noProof/>
+                <w:rtl/>
+              </w:rPr>
+              <w:fldChar w:fldCharType="end"/>
+            </w:r>
+          </w:hyperlink>
+        </w:p>
+        <w:p>
+          <w:pPr>
+            <w:pStyle w:val="TOC1"/>
+            <w:tabs>
+              <w:tab w:val="right" w:leader="dot" w:pos="8296"/>
+            </w:tabs>
+            <w:rPr>
+              <w:rFonts w:eastAsiaTheme="minorEastAsia"/>
+              <w:noProof/>
+              <w:sz w:val="24"/>
+              <w:szCs w:val="24"/>
+              <w:rtl/>
+            </w:rPr>
+          </w:pPr>
+          <w:hyperlink w:anchor="_Toc234755976" w:history="1">
+            <w:r>
+              <w:rPr>
+                <w:rStyle w:val="Hyperlink"/>
+                <w:noProof/>
+              </w:rPr>
+              <w:t>YAML</w:t>
+            </w:r>
+            <w:r>
+              <w:rPr>
+                <w:noProof/>
+                <w:webHidden/>
+                <w:rtl/>
+              </w:rPr>
+              <w:tab/>
+            </w:r>
+            <w:r>
+              <w:rPr>
+                <w:rStyle w:val="Hyperlink"/>
+                <w:noProof/>
+                <w:rtl/>
+              </w:rPr>
+              <w:fldChar w:fldCharType="begin"/>
+            </w:r>
+            <w:r>
+              <w:rPr>
+                <w:noProof/>
+                <w:webHidden/>
+                <w:rtl/>
+              </w:rPr>
+              <w:instrText xml:space="preserve"> </w:instrText>
+            </w:r>
+            <w:r>
+              <w:rPr>
+                <w:noProof/>
+                <w:webHidden/>
+              </w:rPr>
+              <w:instrText>PAGEREF</w:instrText>
+            </w:r>
+            <w:r>
+              <w:rPr>
+                <w:noProof/>
+                <w:webHidden/>
+                <w:rtl/>
+              </w:rPr>
+              <w:instrText xml:space="preserve"> _</w:instrText>
+            </w:r>
+            <w:r>
+              <w:rPr>
+                <w:noProof/>
+                <w:webHidden/>
+              </w:rPr>
+              <w:instrText>Toc234755976 \h</w:instrText>
+            </w:r>
+            <w:r>
+              <w:rPr>
+                <w:noProof/>
+                <w:webHidden/>
+                <w:rtl/>
+              </w:rPr>
+              <w:instrText xml:space="preserve"> </w:instrText>
+            </w:r>
+            <w:r>
+              <w:rPr>
+                <w:rStyle w:val="Hyperlink"/>
+                <w:noProof/>
+                <w:rtl/>
+              </w:rPr>
+            </w:r>
+            <w:r>
+              <w:rPr>
+                <w:rStyle w:val="Hyperlink"/>
+                <w:noProof/>
+                <w:rtl/>
+              </w:rPr>
+              <w:fldChar w:fldCharType="separate"/>
+            </w:r>
+            <w:r>
+              <w:rPr>
+                <w:noProof/>
+                <w:webHidden/>
+                <w:rtl/>
+              </w:rPr>
+              <w:t>27</w:t>
+            </w:r>
+            <w:r>
+              <w:rPr>
+                <w:rStyle w:val="Hyperlink"/>
+                <w:noProof/>
+                <w:rtl/>
+              </w:rPr>
+              <w:fldChar w:fldCharType="end"/>
+            </w:r>
+          </w:hyperlink>
+        </w:p>
+        <w:p>
+          <w:pPr>
+            <w:pStyle w:val="TOC1"/>
+            <w:tabs>
+              <w:tab w:val="right" w:leader="dot" w:pos="8296"/>
+            </w:tabs>
+            <w:rPr>
+              <w:rFonts w:eastAsiaTheme="minorEastAsia"/>
+              <w:noProof/>
+              <w:sz w:val="24"/>
+              <w:szCs w:val="24"/>
+              <w:rtl/>
+            </w:rPr>
+          </w:pPr>
+          <w:hyperlink w:anchor="_Toc234755977" w:history="1">
+            <w:r>
+              <w:rPr>
+                <w:rStyle w:val="Hyperlink"/>
+                <w:noProof/>
+              </w:rPr>
+              <w:t>CI and CD</w:t>
+            </w:r>
+            <w:r>
+              <w:rPr>
+                <w:noProof/>
+                <w:webHidden/>
+                <w:rtl/>
+              </w:rPr>
+              <w:tab/>
+            </w:r>
+            <w:r>
+              <w:rPr>
+                <w:rStyle w:val="Hyperlink"/>
+                <w:noProof/>
+                <w:rtl/>
+              </w:rPr>
+              <w:fldChar w:fldCharType="begin"/>
+            </w:r>
+            <w:r>
+              <w:rPr>
+                <w:noProof/>
+                <w:webHidden/>
+                <w:rtl/>
+              </w:rPr>
+              <w:instrText xml:space="preserve"> </w:instrText>
+            </w:r>
+            <w:r>
+              <w:rPr>
+                <w:noProof/>
+                <w:webHidden/>
+              </w:rPr>
+              <w:instrText>PAGEREF</w:instrText>
+            </w:r>
+            <w:r>
+              <w:rPr>
+                <w:noProof/>
+                <w:webHidden/>
+                <w:rtl/>
+              </w:rPr>
+              <w:instrText xml:space="preserve"> _</w:instrText>
+            </w:r>
+            <w:r>
+              <w:rPr>
+                <w:noProof/>
+                <w:webHidden/>
+              </w:rPr>
+              <w:instrText>Toc234755977 \h</w:instrText>
+            </w:r>
+            <w:r>
+              <w:rPr>
+                <w:noProof/>
+                <w:webHidden/>
+                <w:rtl/>
+              </w:rPr>
+              <w:instrText xml:space="preserve"> </w:instrText>
+            </w:r>
+            <w:r>
+              <w:rPr>
+                <w:rStyle w:val="Hyperlink"/>
+                <w:noProof/>
+                <w:rtl/>
+              </w:rPr>
+            </w:r>
+            <w:r>
+              <w:rPr>
+                <w:rStyle w:val="Hyperlink"/>
+                <w:noProof/>
+                <w:rtl/>
+              </w:rPr>
+              <w:fldChar w:fldCharType="separate"/>
+            </w:r>
+            <w:r>
+              <w:rPr>
+                <w:noProof/>
+                <w:webHidden/>
+                <w:rtl/>
+              </w:rPr>
+              <w:t>27</w:t>
+            </w:r>
+            <w:r>
+              <w:rPr>
+                <w:rStyle w:val="Hyperlink"/>
+                <w:noProof/>
+                <w:rtl/>
+              </w:rPr>
+              <w:fldChar w:fldCharType="end"/>
+            </w:r>
+          </w:hyperlink>
+        </w:p>
+        <w:p>
+          <w:pPr>
+            <w:pStyle w:val="TOC2"/>
+            <w:tabs>
+              <w:tab w:val="right" w:leader="dot" w:pos="8296"/>
+            </w:tabs>
+            <w:rPr>
+              <w:rFonts w:eastAsiaTheme="minorEastAsia"/>
+              <w:noProof/>
+              <w:sz w:val="24"/>
+              <w:szCs w:val="24"/>
+              <w:rtl/>
+            </w:rPr>
+          </w:pPr>
+          <w:hyperlink w:anchor="_Toc234755978" w:history="1">
+            <w:r>
+              <w:rPr>
+                <w:rStyle w:val="Hyperlink"/>
+                <w:noProof/>
+              </w:rPr>
+              <w:t>Ci - Continuous Integration</w:t>
+            </w:r>
+            <w:r>
+              <w:rPr>
+                <w:rStyle w:val="Hyperlink"/>
+                <w:noProof/>
+                <w:rtl/>
+              </w:rPr>
+              <w:t>:</w:t>
+            </w:r>
+            <w:r>
+              <w:rPr>
+                <w:noProof/>
+                <w:webHidden/>
+                <w:rtl/>
+              </w:rPr>
+              <w:tab/>
+            </w:r>
+            <w:r>
+              <w:rPr>
+                <w:rStyle w:val="Hyperlink"/>
+                <w:noProof/>
+                <w:rtl/>
+              </w:rPr>
+              <w:fldChar w:fldCharType="begin"/>
+            </w:r>
+            <w:r>
+              <w:rPr>
+                <w:noProof/>
+                <w:webHidden/>
+                <w:rtl/>
+              </w:rPr>
+              <w:instrText xml:space="preserve"> </w:instrText>
+            </w:r>
+            <w:r>
+              <w:rPr>
+                <w:noProof/>
+                <w:webHidden/>
+              </w:rPr>
+              <w:instrText>PAGEREF</w:instrText>
+            </w:r>
+            <w:r>
+              <w:rPr>
+                <w:noProof/>
+                <w:webHidden/>
+                <w:rtl/>
+              </w:rPr>
+              <w:instrText xml:space="preserve"> _</w:instrText>
+            </w:r>
+            <w:r>
+              <w:rPr>
+                <w:noProof/>
+                <w:webHidden/>
+              </w:rPr>
+              <w:instrText>Toc234755978 \h</w:instrText>
+            </w:r>
+            <w:r>
+              <w:rPr>
+                <w:noProof/>
+                <w:webHidden/>
+                <w:rtl/>
+              </w:rPr>
+              <w:instrText xml:space="preserve"> </w:instrText>
+            </w:r>
+            <w:r>
+              <w:rPr>
+                <w:rStyle w:val="Hyperlink"/>
+                <w:noProof/>
+                <w:rtl/>
+              </w:rPr>
+            </w:r>
+            <w:r>
+              <w:rPr>
+                <w:rStyle w:val="Hyperlink"/>
+                <w:noProof/>
+                <w:rtl/>
+              </w:rPr>
+              <w:fldChar w:fldCharType="separate"/>
+            </w:r>
+            <w:r>
+              <w:rPr>
+                <w:noProof/>
+                <w:webHidden/>
+                <w:rtl/>
+              </w:rPr>
+              <w:t>28</w:t>
+            </w:r>
+            <w:r>
+              <w:rPr>
+                <w:rStyle w:val="Hyperlink"/>
+                <w:noProof/>
+                <w:rtl/>
+              </w:rPr>
+              <w:fldChar w:fldCharType="end"/>
+            </w:r>
+          </w:hyperlink>
+        </w:p>
+        <w:p>
+          <w:pPr>
+            <w:pStyle w:val="TOC2"/>
+            <w:tabs>
+              <w:tab w:val="right" w:leader="dot" w:pos="8296"/>
+            </w:tabs>
+            <w:rPr>
+              <w:rFonts w:eastAsiaTheme="minorEastAsia"/>
+              <w:noProof/>
+              <w:sz w:val="24"/>
+              <w:szCs w:val="24"/>
+              <w:rtl/>
+            </w:rPr>
+          </w:pPr>
+          <w:hyperlink w:anchor="_Toc234755979" w:history="1">
+            <w:r>
+              <w:rPr>
+                <w:rStyle w:val="Hyperlink"/>
+                <w:noProof/>
+              </w:rPr>
+              <w:t xml:space="preserve">CD - </w:t>
+            </w:r>
+            <w:r>
+              <w:rPr>
+                <w:rStyle w:val="Hyperlink"/>
+                <w:noProof/>
+                <w:rtl/>
+              </w:rPr>
+              <w:t>:</w:t>
+            </w:r>
+            <w:r>
+              <w:rPr>
+                <w:noProof/>
+                <w:webHidden/>
+                <w:rtl/>
+              </w:rPr>
+              <w:tab/>
+            </w:r>
+            <w:r>
+              <w:rPr>
+                <w:rStyle w:val="Hyperlink"/>
+                <w:noProof/>
+                <w:rtl/>
+              </w:rPr>
+              <w:fldChar w:fldCharType="begin"/>
+            </w:r>
+            <w:r>
+              <w:rPr>
+                <w:noProof/>
+                <w:webHidden/>
+                <w:rtl/>
+              </w:rPr>
+              <w:instrText xml:space="preserve"> </w:instrText>
+            </w:r>
+            <w:r>
+              <w:rPr>
+                <w:noProof/>
+                <w:webHidden/>
+              </w:rPr>
+              <w:instrText>PAGEREF</w:instrText>
+            </w:r>
+            <w:r>
+              <w:rPr>
+                <w:noProof/>
+                <w:webHidden/>
+                <w:rtl/>
+              </w:rPr>
+              <w:instrText xml:space="preserve"> _</w:instrText>
+            </w:r>
+            <w:r>
+              <w:rPr>
+                <w:noProof/>
+                <w:webHidden/>
+              </w:rPr>
+              <w:instrText>Toc234755979 \h</w:instrText>
+            </w:r>
+            <w:r>
+              <w:rPr>
+                <w:noProof/>
+                <w:webHidden/>
+                <w:rtl/>
+              </w:rPr>
+              <w:instrText xml:space="preserve"> </w:instrText>
+            </w:r>
+            <w:r>
+              <w:rPr>
+                <w:rStyle w:val="Hyperlink"/>
+                <w:noProof/>
+                <w:rtl/>
+              </w:rPr>
+            </w:r>
+            <w:r>
+              <w:rPr>
+                <w:rStyle w:val="Hyperlink"/>
+                <w:noProof/>
+                <w:rtl/>
+              </w:rPr>
+              <w:fldChar w:fldCharType="separate"/>
+            </w:r>
+            <w:r>
+              <w:rPr>
+                <w:noProof/>
+                <w:webHidden/>
+                <w:rtl/>
+              </w:rPr>
+              <w:t>28</w:t>
+            </w:r>
+            <w:r>
+              <w:rPr>
+                <w:rStyle w:val="Hyperlink"/>
+                <w:noProof/>
+                <w:rtl/>
+              </w:rPr>
+              <w:fldChar w:fldCharType="end"/>
+            </w:r>
+          </w:hyperlink>
+        </w:p>
+        <w:p>
+          <w:pPr>
+            <w:pStyle w:val="TOC2"/>
+            <w:tabs>
+              <w:tab w:val="right" w:leader="dot" w:pos="8296"/>
+            </w:tabs>
+            <w:rPr>
+              <w:rFonts w:eastAsiaTheme="minorEastAsia"/>
+              <w:noProof/>
+              <w:sz w:val="24"/>
+              <w:szCs w:val="24"/>
+              <w:rtl/>
+            </w:rPr>
+          </w:pPr>
+          <w:hyperlink w:anchor="_Toc234755980" w:history="1">
+            <w:r>
+              <w:rPr>
+                <w:rStyle w:val="Hyperlink"/>
+                <w:noProof/>
+              </w:rPr>
+              <w:t>GitHub Ac</w:t>
+            </w:r>
+            <w:r>
+              <w:rPr>
+                <w:rStyle w:val="Hyperlink"/>
+                <w:noProof/>
+              </w:rPr>
+              <w:t>t</w:t>
+            </w:r>
+            <w:r>
+              <w:rPr>
+                <w:rStyle w:val="Hyperlink"/>
+                <w:noProof/>
+              </w:rPr>
+              <w:t>ions Folder</w:t>
+            </w:r>
+            <w:r>
+              <w:rPr>
+                <w:rStyle w:val="Hyperlink"/>
+                <w:noProof/>
+                <w:rtl/>
+              </w:rPr>
+              <w:t>:</w:t>
+            </w:r>
+            <w:r>
+              <w:rPr>
+                <w:noProof/>
+                <w:webHidden/>
+                <w:rtl/>
+              </w:rPr>
+              <w:tab/>
+            </w:r>
+            <w:r>
+              <w:rPr>
+                <w:rStyle w:val="Hyperlink"/>
+                <w:noProof/>
+                <w:rtl/>
+              </w:rPr>
+              <w:fldChar w:fldCharType="begin"/>
+            </w:r>
+            <w:r>
+              <w:rPr>
+                <w:noProof/>
+                <w:webHidden/>
+                <w:rtl/>
+              </w:rPr>
+              <w:instrText xml:space="preserve"> </w:instrText>
+            </w:r>
+            <w:r>
+              <w:rPr>
+                <w:noProof/>
+                <w:webHidden/>
+              </w:rPr>
+              <w:instrText>PAGEREF</w:instrText>
+            </w:r>
+            <w:r>
+              <w:rPr>
+                <w:noProof/>
+                <w:webHidden/>
+                <w:rtl/>
+              </w:rPr>
+              <w:instrText xml:space="preserve"> _</w:instrText>
+            </w:r>
+            <w:r>
+              <w:rPr>
+                <w:noProof/>
+                <w:webHidden/>
+              </w:rPr>
+              <w:instrText>Toc234755980 \h</w:instrText>
+            </w:r>
+            <w:r>
+              <w:rPr>
+                <w:noProof/>
+                <w:webHidden/>
+                <w:rtl/>
+              </w:rPr>
+              <w:instrText xml:space="preserve"> </w:instrText>
+            </w:r>
+            <w:r>
+              <w:rPr>
+                <w:rStyle w:val="Hyperlink"/>
+                <w:noProof/>
+                <w:rtl/>
+              </w:rPr>
+            </w:r>
+            <w:r>
+              <w:rPr>
+                <w:rStyle w:val="Hyperlink"/>
+                <w:noProof/>
+                <w:rtl/>
+              </w:rPr>
+              <w:fldChar w:fldCharType="separate"/>
+            </w:r>
+            <w:r>
+              <w:rPr>
+                <w:noProof/>
+                <w:webHidden/>
+                <w:rtl/>
+              </w:rPr>
+              <w:t>28</w:t>
             </w:r>
             <w:r>
               <w:rPr>
@@ -6259,7 +6843,7 @@
           <w:rtl/>
         </w:rPr>
       </w:pPr>
-      <w:bookmarkStart w:id="2" w:name="_Toc234741685"/>
+      <w:bookmarkStart w:id="2" w:name="_Toc234755923"/>
       <w:r>
         <w:rPr>
           <w:rFonts w:hint="cs"/>
@@ -6278,7 +6862,7 @@
           <w:szCs w:val="28"/>
         </w:rPr>
       </w:pPr>
-      <w:bookmarkStart w:id="3" w:name="_Toc234741686"/>
+      <w:bookmarkStart w:id="3" w:name="_Toc234755924"/>
       <w:r>
         <w:rPr>
           <w:rStyle w:val="20"/>
@@ -6328,7 +6912,7 @@
           <w:szCs w:val="28"/>
         </w:rPr>
       </w:pPr>
-      <w:bookmarkStart w:id="4" w:name="_Toc234741687"/>
+      <w:bookmarkStart w:id="4" w:name="_Toc234755925"/>
       <w:r>
         <w:rPr>
           <w:rStyle w:val="20"/>
@@ -6441,6 +7025,7 @@
           <w:sz w:val="28"/>
           <w:szCs w:val="28"/>
         </w:rPr>
+        <w:lastRenderedPageBreak/>
         <w:t>This is enough for a serious prototype and for paper trading research, especially on daily data. It may be enough for hourly data on a limited universe, but daily data is the more realistic starting point. It is not enough to assume you have a stable live trading edge; that depends on signal quality, execution quality, and cost modeling.</w:t>
       </w:r>
     </w:p>
@@ -6452,13 +7037,12 @@
           <w:szCs w:val="28"/>
         </w:rPr>
       </w:pPr>
-      <w:bookmarkStart w:id="5" w:name="_Toc234741688"/>
+      <w:bookmarkStart w:id="5" w:name="_Toc234755926"/>
       <w:r>
         <w:rPr>
           <w:rStyle w:val="20"/>
           <w:u w:val="single"/>
         </w:rPr>
-        <w:lastRenderedPageBreak/>
         <w:t>Q3. What type of model should I use?</w:t>
       </w:r>
       <w:bookmarkEnd w:id="5"/>
@@ -6782,7 +7366,7 @@
           <w:rtl/>
         </w:rPr>
       </w:pPr>
-      <w:bookmarkStart w:id="6" w:name="_Toc234741689"/>
+      <w:bookmarkStart w:id="6" w:name="_Toc234755927"/>
       <w:r>
         <w:rPr>
           <w:rFonts w:hint="cs"/>
@@ -6882,6 +7466,7 @@
           <w:szCs w:val="28"/>
           <w:rtl/>
         </w:rPr>
+        <w:lastRenderedPageBreak/>
         <w:t>ניתוח של התפלגויות, ובדיקת תלות מסטטיסטיקה -&gt;</w:t>
       </w:r>
       <w:r>
@@ -7012,7 +7597,6 @@
           <w:szCs w:val="28"/>
           <w:rtl/>
         </w:rPr>
-        <w:lastRenderedPageBreak/>
         <w:t>אולי מבני נתונים מהירים לבדיקת מניות וכדומה כמו שראינו במבני נתונים.</w:t>
       </w:r>
     </w:p>
@@ -7101,7 +7685,7 @@
           <w:szCs w:val="28"/>
         </w:rPr>
       </w:pPr>
-      <w:bookmarkStart w:id="7" w:name="_Toc234741690"/>
+      <w:bookmarkStart w:id="7" w:name="_Toc234755928"/>
       <w:r>
         <w:rPr>
           <w:rStyle w:val="20"/>
@@ -7151,7 +7735,7 @@
           <w:szCs w:val="28"/>
         </w:rPr>
       </w:pPr>
-      <w:bookmarkStart w:id="8" w:name="_Toc234741691"/>
+      <w:bookmarkStart w:id="8" w:name="_Toc234755929"/>
       <w:r>
         <w:rPr>
           <w:rStyle w:val="20"/>
@@ -7247,7 +7831,7 @@
           <w:szCs w:val="28"/>
         </w:rPr>
       </w:pPr>
-      <w:bookmarkStart w:id="9" w:name="_Toc234741692"/>
+      <w:bookmarkStart w:id="9" w:name="_Toc234755930"/>
       <w:r>
         <w:rPr>
           <w:rStyle w:val="20"/>
@@ -7417,12 +8001,13 @@
           <w:szCs w:val="28"/>
         </w:rPr>
       </w:pPr>
-      <w:bookmarkStart w:id="10" w:name="_Toc234741693"/>
+      <w:bookmarkStart w:id="10" w:name="_Toc234755931"/>
       <w:r>
         <w:rPr>
           <w:rStyle w:val="20"/>
           <w:u w:val="single"/>
         </w:rPr>
+        <w:lastRenderedPageBreak/>
         <w:t>Q7. Coding language</w:t>
       </w:r>
       <w:bookmarkEnd w:id="10"/>
@@ -7446,15 +8031,7 @@
           <w:szCs w:val="28"/>
         </w:rPr>
         <w:br/>
-        <w:t xml:space="preserve">Python is the correct choice for this project. It is the standard </w:t>
-      </w:r>
-      <w:r>
-        <w:rPr>
-          <w:sz w:val="28"/>
-          <w:szCs w:val="28"/>
-        </w:rPr>
-        <w:lastRenderedPageBreak/>
-        <w:t xml:space="preserve">language for market-data work, machine learning, </w:t>
+        <w:t xml:space="preserve">Python is the correct choice for this project. It is the standard language for market-data work, machine learning, </w:t>
       </w:r>
       <w:proofErr w:type="spellStart"/>
       <w:r>
@@ -7481,7 +8058,7 @@
           <w:szCs w:val="28"/>
         </w:rPr>
       </w:pPr>
-      <w:bookmarkStart w:id="11" w:name="_Toc234741694"/>
+      <w:bookmarkStart w:id="11" w:name="_Toc234755932"/>
       <w:r>
         <w:rPr>
           <w:rStyle w:val="20"/>
@@ -7562,7 +8139,7 @@
           <w:szCs w:val="28"/>
         </w:rPr>
       </w:pPr>
-      <w:bookmarkStart w:id="12" w:name="_Toc234741695"/>
+      <w:bookmarkStart w:id="12" w:name="_Toc234755933"/>
       <w:r>
         <w:rPr>
           <w:rStyle w:val="20"/>
@@ -7703,7 +8280,7 @@
           <w:szCs w:val="28"/>
         </w:rPr>
       </w:pPr>
-      <w:bookmarkStart w:id="13" w:name="_Toc234741696"/>
+      <w:bookmarkStart w:id="13" w:name="_Toc234755934"/>
       <w:r>
         <w:rPr>
           <w:rStyle w:val="20"/>
@@ -7732,7 +8309,6 @@
           <w:szCs w:val="28"/>
         </w:rPr>
         <w:br/>
-        <w:t xml:space="preserve">Weights alone are not enough. The saved training data, or at least a reproducible snapshot of it, is needed so the model can be reproduced, audited, compared, and debugged later. Without the </w:t>
       </w:r>
       <w:r>
         <w:rPr>
@@ -7740,7 +8316,7 @@
           <w:szCs w:val="28"/>
         </w:rPr>
         <w:lastRenderedPageBreak/>
-        <w:t xml:space="preserve">data and preprocessing pipeline, the </w:t>
+        <w:t xml:space="preserve">Weights alone are not enough. The saved training data, or at least a reproducible snapshot of it, is needed so the model can be reproduced, audited, compared, and debugged later. Without the data and preprocessing pipeline, the </w:t>
       </w:r>
       <w:proofErr w:type="gramStart"/>
       <w:r>
@@ -7943,7 +8519,7 @@
           <w:rtl/>
         </w:rPr>
       </w:pPr>
-      <w:bookmarkStart w:id="14" w:name="_Toc234741697"/>
+      <w:bookmarkStart w:id="14" w:name="_Toc234755935"/>
       <w:r>
         <w:rPr>
           <w:rFonts w:hint="cs"/>
@@ -8017,7 +8593,7 @@
           <w:szCs w:val="28"/>
         </w:rPr>
       </w:pPr>
-      <w:bookmarkStart w:id="15" w:name="_Toc234741698"/>
+      <w:bookmarkStart w:id="15" w:name="_Toc234755936"/>
       <w:r>
         <w:rPr>
           <w:rStyle w:val="20"/>
@@ -8234,6 +8810,7 @@
           <w:sz w:val="28"/>
           <w:szCs w:val="28"/>
         </w:rPr>
+        <w:lastRenderedPageBreak/>
         <w:t>break if broker connection fails</w:t>
       </w:r>
     </w:p>
@@ -8270,7 +8847,6 @@
           <w:sz w:val="28"/>
           <w:szCs w:val="28"/>
         </w:rPr>
-        <w:lastRenderedPageBreak/>
         <w:t>This part should sit outside the prediction model as a hard risk layer.</w:t>
       </w:r>
     </w:p>
@@ -8282,7 +8858,7 @@
           <w:u w:val="single"/>
         </w:rPr>
       </w:pPr>
-      <w:bookmarkStart w:id="16" w:name="_Toc234741699"/>
+      <w:bookmarkStart w:id="16" w:name="_Toc234755937"/>
       <w:r>
         <w:rPr>
           <w:u w:val="single"/>
@@ -8316,7 +8892,7 @@
           <w:u w:val="single"/>
         </w:rPr>
       </w:pPr>
-      <w:bookmarkStart w:id="17" w:name="_Toc234741700"/>
+      <w:bookmarkStart w:id="17" w:name="_Toc234755938"/>
       <w:r>
         <w:rPr>
           <w:u w:val="single"/>
@@ -8333,7 +8909,7 @@
           <w:szCs w:val="28"/>
         </w:rPr>
       </w:pPr>
-      <w:bookmarkStart w:id="18" w:name="_Toc234741701"/>
+      <w:bookmarkStart w:id="18" w:name="_Toc234755939"/>
       <w:r>
         <w:rPr>
           <w:rStyle w:val="30"/>
@@ -8371,7 +8947,7 @@
           <w:szCs w:val="28"/>
         </w:rPr>
       </w:pPr>
-      <w:bookmarkStart w:id="19" w:name="_Toc234741702"/>
+      <w:bookmarkStart w:id="19" w:name="_Toc234755940"/>
       <w:r>
         <w:rPr>
           <w:rStyle w:val="20"/>
@@ -8523,7 +9099,7 @@
           <w:szCs w:val="28"/>
         </w:rPr>
       </w:pPr>
-      <w:bookmarkStart w:id="20" w:name="_Toc234741703"/>
+      <w:bookmarkStart w:id="20" w:name="_Toc234755941"/>
       <w:r>
         <w:rPr>
           <w:rStyle w:val="30"/>
@@ -8561,7 +9137,7 @@
           <w:szCs w:val="28"/>
         </w:rPr>
       </w:pPr>
-      <w:bookmarkStart w:id="21" w:name="_Toc234741704"/>
+      <w:bookmarkStart w:id="21" w:name="_Toc234755942"/>
       <w:r>
         <w:rPr>
           <w:rStyle w:val="30"/>
@@ -8624,6 +9200,7 @@
           <w:sz w:val="28"/>
           <w:szCs w:val="28"/>
         </w:rPr>
+        <w:lastRenderedPageBreak/>
         <w:t>stock splits</w:t>
       </w:r>
     </w:p>
@@ -8664,7 +9241,6 @@
           <w:sz w:val="28"/>
           <w:szCs w:val="28"/>
         </w:rPr>
-        <w:lastRenderedPageBreak/>
         <w:t>mergers</w:t>
       </w:r>
     </w:p>
@@ -8732,7 +9308,7 @@
           <w:szCs w:val="28"/>
         </w:rPr>
       </w:pPr>
-      <w:bookmarkStart w:id="22" w:name="_Toc234741705"/>
+      <w:bookmarkStart w:id="22" w:name="_Toc234755943"/>
       <w:r>
         <w:rPr>
           <w:rStyle w:val="30"/>
@@ -8882,7 +9458,7 @@
           <w:szCs w:val="28"/>
         </w:rPr>
       </w:pPr>
-      <w:bookmarkStart w:id="23" w:name="_Toc234741706"/>
+      <w:bookmarkStart w:id="23" w:name="_Toc234755944"/>
       <w:r>
         <w:rPr>
           <w:rStyle w:val="30"/>
@@ -9039,7 +9615,7 @@
           <w:szCs w:val="28"/>
         </w:rPr>
       </w:pPr>
-      <w:bookmarkStart w:id="24" w:name="_Toc234741707"/>
+      <w:bookmarkStart w:id="24" w:name="_Toc234755945"/>
       <w:r>
         <w:rPr>
           <w:rStyle w:val="30"/>
@@ -9100,6 +9676,7 @@
           <w:sz w:val="28"/>
           <w:szCs w:val="28"/>
         </w:rPr>
+        <w:lastRenderedPageBreak/>
         <w:t>every day</w:t>
       </w:r>
     </w:p>
@@ -9140,7 +9717,6 @@
           <w:sz w:val="28"/>
           <w:szCs w:val="28"/>
         </w:rPr>
-        <w:lastRenderedPageBreak/>
         <w:t>every month</w:t>
       </w:r>
     </w:p>
@@ -9172,7 +9748,7 @@
           <w:szCs w:val="28"/>
         </w:rPr>
       </w:pPr>
-      <w:bookmarkStart w:id="25" w:name="_Toc234741708"/>
+      <w:bookmarkStart w:id="25" w:name="_Toc234755946"/>
       <w:r>
         <w:rPr>
           <w:rStyle w:val="30"/>
@@ -9320,7 +9896,7 @@
           <w:szCs w:val="28"/>
         </w:rPr>
       </w:pPr>
-      <w:bookmarkStart w:id="26" w:name="_Toc234741709"/>
+      <w:bookmarkStart w:id="26" w:name="_Toc234755947"/>
       <w:r>
         <w:rPr>
           <w:rStyle w:val="30"/>
@@ -9470,7 +10046,7 @@
           <w:szCs w:val="28"/>
         </w:rPr>
       </w:pPr>
-      <w:bookmarkStart w:id="27" w:name="_Toc234741710"/>
+      <w:bookmarkStart w:id="27" w:name="_Toc234755948"/>
       <w:r>
         <w:rPr>
           <w:rStyle w:val="30"/>
@@ -9503,7 +10079,7 @@
           <w:szCs w:val="28"/>
         </w:rPr>
       </w:pPr>
-      <w:bookmarkStart w:id="28" w:name="_Toc234741711"/>
+      <w:bookmarkStart w:id="28" w:name="_Toc234755949"/>
       <w:r>
         <w:rPr>
           <w:rStyle w:val="30"/>
@@ -9530,6 +10106,13 @@
           <w:szCs w:val="28"/>
         </w:rPr>
         <w:br/>
+      </w:r>
+      <w:r>
+        <w:rPr>
+          <w:sz w:val="28"/>
+          <w:szCs w:val="28"/>
+        </w:rPr>
+        <w:lastRenderedPageBreak/>
         <w:t>This simplifies the first system and avoids extra complexity such as borrow constraints and short-side risk handling.</w:t>
       </w:r>
     </w:p>
@@ -9541,12 +10124,11 @@
           <w:szCs w:val="28"/>
         </w:rPr>
       </w:pPr>
-      <w:bookmarkStart w:id="29" w:name="_Toc234741712"/>
+      <w:bookmarkStart w:id="29" w:name="_Toc234755950"/>
       <w:r>
         <w:rPr>
           <w:rStyle w:val="30"/>
         </w:rPr>
-        <w:lastRenderedPageBreak/>
         <w:t>Q12. What if the model is uncertain?</w:t>
       </w:r>
       <w:bookmarkEnd w:id="29"/>
@@ -9819,7 +10401,7 @@
           <w:rtl/>
         </w:rPr>
       </w:pPr>
-      <w:bookmarkStart w:id="30" w:name="_Toc234741713"/>
+      <w:bookmarkStart w:id="30" w:name="_Toc234755951"/>
       <w:r>
         <w:rPr>
           <w:rFonts w:hint="cs"/>
@@ -9837,7 +10419,7 @@
           <w:rtl/>
         </w:rPr>
       </w:pPr>
-      <w:bookmarkStart w:id="31" w:name="_Toc234741714"/>
+      <w:bookmarkStart w:id="31" w:name="_Toc234755952"/>
       <w:r>
         <w:rPr>
           <w:rFonts w:hint="cs"/>
@@ -9898,7 +10480,7 @@
           <w:rtl/>
         </w:rPr>
       </w:pPr>
-      <w:bookmarkStart w:id="32" w:name="_Toc234741715"/>
+      <w:bookmarkStart w:id="32" w:name="_Toc234755953"/>
       <w:r>
         <w:rPr>
           <w:rFonts w:hint="cs"/>
@@ -10208,7 +10790,7 @@
           <w:rtl/>
         </w:rPr>
       </w:pPr>
-      <w:bookmarkStart w:id="33" w:name="_Toc234741716"/>
+      <w:bookmarkStart w:id="33" w:name="_Toc234755954"/>
       <w:r>
         <w:rPr>
           <w:rFonts w:hint="cs"/>
@@ -10372,7 +10954,7 @@
           <w:rtl/>
         </w:rPr>
       </w:pPr>
-      <w:bookmarkStart w:id="34" w:name="_Toc234741717"/>
+      <w:bookmarkStart w:id="34" w:name="_Toc234755955"/>
       <w:r>
         <w:rPr>
           <w:rFonts w:eastAsiaTheme="minorEastAsia" w:hint="cs"/>
@@ -10537,13 +11119,14 @@
           <w:rtl/>
         </w:rPr>
       </w:pPr>
-      <w:bookmarkStart w:id="35" w:name="_Toc234741718"/>
+      <w:bookmarkStart w:id="35" w:name="_Toc234755956"/>
       <w:r>
         <w:rPr>
           <w:rFonts w:hint="cs"/>
           <w:u w:val="single"/>
           <w:rtl/>
         </w:rPr>
+        <w:lastRenderedPageBreak/>
         <w:t>שלבי ביצוע המודל</w:t>
       </w:r>
       <w:bookmarkEnd w:id="35"/>
@@ -10556,7 +11139,7 @@
           <w:rtl/>
         </w:rPr>
       </w:pPr>
-      <w:bookmarkStart w:id="36" w:name="_Toc234741719"/>
+      <w:bookmarkStart w:id="36" w:name="_Toc234755957"/>
       <w:r>
         <w:rPr>
           <w:rFonts w:cs="Times New Roman"/>
@@ -10609,7 +11192,7 @@
           <w:rtl/>
         </w:rPr>
       </w:pPr>
-      <w:bookmarkStart w:id="37" w:name="_Toc234741720"/>
+      <w:bookmarkStart w:id="37" w:name="_Toc234755958"/>
       <w:r>
         <w:rPr>
           <w:rFonts w:hint="cs"/>
@@ -10739,13 +11322,14 @@
           <w:rtl/>
         </w:rPr>
       </w:pPr>
-      <w:bookmarkStart w:id="38" w:name="_Toc234741721"/>
+      <w:bookmarkStart w:id="38" w:name="_Toc234755959"/>
       <w:r>
         <w:rPr>
           <w:rFonts w:hint="cs"/>
           <w:u w:val="single"/>
           <w:rtl/>
         </w:rPr>
+        <w:lastRenderedPageBreak/>
         <w:t xml:space="preserve">מטלות להיום </w:t>
       </w:r>
       <w:r>
@@ -10956,7 +11540,7 @@
           <w:rtl/>
         </w:rPr>
       </w:pPr>
-      <w:bookmarkStart w:id="39" w:name="_Toc234741722"/>
+      <w:bookmarkStart w:id="39" w:name="_Toc234755960"/>
       <w:r>
         <w:rPr>
           <w:rFonts w:hint="cs"/>
@@ -11331,11 +11915,12 @@
           <w:u w:val="single"/>
         </w:rPr>
       </w:pPr>
-      <w:bookmarkStart w:id="40" w:name="_Toc234741723"/>
+      <w:bookmarkStart w:id="40" w:name="_Toc234755961"/>
       <w:r>
         <w:rPr>
           <w:u w:val="single"/>
         </w:rPr>
+        <w:lastRenderedPageBreak/>
         <w:t xml:space="preserve">Linear regression vs </w:t>
       </w:r>
       <w:proofErr w:type="spellStart"/>
@@ -11770,11 +12355,12 @@
           <w:rtl/>
         </w:rPr>
       </w:pPr>
-      <w:bookmarkStart w:id="41" w:name="_Toc234741724"/>
+      <w:bookmarkStart w:id="41" w:name="_Toc234755962"/>
       <w:r>
         <w:rPr>
           <w:u w:val="single"/>
         </w:rPr>
+        <w:lastRenderedPageBreak/>
         <w:t>Train – 70%, validation -15%, test – 15%</w:t>
       </w:r>
       <w:bookmarkEnd w:id="41"/>
@@ -12041,7 +12627,7 @@
           <w:rtl/>
         </w:rPr>
       </w:pPr>
-      <w:bookmarkStart w:id="42" w:name="_Toc234741725"/>
+      <w:bookmarkStart w:id="42" w:name="_Toc234755963"/>
       <w:r>
         <w:rPr>
           <w:rFonts w:hint="cs"/>
@@ -12286,7 +12872,6 @@
                 <w:szCs w:val="28"/>
                 <w:rtl/>
               </w:rPr>
-              <w:lastRenderedPageBreak/>
               <w:t>3</w:t>
             </w:r>
           </w:p>
@@ -12397,7 +12982,7 @@
           <w:rtl/>
         </w:rPr>
       </w:pPr>
-      <w:bookmarkStart w:id="43" w:name="_Toc234741726"/>
+      <w:bookmarkStart w:id="43" w:name="_Toc234755964"/>
       <w:r>
         <w:rPr>
           <w:rFonts w:hint="cs"/>
@@ -12790,7 +13375,7 @@
           <w:rtl/>
         </w:rPr>
       </w:pPr>
-      <w:bookmarkStart w:id="44" w:name="_Toc234741727"/>
+      <w:bookmarkStart w:id="44" w:name="_Toc234755965"/>
       <w:r>
         <w:rPr>
           <w:u w:val="single"/>
@@ -12981,7 +13566,7 @@
           <w:rtl/>
         </w:rPr>
       </w:pPr>
-      <w:bookmarkStart w:id="45" w:name="_Toc234741728"/>
+      <w:bookmarkStart w:id="45" w:name="_Toc234755966"/>
       <w:r>
         <w:rPr>
           <w:rFonts w:hint="cs"/>
@@ -13123,7 +13708,7 @@
           <w:u w:val="single"/>
         </w:rPr>
       </w:pPr>
-      <w:bookmarkStart w:id="46" w:name="_Toc234741729"/>
+      <w:bookmarkStart w:id="46" w:name="_Toc234755967"/>
       <w:r>
         <w:rPr>
           <w:u w:val="single"/>
@@ -13380,7 +13965,6 @@
           <w:szCs w:val="28"/>
           <w:rtl/>
         </w:rPr>
-        <w:lastRenderedPageBreak/>
         <w:t xml:space="preserve">נשים מודלים מאותו נושא ביחד לדוגמא </w:t>
       </w:r>
       <m:oMath>
@@ -13479,7 +14063,7 @@
           <w:rtl/>
         </w:rPr>
       </w:pPr>
-      <w:bookmarkStart w:id="47" w:name="_Toc234741730"/>
+      <w:bookmarkStart w:id="47" w:name="_Toc234755968"/>
       <w:r>
         <w:rPr>
           <w:rFonts w:hint="cs"/>
@@ -13692,7 +14276,6 @@
           <w:szCs w:val="28"/>
           <w:rtl/>
         </w:rPr>
-        <w:lastRenderedPageBreak/>
         <w:drawing>
           <wp:inline distT="0" distB="0" distL="0" distR="0" wp14:anchorId="6B7F5251" wp14:editId="694B5469">
             <wp:extent cx="5274310" cy="539750"/>
@@ -13840,6 +14423,7 @@
           <w:szCs w:val="28"/>
           <w:rtl/>
         </w:rPr>
+        <w:lastRenderedPageBreak/>
         <w:t>אם אתה רוצה קובץ מסוים ולא את כולם, אתה מחליף את ה "." בשם של הקובץ.</w:t>
       </w:r>
     </w:p>
@@ -14182,13 +14766,103 @@
     </w:p>
     <w:p>
       <w:pPr>
-        <w:ind w:left="360"/>
-        <w:rPr>
-          <w:sz w:val="28"/>
-          <w:szCs w:val="28"/>
-          <w:rtl/>
-        </w:rPr>
-      </w:pPr>
+        <w:pStyle w:val="2"/>
+        <w:jc w:val="center"/>
+        <w:rPr>
+          <w:u w:val="single"/>
+        </w:rPr>
+      </w:pPr>
+      <w:r>
+        <w:rPr>
+          <w:u w:val="single"/>
+        </w:rPr>
+        <w:t>Push vs commit</w:t>
+      </w:r>
+    </w:p>
+    <w:p>
+      <w:pPr>
+        <w:rPr>
+          <w:sz w:val="28"/>
+          <w:szCs w:val="28"/>
+          <w:rtl/>
+        </w:rPr>
+      </w:pPr>
+      <w:r>
+        <w:rPr>
+          <w:rFonts w:hint="cs"/>
+          <w:sz w:val="28"/>
+          <w:szCs w:val="28"/>
+          <w:rtl/>
+        </w:rPr>
+        <w:t>זה ההבדל בין הפקודות השונות:</w:t>
+      </w:r>
+    </w:p>
+    <w:p>
+      <w:pPr>
+        <w:rPr>
+          <w:rFonts w:hint="cs"/>
+          <w:sz w:val="28"/>
+          <w:szCs w:val="28"/>
+          <w:rtl/>
+        </w:rPr>
+      </w:pPr>
+      <w:r>
+        <w:rPr>
+          <w:rFonts w:cs="Arial"/>
+          <w:noProof/>
+          <w:sz w:val="28"/>
+          <w:szCs w:val="28"/>
+          <w:rtl/>
+        </w:rPr>
+        <w:drawing>
+          <wp:inline distT="0" distB="0" distL="0" distR="0" wp14:anchorId="13EAE7CE" wp14:editId="133D9662">
+            <wp:extent cx="5274310" cy="929005"/>
+            <wp:effectExtent l="0" t="0" r="2540" b="4445"/>
+            <wp:docPr id="1999292418" name="תמונה 3"/>
+            <wp:cNvGraphicFramePr>
+              <a:graphicFrameLocks xmlns:a="http://schemas.openxmlformats.org/drawingml/2006/main" noChangeAspect="1"/>
+            </wp:cNvGraphicFramePr>
+            <a:graphic xmlns:a="http://schemas.openxmlformats.org/drawingml/2006/main">
+              <a:graphicData uri="http://schemas.openxmlformats.org/drawingml/2006/picture">
+                <pic:pic xmlns:pic="http://schemas.openxmlformats.org/drawingml/2006/picture">
+                  <pic:nvPicPr>
+                    <pic:cNvPr id="0" name="Picture 3"/>
+                    <pic:cNvPicPr>
+                      <a:picLocks noChangeAspect="1" noChangeArrowheads="1"/>
+                    </pic:cNvPicPr>
+                  </pic:nvPicPr>
+                  <pic:blipFill>
+                    <a:blip r:embed="rId14">
+                      <a:extLst>
+                        <a:ext uri="{28A0092B-C50C-407E-A947-70E740481C1C}">
+                          <a14:useLocalDpi xmlns:a14="http://schemas.microsoft.com/office/drawing/2010/main" val="0"/>
+                        </a:ext>
+                      </a:extLst>
+                    </a:blip>
+                    <a:srcRect/>
+                    <a:stretch>
+                      <a:fillRect/>
+                    </a:stretch>
+                  </pic:blipFill>
+                  <pic:spPr bwMode="auto">
+                    <a:xfrm>
+                      <a:off x="0" y="0"/>
+                      <a:ext cx="5274310" cy="929005"/>
+                    </a:xfrm>
+                    <a:prstGeom prst="rect">
+                      <a:avLst/>
+                    </a:prstGeom>
+                    <a:noFill/>
+                    <a:ln>
+                      <a:noFill/>
+                    </a:ln>
+                  </pic:spPr>
+                </pic:pic>
+              </a:graphicData>
+            </a:graphic>
+          </wp:inline>
+        </w:drawing>
+      </w:r>
     </w:p>
     <w:p>
       <w:pPr>
@@ -14217,7 +14891,7 @@
           <w:rtl/>
         </w:rPr>
       </w:pPr>
-      <w:bookmarkStart w:id="48" w:name="_Toc234741731"/>
+      <w:bookmarkStart w:id="48" w:name="_Toc234755969"/>
       <w:r>
         <w:rPr>
           <w:rFonts w:hint="cs"/>
@@ -16327,7 +17001,7 @@
           <w:rtl/>
         </w:rPr>
       </w:pPr>
-      <w:bookmarkStart w:id="49" w:name="_Toc234741732"/>
+      <w:bookmarkStart w:id="49" w:name="_Toc234755970"/>
       <w:r>
         <w:rPr>
           <w:rFonts w:hint="cs"/>
@@ -16673,7 +17347,7 @@
           <w:rtl/>
         </w:rPr>
       </w:pPr>
-      <w:bookmarkStart w:id="50" w:name="_Toc234741733"/>
+      <w:bookmarkStart w:id="50" w:name="_Toc234755971"/>
       <w:r>
         <w:rPr>
           <w:u w:val="single"/>
@@ -17002,7 +17676,7 @@
           <w:rtl/>
         </w:rPr>
       </w:pPr>
-      <w:bookmarkStart w:id="51" w:name="_Toc234741734"/>
+      <w:bookmarkStart w:id="51" w:name="_Toc234755972"/>
       <w:r>
         <w:rPr>
           <w:u w:val="single"/>
@@ -17080,7 +17754,7 @@
           <w:rtl/>
         </w:rPr>
       </w:pPr>
-      <w:bookmarkStart w:id="52" w:name="_Toc234741735"/>
+      <w:bookmarkStart w:id="52" w:name="_Toc234755973"/>
       <w:r>
         <w:rPr>
           <w:u w:val="single"/>
@@ -17201,7 +17875,7 @@
           <w:rtl/>
         </w:rPr>
       </w:pPr>
-      <w:bookmarkStart w:id="53" w:name="_Toc234741736"/>
+      <w:bookmarkStart w:id="53" w:name="_Toc234755974"/>
       <w:proofErr w:type="gramStart"/>
       <w:r>
         <w:rPr>
@@ -17355,7 +18029,7 @@
           <w:rtl/>
         </w:rPr>
       </w:pPr>
-      <w:bookmarkStart w:id="54" w:name="_Toc234741737"/>
+      <w:bookmarkStart w:id="54" w:name="_Toc234755975"/>
       <w:r>
         <w:rPr>
           <w:u w:val="single"/>
@@ -17564,12 +18238,14 @@
           <w:u w:val="single"/>
         </w:rPr>
       </w:pPr>
+      <w:bookmarkStart w:id="55" w:name="_Toc234755976"/>
       <w:r>
         <w:rPr>
           <w:u w:val="single"/>
         </w:rPr>
         <w:t>YAML</w:t>
       </w:r>
+      <w:bookmarkEnd w:id="55"/>
     </w:p>
     <w:p>
       <w:pPr>
@@ -17707,7 +18383,6 @@
     <w:p>
       <w:pPr>
         <w:rPr>
-          <w:rFonts w:hint="cs"/>
           <w:sz w:val="28"/>
           <w:szCs w:val="28"/>
           <w:rtl/>
@@ -17731,6 +18406,7 @@
           <w:u w:val="single"/>
         </w:rPr>
       </w:pPr>
+      <w:bookmarkStart w:id="56" w:name="_Toc234755977"/>
       <w:r>
         <w:rPr>
           <w:u w:val="single"/>
@@ -17738,6 +18414,7 @@
         <w:lastRenderedPageBreak/>
         <w:t>CI and CD</w:t>
       </w:r>
+      <w:bookmarkEnd w:id="56"/>
     </w:p>
     <w:p>
       <w:pPr>
@@ -17765,6 +18442,7 @@
           <w:rtl/>
         </w:rPr>
       </w:pPr>
+      <w:bookmarkStart w:id="57" w:name="_Toc234755978"/>
       <w:r>
         <w:rPr>
           <w:u w:val="single"/>
@@ -17785,6 +18463,7 @@
         </w:rPr>
         <w:t>:</w:t>
       </w:r>
+      <w:bookmarkEnd w:id="57"/>
     </w:p>
     <w:p>
       <w:pPr>
@@ -17907,7 +18586,6 @@
     <w:p>
       <w:pPr>
         <w:rPr>
-          <w:rFonts w:hint="cs"/>
           <w:sz w:val="28"/>
           <w:szCs w:val="28"/>
         </w:rPr>
@@ -17921,6 +18599,7 @@
           <w:rtl/>
         </w:rPr>
       </w:pPr>
+      <w:bookmarkStart w:id="58" w:name="_Toc234755979"/>
       <w:r>
         <w:rPr>
           <w:u w:val="single"/>
@@ -17942,6 +18621,7 @@
         </w:rPr>
         <w:t>:</w:t>
       </w:r>
+      <w:bookmarkEnd w:id="58"/>
       <w:proofErr w:type="gramEnd"/>
     </w:p>
     <w:p>
@@ -17959,6 +18639,7 @@
           <w:rtl/>
         </w:rPr>
       </w:pPr>
+      <w:bookmarkStart w:id="59" w:name="_Toc234755980"/>
       <w:r>
         <w:rPr>
           <w:u w:val="single"/>
@@ -17973,6 +18654,7 @@
         </w:rPr>
         <w:t>:</w:t>
       </w:r>
+      <w:bookmarkEnd w:id="59"/>
     </w:p>
     <w:p>
       <w:pPr>
@@ -18077,7 +18759,384 @@
     <w:p>
       <w:pPr>
         <w:rPr>
-          <w:rFonts w:hint="cs"/>
+          <w:sz w:val="28"/>
+          <w:szCs w:val="28"/>
+          <w:rtl/>
+        </w:rPr>
+      </w:pPr>
+    </w:p>
+    <w:p>
+      <w:pPr>
+        <w:pStyle w:val="2"/>
+        <w:rPr>
+          <w:u w:val="single"/>
+          <w:rtl/>
+        </w:rPr>
+      </w:pPr>
+      <w:r>
+        <w:rPr>
+          <w:u w:val="single"/>
+        </w:rPr>
+        <w:t>Dependency Automation</w:t>
+      </w:r>
+      <w:r>
+        <w:rPr>
+          <w:rFonts w:hint="cs"/>
+          <w:u w:val="single"/>
+          <w:rtl/>
+        </w:rPr>
+        <w:t>:</w:t>
+      </w:r>
+    </w:p>
+    <w:p>
+      <w:pPr>
+        <w:rPr>
+          <w:sz w:val="28"/>
+          <w:szCs w:val="28"/>
+          <w:rtl/>
+        </w:rPr>
+      </w:pPr>
+      <w:r>
+        <w:rPr>
+          <w:rFonts w:hint="cs"/>
+          <w:sz w:val="28"/>
+          <w:szCs w:val="28"/>
+          <w:rtl/>
+        </w:rPr>
+        <w:t>בעצם לעדכן באופן אוטומטי את ההתקנות שצריך כדי שהפרויקט יעבוד.</w:t>
+      </w:r>
+    </w:p>
+    <w:p>
+      <w:pPr>
+        <w:rPr>
+          <w:sz w:val="28"/>
+          <w:szCs w:val="28"/>
+        </w:rPr>
+      </w:pPr>
+      <w:r>
+        <w:rPr>
+          <w:rFonts w:cs="Arial"/>
+          <w:noProof/>
+          <w:sz w:val="28"/>
+          <w:szCs w:val="28"/>
+          <w:rtl/>
+        </w:rPr>
+        <w:lastRenderedPageBreak/>
+        <w:drawing>
+          <wp:inline distT="0" distB="0" distL="0" distR="0" wp14:anchorId="75CC38C7" wp14:editId="78883166">
+            <wp:extent cx="5274310" cy="3774440"/>
+            <wp:effectExtent l="0" t="0" r="2540" b="0"/>
+            <wp:docPr id="886142992" name="תמונה 1"/>
+            <wp:cNvGraphicFramePr>
+              <a:graphicFrameLocks xmlns:a="http://schemas.openxmlformats.org/drawingml/2006/main" noChangeAspect="1"/>
+            </wp:cNvGraphicFramePr>
+            <a:graphic xmlns:a="http://schemas.openxmlformats.org/drawingml/2006/main">
+              <a:graphicData uri="http://schemas.openxmlformats.org/drawingml/2006/picture">
+                <pic:pic xmlns:pic="http://schemas.openxmlformats.org/drawingml/2006/picture">
+                  <pic:nvPicPr>
+                    <pic:cNvPr id="0" name="Picture 1"/>
+                    <pic:cNvPicPr>
+                      <a:picLocks noChangeAspect="1" noChangeArrowheads="1"/>
+                    </pic:cNvPicPr>
+                  </pic:nvPicPr>
+                  <pic:blipFill>
+                    <a:blip r:embed="rId15">
+                      <a:extLst>
+                        <a:ext uri="{28A0092B-C50C-407E-A947-70E740481C1C}">
+                          <a14:useLocalDpi xmlns:a14="http://schemas.microsoft.com/office/drawing/2010/main" val="0"/>
+                        </a:ext>
+                      </a:extLst>
+                    </a:blip>
+                    <a:srcRect/>
+                    <a:stretch>
+                      <a:fillRect/>
+                    </a:stretch>
+                  </pic:blipFill>
+                  <pic:spPr bwMode="auto">
+                    <a:xfrm>
+                      <a:off x="0" y="0"/>
+                      <a:ext cx="5274310" cy="3774440"/>
+                    </a:xfrm>
+                    <a:prstGeom prst="rect">
+                      <a:avLst/>
+                    </a:prstGeom>
+                    <a:noFill/>
+                    <a:ln>
+                      <a:noFill/>
+                    </a:ln>
+                  </pic:spPr>
+                </pic:pic>
+              </a:graphicData>
+            </a:graphic>
+          </wp:inline>
+        </w:drawing>
+      </w:r>
+    </w:p>
+    <w:p>
+      <w:pPr>
+        <w:rPr>
+          <w:sz w:val="28"/>
+          <w:szCs w:val="28"/>
+        </w:rPr>
+      </w:pPr>
+      <w:r>
+        <w:rPr>
+          <w:rFonts w:cs="Arial"/>
+          <w:noProof/>
+          <w:sz w:val="28"/>
+          <w:szCs w:val="28"/>
+          <w:rtl/>
+        </w:rPr>
+        <w:drawing>
+          <wp:inline distT="0" distB="0" distL="0" distR="0" wp14:anchorId="7EDB84E8" wp14:editId="4FAE97FB">
+            <wp:extent cx="5260340" cy="2136775"/>
+            <wp:effectExtent l="0" t="0" r="0" b="0"/>
+            <wp:docPr id="930625998" name="תמונה 2"/>
+            <wp:cNvGraphicFramePr>
+              <a:graphicFrameLocks xmlns:a="http://schemas.openxmlformats.org/drawingml/2006/main" noChangeAspect="1"/>
+            </wp:cNvGraphicFramePr>
+            <a:graphic xmlns:a="http://schemas.openxmlformats.org/drawingml/2006/main">
+              <a:graphicData uri="http://schemas.openxmlformats.org/drawingml/2006/picture">
+                <pic:pic xmlns:pic="http://schemas.openxmlformats.org/drawingml/2006/picture">
+                  <pic:nvPicPr>
+                    <pic:cNvPr id="0" name="Picture 2"/>
+                    <pic:cNvPicPr>
+                      <a:picLocks noChangeAspect="1" noChangeArrowheads="1"/>
+                    </pic:cNvPicPr>
+                  </pic:nvPicPr>
+                  <pic:blipFill>
+                    <a:blip r:embed="rId16">
+                      <a:extLst>
+                        <a:ext uri="{28A0092B-C50C-407E-A947-70E740481C1C}">
+                          <a14:useLocalDpi xmlns:a14="http://schemas.microsoft.com/office/drawing/2010/main" val="0"/>
+                        </a:ext>
+                      </a:extLst>
+                    </a:blip>
+                    <a:srcRect/>
+                    <a:stretch>
+                      <a:fillRect/>
+                    </a:stretch>
+                  </pic:blipFill>
+                  <pic:spPr bwMode="auto">
+                    <a:xfrm>
+                      <a:off x="0" y="0"/>
+                      <a:ext cx="5260340" cy="2136775"/>
+                    </a:xfrm>
+                    <a:prstGeom prst="rect">
+                      <a:avLst/>
+                    </a:prstGeom>
+                    <a:noFill/>
+                    <a:ln>
+                      <a:noFill/>
+                    </a:ln>
+                  </pic:spPr>
+                </pic:pic>
+              </a:graphicData>
+            </a:graphic>
+          </wp:inline>
+        </w:drawing>
+      </w:r>
+    </w:p>
+    <w:p>
+      <w:pPr>
+        <w:tabs>
+          <w:tab w:val="left" w:pos="1263"/>
+        </w:tabs>
+        <w:rPr>
+          <w:sz w:val="28"/>
+          <w:szCs w:val="28"/>
+          <w:rtl/>
+        </w:rPr>
+      </w:pPr>
+      <w:r>
+        <w:rPr>
+          <w:rFonts w:hint="cs"/>
+          <w:sz w:val="28"/>
+          <w:szCs w:val="28"/>
+          <w:rtl/>
+        </w:rPr>
+        <w:t xml:space="preserve">חשוב, נשתמש בכלי המובנה של </w:t>
+      </w:r>
+      <w:r>
+        <w:rPr>
+          <w:sz w:val="28"/>
+          <w:szCs w:val="28"/>
+        </w:rPr>
+        <w:t>GitHub</w:t>
+      </w:r>
+      <w:r>
+        <w:rPr>
+          <w:rFonts w:hint="cs"/>
+          <w:sz w:val="28"/>
+          <w:szCs w:val="28"/>
+          <w:rtl/>
+        </w:rPr>
+        <w:t xml:space="preserve">, </w:t>
+      </w:r>
+      <w:proofErr w:type="spellStart"/>
+      <w:r>
+        <w:rPr>
+          <w:sz w:val="28"/>
+          <w:szCs w:val="28"/>
+        </w:rPr>
+        <w:t>Dependabot</w:t>
+      </w:r>
+      <w:proofErr w:type="spellEnd"/>
+      <w:r>
+        <w:rPr>
+          <w:rFonts w:hint="cs"/>
+          <w:sz w:val="28"/>
+          <w:szCs w:val="28"/>
+          <w:rtl/>
+        </w:rPr>
+        <w:t>.</w:t>
+      </w:r>
+    </w:p>
+    <w:p>
+      <w:pPr>
+        <w:tabs>
+          <w:tab w:val="left" w:pos="1263"/>
+        </w:tabs>
+        <w:rPr>
+          <w:sz w:val="28"/>
+          <w:szCs w:val="28"/>
+          <w:rtl/>
+        </w:rPr>
+      </w:pPr>
+      <w:r>
+        <w:rPr>
+          <w:rFonts w:hint="cs"/>
+          <w:sz w:val="28"/>
+          <w:szCs w:val="28"/>
+          <w:rtl/>
+        </w:rPr>
+        <w:t>תחשוב על סוכן שכל הזמן מסתכל על הספריות שאתה צריך ומתקין את הגרסה הכי חדשה.</w:t>
+      </w:r>
+    </w:p>
+    <w:p>
+      <w:pPr>
+        <w:tabs>
+          <w:tab w:val="left" w:pos="1263"/>
+        </w:tabs>
+        <w:bidi w:val="0"/>
+        <w:rPr>
+          <w:sz w:val="28"/>
+          <w:szCs w:val="28"/>
+        </w:rPr>
+      </w:pPr>
+      <w:r>
+        <w:rPr>
+          <w:sz w:val="28"/>
+          <w:szCs w:val="28"/>
+        </w:rPr>
+        <w:t>I</w:t>
+      </w:r>
+      <w:r>
+        <w:rPr>
+          <w:sz w:val="28"/>
+          <w:szCs w:val="28"/>
+        </w:rPr>
+        <w:t xml:space="preserve">t updates to the newest versions—but it follows </w:t>
+      </w:r>
+      <w:r>
+        <w:rPr>
+          <w:b/>
+          <w:bCs/>
+          <w:sz w:val="28"/>
+          <w:szCs w:val="28"/>
+        </w:rPr>
+        <w:t>strict rules</w:t>
+      </w:r>
+      <w:r>
+        <w:rPr>
+          <w:sz w:val="28"/>
+          <w:szCs w:val="28"/>
+        </w:rPr>
+        <w:t xml:space="preserve"> that you configure so it doesn't accidentally break your code.</w:t>
+      </w:r>
+    </w:p>
+    <w:p>
+      <w:pPr>
+        <w:tabs>
+          <w:tab w:val="left" w:pos="1263"/>
+        </w:tabs>
+        <w:rPr>
+          <w:sz w:val="28"/>
+          <w:szCs w:val="28"/>
+          <w:rtl/>
+        </w:rPr>
+      </w:pPr>
+      <w:r>
+        <w:rPr>
+          <w:rFonts w:hint="cs"/>
+          <w:sz w:val="28"/>
+          <w:szCs w:val="28"/>
+          <w:rtl/>
+        </w:rPr>
+        <w:t xml:space="preserve">ניצור שוב קובץ </w:t>
+      </w:r>
+      <w:proofErr w:type="spellStart"/>
+      <w:r>
+        <w:rPr>
+          <w:sz w:val="28"/>
+          <w:szCs w:val="28"/>
+        </w:rPr>
+        <w:t>yml</w:t>
+      </w:r>
+      <w:proofErr w:type="spellEnd"/>
+      <w:r>
+        <w:rPr>
+          <w:rFonts w:hint="cs"/>
+          <w:sz w:val="28"/>
+          <w:szCs w:val="28"/>
+          <w:rtl/>
+        </w:rPr>
+        <w:t xml:space="preserve"> בתיקיית </w:t>
+      </w:r>
+      <w:proofErr w:type="spellStart"/>
+      <w:r>
+        <w:rPr>
+          <w:sz w:val="28"/>
+          <w:szCs w:val="28"/>
+        </w:rPr>
+        <w:t>github</w:t>
+      </w:r>
+      <w:proofErr w:type="spellEnd"/>
+      <w:r>
+        <w:rPr>
+          <w:rFonts w:hint="cs"/>
+          <w:sz w:val="28"/>
+          <w:szCs w:val="28"/>
+          <w:rtl/>
+        </w:rPr>
+        <w:t xml:space="preserve"> שיצרנו לפרויקט ונפרט בה.</w:t>
+      </w:r>
+    </w:p>
+    <w:p>
+      <w:pPr>
+        <w:tabs>
+          <w:tab w:val="left" w:pos="1263"/>
+        </w:tabs>
+        <w:rPr>
+          <w:rFonts w:hint="cs"/>
+          <w:sz w:val="28"/>
+          <w:szCs w:val="28"/>
+        </w:rPr>
+      </w:pPr>
+    </w:p>
+    <w:p>
+      <w:pPr>
+        <w:rPr>
+          <w:rFonts w:hint="cs"/>
+          <w:sz w:val="28"/>
+          <w:szCs w:val="28"/>
+          <w:rtl/>
+        </w:rPr>
+      </w:pPr>
+    </w:p>
+    <w:p>
+      <w:pPr>
+        <w:rPr>
           <w:sz w:val="28"/>
           <w:szCs w:val="28"/>
           <w:rtl/>

</xml_diff>

<commit_message>
Update of a basic API and it's tests
</commit_message>
<xml_diff>
--- a/stock algo trading project.docx
+++ b/stock algo trading project.docx
@@ -10,7 +10,7 @@
           <w:u w:val="single"/>
         </w:rPr>
       </w:pPr>
-      <w:bookmarkStart w:id="0" w:name="_Toc234755922"/>
+      <w:bookmarkStart w:id="0" w:name="_Toc234781145"/>
       <w:r>
         <w:rPr>
           <w:u w:val="single"/>
@@ -80,7 +80,7 @@
           <w:r>
             <w:fldChar w:fldCharType="separate"/>
           </w:r>
-          <w:hyperlink w:anchor="_Toc234755922" w:history="1">
+          <w:hyperlink w:anchor="_Toc234781145" w:history="1">
             <w:r>
               <w:rPr>
                 <w:rStyle w:val="Hyperlink"/>
@@ -132,7 +132,7 @@
                 <w:noProof/>
                 <w:webHidden/>
               </w:rPr>
-              <w:instrText>Toc234755922 \h</w:instrText>
+              <w:instrText>Toc234781145 \h</w:instrText>
             </w:r>
             <w:r>
               <w:rPr>
@@ -189,7 +189,7 @@
               <w:rtl/>
             </w:rPr>
           </w:pPr>
-          <w:hyperlink w:anchor="_Toc234755923" w:history="1">
+          <w:hyperlink w:anchor="_Toc234781146" w:history="1">
             <w:r>
               <w:rPr>
                 <w:rStyle w:val="Hyperlink"/>
@@ -242,7 +242,7 @@
                 <w:noProof/>
                 <w:webHidden/>
               </w:rPr>
-              <w:instrText>Toc234755923 \h</w:instrText>
+              <w:instrText>Toc234781146 \h</w:instrText>
             </w:r>
             <w:r>
               <w:rPr>
@@ -299,7 +299,7 @@
               <w:rtl/>
             </w:rPr>
           </w:pPr>
-          <w:hyperlink w:anchor="_Toc234755924" w:history="1">
+          <w:hyperlink w:anchor="_Toc234781147" w:history="1">
             <w:r>
               <w:rPr>
                 <w:rStyle w:val="Hyperlink"/>
@@ -351,7 +351,7 @@
                 <w:noProof/>
                 <w:webHidden/>
               </w:rPr>
-              <w:instrText>Toc234755924 \h</w:instrText>
+              <w:instrText>Toc234781147 \h</w:instrText>
             </w:r>
             <w:r>
               <w:rPr>
@@ -408,7 +408,7 @@
               <w:rtl/>
             </w:rPr>
           </w:pPr>
-          <w:hyperlink w:anchor="_Toc234755925" w:history="1">
+          <w:hyperlink w:anchor="_Toc234781148" w:history="1">
             <w:r>
               <w:rPr>
                 <w:rStyle w:val="Hyperlink"/>
@@ -460,7 +460,7 @@
                 <w:noProof/>
                 <w:webHidden/>
               </w:rPr>
-              <w:instrText>Toc234755925 \h</w:instrText>
+              <w:instrText>Toc234781148 \h</w:instrText>
             </w:r>
             <w:r>
               <w:rPr>
@@ -517,7 +517,7 @@
               <w:rtl/>
             </w:rPr>
           </w:pPr>
-          <w:hyperlink w:anchor="_Toc234755926" w:history="1">
+          <w:hyperlink w:anchor="_Toc234781149" w:history="1">
             <w:r>
               <w:rPr>
                 <w:rStyle w:val="Hyperlink"/>
@@ -569,7 +569,7 @@
                 <w:noProof/>
                 <w:webHidden/>
               </w:rPr>
-              <w:instrText>Toc234755926 \h</w:instrText>
+              <w:instrText>Toc234781149 \h</w:instrText>
             </w:r>
             <w:r>
               <w:rPr>
@@ -626,7 +626,7 @@
               <w:rtl/>
             </w:rPr>
           </w:pPr>
-          <w:hyperlink w:anchor="_Toc234755927" w:history="1">
+          <w:hyperlink w:anchor="_Toc234781150" w:history="1">
             <w:r>
               <w:rPr>
                 <w:rStyle w:val="Hyperlink"/>
@@ -679,7 +679,7 @@
                 <w:noProof/>
                 <w:webHidden/>
               </w:rPr>
-              <w:instrText>Toc234755927 \h</w:instrText>
+              <w:instrText>Toc234781150 \h</w:instrText>
             </w:r>
             <w:r>
               <w:rPr>
@@ -710,7 +710,7 @@
                 <w:webHidden/>
                 <w:rtl/>
               </w:rPr>
-              <w:t>5</w:t>
+              <w:t>6</w:t>
             </w:r>
             <w:r>
               <w:rPr>
@@ -736,7 +736,7 @@
               <w:rtl/>
             </w:rPr>
           </w:pPr>
-          <w:hyperlink w:anchor="_Toc234755928" w:history="1">
+          <w:hyperlink w:anchor="_Toc234781151" w:history="1">
             <w:r>
               <w:rPr>
                 <w:rStyle w:val="Hyperlink"/>
@@ -788,7 +788,7 @@
                 <w:noProof/>
                 <w:webHidden/>
               </w:rPr>
-              <w:instrText>Toc234755928 \h</w:instrText>
+              <w:instrText>Toc234781151 \h</w:instrText>
             </w:r>
             <w:r>
               <w:rPr>
@@ -845,7 +845,7 @@
               <w:rtl/>
             </w:rPr>
           </w:pPr>
-          <w:hyperlink w:anchor="_Toc234755929" w:history="1">
+          <w:hyperlink w:anchor="_Toc234781152" w:history="1">
             <w:r>
               <w:rPr>
                 <w:rStyle w:val="Hyperlink"/>
@@ -897,7 +897,7 @@
                 <w:noProof/>
                 <w:webHidden/>
               </w:rPr>
-              <w:instrText>Toc234755929 \h</w:instrText>
+              <w:instrText>Toc234781152 \h</w:instrText>
             </w:r>
             <w:r>
               <w:rPr>
@@ -954,7 +954,7 @@
               <w:rtl/>
             </w:rPr>
           </w:pPr>
-          <w:hyperlink w:anchor="_Toc234755930" w:history="1">
+          <w:hyperlink w:anchor="_Toc234781153" w:history="1">
             <w:r>
               <w:rPr>
                 <w:rStyle w:val="Hyperlink"/>
@@ -1006,7 +1006,7 @@
                 <w:noProof/>
                 <w:webHidden/>
               </w:rPr>
-              <w:instrText>Toc234755930 \h</w:instrText>
+              <w:instrText>Toc234781153 \h</w:instrText>
             </w:r>
             <w:r>
               <w:rPr>
@@ -1063,7 +1063,7 @@
               <w:rtl/>
             </w:rPr>
           </w:pPr>
-          <w:hyperlink w:anchor="_Toc234755931" w:history="1">
+          <w:hyperlink w:anchor="_Toc234781154" w:history="1">
             <w:r>
               <w:rPr>
                 <w:rStyle w:val="Hyperlink"/>
@@ -1115,7 +1115,7 @@
                 <w:noProof/>
                 <w:webHidden/>
               </w:rPr>
-              <w:instrText>Toc234755931 \h</w:instrText>
+              <w:instrText>Toc234781154 \h</w:instrText>
             </w:r>
             <w:r>
               <w:rPr>
@@ -1172,7 +1172,7 @@
               <w:rtl/>
             </w:rPr>
           </w:pPr>
-          <w:hyperlink w:anchor="_Toc234755932" w:history="1">
+          <w:hyperlink w:anchor="_Toc234781155" w:history="1">
             <w:r>
               <w:rPr>
                 <w:rStyle w:val="Hyperlink"/>
@@ -1224,7 +1224,7 @@
                 <w:noProof/>
                 <w:webHidden/>
               </w:rPr>
-              <w:instrText>Toc234755932 \h</w:instrText>
+              <w:instrText>Toc234781155 \h</w:instrText>
             </w:r>
             <w:r>
               <w:rPr>
@@ -1281,7 +1281,7 @@
               <w:rtl/>
             </w:rPr>
           </w:pPr>
-          <w:hyperlink w:anchor="_Toc234755933" w:history="1">
+          <w:hyperlink w:anchor="_Toc234781156" w:history="1">
             <w:r>
               <w:rPr>
                 <w:rStyle w:val="Hyperlink"/>
@@ -1333,7 +1333,7 @@
                 <w:noProof/>
                 <w:webHidden/>
               </w:rPr>
-              <w:instrText>Toc234755933 \h</w:instrText>
+              <w:instrText>Toc234781156 \h</w:instrText>
             </w:r>
             <w:r>
               <w:rPr>
@@ -1390,7 +1390,7 @@
               <w:rtl/>
             </w:rPr>
           </w:pPr>
-          <w:hyperlink w:anchor="_Toc234755934" w:history="1">
+          <w:hyperlink w:anchor="_Toc234781157" w:history="1">
             <w:r>
               <w:rPr>
                 <w:rStyle w:val="Hyperlink"/>
@@ -1442,7 +1442,7 @@
                 <w:noProof/>
                 <w:webHidden/>
               </w:rPr>
-              <w:instrText>Toc234755934 \h</w:instrText>
+              <w:instrText>Toc234781157 \h</w:instrText>
             </w:r>
             <w:r>
               <w:rPr>
@@ -1473,7 +1473,7 @@
                 <w:webHidden/>
                 <w:rtl/>
               </w:rPr>
-              <w:t>7</w:t>
+              <w:t>8</w:t>
             </w:r>
             <w:r>
               <w:rPr>
@@ -1499,7 +1499,7 @@
               <w:rtl/>
             </w:rPr>
           </w:pPr>
-          <w:hyperlink w:anchor="_Toc234755935" w:history="1">
+          <w:hyperlink w:anchor="_Toc234781158" w:history="1">
             <w:r>
               <w:rPr>
                 <w:rStyle w:val="Hyperlink"/>
@@ -1552,7 +1552,7 @@
                 <w:noProof/>
                 <w:webHidden/>
               </w:rPr>
-              <w:instrText>Toc234755935 \h</w:instrText>
+              <w:instrText>Toc234781158 \h</w:instrText>
             </w:r>
             <w:r>
               <w:rPr>
@@ -1609,7 +1609,7 @@
               <w:rtl/>
             </w:rPr>
           </w:pPr>
-          <w:hyperlink w:anchor="_Toc234755936" w:history="1">
+          <w:hyperlink w:anchor="_Toc234781159" w:history="1">
             <w:r>
               <w:rPr>
                 <w:rStyle w:val="Hyperlink"/>
@@ -1661,7 +1661,7 @@
                 <w:noProof/>
                 <w:webHidden/>
               </w:rPr>
-              <w:instrText>Toc234755936 \h</w:instrText>
+              <w:instrText>Toc234781159 \h</w:instrText>
             </w:r>
             <w:r>
               <w:rPr>
@@ -1718,7 +1718,7 @@
               <w:rtl/>
             </w:rPr>
           </w:pPr>
-          <w:hyperlink w:anchor="_Toc234755937" w:history="1">
+          <w:hyperlink w:anchor="_Toc234781160" w:history="1">
             <w:r>
               <w:rPr>
                 <w:rStyle w:val="Hyperlink"/>
@@ -1770,7 +1770,7 @@
                 <w:noProof/>
                 <w:webHidden/>
               </w:rPr>
-              <w:instrText>Toc234755937 \h</w:instrText>
+              <w:instrText>Toc234781160 \h</w:instrText>
             </w:r>
             <w:r>
               <w:rPr>
@@ -1827,7 +1827,7 @@
               <w:rtl/>
             </w:rPr>
           </w:pPr>
-          <w:hyperlink w:anchor="_Toc234755938" w:history="1">
+          <w:hyperlink w:anchor="_Toc234781161" w:history="1">
             <w:r>
               <w:rPr>
                 <w:rStyle w:val="Hyperlink"/>
@@ -1879,7 +1879,7 @@
                 <w:noProof/>
                 <w:webHidden/>
               </w:rPr>
-              <w:instrText>Toc234755938 \h</w:instrText>
+              <w:instrText>Toc234781161 \h</w:instrText>
             </w:r>
             <w:r>
               <w:rPr>
@@ -1936,7 +1936,7 @@
               <w:rtl/>
             </w:rPr>
           </w:pPr>
-          <w:hyperlink w:anchor="_Toc234755939" w:history="1">
+          <w:hyperlink w:anchor="_Toc234781162" w:history="1">
             <w:r>
               <w:rPr>
                 <w:rStyle w:val="Hyperlink"/>
@@ -1988,7 +1988,7 @@
                 <w:noProof/>
                 <w:webHidden/>
               </w:rPr>
-              <w:instrText>Toc234755939 \h</w:instrText>
+              <w:instrText>Toc234781162 \h</w:instrText>
             </w:r>
             <w:r>
               <w:rPr>
@@ -2045,7 +2045,7 @@
               <w:rtl/>
             </w:rPr>
           </w:pPr>
-          <w:hyperlink w:anchor="_Toc234755940" w:history="1">
+          <w:hyperlink w:anchor="_Toc234781163" w:history="1">
             <w:r>
               <w:rPr>
                 <w:rStyle w:val="Hyperlink"/>
@@ -2097,7 +2097,7 @@
                 <w:noProof/>
                 <w:webHidden/>
               </w:rPr>
-              <w:instrText>Toc234755940 \h</w:instrText>
+              <w:instrText>Toc234781163 \h</w:instrText>
             </w:r>
             <w:r>
               <w:rPr>
@@ -2154,7 +2154,7 @@
               <w:rtl/>
             </w:rPr>
           </w:pPr>
-          <w:hyperlink w:anchor="_Toc234755941" w:history="1">
+          <w:hyperlink w:anchor="_Toc234781164" w:history="1">
             <w:r>
               <w:rPr>
                 <w:rStyle w:val="Hyperlink"/>
@@ -2206,7 +2206,7 @@
                 <w:noProof/>
                 <w:webHidden/>
               </w:rPr>
-              <w:instrText>Toc234755941 \h</w:instrText>
+              <w:instrText>Toc234781164 \h</w:instrText>
             </w:r>
             <w:r>
               <w:rPr>
@@ -2263,7 +2263,7 @@
               <w:rtl/>
             </w:rPr>
           </w:pPr>
-          <w:hyperlink w:anchor="_Toc234755942" w:history="1">
+          <w:hyperlink w:anchor="_Toc234781165" w:history="1">
             <w:r>
               <w:rPr>
                 <w:rStyle w:val="Hyperlink"/>
@@ -2315,7 +2315,7 @@
                 <w:noProof/>
                 <w:webHidden/>
               </w:rPr>
-              <w:instrText>Toc234755942 \h</w:instrText>
+              <w:instrText>Toc234781165 \h</w:instrText>
             </w:r>
             <w:r>
               <w:rPr>
@@ -2346,7 +2346,7 @@
                 <w:webHidden/>
                 <w:rtl/>
               </w:rPr>
-              <w:t>9</w:t>
+              <w:t>10</w:t>
             </w:r>
             <w:r>
               <w:rPr>
@@ -2372,7 +2372,7 @@
               <w:rtl/>
             </w:rPr>
           </w:pPr>
-          <w:hyperlink w:anchor="_Toc234755943" w:history="1">
+          <w:hyperlink w:anchor="_Toc234781166" w:history="1">
             <w:r>
               <w:rPr>
                 <w:rStyle w:val="Hyperlink"/>
@@ -2424,7 +2424,7 @@
                 <w:noProof/>
                 <w:webHidden/>
               </w:rPr>
-              <w:instrText>Toc234755943 \h</w:instrText>
+              <w:instrText>Toc234781166 \h</w:instrText>
             </w:r>
             <w:r>
               <w:rPr>
@@ -2481,7 +2481,7 @@
               <w:rtl/>
             </w:rPr>
           </w:pPr>
-          <w:hyperlink w:anchor="_Toc234755944" w:history="1">
+          <w:hyperlink w:anchor="_Toc234781167" w:history="1">
             <w:r>
               <w:rPr>
                 <w:rStyle w:val="Hyperlink"/>
@@ -2533,7 +2533,7 @@
                 <w:noProof/>
                 <w:webHidden/>
               </w:rPr>
-              <w:instrText>Toc234755944 \h</w:instrText>
+              <w:instrText>Toc234781167 \h</w:instrText>
             </w:r>
             <w:r>
               <w:rPr>
@@ -2590,7 +2590,7 @@
               <w:rtl/>
             </w:rPr>
           </w:pPr>
-          <w:hyperlink w:anchor="_Toc234755945" w:history="1">
+          <w:hyperlink w:anchor="_Toc234781168" w:history="1">
             <w:r>
               <w:rPr>
                 <w:rStyle w:val="Hyperlink"/>
@@ -2642,7 +2642,7 @@
                 <w:noProof/>
                 <w:webHidden/>
               </w:rPr>
-              <w:instrText>Toc234755945 \h</w:instrText>
+              <w:instrText>Toc234781168 \h</w:instrText>
             </w:r>
             <w:r>
               <w:rPr>
@@ -2673,7 +2673,7 @@
                 <w:webHidden/>
                 <w:rtl/>
               </w:rPr>
-              <w:t>10</w:t>
+              <w:t>11</w:t>
             </w:r>
             <w:r>
               <w:rPr>
@@ -2699,7 +2699,7 @@
               <w:rtl/>
             </w:rPr>
           </w:pPr>
-          <w:hyperlink w:anchor="_Toc234755946" w:history="1">
+          <w:hyperlink w:anchor="_Toc234781169" w:history="1">
             <w:r>
               <w:rPr>
                 <w:rStyle w:val="Hyperlink"/>
@@ -2751,7 +2751,7 @@
                 <w:noProof/>
                 <w:webHidden/>
               </w:rPr>
-              <w:instrText>Toc234755946 \h</w:instrText>
+              <w:instrText>Toc234781169 \h</w:instrText>
             </w:r>
             <w:r>
               <w:rPr>
@@ -2808,7 +2808,7 @@
               <w:rtl/>
             </w:rPr>
           </w:pPr>
-          <w:hyperlink w:anchor="_Toc234755947" w:history="1">
+          <w:hyperlink w:anchor="_Toc234781170" w:history="1">
             <w:r>
               <w:rPr>
                 <w:rStyle w:val="Hyperlink"/>
@@ -2860,7 +2860,7 @@
                 <w:noProof/>
                 <w:webHidden/>
               </w:rPr>
-              <w:instrText>Toc234755947 \h</w:instrText>
+              <w:instrText>Toc234781170 \h</w:instrText>
             </w:r>
             <w:r>
               <w:rPr>
@@ -2917,7 +2917,7 @@
               <w:rtl/>
             </w:rPr>
           </w:pPr>
-          <w:hyperlink w:anchor="_Toc234755948" w:history="1">
+          <w:hyperlink w:anchor="_Toc234781171" w:history="1">
             <w:r>
               <w:rPr>
                 <w:rStyle w:val="Hyperlink"/>
@@ -2969,7 +2969,7 @@
                 <w:noProof/>
                 <w:webHidden/>
               </w:rPr>
-              <w:instrText>Toc234755948 \h</w:instrText>
+              <w:instrText>Toc234781171 \h</w:instrText>
             </w:r>
             <w:r>
               <w:rPr>
@@ -3026,7 +3026,7 @@
               <w:rtl/>
             </w:rPr>
           </w:pPr>
-          <w:hyperlink w:anchor="_Toc234755949" w:history="1">
+          <w:hyperlink w:anchor="_Toc234781172" w:history="1">
             <w:r>
               <w:rPr>
                 <w:rStyle w:val="Hyperlink"/>
@@ -3078,7 +3078,7 @@
                 <w:noProof/>
                 <w:webHidden/>
               </w:rPr>
-              <w:instrText>Toc234755949 \h</w:instrText>
+              <w:instrText>Toc234781172 \h</w:instrText>
             </w:r>
             <w:r>
               <w:rPr>
@@ -3109,7 +3109,7 @@
                 <w:webHidden/>
                 <w:rtl/>
               </w:rPr>
-              <w:t>11</w:t>
+              <w:t>12</w:t>
             </w:r>
             <w:r>
               <w:rPr>
@@ -3135,7 +3135,7 @@
               <w:rtl/>
             </w:rPr>
           </w:pPr>
-          <w:hyperlink w:anchor="_Toc234755950" w:history="1">
+          <w:hyperlink w:anchor="_Toc234781173" w:history="1">
             <w:r>
               <w:rPr>
                 <w:rStyle w:val="Hyperlink"/>
@@ -3187,7 +3187,7 @@
                 <w:noProof/>
                 <w:webHidden/>
               </w:rPr>
-              <w:instrText>Toc234755950 \h</w:instrText>
+              <w:instrText>Toc234781173 \h</w:instrText>
             </w:r>
             <w:r>
               <w:rPr>
@@ -3244,7 +3244,7 @@
               <w:rtl/>
             </w:rPr>
           </w:pPr>
-          <w:hyperlink w:anchor="_Toc234755951" w:history="1">
+          <w:hyperlink w:anchor="_Toc234781174" w:history="1">
             <w:r>
               <w:rPr>
                 <w:rStyle w:val="Hyperlink"/>
@@ -3297,7 +3297,7 @@
                 <w:noProof/>
                 <w:webHidden/>
               </w:rPr>
-              <w:instrText>Toc234755951 \h</w:instrText>
+              <w:instrText>Toc234781174 \h</w:instrText>
             </w:r>
             <w:r>
               <w:rPr>
@@ -3354,7 +3354,7 @@
               <w:rtl/>
             </w:rPr>
           </w:pPr>
-          <w:hyperlink w:anchor="_Toc234755952" w:history="1">
+          <w:hyperlink w:anchor="_Toc234781175" w:history="1">
             <w:r>
               <w:rPr>
                 <w:rStyle w:val="Hyperlink"/>
@@ -3407,7 +3407,7 @@
                 <w:noProof/>
                 <w:webHidden/>
               </w:rPr>
-              <w:instrText>Toc234755952 \h</w:instrText>
+              <w:instrText>Toc234781175 \h</w:instrText>
             </w:r>
             <w:r>
               <w:rPr>
@@ -3464,7 +3464,7 @@
               <w:rtl/>
             </w:rPr>
           </w:pPr>
-          <w:hyperlink w:anchor="_Toc234755953" w:history="1">
+          <w:hyperlink w:anchor="_Toc234781176" w:history="1">
             <w:r>
               <w:rPr>
                 <w:rStyle w:val="Hyperlink"/>
@@ -3532,7 +3532,7 @@
                 <w:noProof/>
                 <w:webHidden/>
               </w:rPr>
-              <w:instrText>Toc234755953 \h</w:instrText>
+              <w:instrText>Toc234781176 \h</w:instrText>
             </w:r>
             <w:r>
               <w:rPr>
@@ -3589,7 +3589,7 @@
               <w:rtl/>
             </w:rPr>
           </w:pPr>
-          <w:hyperlink w:anchor="_Toc234755954" w:history="1">
+          <w:hyperlink w:anchor="_Toc234781177" w:history="1">
             <w:r>
               <w:rPr>
                 <w:rStyle w:val="Hyperlink"/>
@@ -3642,7 +3642,7 @@
                 <w:noProof/>
                 <w:webHidden/>
               </w:rPr>
-              <w:instrText>Toc234755954 \h</w:instrText>
+              <w:instrText>Toc234781177 \h</w:instrText>
             </w:r>
             <w:r>
               <w:rPr>
@@ -3699,7 +3699,7 @@
               <w:rtl/>
             </w:rPr>
           </w:pPr>
-          <w:hyperlink w:anchor="_Toc234755955" w:history="1">
+          <w:hyperlink w:anchor="_Toc234781178" w:history="1">
             <w:r>
               <w:rPr>
                 <w:rStyle w:val="Hyperlink"/>
@@ -3752,7 +3752,7 @@
                 <w:noProof/>
                 <w:webHidden/>
               </w:rPr>
-              <w:instrText>Toc234755955 \h</w:instrText>
+              <w:instrText>Toc234781178 \h</w:instrText>
             </w:r>
             <w:r>
               <w:rPr>
@@ -3783,7 +3783,7 @@
                 <w:webHidden/>
                 <w:rtl/>
               </w:rPr>
-              <w:t>13</w:t>
+              <w:t>14</w:t>
             </w:r>
             <w:r>
               <w:rPr>
@@ -3809,7 +3809,7 @@
               <w:rtl/>
             </w:rPr>
           </w:pPr>
-          <w:hyperlink w:anchor="_Toc234755956" w:history="1">
+          <w:hyperlink w:anchor="_Toc234781179" w:history="1">
             <w:r>
               <w:rPr>
                 <w:rStyle w:val="Hyperlink"/>
@@ -3862,7 +3862,7 @@
                 <w:noProof/>
                 <w:webHidden/>
               </w:rPr>
-              <w:instrText>Toc234755956 \h</w:instrText>
+              <w:instrText>Toc234781179 \h</w:instrText>
             </w:r>
             <w:r>
               <w:rPr>
@@ -3919,8 +3919,8 @@
               <w:rtl/>
             </w:rPr>
           </w:pPr>
-          <w:hyperlink w:anchor="_Toc234755957" w:history="1">
-            <w:bookmarkStart w:id="1" w:name="_Toc234741719"/>
+          <w:hyperlink w:anchor="_Toc234781180" w:history="1">
+            <w:bookmarkStart w:id="1" w:name="_Toc234755957"/>
             <w:r>
               <w:rPr>
                 <w:rStyle w:val="Hyperlink"/>
@@ -3929,10 +3929,10 @@
                 <w:rtl/>
               </w:rPr>
               <w:drawing>
-                <wp:inline distT="0" distB="0" distL="0" distR="0" wp14:anchorId="0E6AC4BA" wp14:editId="3109D057">
+                <wp:inline distT="0" distB="0" distL="0" distR="0" wp14:anchorId="37856F07" wp14:editId="150140F4">
                   <wp:extent cx="4277322" cy="5877745"/>
                   <wp:effectExtent l="0" t="0" r="9525" b="8890"/>
-                  <wp:docPr id="912846461" name="תמונה 1"/>
+                  <wp:docPr id="323551242" name="תמונה 1"/>
                   <wp:cNvGraphicFramePr>
                     <a:graphicFrameLocks xmlns:a="http://schemas.openxmlformats.org/drawingml/2006/main" noChangeAspect="1"/>
                   </wp:cNvGraphicFramePr>
@@ -4009,7 +4009,7 @@
                 <w:noProof/>
                 <w:webHidden/>
               </w:rPr>
-              <w:instrText>Toc234755957 \h</w:instrText>
+              <w:instrText>Toc234781180 \h</w:instrText>
             </w:r>
             <w:r>
               <w:rPr>
@@ -4066,7 +4066,7 @@
               <w:rtl/>
             </w:rPr>
           </w:pPr>
-          <w:hyperlink w:anchor="_Toc234755958" w:history="1">
+          <w:hyperlink w:anchor="_Toc234781181" w:history="1">
             <w:r>
               <w:rPr>
                 <w:rStyle w:val="Hyperlink"/>
@@ -4119,7 +4119,7 @@
                 <w:noProof/>
                 <w:webHidden/>
               </w:rPr>
-              <w:instrText>Toc234755958 \h</w:instrText>
+              <w:instrText>Toc234781181 \h</w:instrText>
             </w:r>
             <w:r>
               <w:rPr>
@@ -4176,7 +4176,7 @@
               <w:rtl/>
             </w:rPr>
           </w:pPr>
-          <w:hyperlink w:anchor="_Toc234755959" w:history="1">
+          <w:hyperlink w:anchor="_Toc234781182" w:history="1">
             <w:r>
               <w:rPr>
                 <w:rStyle w:val="Hyperlink"/>
@@ -4229,7 +4229,7 @@
                 <w:noProof/>
                 <w:webHidden/>
               </w:rPr>
-              <w:instrText>Toc234755959 \h</w:instrText>
+              <w:instrText>Toc234781182 \h</w:instrText>
             </w:r>
             <w:r>
               <w:rPr>
@@ -4286,7 +4286,7 @@
               <w:rtl/>
             </w:rPr>
           </w:pPr>
-          <w:hyperlink w:anchor="_Toc234755960" w:history="1">
+          <w:hyperlink w:anchor="_Toc234781183" w:history="1">
             <w:r>
               <w:rPr>
                 <w:rStyle w:val="Hyperlink"/>
@@ -4339,7 +4339,7 @@
                 <w:noProof/>
                 <w:webHidden/>
               </w:rPr>
-              <w:instrText>Toc234755960 \h</w:instrText>
+              <w:instrText>Toc234781183 \h</w:instrText>
             </w:r>
             <w:r>
               <w:rPr>
@@ -4396,7 +4396,7 @@
               <w:rtl/>
             </w:rPr>
           </w:pPr>
-          <w:hyperlink w:anchor="_Toc234755961" w:history="1">
+          <w:hyperlink w:anchor="_Toc234781184" w:history="1">
             <w:r>
               <w:rPr>
                 <w:rStyle w:val="Hyperlink"/>
@@ -4448,7 +4448,7 @@
                 <w:noProof/>
                 <w:webHidden/>
               </w:rPr>
-              <w:instrText>Toc234755961 \h</w:instrText>
+              <w:instrText>Toc234781184 \h</w:instrText>
             </w:r>
             <w:r>
               <w:rPr>
@@ -4505,7 +4505,7 @@
               <w:rtl/>
             </w:rPr>
           </w:pPr>
-          <w:hyperlink w:anchor="_Toc234755962" w:history="1">
+          <w:hyperlink w:anchor="_Toc234781185" w:history="1">
             <w:r>
               <w:rPr>
                 <w:rStyle w:val="Hyperlink"/>
@@ -4557,7 +4557,7 @@
                 <w:noProof/>
                 <w:webHidden/>
               </w:rPr>
-              <w:instrText>Toc234755962 \h</w:instrText>
+              <w:instrText>Toc234781185 \h</w:instrText>
             </w:r>
             <w:r>
               <w:rPr>
@@ -4614,7 +4614,7 @@
               <w:rtl/>
             </w:rPr>
           </w:pPr>
-          <w:hyperlink w:anchor="_Toc234755963" w:history="1">
+          <w:hyperlink w:anchor="_Toc234781186" w:history="1">
             <w:r>
               <w:rPr>
                 <w:rStyle w:val="Hyperlink"/>
@@ -4667,7 +4667,7 @@
                 <w:noProof/>
                 <w:webHidden/>
               </w:rPr>
-              <w:instrText>Toc234755963 \h</w:instrText>
+              <w:instrText>Toc234781186 \h</w:instrText>
             </w:r>
             <w:r>
               <w:rPr>
@@ -4724,7 +4724,7 @@
               <w:rtl/>
             </w:rPr>
           </w:pPr>
-          <w:hyperlink w:anchor="_Toc234755964" w:history="1">
+          <w:hyperlink w:anchor="_Toc234781187" w:history="1">
             <w:r>
               <w:rPr>
                 <w:rStyle w:val="Hyperlink"/>
@@ -4777,7 +4777,7 @@
                 <w:noProof/>
                 <w:webHidden/>
               </w:rPr>
-              <w:instrText>Toc234755964 \h</w:instrText>
+              <w:instrText>Toc234781187 \h</w:instrText>
             </w:r>
             <w:r>
               <w:rPr>
@@ -4834,7 +4834,7 @@
               <w:rtl/>
             </w:rPr>
           </w:pPr>
-          <w:hyperlink w:anchor="_Toc234755965" w:history="1">
+          <w:hyperlink w:anchor="_Toc234781188" w:history="1">
             <w:r>
               <w:rPr>
                 <w:rStyle w:val="Hyperlink"/>
@@ -4894,7 +4894,7 @@
                 <w:noProof/>
                 <w:webHidden/>
               </w:rPr>
-              <w:instrText>Toc234755965 \h</w:instrText>
+              <w:instrText>Toc234781188 \h</w:instrText>
             </w:r>
             <w:r>
               <w:rPr>
@@ -4951,7 +4951,7 @@
               <w:rtl/>
             </w:rPr>
           </w:pPr>
-          <w:hyperlink w:anchor="_Toc234755966" w:history="1">
+          <w:hyperlink w:anchor="_Toc234781189" w:history="1">
             <w:r>
               <w:rPr>
                 <w:rStyle w:val="Hyperlink"/>
@@ -5004,7 +5004,7 @@
                 <w:noProof/>
                 <w:webHidden/>
               </w:rPr>
-              <w:instrText>Toc234755966 \h</w:instrText>
+              <w:instrText>Toc234781189 \h</w:instrText>
             </w:r>
             <w:r>
               <w:rPr>
@@ -5061,7 +5061,7 @@
               <w:rtl/>
             </w:rPr>
           </w:pPr>
-          <w:hyperlink w:anchor="_Toc234755967" w:history="1">
+          <w:hyperlink w:anchor="_Toc234781190" w:history="1">
             <w:r>
               <w:rPr>
                 <w:rStyle w:val="Hyperlink"/>
@@ -5113,7 +5113,7 @@
                 <w:noProof/>
                 <w:webHidden/>
               </w:rPr>
-              <w:instrText>Toc234755967 \h</w:instrText>
+              <w:instrText>Toc234781190 \h</w:instrText>
             </w:r>
             <w:r>
               <w:rPr>
@@ -5170,30 +5170,14 @@
               <w:rtl/>
             </w:rPr>
           </w:pPr>
-          <w:hyperlink w:anchor="_Toc234755968" w:history="1">
-            <w:r>
-              <w:rPr>
-                <w:rStyle w:val="Hyperlink"/>
-                <w:noProof/>
-                <w:rtl/>
-              </w:rPr>
-              <w:t>העלאת/ עדכון הקבצים בחשב</w:t>
-            </w:r>
-            <w:r>
-              <w:rPr>
-                <w:rStyle w:val="Hyperlink"/>
-                <w:noProof/>
-                <w:rtl/>
-              </w:rPr>
-              <w:t>ו</w:t>
-            </w:r>
-            <w:r>
-              <w:rPr>
-                <w:rStyle w:val="Hyperlink"/>
-                <w:noProof/>
-                <w:rtl/>
-              </w:rPr>
-              <w:t xml:space="preserve">ן </w:t>
+          <w:hyperlink w:anchor="_Toc234781191" w:history="1">
+            <w:r>
+              <w:rPr>
+                <w:rStyle w:val="Hyperlink"/>
+                <w:noProof/>
+                <w:rtl/>
+              </w:rPr>
+              <w:t xml:space="preserve">העלאת/ עדכון הקבצים בחשבון </w:t>
             </w:r>
             <w:r>
               <w:rPr>
@@ -5246,7 +5230,7 @@
                 <w:noProof/>
                 <w:webHidden/>
               </w:rPr>
-              <w:instrText>Toc234755968 \h</w:instrText>
+              <w:instrText>Toc234781191 \h</w:instrText>
             </w:r>
             <w:r>
               <w:rPr>
@@ -5278,6 +5262,115 @@
                 <w:rtl/>
               </w:rPr>
               <w:t>21</w:t>
+            </w:r>
+            <w:r>
+              <w:rPr>
+                <w:rStyle w:val="Hyperlink"/>
+                <w:noProof/>
+                <w:rtl/>
+              </w:rPr>
+              <w:fldChar w:fldCharType="end"/>
+            </w:r>
+          </w:hyperlink>
+        </w:p>
+        <w:p>
+          <w:pPr>
+            <w:pStyle w:val="TOC2"/>
+            <w:tabs>
+              <w:tab w:val="right" w:leader="dot" w:pos="8296"/>
+            </w:tabs>
+            <w:rPr>
+              <w:rFonts w:eastAsiaTheme="minorEastAsia"/>
+              <w:noProof/>
+              <w:sz w:val="24"/>
+              <w:szCs w:val="24"/>
+              <w:rtl/>
+            </w:rPr>
+          </w:pPr>
+          <w:hyperlink w:anchor="_Toc234781192" w:history="1">
+            <w:r>
+              <w:rPr>
+                <w:rStyle w:val="Hyperlink"/>
+                <w:noProof/>
+              </w:rPr>
+              <w:t>Push vs commit</w:t>
+            </w:r>
+            <w:r>
+              <w:rPr>
+                <w:noProof/>
+                <w:webHidden/>
+                <w:rtl/>
+              </w:rPr>
+              <w:tab/>
+            </w:r>
+            <w:r>
+              <w:rPr>
+                <w:rStyle w:val="Hyperlink"/>
+                <w:noProof/>
+                <w:rtl/>
+              </w:rPr>
+              <w:fldChar w:fldCharType="begin"/>
+            </w:r>
+            <w:r>
+              <w:rPr>
+                <w:noProof/>
+                <w:webHidden/>
+                <w:rtl/>
+              </w:rPr>
+              <w:instrText xml:space="preserve"> </w:instrText>
+            </w:r>
+            <w:r>
+              <w:rPr>
+                <w:noProof/>
+                <w:webHidden/>
+              </w:rPr>
+              <w:instrText>PAGEREF</w:instrText>
+            </w:r>
+            <w:r>
+              <w:rPr>
+                <w:noProof/>
+                <w:webHidden/>
+                <w:rtl/>
+              </w:rPr>
+              <w:instrText xml:space="preserve"> _</w:instrText>
+            </w:r>
+            <w:r>
+              <w:rPr>
+                <w:noProof/>
+                <w:webHidden/>
+              </w:rPr>
+              <w:instrText>Toc234781192 \h</w:instrText>
+            </w:r>
+            <w:r>
+              <w:rPr>
+                <w:noProof/>
+                <w:webHidden/>
+                <w:rtl/>
+              </w:rPr>
+              <w:instrText xml:space="preserve"> </w:instrText>
+            </w:r>
+            <w:r>
+              <w:rPr>
+                <w:rStyle w:val="Hyperlink"/>
+                <w:noProof/>
+                <w:rtl/>
+              </w:rPr>
+            </w:r>
+            <w:r>
+              <w:rPr>
+                <w:rStyle w:val="Hyperlink"/>
+                <w:noProof/>
+                <w:rtl/>
+              </w:rPr>
+              <w:fldChar w:fldCharType="separate"/>
+            </w:r>
+            <w:r>
+              <w:rPr>
+                <w:noProof/>
+                <w:webHidden/>
+                <w:rtl/>
+              </w:rPr>
+              <w:t>22</w:t>
             </w:r>
             <w:r>
               <w:rPr>
@@ -5303,7 +5396,7 @@
               <w:rtl/>
             </w:rPr>
           </w:pPr>
-          <w:hyperlink w:anchor="_Toc234755969" w:history="1">
+          <w:hyperlink w:anchor="_Toc234781193" w:history="1">
             <w:r>
               <w:rPr>
                 <w:rStyle w:val="Hyperlink"/>
@@ -5356,7 +5449,7 @@
                 <w:noProof/>
                 <w:webHidden/>
               </w:rPr>
-              <w:instrText>Toc234755969 \h</w:instrText>
+              <w:instrText>Toc234781193 \h</w:instrText>
             </w:r>
             <w:r>
               <w:rPr>
@@ -5413,7 +5506,7 @@
               <w:rtl/>
             </w:rPr>
           </w:pPr>
-          <w:hyperlink w:anchor="_Toc234755970" w:history="1">
+          <w:hyperlink w:anchor="_Toc234781194" w:history="1">
             <w:r>
               <w:rPr>
                 <w:rStyle w:val="Hyperlink"/>
@@ -5466,7 +5559,7 @@
                 <w:noProof/>
                 <w:webHidden/>
               </w:rPr>
-              <w:instrText>Toc234755970 \h</w:instrText>
+              <w:instrText>Toc234781194 \h</w:instrText>
             </w:r>
             <w:r>
               <w:rPr>
@@ -5523,7 +5616,7 @@
               <w:rtl/>
             </w:rPr>
           </w:pPr>
-          <w:hyperlink w:anchor="_Toc234755971" w:history="1">
+          <w:hyperlink w:anchor="_Toc234781195" w:history="1">
             <w:r>
               <w:rPr>
                 <w:rStyle w:val="Hyperlink"/>
@@ -5575,7 +5668,7 @@
                 <w:noProof/>
                 <w:webHidden/>
               </w:rPr>
-              <w:instrText>Toc234755971 \h</w:instrText>
+              <w:instrText>Toc234781195 \h</w:instrText>
             </w:r>
             <w:r>
               <w:rPr>
@@ -5632,7 +5725,7 @@
               <w:rtl/>
             </w:rPr>
           </w:pPr>
-          <w:hyperlink w:anchor="_Toc234755972" w:history="1">
+          <w:hyperlink w:anchor="_Toc234781196" w:history="1">
             <w:r>
               <w:rPr>
                 <w:rStyle w:val="Hyperlink"/>
@@ -5692,7 +5785,7 @@
                 <w:noProof/>
                 <w:webHidden/>
               </w:rPr>
-              <w:instrText>Toc234755972 \h</w:instrText>
+              <w:instrText>Toc234781196 \h</w:instrText>
             </w:r>
             <w:r>
               <w:rPr>
@@ -5749,7 +5842,7 @@
               <w:rtl/>
             </w:rPr>
           </w:pPr>
-          <w:hyperlink w:anchor="_Toc234755973" w:history="1">
+          <w:hyperlink w:anchor="_Toc234781197" w:history="1">
             <w:r>
               <w:rPr>
                 <w:rStyle w:val="Hyperlink"/>
@@ -5809,7 +5902,7 @@
                 <w:noProof/>
                 <w:webHidden/>
               </w:rPr>
-              <w:instrText>Toc234755973 \h</w:instrText>
+              <w:instrText>Toc234781197 \h</w:instrText>
             </w:r>
             <w:r>
               <w:rPr>
@@ -5866,7 +5959,7 @@
               <w:rtl/>
             </w:rPr>
           </w:pPr>
-          <w:hyperlink w:anchor="_Toc234755974" w:history="1">
+          <w:hyperlink w:anchor="_Toc234781198" w:history="1">
             <w:r>
               <w:rPr>
                 <w:rStyle w:val="Hyperlink"/>
@@ -5918,7 +6011,7 @@
                 <w:noProof/>
                 <w:webHidden/>
               </w:rPr>
-              <w:instrText>Toc234755974 \h</w:instrText>
+              <w:instrText>Toc234781198 \h</w:instrText>
             </w:r>
             <w:r>
               <w:rPr>
@@ -5949,7 +6042,7 @@
                 <w:webHidden/>
                 <w:rtl/>
               </w:rPr>
-              <w:t>26</w:t>
+              <w:t>27</w:t>
             </w:r>
             <w:r>
               <w:rPr>
@@ -5975,7 +6068,7 @@
               <w:rtl/>
             </w:rPr>
           </w:pPr>
-          <w:hyperlink w:anchor="_Toc234755975" w:history="1">
+          <w:hyperlink w:anchor="_Toc234781199" w:history="1">
             <w:r>
               <w:rPr>
                 <w:rStyle w:val="Hyperlink"/>
@@ -6027,7 +6120,7 @@
                 <w:noProof/>
                 <w:webHidden/>
               </w:rPr>
-              <w:instrText>Toc234755975 \h</w:instrText>
+              <w:instrText>Toc234781199 \h</w:instrText>
             </w:r>
             <w:r>
               <w:rPr>
@@ -6084,7 +6177,7 @@
               <w:rtl/>
             </w:rPr>
           </w:pPr>
-          <w:hyperlink w:anchor="_Toc234755976" w:history="1">
+          <w:hyperlink w:anchor="_Toc234781200" w:history="1">
             <w:r>
               <w:rPr>
                 <w:rStyle w:val="Hyperlink"/>
@@ -6136,7 +6229,7 @@
                 <w:noProof/>
                 <w:webHidden/>
               </w:rPr>
-              <w:instrText>Toc234755976 \h</w:instrText>
+              <w:instrText>Toc234781200 \h</w:instrText>
             </w:r>
             <w:r>
               <w:rPr>
@@ -6193,7 +6286,7 @@
               <w:rtl/>
             </w:rPr>
           </w:pPr>
-          <w:hyperlink w:anchor="_Toc234755977" w:history="1">
+          <w:hyperlink w:anchor="_Toc234781201" w:history="1">
             <w:r>
               <w:rPr>
                 <w:rStyle w:val="Hyperlink"/>
@@ -6245,7 +6338,7 @@
                 <w:noProof/>
                 <w:webHidden/>
               </w:rPr>
-              <w:instrText>Toc234755977 \h</w:instrText>
+              <w:instrText>Toc234781201 \h</w:instrText>
             </w:r>
             <w:r>
               <w:rPr>
@@ -6276,7 +6369,7 @@
                 <w:webHidden/>
                 <w:rtl/>
               </w:rPr>
-              <w:t>27</w:t>
+              <w:t>28</w:t>
             </w:r>
             <w:r>
               <w:rPr>
@@ -6302,7 +6395,7 @@
               <w:rtl/>
             </w:rPr>
           </w:pPr>
-          <w:hyperlink w:anchor="_Toc234755978" w:history="1">
+          <w:hyperlink w:anchor="_Toc234781202" w:history="1">
             <w:r>
               <w:rPr>
                 <w:rStyle w:val="Hyperlink"/>
@@ -6362,7 +6455,7 @@
                 <w:noProof/>
                 <w:webHidden/>
               </w:rPr>
-              <w:instrText>Toc234755978 \h</w:instrText>
+              <w:instrText>Toc234781202 \h</w:instrText>
             </w:r>
             <w:r>
               <w:rPr>
@@ -6419,7 +6512,7 @@
               <w:rtl/>
             </w:rPr>
           </w:pPr>
-          <w:hyperlink w:anchor="_Toc234755979" w:history="1">
+          <w:hyperlink w:anchor="_Toc234781203" w:history="1">
             <w:r>
               <w:rPr>
                 <w:rStyle w:val="Hyperlink"/>
@@ -6479,7 +6572,7 @@
                 <w:noProof/>
                 <w:webHidden/>
               </w:rPr>
-              <w:instrText>Toc234755979 \h</w:instrText>
+              <w:instrText>Toc234781203 \h</w:instrText>
             </w:r>
             <w:r>
               <w:rPr>
@@ -6536,27 +6629,13 @@
               <w:rtl/>
             </w:rPr>
           </w:pPr>
-          <w:hyperlink w:anchor="_Toc234755980" w:history="1">
-            <w:r>
-              <w:rPr>
-                <w:rStyle w:val="Hyperlink"/>
-                <w:noProof/>
-              </w:rPr>
-              <w:t>GitHub Ac</w:t>
-            </w:r>
-            <w:r>
-              <w:rPr>
-                <w:rStyle w:val="Hyperlink"/>
-                <w:noProof/>
-              </w:rPr>
-              <w:t>t</w:t>
-            </w:r>
-            <w:r>
-              <w:rPr>
-                <w:rStyle w:val="Hyperlink"/>
-                <w:noProof/>
-              </w:rPr>
-              <w:t>ions Folder</w:t>
+          <w:hyperlink w:anchor="_Toc234781204" w:history="1">
+            <w:r>
+              <w:rPr>
+                <w:rStyle w:val="Hyperlink"/>
+                <w:noProof/>
+              </w:rPr>
+              <w:t>GitHub Actions Folder</w:t>
             </w:r>
             <w:r>
               <w:rPr>
@@ -6610,7 +6689,138 @@
                 <w:noProof/>
                 <w:webHidden/>
               </w:rPr>
-              <w:instrText>Toc234755980 \h</w:instrText>
+              <w:instrText>Toc234781204 \h</w:instrText>
+            </w:r>
+            <w:r>
+              <w:rPr>
+                <w:noProof/>
+                <w:webHidden/>
+                <w:rtl/>
+              </w:rPr>
+              <w:instrText xml:space="preserve"> </w:instrText>
+            </w:r>
+            <w:r>
+              <w:rPr>
+                <w:rStyle w:val="Hyperlink"/>
+                <w:noProof/>
+                <w:rtl/>
+              </w:rPr>
+            </w:r>
+            <w:r>
+              <w:rPr>
+                <w:rStyle w:val="Hyperlink"/>
+                <w:noProof/>
+                <w:rtl/>
+              </w:rPr>
+              <w:fldChar w:fldCharType="separate"/>
+            </w:r>
+            <w:r>
+              <w:rPr>
+                <w:noProof/>
+                <w:webHidden/>
+                <w:rtl/>
+              </w:rPr>
+              <w:t>28</w:t>
+            </w:r>
+            <w:r>
+              <w:rPr>
+                <w:rStyle w:val="Hyperlink"/>
+                <w:noProof/>
+                <w:rtl/>
+              </w:rPr>
+              <w:fldChar w:fldCharType="end"/>
+            </w:r>
+          </w:hyperlink>
+        </w:p>
+        <w:p>
+          <w:pPr>
+            <w:pStyle w:val="TOC2"/>
+            <w:tabs>
+              <w:tab w:val="right" w:leader="dot" w:pos="8296"/>
+            </w:tabs>
+            <w:rPr>
+              <w:rFonts w:eastAsiaTheme="minorEastAsia"/>
+              <w:noProof/>
+              <w:sz w:val="24"/>
+              <w:szCs w:val="24"/>
+              <w:rtl/>
+            </w:rPr>
+          </w:pPr>
+          <w:hyperlink w:anchor="_Toc234781205" w:history="1">
+            <w:r>
+              <w:rPr>
+                <w:rStyle w:val="Hyperlink"/>
+                <w:noProof/>
+              </w:rPr>
+              <w:t>Dependency A</w:t>
+            </w:r>
+            <w:r>
+              <w:rPr>
+                <w:rStyle w:val="Hyperlink"/>
+                <w:noProof/>
+              </w:rPr>
+              <w:t>u</w:t>
+            </w:r>
+            <w:r>
+              <w:rPr>
+                <w:rStyle w:val="Hyperlink"/>
+                <w:noProof/>
+              </w:rPr>
+              <w:t>tomation</w:t>
+            </w:r>
+            <w:r>
+              <w:rPr>
+                <w:rStyle w:val="Hyperlink"/>
+                <w:noProof/>
+                <w:rtl/>
+              </w:rPr>
+              <w:t>:</w:t>
+            </w:r>
+            <w:r>
+              <w:rPr>
+                <w:noProof/>
+                <w:webHidden/>
+                <w:rtl/>
+              </w:rPr>
+              <w:tab/>
+            </w:r>
+            <w:r>
+              <w:rPr>
+                <w:rStyle w:val="Hyperlink"/>
+                <w:noProof/>
+                <w:rtl/>
+              </w:rPr>
+              <w:fldChar w:fldCharType="begin"/>
+            </w:r>
+            <w:r>
+              <w:rPr>
+                <w:noProof/>
+                <w:webHidden/>
+                <w:rtl/>
+              </w:rPr>
+              <w:instrText xml:space="preserve"> </w:instrText>
+            </w:r>
+            <w:r>
+              <w:rPr>
+                <w:noProof/>
+                <w:webHidden/>
+              </w:rPr>
+              <w:instrText>PAGEREF</w:instrText>
+            </w:r>
+            <w:r>
+              <w:rPr>
+                <w:noProof/>
+                <w:webHidden/>
+                <w:rtl/>
+              </w:rPr>
+              <w:instrText xml:space="preserve"> _</w:instrText>
+            </w:r>
+            <w:r>
+              <w:rPr>
+                <w:noProof/>
+                <w:webHidden/>
+              </w:rPr>
+              <w:instrText>Toc234781205 \h</w:instrText>
             </w:r>
             <w:r>
               <w:rPr>
@@ -6843,7 +7053,7 @@
           <w:rtl/>
         </w:rPr>
       </w:pPr>
-      <w:bookmarkStart w:id="2" w:name="_Toc234755923"/>
+      <w:bookmarkStart w:id="2" w:name="_Toc234781146"/>
       <w:r>
         <w:rPr>
           <w:rFonts w:hint="cs"/>
@@ -6862,7 +7072,7 @@
           <w:szCs w:val="28"/>
         </w:rPr>
       </w:pPr>
-      <w:bookmarkStart w:id="3" w:name="_Toc234755924"/>
+      <w:bookmarkStart w:id="3" w:name="_Toc234781147"/>
       <w:r>
         <w:rPr>
           <w:rStyle w:val="20"/>
@@ -6912,7 +7122,7 @@
           <w:szCs w:val="28"/>
         </w:rPr>
       </w:pPr>
-      <w:bookmarkStart w:id="4" w:name="_Toc234755925"/>
+      <w:bookmarkStart w:id="4" w:name="_Toc234781148"/>
       <w:r>
         <w:rPr>
           <w:rStyle w:val="20"/>
@@ -7009,7 +7219,15 @@
           <w:sz w:val="28"/>
           <w:szCs w:val="28"/>
         </w:rPr>
-        <w:t xml:space="preserve">Alpha Vantage for API-based historical and intraday market data. Alpha Vantage offers free stock APIs, but its free usage is limited to 25 API requests per day, so it is useful mainly for prototyping or a small universe. </w:t>
+        <w:t xml:space="preserve">Alpha Vantage for API-based historical and intraday market data. Alpha Vantage offers free stock APIs, but its free usage is </w:t>
+      </w:r>
+      <w:r>
+        <w:rPr>
+          <w:sz w:val="28"/>
+          <w:szCs w:val="28"/>
+        </w:rPr>
+        <w:lastRenderedPageBreak/>
+        <w:t xml:space="preserve">limited to 25 API requests per day, so it is useful mainly for prototyping or a small universe. </w:t>
       </w:r>
     </w:p>
     <w:p>
@@ -7025,7 +7243,6 @@
           <w:sz w:val="28"/>
           <w:szCs w:val="28"/>
         </w:rPr>
-        <w:lastRenderedPageBreak/>
         <w:t>This is enough for a serious prototype and for paper trading research, especially on daily data. It may be enough for hourly data on a limited universe, but daily data is the more realistic starting point. It is not enough to assume you have a stable live trading edge; that depends on signal quality, execution quality, and cost modeling.</w:t>
       </w:r>
     </w:p>
@@ -7037,7 +7254,7 @@
           <w:szCs w:val="28"/>
         </w:rPr>
       </w:pPr>
-      <w:bookmarkStart w:id="5" w:name="_Toc234755926"/>
+      <w:bookmarkStart w:id="5" w:name="_Toc234781149"/>
       <w:r>
         <w:rPr>
           <w:rStyle w:val="20"/>
@@ -7366,13 +7583,14 @@
           <w:rtl/>
         </w:rPr>
       </w:pPr>
-      <w:bookmarkStart w:id="6" w:name="_Toc234755927"/>
+      <w:bookmarkStart w:id="6" w:name="_Toc234781150"/>
       <w:r>
         <w:rPr>
           <w:rFonts w:hint="cs"/>
           <w:u w:val="single"/>
           <w:rtl/>
         </w:rPr>
+        <w:lastRenderedPageBreak/>
         <w:t>הערות לבדיקה:</w:t>
       </w:r>
       <w:bookmarkEnd w:id="6"/>
@@ -7466,7 +7684,6 @@
           <w:szCs w:val="28"/>
           <w:rtl/>
         </w:rPr>
-        <w:lastRenderedPageBreak/>
         <w:t>ניתוח של התפלגויות, ובדיקת תלות מסטטיסטיקה -&gt;</w:t>
       </w:r>
       <w:r>
@@ -7685,7 +7902,7 @@
           <w:szCs w:val="28"/>
         </w:rPr>
       </w:pPr>
-      <w:bookmarkStart w:id="7" w:name="_Toc234755928"/>
+      <w:bookmarkStart w:id="7" w:name="_Toc234781151"/>
       <w:r>
         <w:rPr>
           <w:rStyle w:val="20"/>
@@ -7735,7 +7952,7 @@
           <w:szCs w:val="28"/>
         </w:rPr>
       </w:pPr>
-      <w:bookmarkStart w:id="8" w:name="_Toc234755929"/>
+      <w:bookmarkStart w:id="8" w:name="_Toc234781152"/>
       <w:r>
         <w:rPr>
           <w:rStyle w:val="20"/>
@@ -7831,7 +8048,7 @@
           <w:szCs w:val="28"/>
         </w:rPr>
       </w:pPr>
-      <w:bookmarkStart w:id="9" w:name="_Toc234755930"/>
+      <w:bookmarkStart w:id="9" w:name="_Toc234781153"/>
       <w:r>
         <w:rPr>
           <w:rStyle w:val="20"/>
@@ -7954,6 +8171,7 @@
           <w:sz w:val="28"/>
           <w:szCs w:val="28"/>
         </w:rPr>
+        <w:lastRenderedPageBreak/>
         <w:t>Local machine for coding, debugging, data cleaning, and smaller runs</w:t>
       </w:r>
     </w:p>
@@ -8001,13 +8219,12 @@
           <w:szCs w:val="28"/>
         </w:rPr>
       </w:pPr>
-      <w:bookmarkStart w:id="10" w:name="_Toc234755931"/>
+      <w:bookmarkStart w:id="10" w:name="_Toc234781154"/>
       <w:r>
         <w:rPr>
           <w:rStyle w:val="20"/>
           <w:u w:val="single"/>
         </w:rPr>
-        <w:lastRenderedPageBreak/>
         <w:t>Q7. Coding language</w:t>
       </w:r>
       <w:bookmarkEnd w:id="10"/>
@@ -8058,7 +8275,7 @@
           <w:szCs w:val="28"/>
         </w:rPr>
       </w:pPr>
-      <w:bookmarkStart w:id="11" w:name="_Toc234755932"/>
+      <w:bookmarkStart w:id="11" w:name="_Toc234781155"/>
       <w:r>
         <w:rPr>
           <w:rStyle w:val="20"/>
@@ -8139,7 +8356,7 @@
           <w:szCs w:val="28"/>
         </w:rPr>
       </w:pPr>
-      <w:bookmarkStart w:id="12" w:name="_Toc234755933"/>
+      <w:bookmarkStart w:id="12" w:name="_Toc234781156"/>
       <w:r>
         <w:rPr>
           <w:rStyle w:val="20"/>
@@ -8269,6 +8486,7 @@
           <w:sz w:val="28"/>
           <w:szCs w:val="28"/>
         </w:rPr>
+        <w:lastRenderedPageBreak/>
         <w:t>request throttling and caching are required</w:t>
       </w:r>
     </w:p>
@@ -8280,7 +8498,7 @@
           <w:szCs w:val="28"/>
         </w:rPr>
       </w:pPr>
-      <w:bookmarkStart w:id="13" w:name="_Toc234755934"/>
+      <w:bookmarkStart w:id="13" w:name="_Toc234781157"/>
       <w:r>
         <w:rPr>
           <w:rStyle w:val="20"/>
@@ -8309,13 +8527,6 @@
           <w:szCs w:val="28"/>
         </w:rPr>
         <w:br/>
-      </w:r>
-      <w:r>
-        <w:rPr>
-          <w:sz w:val="28"/>
-          <w:szCs w:val="28"/>
-        </w:rPr>
-        <w:lastRenderedPageBreak/>
         <w:t xml:space="preserve">Weights alone are not enough. The saved training data, or at least a reproducible snapshot of it, is needed so the model can be reproduced, audited, compared, and debugged later. Without the data and preprocessing pipeline, the </w:t>
       </w:r>
       <w:proofErr w:type="gramStart"/>
@@ -8519,7 +8730,7 @@
           <w:rtl/>
         </w:rPr>
       </w:pPr>
-      <w:bookmarkStart w:id="14" w:name="_Toc234755935"/>
+      <w:bookmarkStart w:id="14" w:name="_Toc234781158"/>
       <w:r>
         <w:rPr>
           <w:rFonts w:hint="cs"/>
@@ -8593,7 +8804,7 @@
           <w:szCs w:val="28"/>
         </w:rPr>
       </w:pPr>
-      <w:bookmarkStart w:id="15" w:name="_Toc234755936"/>
+      <w:bookmarkStart w:id="15" w:name="_Toc234781159"/>
       <w:r>
         <w:rPr>
           <w:rStyle w:val="20"/>
@@ -8770,6 +8981,7 @@
           <w:sz w:val="28"/>
           <w:szCs w:val="28"/>
         </w:rPr>
+        <w:lastRenderedPageBreak/>
         <w:t>no trade when model confidence or expected value is below threshold</w:t>
       </w:r>
     </w:p>
@@ -8810,7 +9022,6 @@
           <w:sz w:val="28"/>
           <w:szCs w:val="28"/>
         </w:rPr>
-        <w:lastRenderedPageBreak/>
         <w:t>break if broker connection fails</w:t>
       </w:r>
     </w:p>
@@ -8858,7 +9069,7 @@
           <w:u w:val="single"/>
         </w:rPr>
       </w:pPr>
-      <w:bookmarkStart w:id="16" w:name="_Toc234755937"/>
+      <w:bookmarkStart w:id="16" w:name="_Toc234781160"/>
       <w:r>
         <w:rPr>
           <w:u w:val="single"/>
@@ -8892,7 +9103,7 @@
           <w:u w:val="single"/>
         </w:rPr>
       </w:pPr>
-      <w:bookmarkStart w:id="17" w:name="_Toc234755938"/>
+      <w:bookmarkStart w:id="17" w:name="_Toc234781161"/>
       <w:r>
         <w:rPr>
           <w:u w:val="single"/>
@@ -8909,7 +9120,7 @@
           <w:szCs w:val="28"/>
         </w:rPr>
       </w:pPr>
-      <w:bookmarkStart w:id="18" w:name="_Toc234755939"/>
+      <w:bookmarkStart w:id="18" w:name="_Toc234781162"/>
       <w:r>
         <w:rPr>
           <w:rStyle w:val="30"/>
@@ -8947,7 +9158,7 @@
           <w:szCs w:val="28"/>
         </w:rPr>
       </w:pPr>
-      <w:bookmarkStart w:id="19" w:name="_Toc234755940"/>
+      <w:bookmarkStart w:id="19" w:name="_Toc234781163"/>
       <w:r>
         <w:rPr>
           <w:rStyle w:val="20"/>
@@ -9099,7 +9310,7 @@
           <w:szCs w:val="28"/>
         </w:rPr>
       </w:pPr>
-      <w:bookmarkStart w:id="20" w:name="_Toc234755941"/>
+      <w:bookmarkStart w:id="20" w:name="_Toc234781164"/>
       <w:r>
         <w:rPr>
           <w:rStyle w:val="30"/>
@@ -9126,7 +9337,15 @@
           <w:szCs w:val="28"/>
         </w:rPr>
         <w:br/>
-        <w:t>The correct direction is to use historical membership as much as possible, not just today’s surviving stocks. This is to reduce survivorship bias. The exact construction rule is still open.</w:t>
+        <w:t xml:space="preserve">The correct direction is to use historical membership as much as </w:t>
+      </w:r>
+      <w:r>
+        <w:rPr>
+          <w:sz w:val="28"/>
+          <w:szCs w:val="28"/>
+        </w:rPr>
+        <w:lastRenderedPageBreak/>
+        <w:t>possible, not just today’s surviving stocks. This is to reduce survivorship bias. The exact construction rule is still open.</w:t>
       </w:r>
     </w:p>
     <w:p>
@@ -9137,7 +9356,7 @@
           <w:szCs w:val="28"/>
         </w:rPr>
       </w:pPr>
-      <w:bookmarkStart w:id="21" w:name="_Toc234755942"/>
+      <w:bookmarkStart w:id="21" w:name="_Toc234781165"/>
       <w:r>
         <w:rPr>
           <w:rStyle w:val="30"/>
@@ -9200,7 +9419,6 @@
           <w:sz w:val="28"/>
           <w:szCs w:val="28"/>
         </w:rPr>
-        <w:lastRenderedPageBreak/>
         <w:t>stock splits</w:t>
       </w:r>
     </w:p>
@@ -9308,7 +9526,7 @@
           <w:szCs w:val="28"/>
         </w:rPr>
       </w:pPr>
-      <w:bookmarkStart w:id="22" w:name="_Toc234755943"/>
+      <w:bookmarkStart w:id="22" w:name="_Toc234781166"/>
       <w:r>
         <w:rPr>
           <w:rStyle w:val="30"/>
@@ -9458,7 +9676,7 @@
           <w:szCs w:val="28"/>
         </w:rPr>
       </w:pPr>
-      <w:bookmarkStart w:id="23" w:name="_Toc234755944"/>
+      <w:bookmarkStart w:id="23" w:name="_Toc234781167"/>
       <w:r>
         <w:rPr>
           <w:rStyle w:val="30"/>
@@ -9604,6 +9822,7 @@
           <w:sz w:val="28"/>
           <w:szCs w:val="28"/>
         </w:rPr>
+        <w:lastRenderedPageBreak/>
         <w:t>Important note: do not use random train/test splits here. The split must respect time order.</w:t>
       </w:r>
     </w:p>
@@ -9615,7 +9834,7 @@
           <w:szCs w:val="28"/>
         </w:rPr>
       </w:pPr>
-      <w:bookmarkStart w:id="24" w:name="_Toc234755945"/>
+      <w:bookmarkStart w:id="24" w:name="_Toc234781168"/>
       <w:r>
         <w:rPr>
           <w:rStyle w:val="30"/>
@@ -9676,7 +9895,6 @@
           <w:sz w:val="28"/>
           <w:szCs w:val="28"/>
         </w:rPr>
-        <w:lastRenderedPageBreak/>
         <w:t>every day</w:t>
       </w:r>
     </w:p>
@@ -9748,7 +9966,7 @@
           <w:szCs w:val="28"/>
         </w:rPr>
       </w:pPr>
-      <w:bookmarkStart w:id="25" w:name="_Toc234755946"/>
+      <w:bookmarkStart w:id="25" w:name="_Toc234781169"/>
       <w:r>
         <w:rPr>
           <w:rStyle w:val="30"/>
@@ -9896,7 +10114,7 @@
           <w:szCs w:val="28"/>
         </w:rPr>
       </w:pPr>
-      <w:bookmarkStart w:id="26" w:name="_Toc234755947"/>
+      <w:bookmarkStart w:id="26" w:name="_Toc234781170"/>
       <w:r>
         <w:rPr>
           <w:rStyle w:val="30"/>
@@ -10046,7 +10264,7 @@
           <w:szCs w:val="28"/>
         </w:rPr>
       </w:pPr>
-      <w:bookmarkStart w:id="27" w:name="_Toc234755948"/>
+      <w:bookmarkStart w:id="27" w:name="_Toc234781171"/>
       <w:r>
         <w:rPr>
           <w:rStyle w:val="30"/>
@@ -10068,6 +10286,13 @@
           <w:szCs w:val="28"/>
         </w:rPr>
         <w:br/>
+      </w:r>
+      <w:r>
+        <w:rPr>
+          <w:sz w:val="28"/>
+          <w:szCs w:val="28"/>
+        </w:rPr>
+        <w:lastRenderedPageBreak/>
         <w:t>This is a critical anti-leakage rule. The model must not see future information, revised data, or end-of-day values that were unknown at the decision timestamp. Every feature must be point-in-time correct.</w:t>
       </w:r>
     </w:p>
@@ -10079,7 +10304,7 @@
           <w:szCs w:val="28"/>
         </w:rPr>
       </w:pPr>
-      <w:bookmarkStart w:id="28" w:name="_Toc234755949"/>
+      <w:bookmarkStart w:id="28" w:name="_Toc234781172"/>
       <w:r>
         <w:rPr>
           <w:rStyle w:val="30"/>
@@ -10106,13 +10331,6 @@
           <w:szCs w:val="28"/>
         </w:rPr>
         <w:br/>
-      </w:r>
-      <w:r>
-        <w:rPr>
-          <w:sz w:val="28"/>
-          <w:szCs w:val="28"/>
-        </w:rPr>
-        <w:lastRenderedPageBreak/>
         <w:t>This simplifies the first system and avoids extra complexity such as borrow constraints and short-side risk handling.</w:t>
       </w:r>
     </w:p>
@@ -10124,7 +10342,7 @@
           <w:szCs w:val="28"/>
         </w:rPr>
       </w:pPr>
-      <w:bookmarkStart w:id="29" w:name="_Toc234755950"/>
+      <w:bookmarkStart w:id="29" w:name="_Toc234781173"/>
       <w:r>
         <w:rPr>
           <w:rStyle w:val="30"/>
@@ -10401,7 +10619,7 @@
           <w:rtl/>
         </w:rPr>
       </w:pPr>
-      <w:bookmarkStart w:id="30" w:name="_Toc234755951"/>
+      <w:bookmarkStart w:id="30" w:name="_Toc234781174"/>
       <w:r>
         <w:rPr>
           <w:rFonts w:hint="cs"/>
@@ -10419,7 +10637,7 @@
           <w:rtl/>
         </w:rPr>
       </w:pPr>
-      <w:bookmarkStart w:id="31" w:name="_Toc234755952"/>
+      <w:bookmarkStart w:id="31" w:name="_Toc234781175"/>
       <w:r>
         <w:rPr>
           <w:rFonts w:hint="cs"/>
@@ -10480,7 +10698,7 @@
           <w:rtl/>
         </w:rPr>
       </w:pPr>
-      <w:bookmarkStart w:id="32" w:name="_Toc234755953"/>
+      <w:bookmarkStart w:id="32" w:name="_Toc234781176"/>
       <w:r>
         <w:rPr>
           <w:rFonts w:hint="cs"/>
@@ -10790,7 +11008,7 @@
           <w:rtl/>
         </w:rPr>
       </w:pPr>
-      <w:bookmarkStart w:id="33" w:name="_Toc234755954"/>
+      <w:bookmarkStart w:id="33" w:name="_Toc234781177"/>
       <w:r>
         <w:rPr>
           <w:rFonts w:hint="cs"/>
@@ -10954,13 +11172,14 @@
           <w:rtl/>
         </w:rPr>
       </w:pPr>
-      <w:bookmarkStart w:id="34" w:name="_Toc234755955"/>
+      <w:bookmarkStart w:id="34" w:name="_Toc234781178"/>
       <w:r>
         <w:rPr>
           <w:rFonts w:eastAsiaTheme="minorEastAsia" w:hint="cs"/>
           <w:u w:val="single"/>
           <w:rtl/>
         </w:rPr>
+        <w:lastRenderedPageBreak/>
         <w:t>כלל קנייה:</w:t>
       </w:r>
       <w:bookmarkEnd w:id="34"/>
@@ -11119,7 +11338,7 @@
           <w:rtl/>
         </w:rPr>
       </w:pPr>
-      <w:bookmarkStart w:id="35" w:name="_Toc234755956"/>
+      <w:bookmarkStart w:id="35" w:name="_Toc234781179"/>
       <w:r>
         <w:rPr>
           <w:rFonts w:hint="cs"/>
@@ -11139,7 +11358,7 @@
           <w:rtl/>
         </w:rPr>
       </w:pPr>
-      <w:bookmarkStart w:id="36" w:name="_Toc234755957"/>
+      <w:bookmarkStart w:id="36" w:name="_Toc234781180"/>
       <w:r>
         <w:rPr>
           <w:rFonts w:cs="Times New Roman"/>
@@ -11192,7 +11411,7 @@
           <w:rtl/>
         </w:rPr>
       </w:pPr>
-      <w:bookmarkStart w:id="37" w:name="_Toc234755958"/>
+      <w:bookmarkStart w:id="37" w:name="_Toc234781181"/>
       <w:r>
         <w:rPr>
           <w:rFonts w:hint="cs"/>
@@ -11322,7 +11541,7 @@
           <w:rtl/>
         </w:rPr>
       </w:pPr>
-      <w:bookmarkStart w:id="38" w:name="_Toc234755959"/>
+      <w:bookmarkStart w:id="38" w:name="_Toc234781182"/>
       <w:r>
         <w:rPr>
           <w:rFonts w:hint="cs"/>
@@ -11540,7 +11759,7 @@
           <w:rtl/>
         </w:rPr>
       </w:pPr>
-      <w:bookmarkStart w:id="39" w:name="_Toc234755960"/>
+      <w:bookmarkStart w:id="39" w:name="_Toc234781183"/>
       <w:r>
         <w:rPr>
           <w:rFonts w:hint="cs"/>
@@ -11915,7 +12134,7 @@
           <w:u w:val="single"/>
         </w:rPr>
       </w:pPr>
-      <w:bookmarkStart w:id="40" w:name="_Toc234755961"/>
+      <w:bookmarkStart w:id="40" w:name="_Toc234781184"/>
       <w:r>
         <w:rPr>
           <w:u w:val="single"/>
@@ -12355,7 +12574,7 @@
           <w:rtl/>
         </w:rPr>
       </w:pPr>
-      <w:bookmarkStart w:id="41" w:name="_Toc234755962"/>
+      <w:bookmarkStart w:id="41" w:name="_Toc234781185"/>
       <w:r>
         <w:rPr>
           <w:u w:val="single"/>
@@ -12627,7 +12846,7 @@
           <w:rtl/>
         </w:rPr>
       </w:pPr>
-      <w:bookmarkStart w:id="42" w:name="_Toc234755963"/>
+      <w:bookmarkStart w:id="42" w:name="_Toc234781186"/>
       <w:r>
         <w:rPr>
           <w:rFonts w:hint="cs"/>
@@ -12982,7 +13201,7 @@
           <w:rtl/>
         </w:rPr>
       </w:pPr>
-      <w:bookmarkStart w:id="43" w:name="_Toc234755964"/>
+      <w:bookmarkStart w:id="43" w:name="_Toc234781187"/>
       <w:r>
         <w:rPr>
           <w:rFonts w:hint="cs"/>
@@ -13375,7 +13594,7 @@
           <w:rtl/>
         </w:rPr>
       </w:pPr>
-      <w:bookmarkStart w:id="44" w:name="_Toc234755965"/>
+      <w:bookmarkStart w:id="44" w:name="_Toc234781188"/>
       <w:r>
         <w:rPr>
           <w:u w:val="single"/>
@@ -13566,7 +13785,7 @@
           <w:rtl/>
         </w:rPr>
       </w:pPr>
-      <w:bookmarkStart w:id="45" w:name="_Toc234755966"/>
+      <w:bookmarkStart w:id="45" w:name="_Toc234781189"/>
       <w:r>
         <w:rPr>
           <w:rFonts w:hint="cs"/>
@@ -13708,7 +13927,7 @@
           <w:u w:val="single"/>
         </w:rPr>
       </w:pPr>
-      <w:bookmarkStart w:id="46" w:name="_Toc234755967"/>
+      <w:bookmarkStart w:id="46" w:name="_Toc234781190"/>
       <w:r>
         <w:rPr>
           <w:u w:val="single"/>
@@ -14063,7 +14282,7 @@
           <w:rtl/>
         </w:rPr>
       </w:pPr>
-      <w:bookmarkStart w:id="47" w:name="_Toc234755968"/>
+      <w:bookmarkStart w:id="47" w:name="_Toc234781191"/>
       <w:r>
         <w:rPr>
           <w:rFonts w:hint="cs"/>
@@ -14772,12 +14991,14 @@
           <w:u w:val="single"/>
         </w:rPr>
       </w:pPr>
+      <w:bookmarkStart w:id="48" w:name="_Toc234781192"/>
       <w:r>
         <w:rPr>
           <w:u w:val="single"/>
         </w:rPr>
         <w:t>Push vs commit</w:t>
       </w:r>
+      <w:bookmarkEnd w:id="48"/>
     </w:p>
     <w:p>
       <w:pPr>
@@ -14800,7 +15021,6 @@
     <w:p>
       <w:pPr>
         <w:rPr>
-          <w:rFonts w:hint="cs"/>
           <w:sz w:val="28"/>
           <w:szCs w:val="28"/>
           <w:rtl/>
@@ -14891,7 +15111,7 @@
           <w:rtl/>
         </w:rPr>
       </w:pPr>
-      <w:bookmarkStart w:id="48" w:name="_Toc234755969"/>
+      <w:bookmarkStart w:id="49" w:name="_Toc234781193"/>
       <w:r>
         <w:rPr>
           <w:rFonts w:hint="cs"/>
@@ -14900,7 +15120,7 @@
         </w:rPr>
         <w:t>תובנות/ מסקנות מהפרויקט</w:t>
       </w:r>
-      <w:bookmarkEnd w:id="48"/>
+      <w:bookmarkEnd w:id="49"/>
     </w:p>
     <w:p>
       <w:pPr>
@@ -17001,7 +17221,7 @@
           <w:rtl/>
         </w:rPr>
       </w:pPr>
-      <w:bookmarkStart w:id="49" w:name="_Toc234755970"/>
+      <w:bookmarkStart w:id="50" w:name="_Toc234781194"/>
       <w:r>
         <w:rPr>
           <w:rFonts w:hint="cs"/>
@@ -17010,7 +17230,7 @@
         </w:rPr>
         <w:t>מבנה של כל קובץ חדש שאתה יוצר</w:t>
       </w:r>
-      <w:bookmarkEnd w:id="49"/>
+      <w:bookmarkEnd w:id="50"/>
     </w:p>
     <w:p>
       <w:pPr>
@@ -17347,7 +17567,7 @@
           <w:rtl/>
         </w:rPr>
       </w:pPr>
-      <w:bookmarkStart w:id="50" w:name="_Toc234755971"/>
+      <w:bookmarkStart w:id="51" w:name="_Toc234781195"/>
       <w:r>
         <w:rPr>
           <w:u w:val="single"/>
@@ -17362,7 +17582,7 @@
         </w:rPr>
         <w:t>env.exmple</w:t>
       </w:r>
-      <w:bookmarkEnd w:id="50"/>
+      <w:bookmarkEnd w:id="51"/>
       <w:proofErr w:type="spellEnd"/>
       <w:proofErr w:type="gramEnd"/>
     </w:p>
@@ -17676,7 +17896,7 @@
           <w:rtl/>
         </w:rPr>
       </w:pPr>
-      <w:bookmarkStart w:id="51" w:name="_Toc234755972"/>
+      <w:bookmarkStart w:id="52" w:name="_Toc234781196"/>
       <w:r>
         <w:rPr>
           <w:u w:val="single"/>
@@ -17690,7 +17910,7 @@
         </w:rPr>
         <w:t>:</w:t>
       </w:r>
-      <w:bookmarkEnd w:id="51"/>
+      <w:bookmarkEnd w:id="52"/>
     </w:p>
     <w:p>
       <w:pPr>
@@ -17754,7 +17974,7 @@
           <w:rtl/>
         </w:rPr>
       </w:pPr>
-      <w:bookmarkStart w:id="52" w:name="_Toc234755973"/>
+      <w:bookmarkStart w:id="53" w:name="_Toc234781197"/>
       <w:r>
         <w:rPr>
           <w:u w:val="single"/>
@@ -17769,7 +17989,7 @@
         </w:rPr>
         <w:t>:</w:t>
       </w:r>
-      <w:bookmarkEnd w:id="52"/>
+      <w:bookmarkEnd w:id="53"/>
     </w:p>
     <w:p>
       <w:pPr>
@@ -17875,7 +18095,7 @@
           <w:rtl/>
         </w:rPr>
       </w:pPr>
-      <w:bookmarkStart w:id="53" w:name="_Toc234755974"/>
+      <w:bookmarkStart w:id="54" w:name="_Toc234781198"/>
       <w:proofErr w:type="gramStart"/>
       <w:r>
         <w:rPr>
@@ -17891,7 +18111,7 @@
         </w:rPr>
         <w:t>gitignore</w:t>
       </w:r>
-      <w:bookmarkEnd w:id="53"/>
+      <w:bookmarkEnd w:id="54"/>
       <w:proofErr w:type="spellEnd"/>
       <w:proofErr w:type="gramEnd"/>
     </w:p>
@@ -18029,14 +18249,14 @@
           <w:rtl/>
         </w:rPr>
       </w:pPr>
-      <w:bookmarkStart w:id="54" w:name="_Toc234755975"/>
+      <w:bookmarkStart w:id="55" w:name="_Toc234781199"/>
       <w:r>
         <w:rPr>
           <w:u w:val="single"/>
         </w:rPr>
         <w:t>Path handling</w:t>
       </w:r>
-      <w:bookmarkEnd w:id="54"/>
+      <w:bookmarkEnd w:id="55"/>
     </w:p>
     <w:p>
       <w:pPr>
@@ -18238,14 +18458,14 @@
           <w:u w:val="single"/>
         </w:rPr>
       </w:pPr>
-      <w:bookmarkStart w:id="55" w:name="_Toc234755976"/>
+      <w:bookmarkStart w:id="56" w:name="_Toc234781200"/>
       <w:r>
         <w:rPr>
           <w:u w:val="single"/>
         </w:rPr>
         <w:t>YAML</w:t>
       </w:r>
-      <w:bookmarkEnd w:id="55"/>
+      <w:bookmarkEnd w:id="56"/>
     </w:p>
     <w:p>
       <w:pPr>
@@ -18406,7 +18626,7 @@
           <w:u w:val="single"/>
         </w:rPr>
       </w:pPr>
-      <w:bookmarkStart w:id="56" w:name="_Toc234755977"/>
+      <w:bookmarkStart w:id="57" w:name="_Toc234781201"/>
       <w:r>
         <w:rPr>
           <w:u w:val="single"/>
@@ -18414,7 +18634,7 @@
         <w:lastRenderedPageBreak/>
         <w:t>CI and CD</w:t>
       </w:r>
-      <w:bookmarkEnd w:id="56"/>
+      <w:bookmarkEnd w:id="57"/>
     </w:p>
     <w:p>
       <w:pPr>
@@ -18442,7 +18662,7 @@
           <w:rtl/>
         </w:rPr>
       </w:pPr>
-      <w:bookmarkStart w:id="57" w:name="_Toc234755978"/>
+      <w:bookmarkStart w:id="58" w:name="_Toc234781202"/>
       <w:r>
         <w:rPr>
           <w:u w:val="single"/>
@@ -18463,7 +18683,7 @@
         </w:rPr>
         <w:t>:</w:t>
       </w:r>
-      <w:bookmarkEnd w:id="57"/>
+      <w:bookmarkEnd w:id="58"/>
     </w:p>
     <w:p>
       <w:pPr>
@@ -18599,7 +18819,7 @@
           <w:rtl/>
         </w:rPr>
       </w:pPr>
-      <w:bookmarkStart w:id="58" w:name="_Toc234755979"/>
+      <w:bookmarkStart w:id="59" w:name="_Toc234781203"/>
       <w:r>
         <w:rPr>
           <w:u w:val="single"/>
@@ -18621,7 +18841,7 @@
         </w:rPr>
         <w:t>:</w:t>
       </w:r>
-      <w:bookmarkEnd w:id="58"/>
+      <w:bookmarkEnd w:id="59"/>
       <w:proofErr w:type="gramEnd"/>
     </w:p>
     <w:p>
@@ -18639,7 +18859,7 @@
           <w:rtl/>
         </w:rPr>
       </w:pPr>
-      <w:bookmarkStart w:id="59" w:name="_Toc234755980"/>
+      <w:bookmarkStart w:id="60" w:name="_Toc234781204"/>
       <w:r>
         <w:rPr>
           <w:u w:val="single"/>
@@ -18654,7 +18874,7 @@
         </w:rPr>
         <w:t>:</w:t>
       </w:r>
-      <w:bookmarkEnd w:id="59"/>
+      <w:bookmarkEnd w:id="60"/>
     </w:p>
     <w:p>
       <w:pPr>
@@ -18773,6 +18993,7 @@
           <w:rtl/>
         </w:rPr>
       </w:pPr>
+      <w:bookmarkStart w:id="61" w:name="_Toc234781205"/>
       <w:r>
         <w:rPr>
           <w:u w:val="single"/>
@@ -18787,6 +19008,7 @@
         </w:rPr>
         <w:t>:</w:t>
       </w:r>
+      <w:bookmarkEnd w:id="61"/>
     </w:p>
     <w:p>
       <w:pPr>
@@ -19118,45 +19340,105 @@
           <w:tab w:val="left" w:pos="1263"/>
         </w:tabs>
         <w:rPr>
-          <w:rFonts w:hint="cs"/>
-          <w:sz w:val="28"/>
-          <w:szCs w:val="28"/>
-        </w:rPr>
-      </w:pPr>
-    </w:p>
-    <w:p>
-      <w:pPr>
-        <w:rPr>
-          <w:rFonts w:hint="cs"/>
-          <w:sz w:val="28"/>
-          <w:szCs w:val="28"/>
-          <w:rtl/>
-        </w:rPr>
-      </w:pPr>
-    </w:p>
-    <w:p>
-      <w:pPr>
-        <w:rPr>
-          <w:sz w:val="28"/>
-          <w:szCs w:val="28"/>
-          <w:rtl/>
-        </w:rPr>
-      </w:pPr>
-    </w:p>
-    <w:p>
-      <w:pPr>
-        <w:rPr>
-          <w:sz w:val="28"/>
-          <w:szCs w:val="28"/>
-          <w:rtl/>
-        </w:rPr>
-      </w:pPr>
-    </w:p>
-    <w:p>
-      <w:pPr>
-        <w:rPr>
-          <w:sz w:val="28"/>
-          <w:szCs w:val="28"/>
+          <w:sz w:val="28"/>
+          <w:szCs w:val="28"/>
+        </w:rPr>
+      </w:pPr>
+    </w:p>
+    <w:p>
+      <w:pPr>
+        <w:rPr>
+          <w:sz w:val="28"/>
+          <w:szCs w:val="28"/>
+          <w:rtl/>
+        </w:rPr>
+      </w:pPr>
+    </w:p>
+    <w:p>
+      <w:pPr>
+        <w:rPr>
+          <w:sz w:val="28"/>
+          <w:szCs w:val="28"/>
+          <w:rtl/>
+        </w:rPr>
+      </w:pPr>
+    </w:p>
+    <w:p>
+      <w:pPr>
+        <w:pStyle w:val="1"/>
+        <w:jc w:val="center"/>
+        <w:rPr>
+          <w:u w:val="single"/>
+          <w:rtl/>
+        </w:rPr>
+      </w:pPr>
+      <w:r>
+        <w:rPr>
+          <w:u w:val="single"/>
+        </w:rPr>
+        <w:lastRenderedPageBreak/>
+        <w:t>API layer</w:t>
+      </w:r>
+    </w:p>
+    <w:p>
+      <w:pPr>
+        <w:rPr>
+          <w:sz w:val="28"/>
+          <w:szCs w:val="28"/>
+          <w:rtl/>
+        </w:rPr>
+      </w:pPr>
+      <w:r>
+        <w:rPr>
+          <w:rFonts w:hint="cs"/>
+          <w:sz w:val="28"/>
+          <w:szCs w:val="28"/>
+          <w:rtl/>
+        </w:rPr>
+        <w:t xml:space="preserve">משהו חשוב לעשות, מעולמות ה </w:t>
+      </w:r>
+      <w:proofErr w:type="spellStart"/>
+      <w:r>
+        <w:rPr>
+          <w:sz w:val="28"/>
+          <w:szCs w:val="28"/>
+        </w:rPr>
+        <w:t>DevX</w:t>
+      </w:r>
+      <w:proofErr w:type="spellEnd"/>
+      <w:r>
+        <w:rPr>
+          <w:rFonts w:hint="cs"/>
+          <w:sz w:val="28"/>
+          <w:szCs w:val="28"/>
+          <w:rtl/>
+        </w:rPr>
+        <w:t xml:space="preserve"> זה ליצור ממשק </w:t>
+      </w:r>
+      <w:r>
+        <w:rPr>
+          <w:sz w:val="28"/>
+          <w:szCs w:val="28"/>
+        </w:rPr>
+        <w:t>API</w:t>
+      </w:r>
+      <w:r>
+        <w:rPr>
+          <w:rFonts w:hint="cs"/>
+          <w:sz w:val="28"/>
+          <w:szCs w:val="28"/>
+          <w:rtl/>
+        </w:rPr>
+        <w:t>.</w:t>
+      </w:r>
+    </w:p>
+    <w:p>
+      <w:pPr>
+        <w:rPr>
+          <w:rFonts w:hint="cs"/>
+          <w:sz w:val="28"/>
+          <w:szCs w:val="28"/>
+          <w:rtl/>
         </w:rPr>
       </w:pPr>
     </w:p>
@@ -22842,6 +23124,7 @@
   <w:style w:type="character" w:default="1" w:styleId="a0">
     <w:name w:val="Default Paragraph Font"/>
     <w:uiPriority w:val="1"/>
+    <w:semiHidden/>
     <w:unhideWhenUsed/>
   </w:style>
   <w:style w:type="table" w:default="1" w:styleId="a1">

</xml_diff>